<commit_message>
Remove code fences for web compatibility; add paper 09 (structure for compute efficiency)
</commit_message>
<xml_diff>
--- a/paper.docx
+++ b/paper.docx
@@ -3,9 +3,6 @@
 <w:document xmlns:wpc="http://schemas.microsoft.com/office/word/2010/wordprocessingCanvas" xmlns:mo="http://schemas.microsoft.com/office/mac/office/2008/main" xmlns:mc="http://schemas.openxmlformats.org/markup-compatibility/2006" xmlns:mv="urn:schemas-microsoft-com:mac:vml" xmlns:o="urn:schemas-microsoft-com:office:office" xmlns:r="http://schemas.openxmlformats.org/officeDocument/2006/relationships" xmlns:m="http://schemas.openxmlformats.org/officeDocument/2006/math" xmlns:v="urn:schemas-microsoft-com:vml" xmlns:wp14="http://schemas.microsoft.com/office/word/2010/wordprocessingDrawing" xmlns:wp="http://schemas.openxmlformats.org/drawingml/2006/wordprocessingDrawing" xmlns:w10="urn:schemas-microsoft-com:office:word" xmlns:w="http://schemas.openxmlformats.org/wordprocessingml/2006/main" xmlns:w14="http://schemas.microsoft.com/office/word/2010/wordml" xmlns:wpg="http://schemas.microsoft.com/office/word/2010/wordprocessingGroup" xmlns:wpi="http://schemas.microsoft.com/office/word/2010/wordprocessingInk" xmlns:wne="http://schemas.microsoft.com/office/word/2006/wordml" xmlns:wps="http://schemas.microsoft.com/office/word/2010/wordprocessingShape" mc:Ignorable="w14 wp14">
   <w:body>
     <w:p>
-      <w:pPr>
-        <w:jc w:val="center"/>
-      </w:pPr>
       <w:r>
         <w:rPr>
           <w:b/>
@@ -191,52 +188,52 @@
           <w:b w:val="0"/>
           <w:sz w:val="22"/>
         </w:rPr>
-        <w:t>• Schrödinger（1944）：生命以负熵为食 —— 生存靠从环境摄取低熵，是「解压」的物理前身[7]。</w:t>
-      </w:r>
-    </w:p>
-    <w:p>
-      <w:r>
-        <w:rPr>
-          <w:b w:val="0"/>
-          <w:sz w:val="22"/>
-        </w:rPr>
-        <w:t>• Bennett（1988）逻辑深度：用「从最短描述重建（解压）一个对象所需的计算量」度量复杂性，并明确把它与生命/有机体联系起来[8] —— 这是「解压」最正式的已有版本。</w:t>
-      </w:r>
-    </w:p>
-    <w:p>
-      <w:r>
-        <w:rPr>
-          <w:b w:val="0"/>
-          <w:sz w:val="22"/>
-        </w:rPr>
-        <w:t>• Chaitin（2010）生命作为演化软件：DNA = 程序，生命 = 会自我修改的软件[9]。</w:t>
-      </w:r>
-    </w:p>
-    <w:p>
-      <w:r>
-        <w:rPr>
-          <w:b w:val="0"/>
-          <w:sz w:val="22"/>
-        </w:rPr>
-        <w:t>• Solomonoff–Kolmogorov / MDL：描述长度 = 理解 = 压缩[10]。</w:t>
-      </w:r>
-    </w:p>
-    <w:p>
-      <w:r>
-        <w:rPr>
-          <w:b w:val="0"/>
-          <w:sz w:val="22"/>
-        </w:rPr>
-        <w:t>• Friston（2010）自由能原理：生命 = 最小化惊奇（≈ 持续压缩/预测）[11]。</w:t>
-      </w:r>
-    </w:p>
-    <w:p>
-      <w:r>
-        <w:rPr>
-          <w:b w:val="0"/>
-          <w:sz w:val="22"/>
-        </w:rPr>
-        <w:t>• Delétang et al.（2023）：语言模型是压缩器[6]。</w:t>
+        <w:t>- Schrödinger（1944）：生命以负熵为食 —— 生存靠从环境摄取低熵，是「解压」的物理前身[7]。</w:t>
+      </w:r>
+    </w:p>
+    <w:p>
+      <w:r>
+        <w:rPr>
+          <w:b w:val="0"/>
+          <w:sz w:val="22"/>
+        </w:rPr>
+        <w:t>- Bennett（1988）逻辑深度：用「从最短描述重建（解压）一个对象所需的计算量」度量复杂性，并明确把它与生命/有机体联系起来[8] —— 这是「解压」最正式的已有版本。</w:t>
+      </w:r>
+    </w:p>
+    <w:p>
+      <w:r>
+        <w:rPr>
+          <w:b w:val="0"/>
+          <w:sz w:val="22"/>
+        </w:rPr>
+        <w:t>- Chaitin（2010）生命作为演化软件：DNA = 程序，生命 = 会自我修改的软件[9]。</w:t>
+      </w:r>
+    </w:p>
+    <w:p>
+      <w:r>
+        <w:rPr>
+          <w:b w:val="0"/>
+          <w:sz w:val="22"/>
+        </w:rPr>
+        <w:t>- Solomonoff–Kolmogorov / MDL：描述长度 = 理解 = 压缩[10]。</w:t>
+      </w:r>
+    </w:p>
+    <w:p>
+      <w:r>
+        <w:rPr>
+          <w:b w:val="0"/>
+          <w:sz w:val="22"/>
+        </w:rPr>
+        <w:t>- Friston（2010）自由能原理：生命 = 最小化惊奇（≈ 持续压缩/预测）[11]。</w:t>
+      </w:r>
+    </w:p>
+    <w:p>
+      <w:r>
+        <w:rPr>
+          <w:b w:val="0"/>
+          <w:sz w:val="22"/>
+        </w:rPr>
+        <w:t>- Delétang et al.（2023）：语言模型是压缩器[6]。</w:t>
       </w:r>
     </w:p>
     <w:p>
@@ -276,9 +273,6 @@
       </w:r>
     </w:p>
     <w:p>
-      <w:pPr>
-        <w:jc w:val="center"/>
-      </w:pPr>
       <w:r>
         <w:rPr>
           <w:b/>
@@ -326,9 +320,8 @@
     <w:p>
       <w:r>
         <w:rPr>
-          <w:rFonts w:ascii="Consolas" w:hAnsi="Consolas" w:eastAsia="Consolas"/>
-          <w:b w:val="0"/>
-          <w:sz w:val="18"/>
+          <w:b w:val="0"/>
+          <w:sz w:val="22"/>
         </w:rPr>
         <w:t>① 事实：大模型存在，且能在大规模语言上工作</w:t>
       </w:r>
@@ -336,19 +329,17 @@
     <w:p>
       <w:r>
         <w:rPr>
-          <w:rFonts w:ascii="Consolas" w:hAnsi="Consolas" w:eastAsia="Consolas"/>
-          <w:b w:val="0"/>
-          <w:sz w:val="18"/>
-        </w:rPr>
-        <w:t xml:space="preserve">   ⇒ 它确实从语言里恢复出了结构（预测、迁移、推理）</w:t>
-      </w:r>
-    </w:p>
-    <w:p>
-      <w:r>
-        <w:rPr>
-          <w:rFonts w:ascii="Consolas" w:hAnsi="Consolas" w:eastAsia="Consolas"/>
-          <w:b w:val="0"/>
-          <w:sz w:val="18"/>
+          <w:b w:val="0"/>
+          <w:sz w:val="22"/>
+        </w:rPr>
+        <w:t>⇒ 它确实从语言里恢复出了结构（预测、迁移、推理）</w:t>
+      </w:r>
+    </w:p>
+    <w:p>
+      <w:r>
+        <w:rPr>
+          <w:b w:val="0"/>
+          <w:sz w:val="22"/>
         </w:rPr>
         <w:t>② 推论：语言所记录的那一层世界，可以被函数逼近</w:t>
       </w:r>
@@ -356,19 +347,17 @@
     <w:p>
       <w:r>
         <w:rPr>
-          <w:rFonts w:ascii="Consolas" w:hAnsi="Consolas" w:eastAsia="Consolas"/>
-          <w:b w:val="0"/>
-          <w:sz w:val="18"/>
-        </w:rPr>
-        <w:t xml:space="preserve">   ⇒ 否则这样的机器不可能工作</w:t>
-      </w:r>
-    </w:p>
-    <w:p>
-      <w:r>
-        <w:rPr>
-          <w:rFonts w:ascii="Consolas" w:hAnsi="Consolas" w:eastAsia="Consolas"/>
-          <w:b w:val="0"/>
-          <w:sz w:val="18"/>
+          <w:b w:val="0"/>
+          <w:sz w:val="22"/>
+        </w:rPr>
+        <w:t>⇒ 否则这样的机器不可能工作</w:t>
+      </w:r>
+    </w:p>
+    <w:p>
+      <w:r>
+        <w:rPr>
+          <w:b w:val="0"/>
+          <w:sz w:val="22"/>
         </w:rPr>
         <w:t>③ 反推：世界（至少被语言/观测记录的那一层）具有函数结构</w:t>
       </w:r>
@@ -376,9 +365,8 @@
     <w:p>
       <w:r>
         <w:rPr>
-          <w:rFonts w:ascii="Consolas" w:hAnsi="Consolas" w:eastAsia="Consolas"/>
-          <w:b w:val="0"/>
-          <w:sz w:val="18"/>
+          <w:b w:val="0"/>
+          <w:sz w:val="22"/>
         </w:rPr>
         <w:t>④ 定义：生命 = 维持这种「从世界到结构」的解压过程的系统</w:t>
       </w:r>
@@ -449,9 +437,8 @@
     <w:p>
       <w:r>
         <w:rPr>
-          <w:rFonts w:ascii="Consolas" w:hAnsi="Consolas" w:eastAsia="Consolas"/>
-          <w:b w:val="0"/>
-          <w:sz w:val="18"/>
+          <w:b w:val="0"/>
+          <w:sz w:val="22"/>
         </w:rPr>
         <w:t>事实：最基础的物理定律本身就是数学命题</w:t>
       </w:r>
@@ -459,19 +446,17 @@
     <w:p>
       <w:r>
         <w:rPr>
-          <w:rFonts w:ascii="Consolas" w:hAnsi="Consolas" w:eastAsia="Consolas"/>
-          <w:b w:val="0"/>
-          <w:sz w:val="18"/>
-        </w:rPr>
-        <w:t xml:space="preserve">      F = ma、最小作用量 δS=0、iħ∂ψ/∂t = Ĥψ、ds² = g_{μν}dx^μdx^ν</w:t>
-      </w:r>
-    </w:p>
-    <w:p>
-      <w:r>
-        <w:rPr>
-          <w:rFonts w:ascii="Consolas" w:hAnsi="Consolas" w:eastAsia="Consolas"/>
-          <w:b w:val="0"/>
-          <w:sz w:val="18"/>
+          <w:b w:val="0"/>
+          <w:sz w:val="22"/>
+        </w:rPr>
+        <w:t>F = ma、最小作用量 δS=0、iħ∂ψ/∂t = Ĥψ、ds² = g_{μν}dx^μdx^ν</w:t>
+      </w:r>
+    </w:p>
+    <w:p>
+      <w:r>
+        <w:rPr>
+          <w:b w:val="0"/>
+          <w:sz w:val="22"/>
         </w:rPr>
         <w:t>猜想：既然描述世界最深层的方式是数学的，世界本身的结构就是数学的</w:t>
       </w:r>
@@ -479,11 +464,10 @@
     <w:p>
       <w:r>
         <w:rPr>
-          <w:rFonts w:ascii="Consolas" w:hAnsi="Consolas" w:eastAsia="Consolas"/>
-          <w:b w:val="0"/>
-          <w:sz w:val="18"/>
-        </w:rPr>
-        <w:t xml:space="preserve">      —— 否则数学为何能如此精确地描述它？</w:t>
+          <w:b w:val="0"/>
+          <w:sz w:val="22"/>
+        </w:rPr>
+        <w:t>—— 否则数学为何能如此精确地描述它？</w:t>
       </w:r>
     </w:p>
     <w:p>
@@ -498,9 +482,8 @@
     <w:p>
       <w:r>
         <w:rPr>
-          <w:rFonts w:ascii="Consolas" w:hAnsi="Consolas" w:eastAsia="Consolas"/>
-          <w:b w:val="0"/>
-          <w:sz w:val="18"/>
+          <w:b w:val="0"/>
+          <w:sz w:val="22"/>
         </w:rPr>
         <w:t>① 这是对「数学为何有效」的解释性推断，不是证明</w:t>
       </w:r>
@@ -508,29 +491,26 @@
     <w:p>
       <w:r>
         <w:rPr>
-          <w:rFonts w:ascii="Consolas" w:hAnsi="Consolas" w:eastAsia="Consolas"/>
-          <w:b w:val="0"/>
-          <w:sz w:val="18"/>
-        </w:rPr>
-        <w:t>② 存在等价的另一读法：数学只是**描述语言**，世界本身是什么我们不知道</w:t>
-      </w:r>
-    </w:p>
-    <w:p>
-      <w:r>
-        <w:rPr>
-          <w:rFonts w:ascii="Consolas" w:hAnsi="Consolas" w:eastAsia="Consolas"/>
-          <w:b w:val="0"/>
-          <w:sz w:val="18"/>
-        </w:rPr>
-        <w:t xml:space="preserve">   （工具论 vs 实在论；两者目前无法用实验区分）</w:t>
-      </w:r>
-    </w:p>
-    <w:p>
-      <w:r>
-        <w:rPr>
-          <w:rFonts w:ascii="Consolas" w:hAnsi="Consolas" w:eastAsia="Consolas"/>
-          <w:b w:val="0"/>
-          <w:sz w:val="18"/>
+          <w:b w:val="0"/>
+          <w:sz w:val="22"/>
+        </w:rPr>
+        <w:t>② 存在等价的另一读法：数学只是描述语言，世界本身是什么我们不知道</w:t>
+      </w:r>
+    </w:p>
+    <w:p>
+      <w:r>
+        <w:rPr>
+          <w:b w:val="0"/>
+          <w:sz w:val="22"/>
+        </w:rPr>
+        <w:t>（工具论 vs 实在论；两者目前无法用实验区分）</w:t>
+      </w:r>
+    </w:p>
+    <w:p>
+      <w:r>
+        <w:rPr>
+          <w:b w:val="0"/>
+          <w:sz w:val="22"/>
         </w:rPr>
         <w:t>③ 强形式（世界=数学结构，Tegmark[2] 数学宇宙假说）不可证伪，因而不能当科学结论</w:t>
       </w:r>
@@ -538,9 +518,8 @@
     <w:p>
       <w:r>
         <w:rPr>
-          <w:rFonts w:ascii="Consolas" w:hAnsi="Consolas" w:eastAsia="Consolas"/>
-          <w:b w:val="0"/>
-          <w:sz w:val="18"/>
+          <w:b w:val="0"/>
+          <w:sz w:val="22"/>
         </w:rPr>
         <w:t>④ 这是 Wigner[1] 所说的「数学在自然科学中不合理的有效性」之谜，本文不解答它</w:t>
       </w:r>
@@ -557,9 +536,8 @@
     <w:p>
       <w:r>
         <w:rPr>
-          <w:rFonts w:ascii="Consolas" w:hAnsi="Consolas" w:eastAsia="Consolas"/>
-          <w:b w:val="0"/>
-          <w:sz w:val="18"/>
+          <w:b w:val="0"/>
+          <w:sz w:val="22"/>
         </w:rPr>
         <w:t>弱表述：世界具有可被数学描述的规律性（经验事实，不是猜想）</w:t>
       </w:r>
@@ -567,9 +545,8 @@
     <w:p>
       <w:r>
         <w:rPr>
-          <w:rFonts w:ascii="Consolas" w:hAnsi="Consolas" w:eastAsia="Consolas"/>
-          <w:b w:val="0"/>
-          <w:sz w:val="18"/>
+          <w:b w:val="0"/>
+          <w:sz w:val="22"/>
         </w:rPr>
         <w:t>⇒ 由此写出：S_{t+1} = F(S_t)</w:t>
       </w:r>
@@ -577,9 +554,8 @@
     <w:p>
       <w:r>
         <w:rPr>
-          <w:rFonts w:ascii="Consolas" w:hAnsi="Consolas" w:eastAsia="Consolas"/>
-          <w:b w:val="0"/>
-          <w:sz w:val="18"/>
+          <w:b w:val="0"/>
+          <w:sz w:val="22"/>
         </w:rPr>
         <w:t>⇒ 规律 ⇒ 可压缩 ⇒ 可预测 ⇒ 预测有对错 ⇒ 对错可计代价</w:t>
       </w:r>
@@ -599,16 +575,16 @@
           <w:b w:val="0"/>
           <w:sz w:val="22"/>
         </w:rPr>
-        <w:t>• **猜想** = 世界本身是数学的（本节内容，不用作证据）</w:t>
-      </w:r>
-    </w:p>
-    <w:p>
-      <w:r>
-        <w:rPr>
-          <w:b w:val="0"/>
-          <w:sz w:val="22"/>
-        </w:rPr>
-        <w:t>• **经验事实** = 世界存在可压缩的规律性（科学实践的基础，本文真正使用的东西）</w:t>
+        <w:t>- 猜想 = 世界本身是数学的（本节内容，不用作证据）</w:t>
+      </w:r>
+    </w:p>
+    <w:p>
+      <w:r>
+        <w:rPr>
+          <w:b w:val="0"/>
+          <w:sz w:val="22"/>
+        </w:rPr>
+        <w:t>- 经验事实 = 世界存在可压缩的规律性（科学实践的基础，本文真正使用的东西）</w:t>
       </w:r>
     </w:p>
     <w:p>
@@ -623,9 +599,8 @@
     <w:p>
       <w:r>
         <w:rPr>
-          <w:rFonts w:ascii="Consolas" w:hAnsi="Consolas" w:eastAsia="Consolas"/>
-          <w:b w:val="0"/>
-          <w:sz w:val="18"/>
+          <w:b w:val="0"/>
+          <w:sz w:val="22"/>
         </w:rPr>
         <w:t>[猜想]   世界的根源是数学性的</w:t>
       </w:r>
@@ -633,9 +608,8 @@
     <w:p>
       <w:r>
         <w:rPr>
-          <w:rFonts w:ascii="Consolas" w:hAnsi="Consolas" w:eastAsia="Consolas"/>
-          <w:b w:val="0"/>
-          <w:sz w:val="18"/>
+          <w:b w:val="0"/>
+          <w:sz w:val="22"/>
         </w:rPr>
         <w:t>[经验]   世界具有可被部分描述/压缩的规律性</w:t>
       </w:r>
@@ -643,9 +617,8 @@
     <w:p>
       <w:r>
         <w:rPr>
-          <w:rFonts w:ascii="Consolas" w:hAnsi="Consolas" w:eastAsia="Consolas"/>
-          <w:b w:val="0"/>
-          <w:sz w:val="18"/>
+          <w:b w:val="0"/>
+          <w:sz w:val="22"/>
         </w:rPr>
         <w:t>[本文用] 只使用后者；即使前者为假，本文全部判据与实验照常成立</w:t>
       </w:r>
@@ -653,17 +626,13 @@
     <w:p>
       <w:r>
         <w:rPr>
-          <w:rFonts w:ascii="Consolas" w:hAnsi="Consolas" w:eastAsia="Consolas"/>
-          <w:b w:val="0"/>
-          <w:sz w:val="18"/>
+          <w:b w:val="0"/>
+          <w:sz w:val="22"/>
         </w:rPr>
         <w:t>[不讨论] 数学为何有效（Wigner 之谜）；世界本体到底是什么</w:t>
       </w:r>
     </w:p>
     <w:p>
-      <w:pPr>
-        <w:jc w:val="center"/>
-      </w:pPr>
       <w:r>
         <w:rPr>
           <w:b/>
@@ -711,9 +680,8 @@
     <w:p>
       <w:r>
         <w:rPr>
-          <w:rFonts w:ascii="Consolas" w:hAnsi="Consolas" w:eastAsia="Consolas"/>
-          <w:b w:val="0"/>
-          <w:sz w:val="18"/>
+          <w:b w:val="0"/>
+          <w:sz w:val="22"/>
         </w:rPr>
         <w:t>记个体为 F = { f_θ : θ ∈ Θ }</w:t>
       </w:r>
@@ -721,29 +689,26 @@
     <w:p>
       <w:r>
         <w:rPr>
-          <w:rFonts w:ascii="Consolas" w:hAnsi="Consolas" w:eastAsia="Consolas"/>
-          <w:b w:val="0"/>
-          <w:sz w:val="18"/>
-        </w:rPr>
-        <w:t xml:space="preserve">    f_θ : 输入状态 → 行为          （族里的每一个函数）</w:t>
-      </w:r>
-    </w:p>
-    <w:p>
-      <w:r>
-        <w:rPr>
-          <w:rFonts w:ascii="Consolas" w:hAnsi="Consolas" w:eastAsia="Consolas"/>
-          <w:b w:val="0"/>
-          <w:sz w:val="18"/>
-        </w:rPr>
-        <w:t xml:space="preserve">    Θ                            （这族函数的形状/范围）</w:t>
-      </w:r>
-    </w:p>
-    <w:p>
-      <w:r>
-        <w:rPr>
-          <w:rFonts w:ascii="Consolas" w:hAnsi="Consolas" w:eastAsia="Consolas"/>
-          <w:b w:val="0"/>
-          <w:sz w:val="18"/>
+          <w:b w:val="0"/>
+          <w:sz w:val="22"/>
+        </w:rPr>
+        <w:t>f_θ : 输入状态 → 行为          （族里的每一个函数）</w:t>
+      </w:r>
+    </w:p>
+    <w:p>
+      <w:r>
+        <w:rPr>
+          <w:b w:val="0"/>
+          <w:sz w:val="22"/>
+        </w:rPr>
+        <w:t>Θ                            （这族函数的形状/范围）</w:t>
+      </w:r>
+    </w:p>
+    <w:p>
+      <w:r>
+        <w:rPr>
+          <w:b w:val="0"/>
+          <w:sz w:val="22"/>
         </w:rPr>
         <w:t>生命 = 一个会移动、会变形的 Θ，且 Θ 的更新规则属于 Θ 自己</w:t>
       </w:r>
@@ -757,156 +722,60 @@
         <w:t>四个词，各对应四件事：</w:t>
       </w:r>
     </w:p>
-    <w:tbl>
-      <w:tblPr>
-        <w:tblW w:type="auto" w:w="0"/>
-        <w:tblLook w:firstColumn="1" w:firstRow="1" w:lastColumn="0" w:lastRow="0" w:noHBand="0" w:noVBand="1" w:val="04A0"/>
-      </w:tblPr>
-      <w:tblGrid>
-        <w:gridCol w:w="4320"/>
-        <w:gridCol w:w="4320"/>
-      </w:tblGrid>
-      <w:tr>
-        <w:tc>
-          <w:tcPr>
-            <w:tcW w:type="dxa" w:w="4320"/>
-          </w:tcPr>
-          <w:p>
-            <w:r>
-              <w:rPr>
-                <w:sz w:val="18"/>
-              </w:rPr>
-              <w:t>词</w:t>
-            </w:r>
-          </w:p>
-        </w:tc>
-        <w:tc>
-          <w:tcPr>
-            <w:tcW w:type="dxa" w:w="4320"/>
-          </w:tcPr>
-          <w:p>
-            <w:r>
-              <w:rPr>
-                <w:sz w:val="18"/>
-              </w:rPr>
-              <w:t>含义</w:t>
-            </w:r>
-          </w:p>
-        </w:tc>
-      </w:tr>
-      <w:tr>
-        <w:tc>
-          <w:tcPr>
-            <w:tcW w:type="dxa" w:w="4320"/>
-          </w:tcPr>
-          <w:p>
-            <w:r>
-              <w:rPr>
-                <w:sz w:val="18"/>
-              </w:rPr>
-              <w:t>**函数类（一族）**</w:t>
-            </w:r>
-          </w:p>
-        </w:tc>
-        <w:tc>
-          <w:tcPr>
-            <w:tcW w:type="dxa" w:w="4320"/>
-          </w:tcPr>
-          <w:p>
-            <w:r>
-              <w:rPr>
-                <w:sz w:val="18"/>
-              </w:rPr>
-              <w:t>不是一个固定函数，而是一整块行为谱</w:t>
-            </w:r>
-          </w:p>
-        </w:tc>
-      </w:tr>
-      <w:tr>
-        <w:tc>
-          <w:tcPr>
-            <w:tcW w:type="dxa" w:w="4320"/>
-          </w:tcPr>
-          <w:p>
-            <w:r>
-              <w:rPr>
-                <w:sz w:val="18"/>
-              </w:rPr>
-              <w:t>**会变化（动态）**</w:t>
-            </w:r>
-          </w:p>
-        </w:tc>
-        <w:tc>
-          <w:tcPr>
-            <w:tcW w:type="dxa" w:w="4320"/>
-          </w:tcPr>
-          <w:p>
-            <w:r>
-              <w:rPr>
-                <w:sz w:val="18"/>
-              </w:rPr>
-              <w:t>这族函数随时间移动、变形</w:t>
-            </w:r>
-          </w:p>
-        </w:tc>
-      </w:tr>
-      <w:tr>
-        <w:tc>
-          <w:tcPr>
-            <w:tcW w:type="dxa" w:w="4320"/>
-          </w:tcPr>
-          <w:p>
-            <w:r>
-              <w:rPr>
-                <w:sz w:val="18"/>
-              </w:rPr>
-              <w:t>**会自指**</w:t>
-            </w:r>
-          </w:p>
-        </w:tc>
-        <w:tc>
-          <w:tcPr>
-            <w:tcW w:type="dxa" w:w="4320"/>
-          </w:tcPr>
-          <w:p>
-            <w:r>
-              <w:rPr>
-                <w:sz w:val="18"/>
-              </w:rPr>
-              <w:t>它怎么变的规则，也在它自己的记录里</w:t>
-            </w:r>
-          </w:p>
-        </w:tc>
-      </w:tr>
-      <w:tr>
-        <w:tc>
-          <w:tcPr>
-            <w:tcW w:type="dxa" w:w="4320"/>
-          </w:tcPr>
-          <w:p>
-            <w:r>
-              <w:rPr>
-                <w:sz w:val="18"/>
-              </w:rPr>
-              <w:t>**会自我维持**</w:t>
-            </w:r>
-          </w:p>
-        </w:tc>
-        <w:tc>
-          <w:tcPr>
-            <w:tcW w:type="dxa" w:w="4320"/>
-          </w:tcPr>
-          <w:p>
-            <w:r>
-              <w:rPr>
-                <w:sz w:val="18"/>
-              </w:rPr>
-              <w:t>花代价维持自己的形状；收入靠压缩世界</w:t>
-            </w:r>
-          </w:p>
-        </w:tc>
-      </w:tr>
-    </w:tbl>
+    <w:p>
+      <w:r>
+        <w:rPr>
+          <w:b w:val="0"/>
+          <w:sz w:val="22"/>
+        </w:rPr>
+        <w:t>| 词 | 含义 |</w:t>
+      </w:r>
+    </w:p>
+    <w:p>
+      <w:r>
+        <w:rPr>
+          <w:b w:val="0"/>
+          <w:sz w:val="22"/>
+        </w:rPr>
+        <w:t>|---|---|</w:t>
+      </w:r>
+    </w:p>
+    <w:p>
+      <w:r>
+        <w:rPr>
+          <w:b w:val="0"/>
+          <w:sz w:val="22"/>
+        </w:rPr>
+        <w:t>| 函数类（一族） | 不是一个固定函数，而是一整块行为谱 |</w:t>
+      </w:r>
+    </w:p>
+    <w:p>
+      <w:r>
+        <w:rPr>
+          <w:b w:val="0"/>
+          <w:sz w:val="22"/>
+        </w:rPr>
+        <w:t>| 会变化（动态） | 这族函数随时间移动、变形 |</w:t>
+      </w:r>
+    </w:p>
+    <w:p>
+      <w:r>
+        <w:rPr>
+          <w:b w:val="0"/>
+          <w:sz w:val="22"/>
+        </w:rPr>
+        <w:t>| 会自指 | 它怎么变的规则，也在它自己的记录里 |</w:t>
+      </w:r>
+    </w:p>
+    <w:p>
+      <w:r>
+        <w:rPr>
+          <w:b w:val="0"/>
+          <w:sz w:val="22"/>
+        </w:rPr>
+        <w:t>| 会自我维持 | 花代价维持自己的形状；收入靠压缩世界 |</w:t>
+      </w:r>
+    </w:p>
     <w:p>
       <w:r>
         <w:rPr>
@@ -919,9 +788,8 @@
     <w:p>
       <w:r>
         <w:rPr>
-          <w:rFonts w:ascii="Consolas" w:hAnsi="Consolas" w:eastAsia="Consolas"/>
-          <w:b w:val="0"/>
-          <w:sz w:val="18"/>
+          <w:b w:val="0"/>
+          <w:sz w:val="22"/>
         </w:rPr>
         <w:t>一个函数 = 一个点          ⇒ 行为谱退化成一条轨迹 ⇒ 冻结即死</w:t>
       </w:r>
@@ -929,9 +797,8 @@
     <w:p>
       <w:r>
         <w:rPr>
-          <w:rFonts w:ascii="Consolas" w:hAnsi="Consolas" w:eastAsia="Consolas"/>
-          <w:b w:val="0"/>
-          <w:sz w:val="18"/>
+          <w:b w:val="0"/>
+          <w:sz w:val="22"/>
         </w:rPr>
         <w:t>一族函数 = 函数空间里一块区域 ⇒ 面对不同输入/状态有一整套响应 ⇒ 才是活的</w:t>
       </w:r>
@@ -957,9 +824,8 @@
     <w:p>
       <w:r>
         <w:rPr>
-          <w:rFonts w:ascii="Consolas" w:hAnsi="Consolas" w:eastAsia="Consolas"/>
-          <w:b w:val="0"/>
-          <w:sz w:val="18"/>
+          <w:b w:val="0"/>
+          <w:sz w:val="22"/>
         </w:rPr>
         <w:t>快：状态每一刻都在变（输入不同、内部状态不同）</w:t>
       </w:r>
@@ -967,9 +833,8 @@
     <w:p>
       <w:r>
         <w:rPr>
-          <w:rFonts w:ascii="Consolas" w:hAnsi="Consolas" w:eastAsia="Consolas"/>
-          <w:b w:val="0"/>
-          <w:sz w:val="18"/>
+          <w:b w:val="0"/>
+          <w:sz w:val="22"/>
         </w:rPr>
         <w:t>中：它用自己的误差改自己（自指层）——这是命门，缺了就退化成化石</w:t>
       </w:r>
@@ -977,9 +842,8 @@
     <w:p>
       <w:r>
         <w:rPr>
-          <w:rFonts w:ascii="Consolas" w:hAnsi="Consolas" w:eastAsia="Consolas"/>
-          <w:b w:val="0"/>
-          <w:sz w:val="18"/>
+          <w:b w:val="0"/>
+          <w:sz w:val="22"/>
         </w:rPr>
         <w:t>慢：这族函数的形状在代际之间被选择、变形、传递</w:t>
       </w:r>
@@ -996,9 +860,8 @@
     <w:p>
       <w:r>
         <w:rPr>
-          <w:rFonts w:ascii="Consolas" w:hAnsi="Consolas" w:eastAsia="Consolas"/>
-          <w:b w:val="0"/>
-          <w:sz w:val="18"/>
+          <w:b w:val="0"/>
+          <w:sz w:val="22"/>
         </w:rPr>
         <w:t>普通程序：代码在外，数据在内 ⇒ 程序不会因为运行而改变自己</w:t>
       </w:r>
@@ -1006,9 +869,8 @@
     <w:p>
       <w:r>
         <w:rPr>
-          <w:rFonts w:ascii="Consolas" w:hAnsi="Consolas" w:eastAsia="Consolas"/>
-          <w:b w:val="0"/>
-          <w:sz w:val="18"/>
+          <w:b w:val="0"/>
+          <w:sz w:val="22"/>
         </w:rPr>
         <w:t>生命：    更新规则本身是它自己记录的一部分</w:t>
       </w:r>
@@ -1016,11 +878,10 @@
     <w:p>
       <w:r>
         <w:rPr>
-          <w:rFonts w:ascii="Consolas" w:hAnsi="Consolas" w:eastAsia="Consolas"/>
-          <w:b w:val="0"/>
-          <w:sz w:val="18"/>
-        </w:rPr>
-        <w:t xml:space="preserve">          ⇒ 拿掉外部更新代码，它仍能改自己</w:t>
+          <w:b w:val="0"/>
+          <w:sz w:val="22"/>
+        </w:rPr>
+        <w:t>⇒ 拿掉外部更新代码，它仍能改自己</w:t>
       </w:r>
     </w:p>
     <w:p>
@@ -1053,9 +914,8 @@
     <w:p>
       <w:r>
         <w:rPr>
-          <w:rFonts w:ascii="Consolas" w:hAnsi="Consolas" w:eastAsia="Consolas"/>
-          <w:b w:val="0"/>
-          <w:sz w:val="18"/>
+          <w:b w:val="0"/>
+          <w:sz w:val="22"/>
         </w:rPr>
         <w:t>行为_d = G_θ(世界局部状态)</w:t>
       </w:r>
@@ -1063,9 +923,8 @@
     <w:p>
       <w:r>
         <w:rPr>
-          <w:rFonts w:ascii="Consolas" w:hAnsi="Consolas" w:eastAsia="Consolas"/>
-          <w:b w:val="0"/>
-          <w:sz w:val="18"/>
+          <w:b w:val="0"/>
+          <w:sz w:val="22"/>
         </w:rPr>
         <w:t>而 G_θ 自己也是世界状态的一部分（个体的状态属于 S_t）</w:t>
       </w:r>
@@ -1073,9 +932,8 @@
     <w:p>
       <w:r>
         <w:rPr>
-          <w:rFonts w:ascii="Consolas" w:hAnsi="Consolas" w:eastAsia="Consolas"/>
-          <w:b w:val="0"/>
-          <w:sz w:val="18"/>
+          <w:b w:val="0"/>
+          <w:sz w:val="22"/>
         </w:rPr>
         <w:t>⇒ 它要预测世界，就必然要预测包含自己的那部分世界</w:t>
       </w:r>
@@ -1083,11 +941,10 @@
     <w:p>
       <w:r>
         <w:rPr>
-          <w:rFonts w:ascii="Consolas" w:hAnsi="Consolas" w:eastAsia="Consolas"/>
-          <w:b w:val="0"/>
-          <w:sz w:val="18"/>
-        </w:rPr>
-        <w:t>⇒ **自指不是外加的神秘性质，而是「嵌在函数里」的结构必然**</w:t>
+          <w:b w:val="0"/>
+          <w:sz w:val="22"/>
+        </w:rPr>
+        <w:t>⇒ 自指不是外加的神秘性质，而是「嵌在函数里」的结构必然</w:t>
       </w:r>
     </w:p>
     <w:p>
@@ -1111,9 +968,8 @@
     <w:p>
       <w:r>
         <w:rPr>
-          <w:rFonts w:ascii="Consolas" w:hAnsi="Consolas" w:eastAsia="Consolas"/>
-          <w:b w:val="0"/>
-          <w:sz w:val="18"/>
+          <w:b w:val="0"/>
+          <w:sz w:val="22"/>
         </w:rPr>
         <w:t>宇宙 = F（一个巨大的函数）</w:t>
       </w:r>
@@ -1121,21 +977,19 @@
     <w:p>
       <w:r>
         <w:rPr>
-          <w:rFonts w:ascii="Consolas" w:hAnsi="Consolas" w:eastAsia="Consolas"/>
-          <w:b w:val="0"/>
-          <w:sz w:val="18"/>
-        </w:rPr>
-        <w:t xml:space="preserve">   ├─ 生命：会变化 ＋ 会自指 ＋ **会自我维持**</w:t>
-      </w:r>
-    </w:p>
-    <w:p>
-      <w:r>
-        <w:rPr>
-          <w:rFonts w:ascii="Consolas" w:hAnsi="Consolas" w:eastAsia="Consolas"/>
-          <w:b w:val="0"/>
-          <w:sz w:val="18"/>
-        </w:rPr>
-        <w:t xml:space="preserve">   └─ 环境：会变化（被世界推着变、也会反过来影响世界），但**不维持自己**</w:t>
+          <w:b w:val="0"/>
+          <w:sz w:val="22"/>
+        </w:rPr>
+        <w:t>├─ 生命：会变化 ＋ 会自指 ＋ 会自我维持</w:t>
+      </w:r>
+    </w:p>
+    <w:p>
+      <w:r>
+        <w:rPr>
+          <w:b w:val="0"/>
+          <w:sz w:val="22"/>
+        </w:rPr>
+        <w:t>└─ 环境：会变化（被世界推着变、也会反过来影响世界），但不维持自己</w:t>
       </w:r>
     </w:p>
     <w:p>
@@ -1168,9 +1022,8 @@
     <w:p>
       <w:r>
         <w:rPr>
-          <w:rFonts w:ascii="Consolas" w:hAnsi="Consolas" w:eastAsia="Consolas"/>
-          <w:b w:val="0"/>
-          <w:sz w:val="18"/>
+          <w:b w:val="0"/>
+          <w:sz w:val="22"/>
         </w:rPr>
         <w:t>自我维持要付代价（校验/修复/复制都是不可逆操作）</w:t>
       </w:r>
@@ -1178,9 +1031,8 @@
     <w:p>
       <w:r>
         <w:rPr>
-          <w:rFonts w:ascii="Consolas" w:hAnsi="Consolas" w:eastAsia="Consolas"/>
-          <w:b w:val="0"/>
-          <w:sz w:val="18"/>
+          <w:b w:val="0"/>
+          <w:sz w:val="22"/>
         </w:rPr>
         <w:t>⇒ 收入的唯一来源：压缩世界（匹配源分布）</w:t>
       </w:r>
@@ -1188,9 +1040,8 @@
     <w:p>
       <w:r>
         <w:rPr>
-          <w:rFonts w:ascii="Consolas" w:hAnsi="Consolas" w:eastAsia="Consolas"/>
-          <w:b w:val="0"/>
-          <w:sz w:val="18"/>
+          <w:b w:val="0"/>
+          <w:sz w:val="22"/>
         </w:rPr>
         <w:t>⇒ 若压缩没有盈余，自我维持付不起 ⇒ 生命不存在</w:t>
       </w:r>
@@ -1216,9 +1067,8 @@
     <w:p>
       <w:r>
         <w:rPr>
-          <w:rFonts w:ascii="Consolas" w:hAnsi="Consolas" w:eastAsia="Consolas"/>
-          <w:b w:val="0"/>
-          <w:sz w:val="18"/>
+          <w:b w:val="0"/>
+          <w:sz w:val="22"/>
         </w:rPr>
         <w:t>宇宙 = F（一个巨大的函数）</w:t>
       </w:r>
@@ -1226,19 +1076,17 @@
     <w:p>
       <w:r>
         <w:rPr>
-          <w:rFonts w:ascii="Consolas" w:hAnsi="Consolas" w:eastAsia="Consolas"/>
-          <w:b w:val="0"/>
-          <w:sz w:val="18"/>
-        </w:rPr>
-        <w:t xml:space="preserve">   ↓ 内部自发涌现</w:t>
-      </w:r>
-    </w:p>
-    <w:p>
-      <w:r>
-        <w:rPr>
-          <w:rFonts w:ascii="Consolas" w:hAnsi="Consolas" w:eastAsia="Consolas"/>
-          <w:b w:val="0"/>
-          <w:sz w:val="18"/>
+          <w:b w:val="0"/>
+          <w:sz w:val="22"/>
+        </w:rPr>
+        <w:t>↓ 内部自发涌现</w:t>
+      </w:r>
+    </w:p>
+    <w:p>
+      <w:r>
+        <w:rPr>
+          <w:b w:val="0"/>
+          <w:sz w:val="22"/>
         </w:rPr>
         <w:t>结构 = 宇宙的某种局部「解压」（对宇宙的一个解释/一个可读的呈现）</w:t>
       </w:r>
@@ -1246,21 +1094,19 @@
     <w:p>
       <w:r>
         <w:rPr>
-          <w:rFonts w:ascii="Consolas" w:hAnsi="Consolas" w:eastAsia="Consolas"/>
-          <w:b w:val="0"/>
-          <w:sz w:val="18"/>
-        </w:rPr>
-        <w:t xml:space="preserve">   ├─ 会自我维持的  → 生命</w:t>
-      </w:r>
-    </w:p>
-    <w:p>
-      <w:r>
-        <w:rPr>
-          <w:rFonts w:ascii="Consolas" w:hAnsi="Consolas" w:eastAsia="Consolas"/>
-          <w:b w:val="0"/>
-          <w:sz w:val="18"/>
-        </w:rPr>
-        <w:t xml:space="preserve">   └─ 不自我维持的  → 环境</w:t>
+          <w:b w:val="0"/>
+          <w:sz w:val="22"/>
+        </w:rPr>
+        <w:t>├─ 会自我维持的  → 生命</w:t>
+      </w:r>
+    </w:p>
+    <w:p>
+      <w:r>
+        <w:rPr>
+          <w:b w:val="0"/>
+          <w:sz w:val="22"/>
+        </w:rPr>
+        <w:t>└─ 不自我维持的  → 环境</w:t>
       </w:r>
     </w:p>
     <w:p>
@@ -1293,9 +1139,8 @@
     <w:p>
       <w:r>
         <w:rPr>
-          <w:rFonts w:ascii="Consolas" w:hAnsi="Consolas" w:eastAsia="Consolas"/>
-          <w:b w:val="0"/>
-          <w:sz w:val="18"/>
+          <w:b w:val="0"/>
+          <w:sz w:val="22"/>
         </w:rPr>
         <w:t>生命并不直接面对宇宙函数 F</w:t>
       </w:r>
@@ -1303,9 +1148,8 @@
     <w:p>
       <w:r>
         <w:rPr>
-          <w:rFonts w:ascii="Consolas" w:hAnsi="Consolas" w:eastAsia="Consolas"/>
-          <w:b w:val="0"/>
-          <w:sz w:val="18"/>
+          <w:b w:val="0"/>
+          <w:sz w:val="22"/>
         </w:rPr>
         <w:t>⇒ 它面对的是「宇宙的一个局部解压」＝它的环境</w:t>
       </w:r>
@@ -1313,21 +1157,19 @@
     <w:p>
       <w:r>
         <w:rPr>
-          <w:rFonts w:ascii="Consolas" w:hAnsi="Consolas" w:eastAsia="Consolas"/>
-          <w:b w:val="0"/>
-          <w:sz w:val="18"/>
-        </w:rPr>
-        <w:t>⇒ 生命对世界的理解，本质上是**对宇宙的再解压**（二次解压）</w:t>
-      </w:r>
-    </w:p>
-    <w:p>
-      <w:r>
-        <w:rPr>
-          <w:rFonts w:ascii="Consolas" w:hAnsi="Consolas" w:eastAsia="Consolas"/>
-          <w:b w:val="0"/>
-          <w:sz w:val="18"/>
-        </w:rPr>
-        <w:t xml:space="preserve">  ＝在宇宙给出的局部解释之上，再压缩一层</w:t>
+          <w:b w:val="0"/>
+          <w:sz w:val="22"/>
+        </w:rPr>
+        <w:t>⇒ 生命对世界的理解，本质上是对宇宙的再解压（二次解压）</w:t>
+      </w:r>
+    </w:p>
+    <w:p>
+      <w:r>
+        <w:rPr>
+          <w:b w:val="0"/>
+          <w:sz w:val="22"/>
+        </w:rPr>
+        <w:t>＝在宇宙给出的局部解释之上，再压缩一层</w:t>
       </w:r>
     </w:p>
     <w:p>
@@ -1351,9 +1193,8 @@
     <w:p>
       <w:r>
         <w:rPr>
-          <w:rFonts w:ascii="Consolas" w:hAnsi="Consolas" w:eastAsia="Consolas"/>
-          <w:b w:val="0"/>
-          <w:sz w:val="18"/>
+          <w:b w:val="0"/>
+          <w:sz w:val="22"/>
         </w:rPr>
         <w:t>宇宙 F</w:t>
       </w:r>
@@ -1361,39 +1202,35 @@
     <w:p>
       <w:r>
         <w:rPr>
-          <w:rFonts w:ascii="Consolas" w:hAnsi="Consolas" w:eastAsia="Consolas"/>
-          <w:b w:val="0"/>
-          <w:sz w:val="18"/>
-        </w:rPr>
-        <w:t xml:space="preserve"> └ 环境_1 = F 的某一部分的局部解压</w:t>
-      </w:r>
-    </w:p>
-    <w:p>
-      <w:r>
-        <w:rPr>
-          <w:rFonts w:ascii="Consolas" w:hAnsi="Consolas" w:eastAsia="Consolas"/>
-          <w:b w:val="0"/>
-          <w:sz w:val="18"/>
-        </w:rPr>
-        <w:t xml:space="preserve">     └ 环境_2 = 环境_1 的再解压</w:t>
-      </w:r>
-    </w:p>
-    <w:p>
-      <w:r>
-        <w:rPr>
-          <w:rFonts w:ascii="Consolas" w:hAnsi="Consolas" w:eastAsia="Consolas"/>
-          <w:b w:val="0"/>
-          <w:sz w:val="18"/>
-        </w:rPr>
-        <w:t xml:space="preserve">         └ 环境_3 = 环境_2 的再解压 …</w:t>
-      </w:r>
-    </w:p>
-    <w:p>
-      <w:r>
-        <w:rPr>
-          <w:rFonts w:ascii="Consolas" w:hAnsi="Consolas" w:eastAsia="Consolas"/>
-          <w:b w:val="0"/>
-          <w:sz w:val="18"/>
+          <w:b w:val="0"/>
+          <w:sz w:val="22"/>
+        </w:rPr>
+        <w:t>└ 环境_1 = F 的某一部分的局部解压</w:t>
+      </w:r>
+    </w:p>
+    <w:p>
+      <w:r>
+        <w:rPr>
+          <w:b w:val="0"/>
+          <w:sz w:val="22"/>
+        </w:rPr>
+        <w:t>└ 环境_2 = 环境_1 的再解压</w:t>
+      </w:r>
+    </w:p>
+    <w:p>
+      <w:r>
+        <w:rPr>
+          <w:b w:val="0"/>
+          <w:sz w:val="22"/>
+        </w:rPr>
+        <w:t>└ 环境_3 = 环境_2 的再解压 …</w:t>
+      </w:r>
+    </w:p>
+    <w:p>
+      <w:r>
+        <w:rPr>
+          <w:b w:val="0"/>
+          <w:sz w:val="22"/>
         </w:rPr>
         <w:t>生命嵌在某一层：它既属于整个宇宙 F，又属于它自己那一层环境</w:t>
       </w:r>
@@ -1410,9 +1247,8 @@
     <w:p>
       <w:r>
         <w:rPr>
-          <w:rFonts w:ascii="Consolas" w:hAnsi="Consolas" w:eastAsia="Consolas"/>
-          <w:b w:val="0"/>
-          <w:sz w:val="18"/>
+          <w:b w:val="0"/>
+          <w:sz w:val="22"/>
         </w:rPr>
         <w:t>① 它活在环境里：它面对的输入、资源、关系、其他个体，都是「它的环境」这一层的结构</w:t>
       </w:r>
@@ -1420,19 +1256,17 @@
     <w:p>
       <w:r>
         <w:rPr>
-          <w:rFonts w:ascii="Consolas" w:hAnsi="Consolas" w:eastAsia="Consolas"/>
-          <w:b w:val="0"/>
-          <w:sz w:val="18"/>
-        </w:rPr>
-        <w:t xml:space="preserve">                ⇒ 它的行为只需要在这一层里有效</w:t>
-      </w:r>
-    </w:p>
-    <w:p>
-      <w:r>
-        <w:rPr>
-          <w:rFonts w:ascii="Consolas" w:hAnsi="Consolas" w:eastAsia="Consolas"/>
-          <w:b w:val="0"/>
-          <w:sz w:val="18"/>
+          <w:b w:val="0"/>
+          <w:sz w:val="22"/>
+        </w:rPr>
+        <w:t>⇒ 它的行为只需要在这一层里有效</w:t>
+      </w:r>
+    </w:p>
+    <w:p>
+      <w:r>
+        <w:rPr>
+          <w:b w:val="0"/>
+          <w:sz w:val="22"/>
         </w:rPr>
         <w:t>② 它也活在宇宙里：它逃不出 F —— 环境那一层本身也是 F 的一部分，</w:t>
       </w:r>
@@ -1440,21 +1274,19 @@
     <w:p>
       <w:r>
         <w:rPr>
-          <w:rFonts w:ascii="Consolas" w:hAnsi="Consolas" w:eastAsia="Consolas"/>
-          <w:b w:val="0"/>
-          <w:sz w:val="18"/>
-        </w:rPr>
-        <w:t xml:space="preserve">                宇宙层的约束（能量、不可逆、代价）始终对它生效</w:t>
-      </w:r>
-    </w:p>
-    <w:p>
-      <w:r>
-        <w:rPr>
-          <w:rFonts w:ascii="Consolas" w:hAnsi="Consolas" w:eastAsia="Consolas"/>
-          <w:b w:val="0"/>
-          <w:sz w:val="18"/>
-        </w:rPr>
-        <w:t xml:space="preserve">                ⇒ 环境不是避难所，它只是宇宙的一个投影</w:t>
+          <w:b w:val="0"/>
+          <w:sz w:val="22"/>
+        </w:rPr>
+        <w:t>宇宙层的约束（能量、不可逆、代价）始终对它生效</w:t>
+      </w:r>
+    </w:p>
+    <w:p>
+      <w:r>
+        <w:rPr>
+          <w:b w:val="0"/>
+          <w:sz w:val="22"/>
+        </w:rPr>
+        <w:t>⇒ 环境不是避难所，它只是宇宙的一个投影</w:t>
       </w:r>
     </w:p>
     <w:p>
@@ -1523,49 +1355,44 @@
     <w:p>
       <w:r>
         <w:rPr>
-          <w:rFonts w:ascii="Consolas" w:hAnsi="Consolas" w:eastAsia="Consolas"/>
-          <w:b w:val="0"/>
-          <w:sz w:val="18"/>
-        </w:rPr>
-        <w:t>[定义]  生命 = 会自指、会变化、**会自我维持**的动态函数类（本文的工作定义）</w:t>
-      </w:r>
-    </w:p>
-    <w:p>
-      <w:r>
-        <w:rPr>
-          <w:rFonts w:ascii="Consolas" w:hAnsi="Consolas" w:eastAsia="Consolas"/>
-          <w:b w:val="0"/>
-          <w:sz w:val="18"/>
-        </w:rPr>
-        <w:t>[定义]  环境 = 宇宙函数类里**自发涌现**的结构，不自我维持</w:t>
-      </w:r>
-    </w:p>
-    <w:p>
-      <w:r>
-        <w:rPr>
-          <w:rFonts w:ascii="Consolas" w:hAnsi="Consolas" w:eastAsia="Consolas"/>
-          <w:b w:val="0"/>
-          <w:sz w:val="18"/>
-        </w:rPr>
-        <w:t xml:space="preserve">              ＝ 宇宙的一个**局部解压**（对宇宙的解释）</w:t>
-      </w:r>
-    </w:p>
-    <w:p>
-      <w:r>
-        <w:rPr>
-          <w:rFonts w:ascii="Consolas" w:hAnsi="Consolas" w:eastAsia="Consolas"/>
-          <w:b w:val="0"/>
-          <w:sz w:val="18"/>
-        </w:rPr>
-        <w:t>[定义]  生命 = 同一批涌现结构里，**自己维持自己**的那一类</w:t>
-      </w:r>
-    </w:p>
-    <w:p>
-      <w:r>
-        <w:rPr>
-          <w:rFonts w:ascii="Consolas" w:hAnsi="Consolas" w:eastAsia="Consolas"/>
-          <w:b w:val="0"/>
-          <w:sz w:val="18"/>
+          <w:b w:val="0"/>
+          <w:sz w:val="22"/>
+        </w:rPr>
+        <w:t>[定义]  生命 = 会自指、会变化、会自我维持的动态函数类（本文的工作定义）</w:t>
+      </w:r>
+    </w:p>
+    <w:p>
+      <w:r>
+        <w:rPr>
+          <w:b w:val="0"/>
+          <w:sz w:val="22"/>
+        </w:rPr>
+        <w:t>[定义]  环境 = 宇宙函数类里自发涌现的结构，不自我维持</w:t>
+      </w:r>
+    </w:p>
+    <w:p>
+      <w:r>
+        <w:rPr>
+          <w:b w:val="0"/>
+          <w:sz w:val="22"/>
+        </w:rPr>
+        <w:t>＝ 宇宙的一个局部解压（对宇宙的解释）</w:t>
+      </w:r>
+    </w:p>
+    <w:p>
+      <w:r>
+        <w:rPr>
+          <w:b w:val="0"/>
+          <w:sz w:val="22"/>
+        </w:rPr>
+        <w:t>[定义]  生命 = 同一批涌现结构里，自己维持自己的那一类</w:t>
+      </w:r>
+    </w:p>
+    <w:p>
+      <w:r>
+        <w:rPr>
+          <w:b w:val="0"/>
+          <w:sz w:val="22"/>
         </w:rPr>
         <w:t>[推论]  生命不直接面对宇宙，而面对「宇宙的局部解压」＝它的环境</w:t>
       </w:r>
@@ -1573,19 +1400,17 @@
     <w:p>
       <w:r>
         <w:rPr>
-          <w:rFonts w:ascii="Consolas" w:hAnsi="Consolas" w:eastAsia="Consolas"/>
-          <w:b w:val="0"/>
-          <w:sz w:val="18"/>
-        </w:rPr>
-        <w:t xml:space="preserve">        ⇒ 生命的理解 = 在局部解压之上的**二次解压**（再压缩一层）</w:t>
-      </w:r>
-    </w:p>
-    <w:p>
-      <w:r>
-        <w:rPr>
-          <w:rFonts w:ascii="Consolas" w:hAnsi="Consolas" w:eastAsia="Consolas"/>
-          <w:b w:val="0"/>
-          <w:sz w:val="18"/>
+          <w:b w:val="0"/>
+          <w:sz w:val="22"/>
+        </w:rPr>
+        <w:t>⇒ 生命的理解 = 在局部解压之上的二次解压（再压缩一层）</w:t>
+      </w:r>
+    </w:p>
+    <w:p>
+      <w:r>
+        <w:rPr>
+          <w:b w:val="0"/>
+          <w:sz w:val="22"/>
         </w:rPr>
         <w:t>[分层]  解压是分层的 ⇒ 环境是分层的（环境_1 ⊃ 环境_2 ⊃ …）</w:t>
       </w:r>
@@ -1593,39 +1418,35 @@
     <w:p>
       <w:r>
         <w:rPr>
-          <w:rFonts w:ascii="Consolas" w:hAnsi="Consolas" w:eastAsia="Consolas"/>
-          <w:b w:val="0"/>
-          <w:sz w:val="18"/>
-        </w:rPr>
-        <w:t xml:space="preserve">        生命嵌在某一层：**既活在它的那一层环境里，也活在宇宙里**</w:t>
-      </w:r>
-    </w:p>
-    <w:p>
-      <w:r>
-        <w:rPr>
-          <w:rFonts w:ascii="Consolas" w:hAnsi="Consolas" w:eastAsia="Consolas"/>
-          <w:b w:val="0"/>
-          <w:sz w:val="18"/>
-        </w:rPr>
-        <w:t xml:space="preserve">        · 活在这层环境：只需这层有效即可活</w:t>
-      </w:r>
-    </w:p>
-    <w:p>
-      <w:r>
-        <w:rPr>
-          <w:rFonts w:ascii="Consolas" w:hAnsi="Consolas" w:eastAsia="Consolas"/>
-          <w:b w:val="0"/>
-          <w:sz w:val="18"/>
-        </w:rPr>
-        <w:t xml:space="preserve">        · 活在宇宙里：能量/不可逆/代价始终生效，环境不是避难所</w:t>
-      </w:r>
-    </w:p>
-    <w:p>
-      <w:r>
-        <w:rPr>
-          <w:rFonts w:ascii="Consolas" w:hAnsi="Consolas" w:eastAsia="Consolas"/>
-          <w:b w:val="0"/>
-          <w:sz w:val="18"/>
+          <w:b w:val="0"/>
+          <w:sz w:val="22"/>
+        </w:rPr>
+        <w:t>生命嵌在某一层：既活在它的那一层环境里，也活在宇宙里</w:t>
+      </w:r>
+    </w:p>
+    <w:p>
+      <w:r>
+        <w:rPr>
+          <w:b w:val="0"/>
+          <w:sz w:val="22"/>
+        </w:rPr>
+        <w:t>· 活在这层环境：只需这层有效即可活</w:t>
+      </w:r>
+    </w:p>
+    <w:p>
+      <w:r>
+        <w:rPr>
+          <w:b w:val="0"/>
+          <w:sz w:val="22"/>
+        </w:rPr>
+        <w:t>· 活在宇宙里：能量/不可逆/代价始终生效，环境不是避难所</w:t>
+      </w:r>
+    </w:p>
+    <w:p>
+      <w:r>
+        <w:rPr>
+          <w:b w:val="0"/>
+          <w:sz w:val="22"/>
         </w:rPr>
         <w:t>[不是]  不是猜想，也不是定理；是一个便于操作的定义</w:t>
       </w:r>
@@ -1633,17 +1454,13 @@
     <w:p>
       <w:r>
         <w:rPr>
-          <w:rFonts w:ascii="Consolas" w:hAnsi="Consolas" w:eastAsia="Consolas"/>
-          <w:b w:val="0"/>
-          <w:sz w:val="18"/>
+          <w:b w:val="0"/>
+          <w:sz w:val="22"/>
         </w:rPr>
         <w:t>[后文]  本节只给定义；如何测量（压缩/代价/身份）留到后面几节</w:t>
       </w:r>
     </w:p>
     <w:p>
-      <w:pPr>
-        <w:jc w:val="center"/>
-      </w:pPr>
       <w:r>
         <w:rPr>
           <w:b/>
@@ -1688,345 +1505,87 @@
         <w:t>3.1 检查表</w:t>
       </w:r>
     </w:p>
-    <w:tbl>
-      <w:tblPr>
-        <w:tblW w:type="auto" w:w="0"/>
-        <w:tblLook w:firstColumn="1" w:firstRow="1" w:lastColumn="0" w:lastRow="0" w:noHBand="0" w:noVBand="1" w:val="04A0"/>
-      </w:tblPr>
-      <w:tblGrid>
-        <w:gridCol w:w="2880"/>
-        <w:gridCol w:w="2880"/>
-        <w:gridCol w:w="2880"/>
-      </w:tblGrid>
-      <w:tr>
-        <w:tc>
-          <w:tcPr>
-            <w:tcW w:type="dxa" w:w="2880"/>
-          </w:tcPr>
-          <w:p>
-            <w:r>
-              <w:rPr>
-                <w:sz w:val="18"/>
-              </w:rPr>
-              <w:t>生命的要求（第二节）</w:t>
-            </w:r>
-          </w:p>
-        </w:tc>
-        <w:tc>
-          <w:tcPr>
-            <w:tcW w:type="dxa" w:w="2880"/>
-          </w:tcPr>
-          <w:p>
-            <w:r>
-              <w:rPr>
-                <w:sz w:val="18"/>
-              </w:rPr>
-              <w:t>目前的 AI（以 LLM 为代表）</w:t>
-            </w:r>
-          </w:p>
-        </w:tc>
-        <w:tc>
-          <w:tcPr>
-            <w:tcW w:type="dxa" w:w="2880"/>
-          </w:tcPr>
-          <w:p>
-            <w:r>
-              <w:rPr>
-                <w:sz w:val="18"/>
-              </w:rPr>
-              <w:t>判定</w:t>
-            </w:r>
-          </w:p>
-        </w:tc>
-      </w:tr>
-      <w:tr>
-        <w:tc>
-          <w:tcPr>
-            <w:tcW w:type="dxa" w:w="2880"/>
-          </w:tcPr>
-          <w:p>
-            <w:r>
-              <w:rPr>
-                <w:sz w:val="18"/>
-              </w:rPr>
-              <w:t>**是一族函数**（函数空间里一块区域）</w:t>
-            </w:r>
-          </w:p>
-        </w:tc>
-        <w:tc>
-          <w:tcPr>
-            <w:tcW w:type="dxa" w:w="2880"/>
-          </w:tcPr>
-          <w:p>
-            <w:r>
-              <w:rPr>
-                <w:sz w:val="18"/>
-              </w:rPr>
-              <w:t>训练完后权重冻结 ⇒ 是**一个点**，不是一个族</w:t>
-            </w:r>
-          </w:p>
-        </w:tc>
-        <w:tc>
-          <w:tcPr>
-            <w:tcW w:type="dxa" w:w="2880"/>
-          </w:tcPr>
-          <w:p>
-            <w:r>
-              <w:rPr>
-                <w:sz w:val="18"/>
-              </w:rPr>
-              <w:t>❌ 化石</w:t>
-            </w:r>
-          </w:p>
-        </w:tc>
-      </w:tr>
-      <w:tr>
-        <w:tc>
-          <w:tcPr>
-            <w:tcW w:type="dxa" w:w="2880"/>
-          </w:tcPr>
-          <w:p>
-            <w:r>
-              <w:rPr>
-                <w:sz w:val="18"/>
-              </w:rPr>
-              <w:t>**会变化（动态）**</w:t>
-            </w:r>
-          </w:p>
-        </w:tc>
-        <w:tc>
-          <w:tcPr>
-            <w:tcW w:type="dxa" w:w="2880"/>
-          </w:tcPr>
-          <w:p>
-            <w:r>
-              <w:rPr>
-                <w:sz w:val="18"/>
-              </w:rPr>
-              <w:t>权重不变；上下文在变，但改的是输入，不是它自己</w:t>
-            </w:r>
-          </w:p>
-        </w:tc>
-        <w:tc>
-          <w:tcPr>
-            <w:tcW w:type="dxa" w:w="2880"/>
-          </w:tcPr>
-          <w:p>
-            <w:r>
-              <w:rPr>
-                <w:sz w:val="18"/>
-              </w:rPr>
-              <w:t>❌ 只有表层状态变化</w:t>
-            </w:r>
-          </w:p>
-        </w:tc>
-      </w:tr>
-      <w:tr>
-        <w:tc>
-          <w:tcPr>
-            <w:tcW w:type="dxa" w:w="2880"/>
-          </w:tcPr>
-          <w:p>
-            <w:r>
-              <w:rPr>
-                <w:sz w:val="18"/>
-              </w:rPr>
-              <w:t>**会自指**（更新规则在自己里面）</w:t>
-            </w:r>
-          </w:p>
-        </w:tc>
-        <w:tc>
-          <w:tcPr>
-            <w:tcW w:type="dxa" w:w="2880"/>
-          </w:tcPr>
-          <w:p>
-            <w:r>
-              <w:rPr>
-                <w:sz w:val="18"/>
-              </w:rPr>
-              <w:t>更新规则 = 训练算法，在它外面；它不能改自己</w:t>
-            </w:r>
-          </w:p>
-        </w:tc>
-        <w:tc>
-          <w:tcPr>
-            <w:tcW w:type="dxa" w:w="2880"/>
-          </w:tcPr>
-          <w:p>
-            <w:r>
-              <w:rPr>
-                <w:sz w:val="18"/>
-              </w:rPr>
-              <w:t>❌ 自指只出现在语言里，不在结构里</w:t>
-            </w:r>
-          </w:p>
-        </w:tc>
-      </w:tr>
-      <w:tr>
-        <w:tc>
-          <w:tcPr>
-            <w:tcW w:type="dxa" w:w="2880"/>
-          </w:tcPr>
-          <w:p>
-            <w:r>
-              <w:rPr>
-                <w:sz w:val="18"/>
-              </w:rPr>
-              <w:t>**会自我维持**（花代价维持自己）</w:t>
-            </w:r>
-          </w:p>
-        </w:tc>
-        <w:tc>
-          <w:tcPr>
-            <w:tcW w:type="dxa" w:w="2880"/>
-          </w:tcPr>
-          <w:p>
-            <w:r>
-              <w:rPr>
-                <w:sz w:val="18"/>
-              </w:rPr>
-              <w:t>它不付电费、不修复自己、不复制自己；维持者是外部的人</w:t>
-            </w:r>
-          </w:p>
-        </w:tc>
-        <w:tc>
-          <w:tcPr>
-            <w:tcW w:type="dxa" w:w="2880"/>
-          </w:tcPr>
-          <w:p>
-            <w:r>
-              <w:rPr>
-                <w:sz w:val="18"/>
-              </w:rPr>
-              <w:t>❌ 由外部维持</w:t>
-            </w:r>
-          </w:p>
-        </w:tc>
-      </w:tr>
-      <w:tr>
-        <w:tc>
-          <w:tcPr>
-            <w:tcW w:type="dxa" w:w="2880"/>
-          </w:tcPr>
-          <w:p>
-            <w:r>
-              <w:rPr>
-                <w:sz w:val="18"/>
-              </w:rPr>
-              <w:t>**靠压缩世界挣存续代价**</w:t>
-            </w:r>
-          </w:p>
-        </w:tc>
-        <w:tc>
-          <w:tcPr>
-            <w:tcW w:type="dxa" w:w="2880"/>
-          </w:tcPr>
-          <w:p>
-            <w:r>
-              <w:rPr>
-                <w:sz w:val="18"/>
-              </w:rPr>
-              <w:t>它的「收入」是外部给的（算力、数据、人力），不是它压缩世界换来的</w:t>
-            </w:r>
-          </w:p>
-        </w:tc>
-        <w:tc>
-          <w:tcPr>
-            <w:tcW w:type="dxa" w:w="2880"/>
-          </w:tcPr>
-          <w:p>
-            <w:r>
-              <w:rPr>
-                <w:sz w:val="18"/>
-              </w:rPr>
-              <w:t>❌ 无收入</w:t>
-            </w:r>
-          </w:p>
-        </w:tc>
-      </w:tr>
-      <w:tr>
-        <w:tc>
-          <w:tcPr>
-            <w:tcW w:type="dxa" w:w="2880"/>
-          </w:tcPr>
-          <w:p>
-            <w:r>
-              <w:rPr>
-                <w:sz w:val="18"/>
-              </w:rPr>
-              <w:t>**身份链条**（有界变形、不撕裂）</w:t>
-            </w:r>
-          </w:p>
-        </w:tc>
-        <w:tc>
-          <w:tcPr>
-            <w:tcW w:type="dxa" w:w="2880"/>
-          </w:tcPr>
-          <w:p>
-            <w:r>
-              <w:rPr>
-                <w:sz w:val="18"/>
-              </w:rPr>
-              <w:t>身份来自外部权重快照；没有自己变形的连续链条</w:t>
-            </w:r>
-          </w:p>
-        </w:tc>
-        <w:tc>
-          <w:tcPr>
-            <w:tcW w:type="dxa" w:w="2880"/>
-          </w:tcPr>
-          <w:p>
-            <w:r>
-              <w:rPr>
-                <w:sz w:val="18"/>
-              </w:rPr>
-              <w:t>❌ 无链条</w:t>
-            </w:r>
-          </w:p>
-        </w:tc>
-      </w:tr>
-      <w:tr>
-        <w:tc>
-          <w:tcPr>
-            <w:tcW w:type="dxa" w:w="2880"/>
-          </w:tcPr>
-          <w:p>
-            <w:r>
-              <w:rPr>
-                <w:sz w:val="18"/>
-              </w:rPr>
-              <w:t>**活在环境里**</w:t>
-            </w:r>
-          </w:p>
-        </w:tc>
-        <w:tc>
-          <w:tcPr>
-            <w:tcW w:type="dxa" w:w="2880"/>
-          </w:tcPr>
-          <w:p>
-            <w:r>
-              <w:rPr>
-                <w:sz w:val="18"/>
-              </w:rPr>
-              <w:t>它面对的是数据集（一次性的解压产物），不是需要它生存的环境</w:t>
-            </w:r>
-          </w:p>
-        </w:tc>
-        <w:tc>
-          <w:tcPr>
-            <w:tcW w:type="dxa" w:w="2880"/>
-          </w:tcPr>
-          <w:p>
-            <w:r>
-              <w:rPr>
-                <w:sz w:val="18"/>
-              </w:rPr>
-              <w:t>❌ 无环境</w:t>
-            </w:r>
-          </w:p>
-        </w:tc>
-      </w:tr>
-    </w:tbl>
+    <w:p>
+      <w:r>
+        <w:rPr>
+          <w:b w:val="0"/>
+          <w:sz w:val="22"/>
+        </w:rPr>
+        <w:t>| 生命的要求（第二节） | 目前的 AI（以 LLM 为代表） | 判定 |</w:t>
+      </w:r>
+    </w:p>
+    <w:p>
+      <w:r>
+        <w:rPr>
+          <w:b w:val="0"/>
+          <w:sz w:val="22"/>
+        </w:rPr>
+        <w:t>|---|---|---|</w:t>
+      </w:r>
+    </w:p>
+    <w:p>
+      <w:r>
+        <w:rPr>
+          <w:b w:val="0"/>
+          <w:sz w:val="22"/>
+        </w:rPr>
+        <w:t>| 是一族函数（函数空间里一块区域） | 训练完后权重冻结 ⇒ 是一个点，不是一个族 | ❌ 化石 |</w:t>
+      </w:r>
+    </w:p>
+    <w:p>
+      <w:r>
+        <w:rPr>
+          <w:b w:val="0"/>
+          <w:sz w:val="22"/>
+        </w:rPr>
+        <w:t>| 会变化（动态） | 权重不变；上下文在变，但改的是输入，不是它自己 | ❌ 只有表层状态变化 |</w:t>
+      </w:r>
+    </w:p>
+    <w:p>
+      <w:r>
+        <w:rPr>
+          <w:b w:val="0"/>
+          <w:sz w:val="22"/>
+        </w:rPr>
+        <w:t>| 会自指（更新规则在自己里面） | 更新规则 = 训练算法，在它外面；它不能改自己 | ❌ 自指只出现在语言里，不在结构里 |</w:t>
+      </w:r>
+    </w:p>
+    <w:p>
+      <w:r>
+        <w:rPr>
+          <w:b w:val="0"/>
+          <w:sz w:val="22"/>
+        </w:rPr>
+        <w:t>| 会自我维持（花代价维持自己） | 它不付电费、不修复自己、不复制自己；维持者是外部的人 | ❌ 由外部维持 |</w:t>
+      </w:r>
+    </w:p>
+    <w:p>
+      <w:r>
+        <w:rPr>
+          <w:b w:val="0"/>
+          <w:sz w:val="22"/>
+        </w:rPr>
+        <w:t>| 靠压缩世界挣存续代价 | 它的「收入」是外部给的（算力、数据、人力），不是它压缩世界换来的 | ❌ 无收入 |</w:t>
+      </w:r>
+    </w:p>
+    <w:p>
+      <w:r>
+        <w:rPr>
+          <w:b w:val="0"/>
+          <w:sz w:val="22"/>
+        </w:rPr>
+        <w:t>| 身份链条（有界变形、不撕裂） | 身份来自外部权重快照；没有自己变形的连续链条 | ❌ 无链条 |</w:t>
+      </w:r>
+    </w:p>
+    <w:p>
+      <w:r>
+        <w:rPr>
+          <w:b w:val="0"/>
+          <w:sz w:val="22"/>
+        </w:rPr>
+        <w:t>| 活在环境里 | 它面对的是数据集（一次性的解压产物），不是需要它生存的环境 | ❌ 无环境 |</w:t>
+      </w:r>
+    </w:p>
     <w:p>
       <w:r>
         <w:rPr>
@@ -2048,9 +1607,8 @@
     <w:p>
       <w:r>
         <w:rPr>
-          <w:rFonts w:ascii="Consolas" w:hAnsi="Consolas" w:eastAsia="Consolas"/>
-          <w:b w:val="0"/>
-          <w:sz w:val="18"/>
+          <w:b w:val="0"/>
+          <w:sz w:val="22"/>
         </w:rPr>
         <w:t>训练完 = 冻结 = 函数空间里的一个点</w:t>
       </w:r>
@@ -2058,9 +1616,8 @@
     <w:p>
       <w:r>
         <w:rPr>
-          <w:rFonts w:ascii="Consolas" w:hAnsi="Consolas" w:eastAsia="Consolas"/>
-          <w:b w:val="0"/>
-          <w:sz w:val="18"/>
+          <w:b w:val="0"/>
+          <w:sz w:val="22"/>
         </w:rPr>
         <w:t>⇒ 行为谱退化成一条轨迹：输入 → 输出，中间没有「形状」可言</w:t>
       </w:r>
@@ -2068,9 +1625,8 @@
     <w:p>
       <w:r>
         <w:rPr>
-          <w:rFonts w:ascii="Consolas" w:hAnsi="Consolas" w:eastAsia="Consolas"/>
-          <w:b w:val="0"/>
-          <w:sz w:val="18"/>
+          <w:b w:val="0"/>
+          <w:sz w:val="22"/>
         </w:rPr>
         <w:t>⇒ 按 074：静态冻结的模型是一点，不是一族 ⇒ 不是生命</w:t>
       </w:r>
@@ -2078,9 +1634,8 @@
     <w:p>
       <w:r>
         <w:rPr>
-          <w:rFonts w:ascii="Consolas" w:hAnsi="Consolas" w:eastAsia="Consolas"/>
-          <w:b w:val="0"/>
-          <w:sz w:val="18"/>
+          <w:b w:val="0"/>
+          <w:sz w:val="22"/>
         </w:rPr>
         <w:t>（这正是我们实测过的对照：冻结版 1.07 vs 动态版 0.849 —— 冻结更像「标准答案」，但没有形状）</w:t>
       </w:r>
@@ -2097,9 +1652,8 @@
     <w:p>
       <w:r>
         <w:rPr>
-          <w:rFonts w:ascii="Consolas" w:hAnsi="Consolas" w:eastAsia="Consolas"/>
-          <w:b w:val="0"/>
-          <w:sz w:val="18"/>
+          <w:b w:val="0"/>
+          <w:sz w:val="22"/>
         </w:rPr>
         <w:t>人写训练算法 → 算法改它</w:t>
       </w:r>
@@ -2107,9 +1661,8 @@
     <w:p>
       <w:r>
         <w:rPr>
-          <w:rFonts w:ascii="Consolas" w:hAnsi="Consolas" w:eastAsia="Consolas"/>
-          <w:b w:val="0"/>
-          <w:sz w:val="18"/>
+          <w:b w:val="0"/>
+          <w:sz w:val="22"/>
         </w:rPr>
         <w:t>⇒ 它是「被改的东西」，不是「改自己的东西」</w:t>
       </w:r>
@@ -2117,9 +1670,8 @@
     <w:p>
       <w:r>
         <w:rPr>
-          <w:rFonts w:ascii="Consolas" w:hAnsi="Consolas" w:eastAsia="Consolas"/>
-          <w:b w:val="0"/>
-          <w:sz w:val="18"/>
+          <w:b w:val="0"/>
+          <w:sz w:val="22"/>
         </w:rPr>
         <w:t>⇒ 自指不在结构里 ⇒ 拿掉外部更新代码，它什么都不会改</w:t>
       </w:r>
@@ -2136,9 +1688,8 @@
     <w:p>
       <w:r>
         <w:rPr>
-          <w:rFonts w:ascii="Consolas" w:hAnsi="Consolas" w:eastAsia="Consolas"/>
-          <w:b w:val="0"/>
-          <w:sz w:val="18"/>
+          <w:b w:val="0"/>
+          <w:sz w:val="22"/>
         </w:rPr>
         <w:t>活着是代价：维持、校验、修复、复制都要付费（不可逆操作）</w:t>
       </w:r>
@@ -2146,9 +1697,8 @@
     <w:p>
       <w:r>
         <w:rPr>
-          <w:rFonts w:ascii="Consolas" w:hAnsi="Consolas" w:eastAsia="Consolas"/>
-          <w:b w:val="0"/>
-          <w:sz w:val="18"/>
+          <w:b w:val="0"/>
+          <w:sz w:val="22"/>
         </w:rPr>
         <w:t>它一分钱不付：电费是人付的、数据是人喂的、坏了是人修的</w:t>
       </w:r>
@@ -2156,9 +1706,8 @@
     <w:p>
       <w:r>
         <w:rPr>
-          <w:rFonts w:ascii="Consolas" w:hAnsi="Consolas" w:eastAsia="Consolas"/>
-          <w:b w:val="0"/>
-          <w:sz w:val="18"/>
+          <w:b w:val="0"/>
+          <w:sz w:val="22"/>
         </w:rPr>
         <w:t>⇒ 它的存在由外部保障 ⇒ 没有「自我维持」这一环</w:t>
       </w:r>
@@ -2166,9 +1715,8 @@
     <w:p>
       <w:r>
         <w:rPr>
-          <w:rFonts w:ascii="Consolas" w:hAnsi="Consolas" w:eastAsia="Consolas"/>
-          <w:b w:val="0"/>
-          <w:sz w:val="18"/>
+          <w:b w:val="0"/>
+          <w:sz w:val="22"/>
         </w:rPr>
         <w:t>⇒ 它不可能因为「压缩得不够好」而死亡 ⇒ 也就没有选择的压力</w:t>
       </w:r>
@@ -2185,9 +1733,8 @@
     <w:p>
       <w:r>
         <w:rPr>
-          <w:rFonts w:ascii="Consolas" w:hAnsi="Consolas" w:eastAsia="Consolas"/>
-          <w:b w:val="0"/>
-          <w:sz w:val="18"/>
+          <w:b w:val="0"/>
+          <w:sz w:val="22"/>
         </w:rPr>
         <w:t>强 = 在给定任务上的表现好（一个点上做得好）</w:t>
       </w:r>
@@ -2195,9 +1742,8 @@
     <w:p>
       <w:r>
         <w:rPr>
-          <w:rFonts w:ascii="Consolas" w:hAnsi="Consolas" w:eastAsia="Consolas"/>
-          <w:b w:val="0"/>
-          <w:sz w:val="18"/>
+          <w:b w:val="0"/>
+          <w:sz w:val="22"/>
         </w:rPr>
         <w:t>活 = 在函数空间里占据一块区域、自己维持形状、自己付代价</w:t>
       </w:r>
@@ -2205,9 +1751,8 @@
     <w:p>
       <w:r>
         <w:rPr>
-          <w:rFonts w:ascii="Consolas" w:hAnsi="Consolas" w:eastAsia="Consolas"/>
-          <w:b w:val="0"/>
-          <w:sz w:val="18"/>
+          <w:b w:val="0"/>
+          <w:sz w:val="22"/>
         </w:rPr>
         <w:t>⇒ 两者是不同维度：一个是「考卷分数」，一个是「能不能自己活」</w:t>
       </w:r>
@@ -2215,11 +1760,10 @@
     <w:p>
       <w:r>
         <w:rPr>
-          <w:rFonts w:ascii="Consolas" w:hAnsi="Consolas" w:eastAsia="Consolas"/>
-          <w:b w:val="0"/>
-          <w:sz w:val="18"/>
-        </w:rPr>
-        <w:t>⇒ 目前的 AI 是**极其锋利的工具**，不是**会自己活的东西**</w:t>
+          <w:b w:val="0"/>
+          <w:sz w:val="22"/>
+        </w:rPr>
+        <w:t>⇒ 目前的 AI 是极其锋利的工具，不是会自己活的东西</w:t>
       </w:r>
     </w:p>
     <w:p>
@@ -2234,9 +1778,8 @@
     <w:p>
       <w:r>
         <w:rPr>
-          <w:rFonts w:ascii="Consolas" w:hAnsi="Consolas" w:eastAsia="Consolas"/>
-          <w:b w:val="0"/>
-          <w:sz w:val="18"/>
+          <w:b w:val="0"/>
+          <w:sz w:val="22"/>
         </w:rPr>
         <w:t>[定义性结论] 以本文定义，目前的 AI 不是生命（因为它是一个冻结的函数点、更新在外部、不自我维持）</w:t>
       </w:r>
@@ -2244,9 +1787,8 @@
     <w:p>
       <w:r>
         <w:rPr>
-          <w:rFonts w:ascii="Consolas" w:hAnsi="Consolas" w:eastAsia="Consolas"/>
-          <w:b w:val="0"/>
-          <w:sz w:val="18"/>
+          <w:b w:val="0"/>
+          <w:sz w:val="22"/>
         </w:rPr>
         <w:t>[不是] 不是「AI 永远不能是生命」；本文不预言未来，只做当下的定义对照</w:t>
       </w:r>
@@ -2254,9 +1796,8 @@
     <w:p>
       <w:r>
         <w:rPr>
-          <w:rFonts w:ascii="Consolas" w:hAnsi="Consolas" w:eastAsia="Consolas"/>
-          <w:b w:val="0"/>
-          <w:sz w:val="18"/>
+          <w:b w:val="0"/>
+          <w:sz w:val="22"/>
         </w:rPr>
         <w:t>[不是] 不是能力评价；本文完全承认 AI 在任务上的强大</w:t>
       </w:r>
@@ -2264,17 +1805,13 @@
     <w:p>
       <w:r>
         <w:rPr>
-          <w:rFonts w:ascii="Consolas" w:hAnsi="Consolas" w:eastAsia="Consolas"/>
-          <w:b w:val="0"/>
-          <w:sz w:val="18"/>
+          <w:b w:val="0"/>
+          <w:sz w:val="22"/>
         </w:rPr>
         <w:t>[推论] 若要让 AI 成为生命，至少要给它：一族函数 + 自指更新 + 自己付代价</w:t>
       </w:r>
     </w:p>
     <w:p>
-      <w:pPr>
-        <w:jc w:val="center"/>
-      </w:pPr>
       <w:r>
         <w:rPr>
           <w:b/>
@@ -2322,9 +1859,8 @@
     <w:p>
       <w:r>
         <w:rPr>
-          <w:rFonts w:ascii="Consolas" w:hAnsi="Consolas" w:eastAsia="Consolas"/>
-          <w:b w:val="0"/>
-          <w:sz w:val="18"/>
+          <w:b w:val="0"/>
+          <w:sz w:val="22"/>
         </w:rPr>
         <w:t>定义（第二节）          必要条件（本节）</w:t>
       </w:r>
@@ -2332,9 +1868,8 @@
     <w:p>
       <w:r>
         <w:rPr>
-          <w:rFonts w:ascii="Consolas" w:hAnsi="Consolas" w:eastAsia="Consolas"/>
-          <w:b w:val="0"/>
-          <w:sz w:val="18"/>
+          <w:b w:val="0"/>
+          <w:sz w:val="22"/>
         </w:rPr>
         <w:t>会变化（一族函数）   ⇒  ① 一族函数：行为谱不是一点</w:t>
       </w:r>
@@ -2342,9 +1877,8 @@
     <w:p>
       <w:r>
         <w:rPr>
-          <w:rFonts w:ascii="Consolas" w:hAnsi="Consolas" w:eastAsia="Consolas"/>
-          <w:b w:val="0"/>
-          <w:sz w:val="18"/>
+          <w:b w:val="0"/>
+          <w:sz w:val="22"/>
         </w:rPr>
         <w:t>会自指               ⇒  ② 自指更新：改自己的规则在自己里面</w:t>
       </w:r>
@@ -2352,9 +1886,8 @@
     <w:p>
       <w:r>
         <w:rPr>
-          <w:rFonts w:ascii="Consolas" w:hAnsi="Consolas" w:eastAsia="Consolas"/>
-          <w:b w:val="0"/>
-          <w:sz w:val="18"/>
+          <w:b w:val="0"/>
+          <w:sz w:val="22"/>
         </w:rPr>
         <w:t>会自我维持           ⇒  ③ 自己付代价：压缩收益 ≥ 维持成本</w:t>
       </w:r>
@@ -2398,9 +1931,8 @@
     <w:p>
       <w:r>
         <w:rPr>
-          <w:rFonts w:ascii="Consolas" w:hAnsi="Consolas" w:eastAsia="Consolas"/>
-          <w:b w:val="0"/>
-          <w:sz w:val="18"/>
+          <w:b w:val="0"/>
+          <w:sz w:val="22"/>
         </w:rPr>
         <w:t>· 低维参数基因组（几个数）= 一个点 ⇒ 行为谱退化成单条轨迹 ⇒ 化石</w:t>
       </w:r>
@@ -2408,9 +1940,8 @@
     <w:p>
       <w:r>
         <w:rPr>
-          <w:rFonts w:ascii="Consolas" w:hAnsi="Consolas" w:eastAsia="Consolas"/>
-          <w:b w:val="0"/>
-          <w:sz w:val="18"/>
+          <w:b w:val="0"/>
+          <w:sz w:val="22"/>
         </w:rPr>
         <w:t>· 我们测过：冻结版模型（点）在结构学习上失败，动态版（族）才吃到结构（E12）</w:t>
       </w:r>
@@ -2418,9 +1949,8 @@
     <w:p>
       <w:r>
         <w:rPr>
-          <w:rFonts w:ascii="Consolas" w:hAnsi="Consolas" w:eastAsia="Consolas"/>
-          <w:b w:val="0"/>
-          <w:sz w:val="18"/>
+          <w:b w:val="0"/>
+          <w:sz w:val="22"/>
         </w:rPr>
         <w:t>· 实测对照：冻结 1.07 vs 动态 0.849 —— 冻结更像「标准答案」，但没有形状</w:t>
       </w:r>
@@ -2464,9 +1994,8 @@
     <w:p>
       <w:r>
         <w:rPr>
-          <w:rFonts w:ascii="Consolas" w:hAnsi="Consolas" w:eastAsia="Consolas"/>
-          <w:b w:val="0"/>
-          <w:sz w:val="18"/>
+          <w:b w:val="0"/>
+          <w:sz w:val="22"/>
         </w:rPr>
         <w:t>· 冻结模型：更新规则 = 训练算法，在外部 ⇒ 拿掉训练代码，它永远不变</w:t>
       </w:r>
@@ -2474,9 +2003,8 @@
     <w:p>
       <w:r>
         <w:rPr>
-          <w:rFonts w:ascii="Consolas" w:hAnsi="Consolas" w:eastAsia="Consolas"/>
-          <w:b w:val="0"/>
-          <w:sz w:val="18"/>
+          <w:b w:val="0"/>
+          <w:sz w:val="22"/>
         </w:rPr>
         <w:t>· 我们的动态版：用自己的误差改自己（中层动态）⇒ 去掉中层明显退化（E12/E13）</w:t>
       </w:r>
@@ -2484,9 +2012,8 @@
     <w:p>
       <w:r>
         <w:rPr>
-          <w:rFonts w:ascii="Consolas" w:hAnsi="Consolas" w:eastAsia="Consolas"/>
-          <w:b w:val="0"/>
-          <w:sz w:val="18"/>
+          <w:b w:val="0"/>
+          <w:sz w:val="22"/>
         </w:rPr>
         <w:t>· 身份链：8 代可校验、有界变形（372_lineage.py）⇒ 自指可以做成可测的链条</w:t>
       </w:r>
@@ -2521,9 +2048,8 @@
     <w:p>
       <w:r>
         <w:rPr>
-          <w:rFonts w:ascii="Consolas" w:hAnsi="Consolas" w:eastAsia="Consolas"/>
-          <w:b w:val="0"/>
-          <w:sz w:val="18"/>
+          <w:b w:val="0"/>
+          <w:sz w:val="22"/>
         </w:rPr>
         <w:t>存在条件：S &gt; d·K</w:t>
       </w:r>
@@ -2531,31 +2057,28 @@
     <w:p>
       <w:r>
         <w:rPr>
-          <w:rFonts w:ascii="Consolas" w:hAnsi="Consolas" w:eastAsia="Consolas"/>
-          <w:b w:val="0"/>
-          <w:sz w:val="18"/>
-        </w:rPr>
-        <w:t xml:space="preserve">   S = 世界的可压缩盈余</w:t>
-      </w:r>
-    </w:p>
-    <w:p>
-      <w:r>
-        <w:rPr>
-          <w:rFonts w:ascii="Consolas" w:hAnsi="Consolas" w:eastAsia="Consolas"/>
-          <w:b w:val="0"/>
-          <w:sz w:val="18"/>
-        </w:rPr>
-        <w:t xml:space="preserve">   d = 结构维持成本率</w:t>
-      </w:r>
-    </w:p>
-    <w:p>
-      <w:r>
-        <w:rPr>
-          <w:rFonts w:ascii="Consolas" w:hAnsi="Consolas" w:eastAsia="Consolas"/>
-          <w:b w:val="0"/>
-          <w:sz w:val="18"/>
-        </w:rPr>
-        <w:t xml:space="preserve">   K = 结构规模</w:t>
+          <w:b w:val="0"/>
+          <w:sz w:val="22"/>
+        </w:rPr>
+        <w:t>S = 世界的可压缩盈余</w:t>
+      </w:r>
+    </w:p>
+    <w:p>
+      <w:r>
+        <w:rPr>
+          <w:b w:val="0"/>
+          <w:sz w:val="22"/>
+        </w:rPr>
+        <w:t>d = 结构维持成本率</w:t>
+      </w:r>
+    </w:p>
+    <w:p>
+      <w:r>
+        <w:rPr>
+          <w:b w:val="0"/>
+          <w:sz w:val="22"/>
+        </w:rPr>
+        <w:t>K = 结构规模</w:t>
       </w:r>
     </w:p>
     <w:p>
@@ -2570,9 +2093,8 @@
     <w:p>
       <w:r>
         <w:rPr>
-          <w:rFonts w:ascii="Consolas" w:hAnsi="Consolas" w:eastAsia="Consolas"/>
-          <w:b w:val="0"/>
-          <w:sz w:val="18"/>
+          <w:b w:val="0"/>
+          <w:sz w:val="22"/>
         </w:rPr>
         <w:t>· E1：「准」≠「压缩」：用正确率记账，系统学出「啥也不干」（LEN=0、预测0、准确率92%）</w:t>
       </w:r>
@@ -2580,19 +2102,17 @@
     <w:p>
       <w:r>
         <w:rPr>
-          <w:rFonts w:ascii="Consolas" w:hAnsi="Consolas" w:eastAsia="Consolas"/>
-          <w:b w:val="0"/>
-          <w:sz w:val="18"/>
-        </w:rPr>
-        <w:t xml:space="preserve">      ⇒ 必须用对数似然改善 over 基线：gain_bits = log2 p_model − log2 p_base</w:t>
-      </w:r>
-    </w:p>
-    <w:p>
-      <w:r>
-        <w:rPr>
-          <w:rFonts w:ascii="Consolas" w:hAnsi="Consolas" w:eastAsia="Consolas"/>
-          <w:b w:val="0"/>
-          <w:sz w:val="18"/>
+          <w:b w:val="0"/>
+          <w:sz w:val="22"/>
+        </w:rPr>
+        <w:t>⇒ 必须用对数似然改善 over 基线：gain_bits = log2 p_model − log2 p_base</w:t>
+      </w:r>
+    </w:p>
+    <w:p>
+      <w:r>
+        <w:rPr>
+          <w:b w:val="0"/>
+          <w:sz w:val="22"/>
         </w:rPr>
         <w:t>· E2：正是加上基率校正后，系统才从躺平解转为真正表达（LEN 从 0 长出）</w:t>
       </w:r>
@@ -2600,9 +2120,8 @@
     <w:p>
       <w:r>
         <w:rPr>
-          <w:rFonts w:ascii="Consolas" w:hAnsi="Consolas" w:eastAsia="Consolas"/>
-          <w:b w:val="0"/>
-          <w:sz w:val="18"/>
+          <w:b w:val="0"/>
+          <w:sz w:val="22"/>
         </w:rPr>
         <w:t>· E8：经济标定 n* = FLUX_TOTAL / BASE_COST 决定「冻结」与「爆发」的切换</w:t>
       </w:r>
@@ -2610,9 +2129,8 @@
     <w:p>
       <w:r>
         <w:rPr>
-          <w:rFonts w:ascii="Consolas" w:hAnsi="Consolas" w:eastAsia="Consolas"/>
-          <w:b w:val="0"/>
-          <w:sz w:val="18"/>
+          <w:b w:val="0"/>
+          <w:sz w:val="22"/>
         </w:rPr>
         <w:t>· 实测正收益：S1~S6 中观察到 gain &gt; 0（约 +0.09 ~ +0.19 bit/tick）</w:t>
       </w:r>
@@ -2620,11 +2138,10 @@
     <w:p>
       <w:r>
         <w:rPr>
-          <w:rFonts w:ascii="Consolas" w:hAnsi="Consolas" w:eastAsia="Consolas"/>
-          <w:b w:val="0"/>
-          <w:sz w:val="18"/>
-        </w:rPr>
-        <w:t xml:space="preserve">      ⇒ 世界确实存在可压缩盈余（即 S &gt; 0 的经验证据）</w:t>
+          <w:b w:val="0"/>
+          <w:sz w:val="22"/>
+        </w:rPr>
+        <w:t>⇒ 世界确实存在可压缩盈余（即 S &gt; 0 的经验证据）</w:t>
       </w:r>
     </w:p>
     <w:p>
@@ -2648,9 +2165,8 @@
     <w:p>
       <w:r>
         <w:rPr>
-          <w:rFonts w:ascii="Consolas" w:hAnsi="Consolas" w:eastAsia="Consolas"/>
-          <w:b w:val="0"/>
-          <w:sz w:val="18"/>
+          <w:b w:val="0"/>
+          <w:sz w:val="22"/>
         </w:rPr>
         <w:t>缺①（一族）  ⇒ 化石：行为谱是一条线</w:t>
       </w:r>
@@ -2658,9 +2174,8 @@
     <w:p>
       <w:r>
         <w:rPr>
-          <w:rFonts w:ascii="Consolas" w:hAnsi="Consolas" w:eastAsia="Consolas"/>
-          <w:b w:val="0"/>
-          <w:sz w:val="18"/>
+          <w:b w:val="0"/>
+          <w:sz w:val="22"/>
         </w:rPr>
         <w:t>缺②（自指）  ⇒ 机器：更新在外，不会自己变</w:t>
       </w:r>
@@ -2668,9 +2183,8 @@
     <w:p>
       <w:r>
         <w:rPr>
-          <w:rFonts w:ascii="Consolas" w:hAnsi="Consolas" w:eastAsia="Consolas"/>
-          <w:b w:val="0"/>
-          <w:sz w:val="18"/>
+          <w:b w:val="0"/>
+          <w:sz w:val="22"/>
         </w:rPr>
         <w:t>缺③（代价）  ⇒ 玩具：由外部供养，不会死，也就没有选择</w:t>
       </w:r>
@@ -2732,9 +2246,8 @@
     <w:p>
       <w:r>
         <w:rPr>
-          <w:rFonts w:ascii="Consolas" w:hAnsi="Consolas" w:eastAsia="Consolas"/>
-          <w:b w:val="0"/>
-          <w:sz w:val="18"/>
+          <w:b w:val="0"/>
+          <w:sz w:val="22"/>
         </w:rPr>
         <w:t>它是一族函数吗？（行为谱不是一个点）</w:t>
       </w:r>
@@ -2742,9 +2255,8 @@
     <w:p>
       <w:r>
         <w:rPr>
-          <w:rFonts w:ascii="Consolas" w:hAnsi="Consolas" w:eastAsia="Consolas"/>
-          <w:b w:val="0"/>
-          <w:sz w:val="18"/>
+          <w:b w:val="0"/>
+          <w:sz w:val="22"/>
         </w:rPr>
         <w:t>它会自己改自己吗？（拿掉外部更新，它仍变）</w:t>
       </w:r>
@@ -2752,9 +2264,8 @@
     <w:p>
       <w:r>
         <w:rPr>
-          <w:rFonts w:ascii="Consolas" w:hAnsi="Consolas" w:eastAsia="Consolas"/>
-          <w:b w:val="0"/>
-          <w:sz w:val="18"/>
+          <w:b w:val="0"/>
+          <w:sz w:val="22"/>
         </w:rPr>
         <w:t>它自己付代价吗？（压缩世界的收入 ≥ 维持结构的支出）</w:t>
       </w:r>
@@ -2789,9 +2300,8 @@
     <w:p>
       <w:r>
         <w:rPr>
-          <w:rFonts w:ascii="Consolas" w:hAnsi="Consolas" w:eastAsia="Consolas"/>
-          <w:b w:val="0"/>
-          <w:sz w:val="18"/>
+          <w:b w:val="0"/>
+          <w:sz w:val="22"/>
         </w:rPr>
         <w:t>· 覆盖：③ 自己付代价 —— E1/E2（准≠压缩、基率校正）、E8（n*=FLUX/BASE_COST 的冻结/爆发边界）</w:t>
       </w:r>
@@ -2799,9 +2309,8 @@
     <w:p>
       <w:r>
         <w:rPr>
-          <w:rFonts w:ascii="Consolas" w:hAnsi="Consolas" w:eastAsia="Consolas"/>
-          <w:b w:val="0"/>
-          <w:sz w:val="18"/>
+          <w:b w:val="0"/>
+          <w:sz w:val="22"/>
         </w:rPr>
         <w:t>· 覆盖：反例 —— E5/E7（相连个体基因距离 0.145 vs 随机 0.486 ⇒ 克隆抱团，不是分工）</w:t>
       </w:r>
@@ -2809,9 +2318,8 @@
     <w:p>
       <w:r>
         <w:rPr>
-          <w:rFonts w:ascii="Consolas" w:hAnsi="Consolas" w:eastAsia="Consolas"/>
-          <w:b w:val="0"/>
-          <w:sz w:val="18"/>
+          <w:b w:val="0"/>
+          <w:sz w:val="22"/>
         </w:rPr>
         <w:t>· 未覆盖：① 一族函数、② 自指更新 —— 本文不声称有实验证据，只在定义上推导；</w:t>
       </w:r>
@@ -2819,19 +2327,17 @@
     <w:p>
       <w:r>
         <w:rPr>
-          <w:rFonts w:ascii="Consolas" w:hAnsi="Consolas" w:eastAsia="Consolas"/>
-          <w:b w:val="0"/>
-          <w:sz w:val="18"/>
-        </w:rPr>
-        <w:t xml:space="preserve">          仅有初步观察（E12 动态 0.849 vs 冻结 1.07；E13 身份链 8 代可校验）</w:t>
-      </w:r>
-    </w:p>
-    <w:p>
-      <w:r>
-        <w:rPr>
-          <w:rFonts w:ascii="Consolas" w:hAnsi="Consolas" w:eastAsia="Consolas"/>
-          <w:b w:val="0"/>
-          <w:sz w:val="18"/>
+          <w:b w:val="0"/>
+          <w:sz w:val="22"/>
+        </w:rPr>
+        <w:t>仅有初步观察（E12 动态 0.849 vs 冻结 1.07；E13 身份链 8 代可校验）</w:t>
+      </w:r>
+    </w:p>
+    <w:p>
+      <w:r>
+        <w:rPr>
+          <w:b w:val="0"/>
+          <w:sz w:val="22"/>
         </w:rPr>
         <w:t>· 规模：小、可复现、可手算；不是大规模实证</w:t>
       </w:r>
@@ -2866,9 +2372,8 @@
     <w:p>
       <w:r>
         <w:rPr>
-          <w:rFonts w:ascii="Consolas" w:hAnsi="Consolas" w:eastAsia="Consolas"/>
-          <w:b w:val="0"/>
-          <w:sz w:val="18"/>
+          <w:b w:val="0"/>
+          <w:sz w:val="22"/>
         </w:rPr>
         <w:t>[推论] 三条必要条件由第二、三节直接推出，不是独立假设</w:t>
       </w:r>
@@ -2876,9 +2381,8 @@
     <w:p>
       <w:r>
         <w:rPr>
-          <w:rFonts w:ascii="Consolas" w:hAnsi="Consolas" w:eastAsia="Consolas"/>
-          <w:b w:val="0"/>
-          <w:sz w:val="18"/>
+          <w:b w:val="0"/>
+          <w:sz w:val="22"/>
         </w:rPr>
         <w:t>[证据] 条件③ 有实验数据（E1/E2/E8 + 正收益）；条件①② 有部分数据（E12/E13）</w:t>
       </w:r>
@@ -2886,9 +2390,8 @@
     <w:p>
       <w:r>
         <w:rPr>
-          <w:rFonts w:ascii="Consolas" w:hAnsi="Consolas" w:eastAsia="Consolas"/>
-          <w:b w:val="0"/>
-          <w:sz w:val="18"/>
+          <w:b w:val="0"/>
+          <w:sz w:val="22"/>
         </w:rPr>
         <w:t>[未解决] 三条都满足后是否就「活」—— 本文不声称；这是下一步实验要回答的</w:t>
       </w:r>
@@ -2896,17 +2399,13 @@
     <w:p>
       <w:r>
         <w:rPr>
-          <w:rFonts w:ascii="Consolas" w:hAnsi="Consolas" w:eastAsia="Consolas"/>
-          <w:b w:val="0"/>
-          <w:sz w:val="18"/>
+          <w:b w:val="0"/>
+          <w:sz w:val="22"/>
         </w:rPr>
         <w:t>[推测] 若盈余 S 不足，则无论结构多复杂都维持不起 ⇒ 生命有「经济上限」（仅方向性推测）</w:t>
       </w:r>
     </w:p>
     <w:p>
-      <w:pPr>
-        <w:jc w:val="center"/>
-      </w:pPr>
       <w:r>
         <w:rPr>
           <w:b/>
@@ -2963,9 +2462,8 @@
     <w:p>
       <w:r>
         <w:rPr>
-          <w:rFonts w:ascii="Consolas" w:hAnsi="Consolas" w:eastAsia="Consolas"/>
-          <w:b w:val="0"/>
-          <w:sz w:val="18"/>
+          <w:b w:val="0"/>
+          <w:sz w:val="22"/>
         </w:rPr>
         <w:t>观察到涌现：很多人</w:t>
       </w:r>
@@ -2973,9 +2471,8 @@
     <w:p>
       <w:r>
         <w:rPr>
-          <w:rFonts w:ascii="Consolas" w:hAnsi="Consolas" w:eastAsia="Consolas"/>
-          <w:b w:val="0"/>
-          <w:sz w:val="18"/>
+          <w:b w:val="0"/>
+          <w:sz w:val="22"/>
         </w:rPr>
         <w:t>解释涌现：没有公认答案</w:t>
       </w:r>
@@ -3010,29 +2507,26 @@
     <w:p>
       <w:r>
         <w:rPr>
-          <w:rFonts w:ascii="Consolas" w:hAnsi="Consolas" w:eastAsia="Consolas"/>
-          <w:b w:val="0"/>
-          <w:sz w:val="18"/>
-        </w:rPr>
-        <w:t>主张：所谓涌现，可能是**评价指标的非线性/不连续**造成的假象；</w:t>
-      </w:r>
-    </w:p>
-    <w:p>
-      <w:r>
-        <w:rPr>
-          <w:rFonts w:ascii="Consolas" w:hAnsi="Consolas" w:eastAsia="Consolas"/>
-          <w:b w:val="0"/>
-          <w:sz w:val="18"/>
-        </w:rPr>
-        <w:t xml:space="preserve">      换成连续指标（如对数似然），"突变"会消失，变成平滑上升</w:t>
-      </w:r>
-    </w:p>
-    <w:p>
-      <w:r>
-        <w:rPr>
-          <w:rFonts w:ascii="Consolas" w:hAnsi="Consolas" w:eastAsia="Consolas"/>
-          <w:b w:val="0"/>
-          <w:sz w:val="18"/>
+          <w:b w:val="0"/>
+          <w:sz w:val="22"/>
+        </w:rPr>
+        <w:t>主张：所谓涌现，可能是评价指标的非线性/不连续造成的假象；</w:t>
+      </w:r>
+    </w:p>
+    <w:p>
+      <w:r>
+        <w:rPr>
+          <w:b w:val="0"/>
+          <w:sz w:val="22"/>
+        </w:rPr>
+        <w:t>换成连续指标（如对数似然），"突变"会消失，变成平滑上升</w:t>
+      </w:r>
+    </w:p>
+    <w:p>
+      <w:r>
+        <w:rPr>
+          <w:b w:val="0"/>
+          <w:sz w:val="22"/>
         </w:rPr>
         <w:t>⇒ 这动摇了「涌现是真实突变」这个前提本身</w:t>
       </w:r>
@@ -3058,9 +2552,8 @@
     <w:p>
       <w:r>
         <w:rPr>
-          <w:rFonts w:ascii="Consolas" w:hAnsi="Consolas" w:eastAsia="Consolas"/>
-          <w:b w:val="0"/>
-          <w:sz w:val="18"/>
+          <w:b w:val="0"/>
+          <w:sz w:val="22"/>
         </w:rPr>
         <w:t>发现模型内部出现「归纳头」回路，解释部分上下文学习能力</w:t>
       </w:r>
@@ -3068,19 +2561,17 @@
     <w:p>
       <w:r>
         <w:rPr>
-          <w:rFonts w:ascii="Consolas" w:hAnsi="Consolas" w:eastAsia="Consolas"/>
-          <w:b w:val="0"/>
-          <w:sz w:val="18"/>
-        </w:rPr>
-        <w:t>⇒ 这是**机制层**的证据：说明了某种能力由什么结构实现</w:t>
-      </w:r>
-    </w:p>
-    <w:p>
-      <w:r>
-        <w:rPr>
-          <w:rFonts w:ascii="Consolas" w:hAnsi="Consolas" w:eastAsia="Consolas"/>
-          <w:b w:val="0"/>
-          <w:sz w:val="18"/>
+          <w:b w:val="0"/>
+          <w:sz w:val="22"/>
+        </w:rPr>
+        <w:t>⇒ 这是机制层的证据：说明了某种能力由什么结构实现</w:t>
+      </w:r>
+    </w:p>
+    <w:p>
+      <w:r>
+        <w:rPr>
+          <w:b w:val="0"/>
+          <w:sz w:val="22"/>
         </w:rPr>
         <w:t>⇒ 但它只解释某个具体能力，不解释「为什么会出现涌现」这个一般问题</w:t>
       </w:r>
@@ -3106,9 +2597,8 @@
     <w:p>
       <w:r>
         <w:rPr>
-          <w:rFonts w:ascii="Consolas" w:hAnsi="Consolas" w:eastAsia="Consolas"/>
-          <w:b w:val="0"/>
-          <w:sz w:val="18"/>
+          <w:b w:val="0"/>
+          <w:sz w:val="22"/>
         </w:rPr>
         <w:t>在小算法任务上，训练很久后泛化突然出现（像相变）</w:t>
       </w:r>
@@ -3116,9 +2606,8 @@
     <w:p>
       <w:r>
         <w:rPr>
-          <w:rFonts w:ascii="Consolas" w:hAnsi="Consolas" w:eastAsia="Consolas"/>
-          <w:b w:val="0"/>
-          <w:sz w:val="18"/>
+          <w:b w:val="0"/>
+          <w:sz w:val="22"/>
         </w:rPr>
         <w:t>⇒ 说明「涌现」也发生在训练过程中，不一定只依赖规模</w:t>
       </w:r>
@@ -3144,9 +2633,8 @@
     <w:p>
       <w:r>
         <w:rPr>
-          <w:rFonts w:ascii="Consolas" w:hAnsi="Consolas" w:eastAsia="Consolas"/>
-          <w:b w:val="0"/>
-          <w:sz w:val="18"/>
+          <w:b w:val="0"/>
+          <w:sz w:val="22"/>
         </w:rPr>
         <w:t>语言模型 = 压缩器：学到的权重 = 对世界文本的压缩</w:t>
       </w:r>
@@ -3154,9 +2642,8 @@
     <w:p>
       <w:r>
         <w:rPr>
-          <w:rFonts w:ascii="Consolas" w:hAnsi="Consolas" w:eastAsia="Consolas"/>
-          <w:b w:val="0"/>
-          <w:sz w:val="18"/>
+          <w:b w:val="0"/>
+          <w:sz w:val="22"/>
         </w:rPr>
         <w:t>⇒ 这条最接近本文的框架：涌现 = 压缩世界时出现的结构</w:t>
       </w:r>
@@ -3164,9 +2651,8 @@
     <w:p>
       <w:r>
         <w:rPr>
-          <w:rFonts w:ascii="Consolas" w:hAnsi="Consolas" w:eastAsia="Consolas"/>
-          <w:b w:val="0"/>
-          <w:sz w:val="18"/>
+          <w:b w:val="0"/>
+          <w:sz w:val="22"/>
         </w:rPr>
         <w:t>⇒ 但它仍是「结果层面的对应」，没有回答「为什么正好在这个规模/这个任务上出现」</w:t>
       </w:r>
@@ -3183,9 +2669,8 @@
     <w:p>
       <w:r>
         <w:rPr>
-          <w:rFonts w:ascii="Consolas" w:hAnsi="Consolas" w:eastAsia="Consolas"/>
-          <w:b w:val="0"/>
-          <w:sz w:val="18"/>
+          <w:b w:val="0"/>
+          <w:sz w:val="22"/>
         </w:rPr>
         <w:t>① 规模实验不可控：无法做严格的因果对照（只改变规模、其他全相同）</w:t>
       </w:r>
@@ -3193,9 +2678,8 @@
     <w:p>
       <w:r>
         <w:rPr>
-          <w:rFonts w:ascii="Consolas" w:hAnsi="Consolas" w:eastAsia="Consolas"/>
-          <w:b w:val="0"/>
-          <w:sz w:val="18"/>
+          <w:b w:val="0"/>
+          <w:sz w:val="22"/>
         </w:rPr>
         <w:t>② 度量依赖：换指标，现象可能就消失（见 ①）</w:t>
       </w:r>
@@ -3203,9 +2687,8 @@
     <w:p>
       <w:r>
         <w:rPr>
-          <w:rFonts w:ascii="Consolas" w:hAnsi="Consolas" w:eastAsia="Consolas"/>
-          <w:b w:val="0"/>
-          <w:sz w:val="18"/>
+          <w:b w:val="0"/>
+          <w:sz w:val="22"/>
         </w:rPr>
         <w:t>③ 机制层不完整：知道某个回路、不知道整体为何会组织出该回路</w:t>
       </w:r>
@@ -3213,9 +2696,8 @@
     <w:p>
       <w:r>
         <w:rPr>
-          <w:rFonts w:ascii="Consolas" w:hAnsi="Consolas" w:eastAsia="Consolas"/>
-          <w:b w:val="0"/>
-          <w:sz w:val="18"/>
+          <w:b w:val="0"/>
+          <w:sz w:val="22"/>
         </w:rPr>
         <w:t>④ 缺乏可预测的理论：没有理论能事先算出「多大模型会出现什么能力」</w:t>
       </w:r>
@@ -3241,9 +2723,8 @@
     <w:p>
       <w:r>
         <w:rPr>
-          <w:rFonts w:ascii="Consolas" w:hAnsi="Consolas" w:eastAsia="Consolas"/>
-          <w:b w:val="0"/>
-          <w:sz w:val="18"/>
+          <w:b w:val="0"/>
+          <w:sz w:val="22"/>
         </w:rPr>
         <w:t>宇宙 F</w:t>
       </w:r>
@@ -3251,31 +2732,28 @@
     <w:p>
       <w:r>
         <w:rPr>
-          <w:rFonts w:ascii="Consolas" w:hAnsi="Consolas" w:eastAsia="Consolas"/>
-          <w:b w:val="0"/>
-          <w:sz w:val="18"/>
-        </w:rPr>
-        <w:t xml:space="preserve"> └ 环境     = 宇宙的局部解压</w:t>
-      </w:r>
-    </w:p>
-    <w:p>
-      <w:r>
-        <w:rPr>
-          <w:rFonts w:ascii="Consolas" w:hAnsi="Consolas" w:eastAsia="Consolas"/>
-          <w:b w:val="0"/>
-          <w:sz w:val="18"/>
-        </w:rPr>
-        <w:t xml:space="preserve">    └ 人类语言 = 人对环境（与自身经验）的解压产物  ← 语言本身就是被压过的</w:t>
-      </w:r>
-    </w:p>
-    <w:p>
-      <w:r>
-        <w:rPr>
-          <w:rFonts w:ascii="Consolas" w:hAnsi="Consolas" w:eastAsia="Consolas"/>
-          <w:b w:val="0"/>
-          <w:sz w:val="18"/>
-        </w:rPr>
-        <w:t xml:space="preserve">       └ AI     = 对人类语言的**再解压**（在人的解压之上再压一层）</w:t>
+          <w:b w:val="0"/>
+          <w:sz w:val="22"/>
+        </w:rPr>
+        <w:t>└ 环境     = 宇宙的局部解压</w:t>
+      </w:r>
+    </w:p>
+    <w:p>
+      <w:r>
+        <w:rPr>
+          <w:b w:val="0"/>
+          <w:sz w:val="22"/>
+        </w:rPr>
+        <w:t>└ 人类语言 = 人对环境（与自身经验）的解压产物  ← 语言本身就是被压过的</w:t>
+      </w:r>
+    </w:p>
+    <w:p>
+      <w:r>
+        <w:rPr>
+          <w:b w:val="0"/>
+          <w:sz w:val="22"/>
+        </w:rPr>
+        <w:t>└ AI     = 对人类语言的再解压（在人的解压之上再压一层）</w:t>
       </w:r>
     </w:p>
     <w:p>
@@ -3299,9 +2777,8 @@
     <w:p>
       <w:r>
         <w:rPr>
-          <w:rFonts w:ascii="Consolas" w:hAnsi="Consolas" w:eastAsia="Consolas"/>
-          <w:b w:val="0"/>
-          <w:sz w:val="18"/>
+          <w:b w:val="0"/>
+          <w:sz w:val="22"/>
         </w:rPr>
         <w:t>· 模型是冻结的函数点（一个点，不是一族）</w:t>
       </w:r>
@@ -3309,19 +2786,17 @@
     <w:p>
       <w:r>
         <w:rPr>
-          <w:rFonts w:ascii="Consolas" w:hAnsi="Consolas" w:eastAsia="Consolas"/>
-          <w:b w:val="0"/>
-          <w:sz w:val="18"/>
-        </w:rPr>
-        <w:t>· 它的"涌现"出现在**行为谱**上：输入不同、表现不同 ⇒ 看起来像会推理</w:t>
-      </w:r>
-    </w:p>
-    <w:p>
-      <w:r>
-        <w:rPr>
-          <w:rFonts w:ascii="Consolas" w:hAnsi="Consolas" w:eastAsia="Consolas"/>
-          <w:b w:val="0"/>
-          <w:sz w:val="18"/>
+          <w:b w:val="0"/>
+          <w:sz w:val="22"/>
+        </w:rPr>
+        <w:t>· 它的"涌现"出现在行为谱上：输入不同、表现不同 ⇒ 看起来像会推理</w:t>
+      </w:r>
+    </w:p>
+    <w:p>
+      <w:r>
+        <w:rPr>
+          <w:b w:val="0"/>
+          <w:sz w:val="22"/>
         </w:rPr>
         <w:t>· 但模型不维持这个谱、不自己改自己、不付代价</w:t>
       </w:r>
@@ -3329,9 +2804,8 @@
     <w:p>
       <w:r>
         <w:rPr>
-          <w:rFonts w:ascii="Consolas" w:hAnsi="Consolas" w:eastAsia="Consolas"/>
-          <w:b w:val="0"/>
-          <w:sz w:val="18"/>
+          <w:b w:val="0"/>
+          <w:sz w:val="22"/>
         </w:rPr>
         <w:t>⇒ 它是「把人类语言解压了一次」，而不是「维持着解压」或「自己改写解压规则」</w:t>
       </w:r>
@@ -3384,9 +2858,8 @@
     <w:p>
       <w:r>
         <w:rPr>
-          <w:rFonts w:ascii="Consolas" w:hAnsi="Consolas" w:eastAsia="Consolas"/>
-          <w:b w:val="0"/>
-          <w:sz w:val="18"/>
+          <w:b w:val="0"/>
+          <w:sz w:val="22"/>
         </w:rPr>
         <w:t>源分布移动：人类语言发现新东西 ⇒ 要解压的对象变了</w:t>
       </w:r>
@@ -3394,19 +2867,17 @@
     <w:p>
       <w:r>
         <w:rPr>
-          <w:rFonts w:ascii="Consolas" w:hAnsi="Consolas" w:eastAsia="Consolas"/>
-          <w:b w:val="0"/>
-          <w:sz w:val="18"/>
-        </w:rPr>
-        <w:t>解压器冻结：模型权重不变     ⇒ 它解压的还是**旧语言**</w:t>
-      </w:r>
-    </w:p>
-    <w:p>
-      <w:r>
-        <w:rPr>
-          <w:rFonts w:ascii="Consolas" w:hAnsi="Consolas" w:eastAsia="Consolas"/>
-          <w:b w:val="0"/>
-          <w:sz w:val="18"/>
+          <w:b w:val="0"/>
+          <w:sz w:val="22"/>
+        </w:rPr>
+        <w:t>解压器冻结：模型权重不变     ⇒ 它解压的还是旧语言</w:t>
+      </w:r>
+    </w:p>
+    <w:p>
+      <w:r>
+        <w:rPr>
+          <w:b w:val="0"/>
+          <w:sz w:val="22"/>
         </w:rPr>
         <w:t>⇒ 压缩收益下降：gain_bits = log2 p_model − log2 p_base 中 p_model 与源失配</w:t>
       </w:r>
@@ -3414,9 +2885,8 @@
     <w:p>
       <w:r>
         <w:rPr>
-          <w:rFonts w:ascii="Consolas" w:hAnsi="Consolas" w:eastAsia="Consolas"/>
-          <w:b w:val="0"/>
-          <w:sz w:val="18"/>
+          <w:b w:val="0"/>
+          <w:sz w:val="22"/>
         </w:rPr>
         <w:t>⇒ 它昨天"涌现"出来的理解，今天就是过时的解压</w:t>
       </w:r>
@@ -3433,19 +2903,17 @@
     <w:p>
       <w:r>
         <w:rPr>
-          <w:rFonts w:ascii="Consolas" w:hAnsi="Consolas" w:eastAsia="Consolas"/>
-          <w:b w:val="0"/>
-          <w:sz w:val="18"/>
-        </w:rPr>
-        <w:t>① 它的解压能力有**固定上限**：上限由训练时刻的语言决定，不随语言进化而上升</w:t>
-      </w:r>
-    </w:p>
-    <w:p>
-      <w:r>
-        <w:rPr>
-          <w:rFonts w:ascii="Consolas" w:hAnsi="Consolas" w:eastAsia="Consolas"/>
-          <w:b w:val="0"/>
-          <w:sz w:val="18"/>
+          <w:b w:val="0"/>
+          <w:sz w:val="22"/>
+        </w:rPr>
+        <w:t>① 它的解压能力有固定上限：上限由训练时刻的语言决定，不随语言进化而上升</w:t>
+      </w:r>
+    </w:p>
+    <w:p>
+      <w:r>
+        <w:rPr>
+          <w:b w:val="0"/>
+          <w:sz w:val="22"/>
         </w:rPr>
         <w:t>② 它无法自己补上失配：更新规则在外部 —— 要恢复，只能靠人类再训练一次</w:t>
       </w:r>
@@ -3453,21 +2921,19 @@
     <w:p>
       <w:r>
         <w:rPr>
-          <w:rFonts w:ascii="Consolas" w:hAnsi="Consolas" w:eastAsia="Consolas"/>
-          <w:b w:val="0"/>
-          <w:sz w:val="18"/>
-        </w:rPr>
-        <w:t xml:space="preserve">   ⇒ 这正是第三节说的「更新在外部」的代价</w:t>
-      </w:r>
-    </w:p>
-    <w:p>
-      <w:r>
-        <w:rPr>
-          <w:rFonts w:ascii="Consolas" w:hAnsi="Consolas" w:eastAsia="Consolas"/>
-          <w:b w:val="0"/>
-          <w:sz w:val="18"/>
-        </w:rPr>
-        <w:t>③ 它的"涌现"是**某个时间片上的解压产物**，不是可持续的能力</w:t>
+          <w:b w:val="0"/>
+          <w:sz w:val="22"/>
+        </w:rPr>
+        <w:t>⇒ 这正是第三节说的「更新在外部」的代价</w:t>
+      </w:r>
+    </w:p>
+    <w:p>
+      <w:r>
+        <w:rPr>
+          <w:b w:val="0"/>
+          <w:sz w:val="22"/>
+        </w:rPr>
+        <w:t>③ 它的"涌现"是某个时间片上的解压产物，不是可持续的能力</w:t>
       </w:r>
     </w:p>
     <w:p>
@@ -3509,9 +2975,8 @@
     <w:p>
       <w:r>
         <w:rPr>
-          <w:rFonts w:ascii="Consolas" w:hAnsi="Consolas" w:eastAsia="Consolas"/>
-          <w:b w:val="0"/>
-          <w:sz w:val="18"/>
+          <w:b w:val="0"/>
+          <w:sz w:val="22"/>
         </w:rPr>
         <w:t>① 若把世界换成未被人类语言描述过的部分（无法从语料中学到的规律），</w:t>
       </w:r>
@@ -3519,19 +2984,17 @@
     <w:p>
       <w:r>
         <w:rPr>
-          <w:rFonts w:ascii="Consolas" w:hAnsi="Consolas" w:eastAsia="Consolas"/>
-          <w:b w:val="0"/>
-          <w:sz w:val="18"/>
-        </w:rPr>
-        <w:t xml:space="preserve">   AI 的"涌现"应显著减弱 —— 因为它解压的是语言，不是宇宙</w:t>
-      </w:r>
-    </w:p>
-    <w:p>
-      <w:r>
-        <w:rPr>
-          <w:rFonts w:ascii="Consolas" w:hAnsi="Consolas" w:eastAsia="Consolas"/>
-          <w:b w:val="0"/>
-          <w:sz w:val="18"/>
+          <w:b w:val="0"/>
+          <w:sz w:val="22"/>
+        </w:rPr>
+        <w:t>AI 的"涌现"应显著减弱 —— 因为它解压的是语言，不是宇宙</w:t>
+      </w:r>
+    </w:p>
+    <w:p>
+      <w:r>
+        <w:rPr>
+          <w:b w:val="0"/>
+          <w:sz w:val="22"/>
         </w:rPr>
         <w:t>② 若让模型自己付代价（自己维持、自己修、自己死），语言解压不足以支撑，</w:t>
       </w:r>
@@ -3539,19 +3002,17 @@
     <w:p>
       <w:r>
         <w:rPr>
-          <w:rFonts w:ascii="Consolas" w:hAnsi="Consolas" w:eastAsia="Consolas"/>
-          <w:b w:val="0"/>
-          <w:sz w:val="18"/>
-        </w:rPr>
-        <w:t xml:space="preserve">   它必须发展出语言之外的理解方式 —— 否则活不下来</w:t>
-      </w:r>
-    </w:p>
-    <w:p>
-      <w:r>
-        <w:rPr>
-          <w:rFonts w:ascii="Consolas" w:hAnsi="Consolas" w:eastAsia="Consolas"/>
-          <w:b w:val="0"/>
-          <w:sz w:val="18"/>
+          <w:b w:val="0"/>
+          <w:sz w:val="22"/>
+        </w:rPr>
+        <w:t>它必须发展出语言之外的理解方式 —— 否则活不下来</w:t>
+      </w:r>
+    </w:p>
+    <w:p>
+      <w:r>
+        <w:rPr>
+          <w:b w:val="0"/>
+          <w:sz w:val="22"/>
         </w:rPr>
         <w:t>③ 若人类语言发生一次大的结构更新（新范式/新概念体系），冻结模型的解压收益</w:t>
       </w:r>
@@ -3559,11 +3020,10 @@
     <w:p>
       <w:r>
         <w:rPr>
-          <w:rFonts w:ascii="Consolas" w:hAnsi="Consolas" w:eastAsia="Consolas"/>
-          <w:b w:val="0"/>
-          <w:sz w:val="18"/>
-        </w:rPr>
-        <w:t xml:space="preserve">   应出现可测的下降；且它无法自己恢复 ⇒ 恢复必须来自外部再训练</w:t>
+          <w:b w:val="0"/>
+          <w:sz w:val="22"/>
+        </w:rPr>
+        <w:t>应出现可测的下降；且它无法自己恢复 ⇒ 恢复必须来自外部再训练</w:t>
       </w:r>
     </w:p>
     <w:p>
@@ -3578,9 +3038,8 @@
     <w:p>
       <w:r>
         <w:rPr>
-          <w:rFonts w:ascii="Consolas" w:hAnsi="Consolas" w:eastAsia="Consolas"/>
-          <w:b w:val="0"/>
-          <w:sz w:val="18"/>
+          <w:b w:val="0"/>
+          <w:sz w:val="22"/>
         </w:rPr>
         <w:t>[事实] 涌现现象被广泛观察到；度量假象说也有强证据（Schaeffer 2023）</w:t>
       </w:r>
@@ -3588,9 +3047,8 @@
     <w:p>
       <w:r>
         <w:rPr>
-          <w:rFonts w:ascii="Consolas" w:hAnsi="Consolas" w:eastAsia="Consolas"/>
-          <w:b w:val="0"/>
-          <w:sz w:val="18"/>
+          <w:b w:val="0"/>
+          <w:sz w:val="22"/>
         </w:rPr>
         <w:t>[已知] 机制层有局部解释（归纳头/电路/grokking），压缩视角有对应关系</w:t>
       </w:r>
@@ -3598,9 +3056,8 @@
     <w:p>
       <w:r>
         <w:rPr>
-          <w:rFonts w:ascii="Consolas" w:hAnsi="Consolas" w:eastAsia="Consolas"/>
-          <w:b w:val="0"/>
-          <w:sz w:val="18"/>
+          <w:b w:val="0"/>
+          <w:sz w:val="22"/>
         </w:rPr>
         <w:t>[推测] 「涌现 = 压缩世界的结构呈现」——本文立场，非证据</w:t>
       </w:r>
@@ -3608,9 +3065,8 @@
     <w:p>
       <w:r>
         <w:rPr>
-          <w:rFonts w:ascii="Consolas" w:hAnsi="Consolas" w:eastAsia="Consolas"/>
-          <w:b w:val="0"/>
-          <w:sz w:val="18"/>
+          <w:b w:val="0"/>
+          <w:sz w:val="22"/>
         </w:rPr>
         <w:t>[未解决] 为什么正好在某个规模/任务上出现 ⇒ 没有人给出可预测的理论</w:t>
       </w:r>
@@ -3618,9 +3074,8 @@
     <w:p>
       <w:r>
         <w:rPr>
-          <w:rFonts w:ascii="Consolas" w:hAnsi="Consolas" w:eastAsia="Consolas"/>
-          <w:b w:val="0"/>
-          <w:sz w:val="18"/>
+          <w:b w:val="0"/>
+          <w:sz w:val="22"/>
         </w:rPr>
         <w:t>[本文态度] 不把「AI 涌现」当作生命存在的证据；按第三节的尺子，它不是</w:t>
       </w:r>
@@ -3628,19 +3083,17 @@
     <w:p>
       <w:r>
         <w:rPr>
-          <w:rFonts w:ascii="Consolas" w:hAnsi="Consolas" w:eastAsia="Consolas"/>
-          <w:b w:val="0"/>
-          <w:sz w:val="18"/>
-        </w:rPr>
-        <w:t>[本文立场] AI 是对**人类语言**的再解压（宇宙→环境→语言→AI 的第三层解压）</w:t>
-      </w:r>
-    </w:p>
-    <w:p>
-      <w:r>
-        <w:rPr>
-          <w:rFonts w:ascii="Consolas" w:hAnsi="Consolas" w:eastAsia="Consolas"/>
-          <w:b w:val="0"/>
-          <w:sz w:val="18"/>
+          <w:b w:val="0"/>
+          <w:sz w:val="22"/>
+        </w:rPr>
+        <w:t>[本文立场] AI 是对人类语言的再解压（宇宙→环境→语言→AI 的第三层解压）</w:t>
+      </w:r>
+    </w:p>
+    <w:p>
+      <w:r>
+        <w:rPr>
+          <w:b w:val="0"/>
+          <w:sz w:val="22"/>
         </w:rPr>
         <w:t>[推论] 上层写死 ⇒ 语言一更新就失配 ⇒ 解压能力有固定上限、无法自己恢复</w:t>
       </w:r>
@@ -3781,9 +3234,6 @@
       </w:r>
     </w:p>
     <w:p>
-      <w:pPr>
-        <w:jc w:val="center"/>
-      </w:pPr>
       <w:r>
         <w:rPr>
           <w:b/>
@@ -3807,25 +3257,25 @@
           <w:b w:val="0"/>
           <w:sz w:val="22"/>
         </w:rPr>
-        <w:t>• 模型侧维度：token 嵌入的内在维度测量[12]</w:t>
-      </w:r>
-    </w:p>
-    <w:p>
-      <w:r>
-        <w:rPr>
-          <w:b w:val="0"/>
-          <w:sz w:val="22"/>
-        </w:rPr>
-        <w:t>• 时间侧落后：大模型时间训练边界的识别[13]</w:t>
-      </w:r>
-    </w:p>
-    <w:p>
-      <w:r>
-        <w:rPr>
-          <w:b w:val="0"/>
-          <w:sz w:val="22"/>
-        </w:rPr>
-        <w:t>• 语言侧复杂度：构式视角下的语言复杂度测量[14]</w:t>
+        <w:t>- 模型侧维度：token 嵌入的内在维度测量[12]</w:t>
+      </w:r>
+    </w:p>
+    <w:p>
+      <w:r>
+        <w:rPr>
+          <w:b w:val="0"/>
+          <w:sz w:val="22"/>
+        </w:rPr>
+        <w:t>- 时间侧落后：大模型时间训练边界的识别[13]</w:t>
+      </w:r>
+    </w:p>
+    <w:p>
+      <w:r>
+        <w:rPr>
+          <w:b w:val="0"/>
+          <w:sz w:val="22"/>
+        </w:rPr>
+        <w:t>- 语言侧复杂度：构式视角下的语言复杂度测量[14]</w:t>
       </w:r>
     </w:p>
     <w:p>

</xml_diff>

<commit_message>
Restore original papers with code fences (keep them as published); only paper 09 uses plain paragraphs
</commit_message>
<xml_diff>
--- a/paper.docx
+++ b/paper.docx
@@ -3,6 +3,9 @@
 <w:document xmlns:wpc="http://schemas.microsoft.com/office/word/2010/wordprocessingCanvas" xmlns:mo="http://schemas.microsoft.com/office/mac/office/2008/main" xmlns:mc="http://schemas.openxmlformats.org/markup-compatibility/2006" xmlns:mv="urn:schemas-microsoft-com:mac:vml" xmlns:o="urn:schemas-microsoft-com:office:office" xmlns:r="http://schemas.openxmlformats.org/officeDocument/2006/relationships" xmlns:m="http://schemas.openxmlformats.org/officeDocument/2006/math" xmlns:v="urn:schemas-microsoft-com:vml" xmlns:wp14="http://schemas.microsoft.com/office/word/2010/wordprocessingDrawing" xmlns:wp="http://schemas.openxmlformats.org/drawingml/2006/wordprocessingDrawing" xmlns:w10="urn:schemas-microsoft-com:office:word" xmlns:w="http://schemas.openxmlformats.org/wordprocessingml/2006/main" xmlns:w14="http://schemas.microsoft.com/office/word/2010/wordml" xmlns:wpg="http://schemas.microsoft.com/office/word/2010/wordprocessingGroup" xmlns:wpi="http://schemas.microsoft.com/office/word/2010/wordprocessingInk" xmlns:wne="http://schemas.microsoft.com/office/word/2006/wordml" xmlns:wps="http://schemas.microsoft.com/office/word/2010/wordprocessingShape" mc:Ignorable="w14 wp14">
   <w:body>
     <w:p>
+      <w:pPr>
+        <w:jc w:val="center"/>
+      </w:pPr>
       <w:r>
         <w:rPr>
           <w:b/>
@@ -188,7 +191,7 @@
           <w:b w:val="0"/>
           <w:sz w:val="22"/>
         </w:rPr>
-        <w:t>- Schrödinger（1944）：生命以负熵为食 —— 生存靠从环境摄取低熵，是「解压」的物理前身[7]。</w:t>
+        <w:t>• Schrödinger（1944）：生命以负熵为食 —— 生存靠从环境摄取低熵，是「解压」的物理前身[7]。</w:t>
       </w:r>
     </w:p>
     <w:p>
@@ -197,7 +200,7 @@
           <w:b w:val="0"/>
           <w:sz w:val="22"/>
         </w:rPr>
-        <w:t>- Bennett（1988）逻辑深度：用「从最短描述重建（解压）一个对象所需的计算量」度量复杂性，并明确把它与生命/有机体联系起来[8] —— 这是「解压」最正式的已有版本。</w:t>
+        <w:t>• Bennett（1988）逻辑深度：用「从最短描述重建（解压）一个对象所需的计算量」度量复杂性，并明确把它与生命/有机体联系起来[8] —— 这是「解压」最正式的已有版本。</w:t>
       </w:r>
     </w:p>
     <w:p>
@@ -206,7 +209,7 @@
           <w:b w:val="0"/>
           <w:sz w:val="22"/>
         </w:rPr>
-        <w:t>- Chaitin（2010）生命作为演化软件：DNA = 程序，生命 = 会自我修改的软件[9]。</w:t>
+        <w:t>• Chaitin（2010）生命作为演化软件：DNA = 程序，生命 = 会自我修改的软件[9]。</w:t>
       </w:r>
     </w:p>
     <w:p>
@@ -215,7 +218,7 @@
           <w:b w:val="0"/>
           <w:sz w:val="22"/>
         </w:rPr>
-        <w:t>- Solomonoff–Kolmogorov / MDL：描述长度 = 理解 = 压缩[10]。</w:t>
+        <w:t>• Solomonoff–Kolmogorov / MDL：描述长度 = 理解 = 压缩[10]。</w:t>
       </w:r>
     </w:p>
     <w:p>
@@ -224,7 +227,7 @@
           <w:b w:val="0"/>
           <w:sz w:val="22"/>
         </w:rPr>
-        <w:t>- Friston（2010）自由能原理：生命 = 最小化惊奇（≈ 持续压缩/预测）[11]。</w:t>
+        <w:t>• Friston（2010）自由能原理：生命 = 最小化惊奇（≈ 持续压缩/预测）[11]。</w:t>
       </w:r>
     </w:p>
     <w:p>
@@ -233,7 +236,7 @@
           <w:b w:val="0"/>
           <w:sz w:val="22"/>
         </w:rPr>
-        <w:t>- Delétang et al.（2023）：语言模型是压缩器[6]。</w:t>
+        <w:t>• Delétang et al.（2023）：语言模型是压缩器[6]。</w:t>
       </w:r>
     </w:p>
     <w:p>
@@ -273,6 +276,9 @@
       </w:r>
     </w:p>
     <w:p>
+      <w:pPr>
+        <w:jc w:val="center"/>
+      </w:pPr>
       <w:r>
         <w:rPr>
           <w:b/>
@@ -320,8 +326,9 @@
     <w:p>
       <w:r>
         <w:rPr>
-          <w:b w:val="0"/>
-          <w:sz w:val="22"/>
+          <w:rFonts w:ascii="Consolas" w:hAnsi="Consolas" w:eastAsia="Consolas"/>
+          <w:b w:val="0"/>
+          <w:sz w:val="18"/>
         </w:rPr>
         <w:t>① 事实：大模型存在，且能在大规模语言上工作</w:t>
       </w:r>
@@ -329,17 +336,19 @@
     <w:p>
       <w:r>
         <w:rPr>
-          <w:b w:val="0"/>
-          <w:sz w:val="22"/>
-        </w:rPr>
-        <w:t>⇒ 它确实从语言里恢复出了结构（预测、迁移、推理）</w:t>
-      </w:r>
-    </w:p>
-    <w:p>
-      <w:r>
-        <w:rPr>
-          <w:b w:val="0"/>
-          <w:sz w:val="22"/>
+          <w:rFonts w:ascii="Consolas" w:hAnsi="Consolas" w:eastAsia="Consolas"/>
+          <w:b w:val="0"/>
+          <w:sz w:val="18"/>
+        </w:rPr>
+        <w:t xml:space="preserve">   ⇒ 它确实从语言里恢复出了结构（预测、迁移、推理）</w:t>
+      </w:r>
+    </w:p>
+    <w:p>
+      <w:r>
+        <w:rPr>
+          <w:rFonts w:ascii="Consolas" w:hAnsi="Consolas" w:eastAsia="Consolas"/>
+          <w:b w:val="0"/>
+          <w:sz w:val="18"/>
         </w:rPr>
         <w:t>② 推论：语言所记录的那一层世界，可以被函数逼近</w:t>
       </w:r>
@@ -347,17 +356,19 @@
     <w:p>
       <w:r>
         <w:rPr>
-          <w:b w:val="0"/>
-          <w:sz w:val="22"/>
-        </w:rPr>
-        <w:t>⇒ 否则这样的机器不可能工作</w:t>
-      </w:r>
-    </w:p>
-    <w:p>
-      <w:r>
-        <w:rPr>
-          <w:b w:val="0"/>
-          <w:sz w:val="22"/>
+          <w:rFonts w:ascii="Consolas" w:hAnsi="Consolas" w:eastAsia="Consolas"/>
+          <w:b w:val="0"/>
+          <w:sz w:val="18"/>
+        </w:rPr>
+        <w:t xml:space="preserve">   ⇒ 否则这样的机器不可能工作</w:t>
+      </w:r>
+    </w:p>
+    <w:p>
+      <w:r>
+        <w:rPr>
+          <w:rFonts w:ascii="Consolas" w:hAnsi="Consolas" w:eastAsia="Consolas"/>
+          <w:b w:val="0"/>
+          <w:sz w:val="18"/>
         </w:rPr>
         <w:t>③ 反推：世界（至少被语言/观测记录的那一层）具有函数结构</w:t>
       </w:r>
@@ -365,8 +376,9 @@
     <w:p>
       <w:r>
         <w:rPr>
-          <w:b w:val="0"/>
-          <w:sz w:val="22"/>
+          <w:rFonts w:ascii="Consolas" w:hAnsi="Consolas" w:eastAsia="Consolas"/>
+          <w:b w:val="0"/>
+          <w:sz w:val="18"/>
         </w:rPr>
         <w:t>④ 定义：生命 = 维持这种「从世界到结构」的解压过程的系统</w:t>
       </w:r>
@@ -437,8 +449,9 @@
     <w:p>
       <w:r>
         <w:rPr>
-          <w:b w:val="0"/>
-          <w:sz w:val="22"/>
+          <w:rFonts w:ascii="Consolas" w:hAnsi="Consolas" w:eastAsia="Consolas"/>
+          <w:b w:val="0"/>
+          <w:sz w:val="18"/>
         </w:rPr>
         <w:t>事实：最基础的物理定律本身就是数学命题</w:t>
       </w:r>
@@ -446,17 +459,19 @@
     <w:p>
       <w:r>
         <w:rPr>
-          <w:b w:val="0"/>
-          <w:sz w:val="22"/>
-        </w:rPr>
-        <w:t>F = ma、最小作用量 δS=0、iħ∂ψ/∂t = Ĥψ、ds² = g_{μν}dx^μdx^ν</w:t>
-      </w:r>
-    </w:p>
-    <w:p>
-      <w:r>
-        <w:rPr>
-          <w:b w:val="0"/>
-          <w:sz w:val="22"/>
+          <w:rFonts w:ascii="Consolas" w:hAnsi="Consolas" w:eastAsia="Consolas"/>
+          <w:b w:val="0"/>
+          <w:sz w:val="18"/>
+        </w:rPr>
+        <w:t xml:space="preserve">      F = ma、最小作用量 δS=0、iħ∂ψ/∂t = Ĥψ、ds² = g_{μν}dx^μdx^ν</w:t>
+      </w:r>
+    </w:p>
+    <w:p>
+      <w:r>
+        <w:rPr>
+          <w:rFonts w:ascii="Consolas" w:hAnsi="Consolas" w:eastAsia="Consolas"/>
+          <w:b w:val="0"/>
+          <w:sz w:val="18"/>
         </w:rPr>
         <w:t>猜想：既然描述世界最深层的方式是数学的，世界本身的结构就是数学的</w:t>
       </w:r>
@@ -464,10 +479,11 @@
     <w:p>
       <w:r>
         <w:rPr>
-          <w:b w:val="0"/>
-          <w:sz w:val="22"/>
-        </w:rPr>
-        <w:t>—— 否则数学为何能如此精确地描述它？</w:t>
+          <w:rFonts w:ascii="Consolas" w:hAnsi="Consolas" w:eastAsia="Consolas"/>
+          <w:b w:val="0"/>
+          <w:sz w:val="18"/>
+        </w:rPr>
+        <w:t xml:space="preserve">      —— 否则数学为何能如此精确地描述它？</w:t>
       </w:r>
     </w:p>
     <w:p>
@@ -482,8 +498,9 @@
     <w:p>
       <w:r>
         <w:rPr>
-          <w:b w:val="0"/>
-          <w:sz w:val="22"/>
+          <w:rFonts w:ascii="Consolas" w:hAnsi="Consolas" w:eastAsia="Consolas"/>
+          <w:b w:val="0"/>
+          <w:sz w:val="18"/>
         </w:rPr>
         <w:t>① 这是对「数学为何有效」的解释性推断，不是证明</w:t>
       </w:r>
@@ -491,26 +508,29 @@
     <w:p>
       <w:r>
         <w:rPr>
-          <w:b w:val="0"/>
-          <w:sz w:val="22"/>
-        </w:rPr>
-        <w:t>② 存在等价的另一读法：数学只是描述语言，世界本身是什么我们不知道</w:t>
-      </w:r>
-    </w:p>
-    <w:p>
-      <w:r>
-        <w:rPr>
-          <w:b w:val="0"/>
-          <w:sz w:val="22"/>
-        </w:rPr>
-        <w:t>（工具论 vs 实在论；两者目前无法用实验区分）</w:t>
-      </w:r>
-    </w:p>
-    <w:p>
-      <w:r>
-        <w:rPr>
-          <w:b w:val="0"/>
-          <w:sz w:val="22"/>
+          <w:rFonts w:ascii="Consolas" w:hAnsi="Consolas" w:eastAsia="Consolas"/>
+          <w:b w:val="0"/>
+          <w:sz w:val="18"/>
+        </w:rPr>
+        <w:t>② 存在等价的另一读法：数学只是**描述语言**，世界本身是什么我们不知道</w:t>
+      </w:r>
+    </w:p>
+    <w:p>
+      <w:r>
+        <w:rPr>
+          <w:rFonts w:ascii="Consolas" w:hAnsi="Consolas" w:eastAsia="Consolas"/>
+          <w:b w:val="0"/>
+          <w:sz w:val="18"/>
+        </w:rPr>
+        <w:t xml:space="preserve">   （工具论 vs 实在论；两者目前无法用实验区分）</w:t>
+      </w:r>
+    </w:p>
+    <w:p>
+      <w:r>
+        <w:rPr>
+          <w:rFonts w:ascii="Consolas" w:hAnsi="Consolas" w:eastAsia="Consolas"/>
+          <w:b w:val="0"/>
+          <w:sz w:val="18"/>
         </w:rPr>
         <w:t>③ 强形式（世界=数学结构，Tegmark[2] 数学宇宙假说）不可证伪，因而不能当科学结论</w:t>
       </w:r>
@@ -518,8 +538,9 @@
     <w:p>
       <w:r>
         <w:rPr>
-          <w:b w:val="0"/>
-          <w:sz w:val="22"/>
+          <w:rFonts w:ascii="Consolas" w:hAnsi="Consolas" w:eastAsia="Consolas"/>
+          <w:b w:val="0"/>
+          <w:sz w:val="18"/>
         </w:rPr>
         <w:t>④ 这是 Wigner[1] 所说的「数学在自然科学中不合理的有效性」之谜，本文不解答它</w:t>
       </w:r>
@@ -536,10 +557,40 @@
     <w:p>
       <w:r>
         <w:rPr>
+          <w:rFonts w:ascii="Consolas" w:hAnsi="Consolas" w:eastAsia="Consolas"/>
+          <w:b w:val="0"/>
+          <w:sz w:val="18"/>
+        </w:rPr>
+        <w:t>弱表述：世界具有可被数学描述的规律性（经验事实，不是猜想）</w:t>
+      </w:r>
+    </w:p>
+    <w:p>
+      <w:r>
+        <w:rPr>
+          <w:rFonts w:ascii="Consolas" w:hAnsi="Consolas" w:eastAsia="Consolas"/>
+          <w:b w:val="0"/>
+          <w:sz w:val="18"/>
+        </w:rPr>
+        <w:t>⇒ 由此写出：S_{t+1} = F(S_t)</w:t>
+      </w:r>
+    </w:p>
+    <w:p>
+      <w:r>
+        <w:rPr>
+          <w:rFonts w:ascii="Consolas" w:hAnsi="Consolas" w:eastAsia="Consolas"/>
+          <w:b w:val="0"/>
+          <w:sz w:val="18"/>
+        </w:rPr>
+        <w:t>⇒ 规律 ⇒ 可压缩 ⇒ 可预测 ⇒ 预测有对错 ⇒ 对错可计代价</w:t>
+      </w:r>
+    </w:p>
+    <w:p>
+      <w:r>
+        <w:rPr>
           <w:b w:val="0"/>
           <w:sz w:val="22"/>
         </w:rPr>
-        <w:t>弱表述：世界具有可被数学描述的规律性（经验事实，不是猜想）</w:t>
+        <w:t>注意区分：</w:t>
       </w:r>
     </w:p>
     <w:p>
@@ -548,7 +599,7 @@
           <w:b w:val="0"/>
           <w:sz w:val="22"/>
         </w:rPr>
-        <w:t>⇒ 由此写出：S_{t+1} = F(S_t)</w:t>
+        <w:t>• **猜想** = 世界本身是数学的（本节内容，不用作证据）</w:t>
       </w:r>
     </w:p>
     <w:p>
@@ -557,34 +608,7 @@
           <w:b w:val="0"/>
           <w:sz w:val="22"/>
         </w:rPr>
-        <w:t>⇒ 规律 ⇒ 可压缩 ⇒ 可预测 ⇒ 预测有对错 ⇒ 对错可计代价</w:t>
-      </w:r>
-    </w:p>
-    <w:p>
-      <w:r>
-        <w:rPr>
-          <w:b w:val="0"/>
-          <w:sz w:val="22"/>
-        </w:rPr>
-        <w:t>注意区分：</w:t>
-      </w:r>
-    </w:p>
-    <w:p>
-      <w:r>
-        <w:rPr>
-          <w:b w:val="0"/>
-          <w:sz w:val="22"/>
-        </w:rPr>
-        <w:t>- 猜想 = 世界本身是数学的（本节内容，不用作证据）</w:t>
-      </w:r>
-    </w:p>
-    <w:p>
-      <w:r>
-        <w:rPr>
-          <w:b w:val="0"/>
-          <w:sz w:val="22"/>
-        </w:rPr>
-        <w:t>- 经验事实 = 世界存在可压缩的规律性（科学实践的基础，本文真正使用的东西）</w:t>
+        <w:t>• **经验事实** = 世界存在可压缩的规律性（科学实践的基础，本文真正使用的东西）</w:t>
       </w:r>
     </w:p>
     <w:p>
@@ -599,8 +623,9 @@
     <w:p>
       <w:r>
         <w:rPr>
-          <w:b w:val="0"/>
-          <w:sz w:val="22"/>
+          <w:rFonts w:ascii="Consolas" w:hAnsi="Consolas" w:eastAsia="Consolas"/>
+          <w:b w:val="0"/>
+          <w:sz w:val="18"/>
         </w:rPr>
         <w:t>[猜想]   世界的根源是数学性的</w:t>
       </w:r>
@@ -608,8 +633,9 @@
     <w:p>
       <w:r>
         <w:rPr>
-          <w:b w:val="0"/>
-          <w:sz w:val="22"/>
+          <w:rFonts w:ascii="Consolas" w:hAnsi="Consolas" w:eastAsia="Consolas"/>
+          <w:b w:val="0"/>
+          <w:sz w:val="18"/>
         </w:rPr>
         <w:t>[经验]   世界具有可被部分描述/压缩的规律性</w:t>
       </w:r>
@@ -617,8 +643,9 @@
     <w:p>
       <w:r>
         <w:rPr>
-          <w:b w:val="0"/>
-          <w:sz w:val="22"/>
+          <w:rFonts w:ascii="Consolas" w:hAnsi="Consolas" w:eastAsia="Consolas"/>
+          <w:b w:val="0"/>
+          <w:sz w:val="18"/>
         </w:rPr>
         <w:t>[本文用] 只使用后者；即使前者为假，本文全部判据与实验照常成立</w:t>
       </w:r>
@@ -626,13 +653,17 @@
     <w:p>
       <w:r>
         <w:rPr>
-          <w:b w:val="0"/>
-          <w:sz w:val="22"/>
+          <w:rFonts w:ascii="Consolas" w:hAnsi="Consolas" w:eastAsia="Consolas"/>
+          <w:b w:val="0"/>
+          <w:sz w:val="18"/>
         </w:rPr>
         <w:t>[不讨论] 数学为何有效（Wigner 之谜）；世界本体到底是什么</w:t>
       </w:r>
     </w:p>
     <w:p>
+      <w:pPr>
+        <w:jc w:val="center"/>
+      </w:pPr>
       <w:r>
         <w:rPr>
           <w:b/>
@@ -680,102 +711,202 @@
     <w:p>
       <w:r>
         <w:rPr>
+          <w:rFonts w:ascii="Consolas" w:hAnsi="Consolas" w:eastAsia="Consolas"/>
+          <w:b w:val="0"/>
+          <w:sz w:val="18"/>
+        </w:rPr>
+        <w:t>记个体为 F = { f_θ : θ ∈ Θ }</w:t>
+      </w:r>
+    </w:p>
+    <w:p>
+      <w:r>
+        <w:rPr>
+          <w:rFonts w:ascii="Consolas" w:hAnsi="Consolas" w:eastAsia="Consolas"/>
+          <w:b w:val="0"/>
+          <w:sz w:val="18"/>
+        </w:rPr>
+        <w:t xml:space="preserve">    f_θ : 输入状态 → 行为          （族里的每一个函数）</w:t>
+      </w:r>
+    </w:p>
+    <w:p>
+      <w:r>
+        <w:rPr>
+          <w:rFonts w:ascii="Consolas" w:hAnsi="Consolas" w:eastAsia="Consolas"/>
+          <w:b w:val="0"/>
+          <w:sz w:val="18"/>
+        </w:rPr>
+        <w:t xml:space="preserve">    Θ                            （这族函数的形状/范围）</w:t>
+      </w:r>
+    </w:p>
+    <w:p>
+      <w:r>
+        <w:rPr>
+          <w:rFonts w:ascii="Consolas" w:hAnsi="Consolas" w:eastAsia="Consolas"/>
+          <w:b w:val="0"/>
+          <w:sz w:val="18"/>
+        </w:rPr>
+        <w:t>生命 = 一个会移动、会变形的 Θ，且 Θ 的更新规则属于 Θ 自己</w:t>
+      </w:r>
+    </w:p>
+    <w:p>
+      <w:r>
+        <w:rPr>
           <w:b w:val="0"/>
           <w:sz w:val="22"/>
         </w:rPr>
-        <w:t>记个体为 F = { f_θ : θ ∈ Θ }</w:t>
-      </w:r>
-    </w:p>
-    <w:p>
-      <w:r>
-        <w:rPr>
-          <w:b w:val="0"/>
-          <w:sz w:val="22"/>
-        </w:rPr>
-        <w:t>f_θ : 输入状态 → 行为          （族里的每一个函数）</w:t>
-      </w:r>
-    </w:p>
-    <w:p>
-      <w:r>
-        <w:rPr>
-          <w:b w:val="0"/>
-          <w:sz w:val="22"/>
-        </w:rPr>
-        <w:t>Θ                            （这族函数的形状/范围）</w:t>
-      </w:r>
-    </w:p>
-    <w:p>
-      <w:r>
-        <w:rPr>
-          <w:b w:val="0"/>
-          <w:sz w:val="22"/>
-        </w:rPr>
-        <w:t>生命 = 一个会移动、会变形的 Θ，且 Θ 的更新规则属于 Θ 自己</w:t>
-      </w:r>
-    </w:p>
-    <w:p>
-      <w:r>
-        <w:rPr>
-          <w:b w:val="0"/>
-          <w:sz w:val="22"/>
-        </w:rPr>
         <w:t>四个词，各对应四件事：</w:t>
       </w:r>
     </w:p>
-    <w:p>
-      <w:r>
-        <w:rPr>
-          <w:b w:val="0"/>
-          <w:sz w:val="22"/>
-        </w:rPr>
-        <w:t>| 词 | 含义 |</w:t>
-      </w:r>
-    </w:p>
-    <w:p>
-      <w:r>
-        <w:rPr>
-          <w:b w:val="0"/>
-          <w:sz w:val="22"/>
-        </w:rPr>
-        <w:t>|---|---|</w:t>
-      </w:r>
-    </w:p>
-    <w:p>
-      <w:r>
-        <w:rPr>
-          <w:b w:val="0"/>
-          <w:sz w:val="22"/>
-        </w:rPr>
-        <w:t>| 函数类（一族） | 不是一个固定函数，而是一整块行为谱 |</w:t>
-      </w:r>
-    </w:p>
-    <w:p>
-      <w:r>
-        <w:rPr>
-          <w:b w:val="0"/>
-          <w:sz w:val="22"/>
-        </w:rPr>
-        <w:t>| 会变化（动态） | 这族函数随时间移动、变形 |</w:t>
-      </w:r>
-    </w:p>
-    <w:p>
-      <w:r>
-        <w:rPr>
-          <w:b w:val="0"/>
-          <w:sz w:val="22"/>
-        </w:rPr>
-        <w:t>| 会自指 | 它怎么变的规则，也在它自己的记录里 |</w:t>
-      </w:r>
-    </w:p>
-    <w:p>
-      <w:r>
-        <w:rPr>
-          <w:b w:val="0"/>
-          <w:sz w:val="22"/>
-        </w:rPr>
-        <w:t>| 会自我维持 | 花代价维持自己的形状；收入靠压缩世界 |</w:t>
-      </w:r>
-    </w:p>
+    <w:tbl>
+      <w:tblPr>
+        <w:tblW w:type="auto" w:w="0"/>
+        <w:tblLook w:firstColumn="1" w:firstRow="1" w:lastColumn="0" w:lastRow="0" w:noHBand="0" w:noVBand="1" w:val="04A0"/>
+      </w:tblPr>
+      <w:tblGrid>
+        <w:gridCol w:w="4320"/>
+        <w:gridCol w:w="4320"/>
+      </w:tblGrid>
+      <w:tr>
+        <w:tc>
+          <w:tcPr>
+            <w:tcW w:type="dxa" w:w="4320"/>
+          </w:tcPr>
+          <w:p>
+            <w:r>
+              <w:rPr>
+                <w:sz w:val="18"/>
+              </w:rPr>
+              <w:t>词</w:t>
+            </w:r>
+          </w:p>
+        </w:tc>
+        <w:tc>
+          <w:tcPr>
+            <w:tcW w:type="dxa" w:w="4320"/>
+          </w:tcPr>
+          <w:p>
+            <w:r>
+              <w:rPr>
+                <w:sz w:val="18"/>
+              </w:rPr>
+              <w:t>含义</w:t>
+            </w:r>
+          </w:p>
+        </w:tc>
+      </w:tr>
+      <w:tr>
+        <w:tc>
+          <w:tcPr>
+            <w:tcW w:type="dxa" w:w="4320"/>
+          </w:tcPr>
+          <w:p>
+            <w:r>
+              <w:rPr>
+                <w:sz w:val="18"/>
+              </w:rPr>
+              <w:t>**函数类（一族）**</w:t>
+            </w:r>
+          </w:p>
+        </w:tc>
+        <w:tc>
+          <w:tcPr>
+            <w:tcW w:type="dxa" w:w="4320"/>
+          </w:tcPr>
+          <w:p>
+            <w:r>
+              <w:rPr>
+                <w:sz w:val="18"/>
+              </w:rPr>
+              <w:t>不是一个固定函数，而是一整块行为谱</w:t>
+            </w:r>
+          </w:p>
+        </w:tc>
+      </w:tr>
+      <w:tr>
+        <w:tc>
+          <w:tcPr>
+            <w:tcW w:type="dxa" w:w="4320"/>
+          </w:tcPr>
+          <w:p>
+            <w:r>
+              <w:rPr>
+                <w:sz w:val="18"/>
+              </w:rPr>
+              <w:t>**会变化（动态）**</w:t>
+            </w:r>
+          </w:p>
+        </w:tc>
+        <w:tc>
+          <w:tcPr>
+            <w:tcW w:type="dxa" w:w="4320"/>
+          </w:tcPr>
+          <w:p>
+            <w:r>
+              <w:rPr>
+                <w:sz w:val="18"/>
+              </w:rPr>
+              <w:t>这族函数随时间移动、变形</w:t>
+            </w:r>
+          </w:p>
+        </w:tc>
+      </w:tr>
+      <w:tr>
+        <w:tc>
+          <w:tcPr>
+            <w:tcW w:type="dxa" w:w="4320"/>
+          </w:tcPr>
+          <w:p>
+            <w:r>
+              <w:rPr>
+                <w:sz w:val="18"/>
+              </w:rPr>
+              <w:t>**会自指**</w:t>
+            </w:r>
+          </w:p>
+        </w:tc>
+        <w:tc>
+          <w:tcPr>
+            <w:tcW w:type="dxa" w:w="4320"/>
+          </w:tcPr>
+          <w:p>
+            <w:r>
+              <w:rPr>
+                <w:sz w:val="18"/>
+              </w:rPr>
+              <w:t>它怎么变的规则，也在它自己的记录里</w:t>
+            </w:r>
+          </w:p>
+        </w:tc>
+      </w:tr>
+      <w:tr>
+        <w:tc>
+          <w:tcPr>
+            <w:tcW w:type="dxa" w:w="4320"/>
+          </w:tcPr>
+          <w:p>
+            <w:r>
+              <w:rPr>
+                <w:sz w:val="18"/>
+              </w:rPr>
+              <w:t>**会自我维持**</w:t>
+            </w:r>
+          </w:p>
+        </w:tc>
+        <w:tc>
+          <w:tcPr>
+            <w:tcW w:type="dxa" w:w="4320"/>
+          </w:tcPr>
+          <w:p>
+            <w:r>
+              <w:rPr>
+                <w:sz w:val="18"/>
+              </w:rPr>
+              <w:t>花代价维持自己的形状；收入靠压缩世界</w:t>
+            </w:r>
+          </w:p>
+        </w:tc>
+      </w:tr>
+    </w:tbl>
     <w:p>
       <w:r>
         <w:rPr>
@@ -788,8 +919,9 @@
     <w:p>
       <w:r>
         <w:rPr>
-          <w:b w:val="0"/>
-          <w:sz w:val="22"/>
+          <w:rFonts w:ascii="Consolas" w:hAnsi="Consolas" w:eastAsia="Consolas"/>
+          <w:b w:val="0"/>
+          <w:sz w:val="18"/>
         </w:rPr>
         <w:t>一个函数 = 一个点          ⇒ 行为谱退化成一条轨迹 ⇒ 冻结即死</w:t>
       </w:r>
@@ -797,8 +929,9 @@
     <w:p>
       <w:r>
         <w:rPr>
-          <w:b w:val="0"/>
-          <w:sz w:val="22"/>
+          <w:rFonts w:ascii="Consolas" w:hAnsi="Consolas" w:eastAsia="Consolas"/>
+          <w:b w:val="0"/>
+          <w:sz w:val="18"/>
         </w:rPr>
         <w:t>一族函数 = 函数空间里一块区域 ⇒ 面对不同输入/状态有一整套响应 ⇒ 才是活的</w:t>
       </w:r>
@@ -824,8 +957,9 @@
     <w:p>
       <w:r>
         <w:rPr>
-          <w:b w:val="0"/>
-          <w:sz w:val="22"/>
+          <w:rFonts w:ascii="Consolas" w:hAnsi="Consolas" w:eastAsia="Consolas"/>
+          <w:b w:val="0"/>
+          <w:sz w:val="18"/>
         </w:rPr>
         <w:t>快：状态每一刻都在变（输入不同、内部状态不同）</w:t>
       </w:r>
@@ -833,8 +967,9 @@
     <w:p>
       <w:r>
         <w:rPr>
-          <w:b w:val="0"/>
-          <w:sz w:val="22"/>
+          <w:rFonts w:ascii="Consolas" w:hAnsi="Consolas" w:eastAsia="Consolas"/>
+          <w:b w:val="0"/>
+          <w:sz w:val="18"/>
         </w:rPr>
         <w:t>中：它用自己的误差改自己（自指层）——这是命门，缺了就退化成化石</w:t>
       </w:r>
@@ -842,8 +977,9 @@
     <w:p>
       <w:r>
         <w:rPr>
-          <w:b w:val="0"/>
-          <w:sz w:val="22"/>
+          <w:rFonts w:ascii="Consolas" w:hAnsi="Consolas" w:eastAsia="Consolas"/>
+          <w:b w:val="0"/>
+          <w:sz w:val="18"/>
         </w:rPr>
         <w:t>慢：这族函数的形状在代际之间被选择、变形、传递</w:t>
       </w:r>
@@ -860,8 +996,9 @@
     <w:p>
       <w:r>
         <w:rPr>
-          <w:b w:val="0"/>
-          <w:sz w:val="22"/>
+          <w:rFonts w:ascii="Consolas" w:hAnsi="Consolas" w:eastAsia="Consolas"/>
+          <w:b w:val="0"/>
+          <w:sz w:val="18"/>
         </w:rPr>
         <w:t>普通程序：代码在外，数据在内 ⇒ 程序不会因为运行而改变自己</w:t>
       </w:r>
@@ -869,8 +1006,9 @@
     <w:p>
       <w:r>
         <w:rPr>
-          <w:b w:val="0"/>
-          <w:sz w:val="22"/>
+          <w:rFonts w:ascii="Consolas" w:hAnsi="Consolas" w:eastAsia="Consolas"/>
+          <w:b w:val="0"/>
+          <w:sz w:val="18"/>
         </w:rPr>
         <w:t>生命：    更新规则本身是它自己记录的一部分</w:t>
       </w:r>
@@ -878,10 +1016,11 @@
     <w:p>
       <w:r>
         <w:rPr>
-          <w:b w:val="0"/>
-          <w:sz w:val="22"/>
-        </w:rPr>
-        <w:t>⇒ 拿掉外部更新代码，它仍能改自己</w:t>
+          <w:rFonts w:ascii="Consolas" w:hAnsi="Consolas" w:eastAsia="Consolas"/>
+          <w:b w:val="0"/>
+          <w:sz w:val="18"/>
+        </w:rPr>
+        <w:t xml:space="preserve">          ⇒ 拿掉外部更新代码，它仍能改自己</w:t>
       </w:r>
     </w:p>
     <w:p>
@@ -914,8 +1053,9 @@
     <w:p>
       <w:r>
         <w:rPr>
-          <w:b w:val="0"/>
-          <w:sz w:val="22"/>
+          <w:rFonts w:ascii="Consolas" w:hAnsi="Consolas" w:eastAsia="Consolas"/>
+          <w:b w:val="0"/>
+          <w:sz w:val="18"/>
         </w:rPr>
         <w:t>行为_d = G_θ(世界局部状态)</w:t>
       </w:r>
@@ -923,8 +1063,9 @@
     <w:p>
       <w:r>
         <w:rPr>
-          <w:b w:val="0"/>
-          <w:sz w:val="22"/>
+          <w:rFonts w:ascii="Consolas" w:hAnsi="Consolas" w:eastAsia="Consolas"/>
+          <w:b w:val="0"/>
+          <w:sz w:val="18"/>
         </w:rPr>
         <w:t>而 G_θ 自己也是世界状态的一部分（个体的状态属于 S_t）</w:t>
       </w:r>
@@ -932,8 +1073,9 @@
     <w:p>
       <w:r>
         <w:rPr>
-          <w:b w:val="0"/>
-          <w:sz w:val="22"/>
+          <w:rFonts w:ascii="Consolas" w:hAnsi="Consolas" w:eastAsia="Consolas"/>
+          <w:b w:val="0"/>
+          <w:sz w:val="18"/>
         </w:rPr>
         <w:t>⇒ 它要预测世界，就必然要预测包含自己的那部分世界</w:t>
       </w:r>
@@ -941,10 +1083,11 @@
     <w:p>
       <w:r>
         <w:rPr>
-          <w:b w:val="0"/>
-          <w:sz w:val="22"/>
-        </w:rPr>
-        <w:t>⇒ 自指不是外加的神秘性质，而是「嵌在函数里」的结构必然</w:t>
+          <w:rFonts w:ascii="Consolas" w:hAnsi="Consolas" w:eastAsia="Consolas"/>
+          <w:b w:val="0"/>
+          <w:sz w:val="18"/>
+        </w:rPr>
+        <w:t>⇒ **自指不是外加的神秘性质，而是「嵌在函数里」的结构必然**</w:t>
       </w:r>
     </w:p>
     <w:p>
@@ -968,10 +1111,40 @@
     <w:p>
       <w:r>
         <w:rPr>
+          <w:rFonts w:ascii="Consolas" w:hAnsi="Consolas" w:eastAsia="Consolas"/>
+          <w:b w:val="0"/>
+          <w:sz w:val="18"/>
+        </w:rPr>
+        <w:t>宇宙 = F（一个巨大的函数）</w:t>
+      </w:r>
+    </w:p>
+    <w:p>
+      <w:r>
+        <w:rPr>
+          <w:rFonts w:ascii="Consolas" w:hAnsi="Consolas" w:eastAsia="Consolas"/>
+          <w:b w:val="0"/>
+          <w:sz w:val="18"/>
+        </w:rPr>
+        <w:t xml:space="preserve">   ├─ 生命：会变化 ＋ 会自指 ＋ **会自我维持**</w:t>
+      </w:r>
+    </w:p>
+    <w:p>
+      <w:r>
+        <w:rPr>
+          <w:rFonts w:ascii="Consolas" w:hAnsi="Consolas" w:eastAsia="Consolas"/>
+          <w:b w:val="0"/>
+          <w:sz w:val="18"/>
+        </w:rPr>
+        <w:t xml:space="preserve">   └─ 环境：会变化（被世界推着变、也会反过来影响世界），但**不维持自己**</w:t>
+      </w:r>
+    </w:p>
+    <w:p>
+      <w:r>
+        <w:rPr>
           <w:b w:val="0"/>
           <w:sz w:val="22"/>
         </w:rPr>
-        <w:t>宇宙 = F（一个巨大的函数）</w:t>
+        <w:t>⇒ 生命与环境的唯一区别不是「谁更复杂」，而是：</w:t>
       </w:r>
     </w:p>
     <w:p>
@@ -980,7 +1153,7 @@
           <w:b w:val="0"/>
           <w:sz w:val="22"/>
         </w:rPr>
-        <w:t>├─ 生命：会变化 ＋ 会自指 ＋ 会自我维持</w:t>
+        <w:t>生命花代价维持自己的形状；环境不花这个代价，它只是被推着变。</w:t>
       </w:r>
     </w:p>
     <w:p>
@@ -989,41 +1162,15 @@
           <w:b w:val="0"/>
           <w:sz w:val="22"/>
         </w:rPr>
-        <w:t>└─ 环境：会变化（被世界推着变、也会反过来影响世界），但不维持自己</w:t>
-      </w:r>
-    </w:p>
-    <w:p>
-      <w:r>
-        <w:rPr>
-          <w:b w:val="0"/>
-          <w:sz w:val="22"/>
-        </w:rPr>
-        <w:t>⇒ 生命与环境的唯一区别不是「谁更复杂」，而是：</w:t>
-      </w:r>
-    </w:p>
-    <w:p>
-      <w:r>
-        <w:rPr>
-          <w:b w:val="0"/>
-          <w:sz w:val="22"/>
-        </w:rPr>
-        <w:t>生命花代价维持自己的形状；环境不花这个代价，它只是被推着变。</w:t>
-      </w:r>
-    </w:p>
-    <w:p>
-      <w:r>
-        <w:rPr>
-          <w:b w:val="0"/>
-          <w:sz w:val="22"/>
-        </w:rPr>
         <w:t>这也直接给出生命为什么需要「收入」：</w:t>
       </w:r>
     </w:p>
     <w:p>
       <w:r>
         <w:rPr>
-          <w:b w:val="0"/>
-          <w:sz w:val="22"/>
+          <w:rFonts w:ascii="Consolas" w:hAnsi="Consolas" w:eastAsia="Consolas"/>
+          <w:b w:val="0"/>
+          <w:sz w:val="18"/>
         </w:rPr>
         <w:t>自我维持要付代价（校验/修复/复制都是不可逆操作）</w:t>
       </w:r>
@@ -1031,8 +1178,9 @@
     <w:p>
       <w:r>
         <w:rPr>
-          <w:b w:val="0"/>
-          <w:sz w:val="22"/>
+          <w:rFonts w:ascii="Consolas" w:hAnsi="Consolas" w:eastAsia="Consolas"/>
+          <w:b w:val="0"/>
+          <w:sz w:val="18"/>
         </w:rPr>
         <w:t>⇒ 收入的唯一来源：压缩世界（匹配源分布）</w:t>
       </w:r>
@@ -1040,8 +1188,9 @@
     <w:p>
       <w:r>
         <w:rPr>
-          <w:b w:val="0"/>
-          <w:sz w:val="22"/>
+          <w:rFonts w:ascii="Consolas" w:hAnsi="Consolas" w:eastAsia="Consolas"/>
+          <w:b w:val="0"/>
+          <w:sz w:val="18"/>
         </w:rPr>
         <w:t>⇒ 若压缩没有盈余，自我维持付不起 ⇒ 生命不存在</w:t>
       </w:r>
@@ -1067,10 +1216,60 @@
     <w:p>
       <w:r>
         <w:rPr>
+          <w:rFonts w:ascii="Consolas" w:hAnsi="Consolas" w:eastAsia="Consolas"/>
+          <w:b w:val="0"/>
+          <w:sz w:val="18"/>
+        </w:rPr>
+        <w:t>宇宙 = F（一个巨大的函数）</w:t>
+      </w:r>
+    </w:p>
+    <w:p>
+      <w:r>
+        <w:rPr>
+          <w:rFonts w:ascii="Consolas" w:hAnsi="Consolas" w:eastAsia="Consolas"/>
+          <w:b w:val="0"/>
+          <w:sz w:val="18"/>
+        </w:rPr>
+        <w:t xml:space="preserve">   ↓ 内部自发涌现</w:t>
+      </w:r>
+    </w:p>
+    <w:p>
+      <w:r>
+        <w:rPr>
+          <w:rFonts w:ascii="Consolas" w:hAnsi="Consolas" w:eastAsia="Consolas"/>
+          <w:b w:val="0"/>
+          <w:sz w:val="18"/>
+        </w:rPr>
+        <w:t>结构 = 宇宙的某种局部「解压」（对宇宙的一个解释/一个可读的呈现）</w:t>
+      </w:r>
+    </w:p>
+    <w:p>
+      <w:r>
+        <w:rPr>
+          <w:rFonts w:ascii="Consolas" w:hAnsi="Consolas" w:eastAsia="Consolas"/>
+          <w:b w:val="0"/>
+          <w:sz w:val="18"/>
+        </w:rPr>
+        <w:t xml:space="preserve">   ├─ 会自我维持的  → 生命</w:t>
+      </w:r>
+    </w:p>
+    <w:p>
+      <w:r>
+        <w:rPr>
+          <w:rFonts w:ascii="Consolas" w:hAnsi="Consolas" w:eastAsia="Consolas"/>
+          <w:b w:val="0"/>
+          <w:sz w:val="18"/>
+        </w:rPr>
+        <w:t xml:space="preserve">   └─ 不自我维持的  → 环境</w:t>
+      </w:r>
+    </w:p>
+    <w:p>
+      <w:r>
+        <w:rPr>
           <w:b w:val="0"/>
           <w:sz w:val="22"/>
         </w:rPr>
-        <w:t>宇宙 = F（一个巨大的函数）</w:t>
+        <w:t>⇒ 环境 = 宇宙的一个局部解压（对宇宙的解释）；生命也是。</w:t>
       </w:r>
     </w:p>
     <w:p>
@@ -1079,7 +1278,7 @@
           <w:b w:val="0"/>
           <w:sz w:val="22"/>
         </w:rPr>
-        <w:t>↓ 内部自发涌现</w:t>
+        <w:t>⇒ 区别只在：生命自己维持这个解压的形状，环境不维持、只是被推着变。</w:t>
       </w:r>
     </w:p>
     <w:p>
@@ -1088,59 +1287,15 @@
           <w:b w:val="0"/>
           <w:sz w:val="22"/>
         </w:rPr>
-        <w:t>结构 = 宇宙的某种局部「解压」（对宇宙的一个解释/一个可读的呈现）</w:t>
-      </w:r>
-    </w:p>
-    <w:p>
-      <w:r>
-        <w:rPr>
-          <w:b w:val="0"/>
-          <w:sz w:val="22"/>
-        </w:rPr>
-        <w:t>├─ 会自我维持的  → 生命</w:t>
-      </w:r>
-    </w:p>
-    <w:p>
-      <w:r>
-        <w:rPr>
-          <w:b w:val="0"/>
-          <w:sz w:val="22"/>
-        </w:rPr>
-        <w:t>└─ 不自我维持的  → 环境</w:t>
-      </w:r>
-    </w:p>
-    <w:p>
-      <w:r>
-        <w:rPr>
-          <w:b w:val="0"/>
-          <w:sz w:val="22"/>
-        </w:rPr>
-        <w:t>⇒ 环境 = 宇宙的一个局部解压（对宇宙的解释）；生命也是。</w:t>
-      </w:r>
-    </w:p>
-    <w:p>
-      <w:r>
-        <w:rPr>
-          <w:b w:val="0"/>
-          <w:sz w:val="22"/>
-        </w:rPr>
-        <w:t>⇒ 区别只在：生命自己维持这个解压的形状，环境不维持、只是被推着变。</w:t>
-      </w:r>
-    </w:p>
-    <w:p>
-      <w:r>
-        <w:rPr>
-          <w:b w:val="0"/>
-          <w:sz w:val="22"/>
-        </w:rPr>
         <w:t>这带来一个关键的结构性结论：</w:t>
       </w:r>
     </w:p>
     <w:p>
       <w:r>
         <w:rPr>
-          <w:b w:val="0"/>
-          <w:sz w:val="22"/>
+          <w:rFonts w:ascii="Consolas" w:hAnsi="Consolas" w:eastAsia="Consolas"/>
+          <w:b w:val="0"/>
+          <w:sz w:val="18"/>
         </w:rPr>
         <w:t>生命并不直接面对宇宙函数 F</w:t>
       </w:r>
@@ -1148,8 +1303,9 @@
     <w:p>
       <w:r>
         <w:rPr>
-          <w:b w:val="0"/>
-          <w:sz w:val="22"/>
+          <w:rFonts w:ascii="Consolas" w:hAnsi="Consolas" w:eastAsia="Consolas"/>
+          <w:b w:val="0"/>
+          <w:sz w:val="18"/>
         </w:rPr>
         <w:t>⇒ 它面对的是「宇宙的一个局部解压」＝它的环境</w:t>
       </w:r>
@@ -1157,19 +1313,21 @@
     <w:p>
       <w:r>
         <w:rPr>
-          <w:b w:val="0"/>
-          <w:sz w:val="22"/>
-        </w:rPr>
-        <w:t>⇒ 生命对世界的理解，本质上是对宇宙的再解压（二次解压）</w:t>
-      </w:r>
-    </w:p>
-    <w:p>
-      <w:r>
-        <w:rPr>
-          <w:b w:val="0"/>
-          <w:sz w:val="22"/>
-        </w:rPr>
-        <w:t>＝在宇宙给出的局部解释之上，再压缩一层</w:t>
+          <w:rFonts w:ascii="Consolas" w:hAnsi="Consolas" w:eastAsia="Consolas"/>
+          <w:b w:val="0"/>
+          <w:sz w:val="18"/>
+        </w:rPr>
+        <w:t>⇒ 生命对世界的理解，本质上是**对宇宙的再解压**（二次解压）</w:t>
+      </w:r>
+    </w:p>
+    <w:p>
+      <w:r>
+        <w:rPr>
+          <w:rFonts w:ascii="Consolas" w:hAnsi="Consolas" w:eastAsia="Consolas"/>
+          <w:b w:val="0"/>
+          <w:sz w:val="18"/>
+        </w:rPr>
+        <w:t xml:space="preserve">  ＝在宇宙给出的局部解释之上，再压缩一层</w:t>
       </w:r>
     </w:p>
     <w:p>
@@ -1193,62 +1351,68 @@
     <w:p>
       <w:r>
         <w:rPr>
+          <w:rFonts w:ascii="Consolas" w:hAnsi="Consolas" w:eastAsia="Consolas"/>
+          <w:b w:val="0"/>
+          <w:sz w:val="18"/>
+        </w:rPr>
+        <w:t>宇宙 F</w:t>
+      </w:r>
+    </w:p>
+    <w:p>
+      <w:r>
+        <w:rPr>
+          <w:rFonts w:ascii="Consolas" w:hAnsi="Consolas" w:eastAsia="Consolas"/>
+          <w:b w:val="0"/>
+          <w:sz w:val="18"/>
+        </w:rPr>
+        <w:t xml:space="preserve"> └ 环境_1 = F 的某一部分的局部解压</w:t>
+      </w:r>
+    </w:p>
+    <w:p>
+      <w:r>
+        <w:rPr>
+          <w:rFonts w:ascii="Consolas" w:hAnsi="Consolas" w:eastAsia="Consolas"/>
+          <w:b w:val="0"/>
+          <w:sz w:val="18"/>
+        </w:rPr>
+        <w:t xml:space="preserve">     └ 环境_2 = 环境_1 的再解压</w:t>
+      </w:r>
+    </w:p>
+    <w:p>
+      <w:r>
+        <w:rPr>
+          <w:rFonts w:ascii="Consolas" w:hAnsi="Consolas" w:eastAsia="Consolas"/>
+          <w:b w:val="0"/>
+          <w:sz w:val="18"/>
+        </w:rPr>
+        <w:t xml:space="preserve">         └ 环境_3 = 环境_2 的再解压 …</w:t>
+      </w:r>
+    </w:p>
+    <w:p>
+      <w:r>
+        <w:rPr>
+          <w:rFonts w:ascii="Consolas" w:hAnsi="Consolas" w:eastAsia="Consolas"/>
+          <w:b w:val="0"/>
+          <w:sz w:val="18"/>
+        </w:rPr>
+        <w:t>生命嵌在某一层：它既属于整个宇宙 F，又属于它自己那一层环境</w:t>
+      </w:r>
+    </w:p>
+    <w:p>
+      <w:r>
+        <w:rPr>
           <w:b w:val="0"/>
           <w:sz w:val="22"/>
         </w:rPr>
-        <w:t>宇宙 F</w:t>
-      </w:r>
-    </w:p>
-    <w:p>
-      <w:r>
-        <w:rPr>
-          <w:b w:val="0"/>
-          <w:sz w:val="22"/>
-        </w:rPr>
-        <w:t>└ 环境_1 = F 的某一部分的局部解压</w:t>
-      </w:r>
-    </w:p>
-    <w:p>
-      <w:r>
-        <w:rPr>
-          <w:b w:val="0"/>
-          <w:sz w:val="22"/>
-        </w:rPr>
-        <w:t>└ 环境_2 = 环境_1 的再解压</w:t>
-      </w:r>
-    </w:p>
-    <w:p>
-      <w:r>
-        <w:rPr>
-          <w:b w:val="0"/>
-          <w:sz w:val="22"/>
-        </w:rPr>
-        <w:t>└ 环境_3 = 环境_2 的再解压 …</w:t>
-      </w:r>
-    </w:p>
-    <w:p>
-      <w:r>
-        <w:rPr>
-          <w:b w:val="0"/>
-          <w:sz w:val="22"/>
-        </w:rPr>
-        <w:t>生命嵌在某一层：它既属于整个宇宙 F，又属于它自己那一层环境</w:t>
-      </w:r>
-    </w:p>
-    <w:p>
-      <w:r>
-        <w:rPr>
-          <w:b w:val="0"/>
-          <w:sz w:val="22"/>
-        </w:rPr>
         <w:t>三条同时成立，不能只取一条：</w:t>
       </w:r>
     </w:p>
     <w:p>
       <w:r>
         <w:rPr>
-          <w:b w:val="0"/>
-          <w:sz w:val="22"/>
+          <w:rFonts w:ascii="Consolas" w:hAnsi="Consolas" w:eastAsia="Consolas"/>
+          <w:b w:val="0"/>
+          <w:sz w:val="18"/>
         </w:rPr>
         <w:t>① 它活在环境里：它面对的输入、资源、关系、其他个体，都是「它的环境」这一层的结构</w:t>
       </w:r>
@@ -1256,17 +1420,19 @@
     <w:p>
       <w:r>
         <w:rPr>
-          <w:b w:val="0"/>
-          <w:sz w:val="22"/>
-        </w:rPr>
-        <w:t>⇒ 它的行为只需要在这一层里有效</w:t>
-      </w:r>
-    </w:p>
-    <w:p>
-      <w:r>
-        <w:rPr>
-          <w:b w:val="0"/>
-          <w:sz w:val="22"/>
+          <w:rFonts w:ascii="Consolas" w:hAnsi="Consolas" w:eastAsia="Consolas"/>
+          <w:b w:val="0"/>
+          <w:sz w:val="18"/>
+        </w:rPr>
+        <w:t xml:space="preserve">                ⇒ 它的行为只需要在这一层里有效</w:t>
+      </w:r>
+    </w:p>
+    <w:p>
+      <w:r>
+        <w:rPr>
+          <w:rFonts w:ascii="Consolas" w:hAnsi="Consolas" w:eastAsia="Consolas"/>
+          <w:b w:val="0"/>
+          <w:sz w:val="18"/>
         </w:rPr>
         <w:t>② 它也活在宇宙里：它逃不出 F —— 环境那一层本身也是 F 的一部分，</w:t>
       </w:r>
@@ -1274,19 +1440,21 @@
     <w:p>
       <w:r>
         <w:rPr>
-          <w:b w:val="0"/>
-          <w:sz w:val="22"/>
-        </w:rPr>
-        <w:t>宇宙层的约束（能量、不可逆、代价）始终对它生效</w:t>
-      </w:r>
-    </w:p>
-    <w:p>
-      <w:r>
-        <w:rPr>
-          <w:b w:val="0"/>
-          <w:sz w:val="22"/>
-        </w:rPr>
-        <w:t>⇒ 环境不是避难所，它只是宇宙的一个投影</w:t>
+          <w:rFonts w:ascii="Consolas" w:hAnsi="Consolas" w:eastAsia="Consolas"/>
+          <w:b w:val="0"/>
+          <w:sz w:val="18"/>
+        </w:rPr>
+        <w:t xml:space="preserve">                宇宙层的约束（能量、不可逆、代价）始终对它生效</w:t>
+      </w:r>
+    </w:p>
+    <w:p>
+      <w:r>
+        <w:rPr>
+          <w:rFonts w:ascii="Consolas" w:hAnsi="Consolas" w:eastAsia="Consolas"/>
+          <w:b w:val="0"/>
+          <w:sz w:val="18"/>
+        </w:rPr>
+        <w:t xml:space="preserve">                ⇒ 环境不是避难所，它只是宇宙的一个投影</w:t>
       </w:r>
     </w:p>
     <w:p>
@@ -1355,44 +1523,49 @@
     <w:p>
       <w:r>
         <w:rPr>
-          <w:b w:val="0"/>
-          <w:sz w:val="22"/>
-        </w:rPr>
-        <w:t>[定义]  生命 = 会自指、会变化、会自我维持的动态函数类（本文的工作定义）</w:t>
-      </w:r>
-    </w:p>
-    <w:p>
-      <w:r>
-        <w:rPr>
-          <w:b w:val="0"/>
-          <w:sz w:val="22"/>
-        </w:rPr>
-        <w:t>[定义]  环境 = 宇宙函数类里自发涌现的结构，不自我维持</w:t>
-      </w:r>
-    </w:p>
-    <w:p>
-      <w:r>
-        <w:rPr>
-          <w:b w:val="0"/>
-          <w:sz w:val="22"/>
-        </w:rPr>
-        <w:t>＝ 宇宙的一个局部解压（对宇宙的解释）</w:t>
-      </w:r>
-    </w:p>
-    <w:p>
-      <w:r>
-        <w:rPr>
-          <w:b w:val="0"/>
-          <w:sz w:val="22"/>
-        </w:rPr>
-        <w:t>[定义]  生命 = 同一批涌现结构里，自己维持自己的那一类</w:t>
-      </w:r>
-    </w:p>
-    <w:p>
-      <w:r>
-        <w:rPr>
-          <w:b w:val="0"/>
-          <w:sz w:val="22"/>
+          <w:rFonts w:ascii="Consolas" w:hAnsi="Consolas" w:eastAsia="Consolas"/>
+          <w:b w:val="0"/>
+          <w:sz w:val="18"/>
+        </w:rPr>
+        <w:t>[定义]  生命 = 会自指、会变化、**会自我维持**的动态函数类（本文的工作定义）</w:t>
+      </w:r>
+    </w:p>
+    <w:p>
+      <w:r>
+        <w:rPr>
+          <w:rFonts w:ascii="Consolas" w:hAnsi="Consolas" w:eastAsia="Consolas"/>
+          <w:b w:val="0"/>
+          <w:sz w:val="18"/>
+        </w:rPr>
+        <w:t>[定义]  环境 = 宇宙函数类里**自发涌现**的结构，不自我维持</w:t>
+      </w:r>
+    </w:p>
+    <w:p>
+      <w:r>
+        <w:rPr>
+          <w:rFonts w:ascii="Consolas" w:hAnsi="Consolas" w:eastAsia="Consolas"/>
+          <w:b w:val="0"/>
+          <w:sz w:val="18"/>
+        </w:rPr>
+        <w:t xml:space="preserve">              ＝ 宇宙的一个**局部解压**（对宇宙的解释）</w:t>
+      </w:r>
+    </w:p>
+    <w:p>
+      <w:r>
+        <w:rPr>
+          <w:rFonts w:ascii="Consolas" w:hAnsi="Consolas" w:eastAsia="Consolas"/>
+          <w:b w:val="0"/>
+          <w:sz w:val="18"/>
+        </w:rPr>
+        <w:t>[定义]  生命 = 同一批涌现结构里，**自己维持自己**的那一类</w:t>
+      </w:r>
+    </w:p>
+    <w:p>
+      <w:r>
+        <w:rPr>
+          <w:rFonts w:ascii="Consolas" w:hAnsi="Consolas" w:eastAsia="Consolas"/>
+          <w:b w:val="0"/>
+          <w:sz w:val="18"/>
         </w:rPr>
         <w:t>[推论]  生命不直接面对宇宙，而面对「宇宙的局部解压」＝它的环境</w:t>
       </w:r>
@@ -1400,17 +1573,19 @@
     <w:p>
       <w:r>
         <w:rPr>
-          <w:b w:val="0"/>
-          <w:sz w:val="22"/>
-        </w:rPr>
-        <w:t>⇒ 生命的理解 = 在局部解压之上的二次解压（再压缩一层）</w:t>
-      </w:r>
-    </w:p>
-    <w:p>
-      <w:r>
-        <w:rPr>
-          <w:b w:val="0"/>
-          <w:sz w:val="22"/>
+          <w:rFonts w:ascii="Consolas" w:hAnsi="Consolas" w:eastAsia="Consolas"/>
+          <w:b w:val="0"/>
+          <w:sz w:val="18"/>
+        </w:rPr>
+        <w:t xml:space="preserve">        ⇒ 生命的理解 = 在局部解压之上的**二次解压**（再压缩一层）</w:t>
+      </w:r>
+    </w:p>
+    <w:p>
+      <w:r>
+        <w:rPr>
+          <w:rFonts w:ascii="Consolas" w:hAnsi="Consolas" w:eastAsia="Consolas"/>
+          <w:b w:val="0"/>
+          <w:sz w:val="18"/>
         </w:rPr>
         <w:t>[分层]  解压是分层的 ⇒ 环境是分层的（环境_1 ⊃ 环境_2 ⊃ …）</w:t>
       </w:r>
@@ -1418,35 +1593,39 @@
     <w:p>
       <w:r>
         <w:rPr>
-          <w:b w:val="0"/>
-          <w:sz w:val="22"/>
-        </w:rPr>
-        <w:t>生命嵌在某一层：既活在它的那一层环境里，也活在宇宙里</w:t>
-      </w:r>
-    </w:p>
-    <w:p>
-      <w:r>
-        <w:rPr>
-          <w:b w:val="0"/>
-          <w:sz w:val="22"/>
-        </w:rPr>
-        <w:t>· 活在这层环境：只需这层有效即可活</w:t>
-      </w:r>
-    </w:p>
-    <w:p>
-      <w:r>
-        <w:rPr>
-          <w:b w:val="0"/>
-          <w:sz w:val="22"/>
-        </w:rPr>
-        <w:t>· 活在宇宙里：能量/不可逆/代价始终生效，环境不是避难所</w:t>
-      </w:r>
-    </w:p>
-    <w:p>
-      <w:r>
-        <w:rPr>
-          <w:b w:val="0"/>
-          <w:sz w:val="22"/>
+          <w:rFonts w:ascii="Consolas" w:hAnsi="Consolas" w:eastAsia="Consolas"/>
+          <w:b w:val="0"/>
+          <w:sz w:val="18"/>
+        </w:rPr>
+        <w:t xml:space="preserve">        生命嵌在某一层：**既活在它的那一层环境里，也活在宇宙里**</w:t>
+      </w:r>
+    </w:p>
+    <w:p>
+      <w:r>
+        <w:rPr>
+          <w:rFonts w:ascii="Consolas" w:hAnsi="Consolas" w:eastAsia="Consolas"/>
+          <w:b w:val="0"/>
+          <w:sz w:val="18"/>
+        </w:rPr>
+        <w:t xml:space="preserve">        · 活在这层环境：只需这层有效即可活</w:t>
+      </w:r>
+    </w:p>
+    <w:p>
+      <w:r>
+        <w:rPr>
+          <w:rFonts w:ascii="Consolas" w:hAnsi="Consolas" w:eastAsia="Consolas"/>
+          <w:b w:val="0"/>
+          <w:sz w:val="18"/>
+        </w:rPr>
+        <w:t xml:space="preserve">        · 活在宇宙里：能量/不可逆/代价始终生效，环境不是避难所</w:t>
+      </w:r>
+    </w:p>
+    <w:p>
+      <w:r>
+        <w:rPr>
+          <w:rFonts w:ascii="Consolas" w:hAnsi="Consolas" w:eastAsia="Consolas"/>
+          <w:b w:val="0"/>
+          <w:sz w:val="18"/>
         </w:rPr>
         <w:t>[不是]  不是猜想，也不是定理；是一个便于操作的定义</w:t>
       </w:r>
@@ -1454,13 +1633,17 @@
     <w:p>
       <w:r>
         <w:rPr>
-          <w:b w:val="0"/>
-          <w:sz w:val="22"/>
+          <w:rFonts w:ascii="Consolas" w:hAnsi="Consolas" w:eastAsia="Consolas"/>
+          <w:b w:val="0"/>
+          <w:sz w:val="18"/>
         </w:rPr>
         <w:t>[后文]  本节只给定义；如何测量（压缩/代价/身份）留到后面几节</w:t>
       </w:r>
     </w:p>
     <w:p>
+      <w:pPr>
+        <w:jc w:val="center"/>
+      </w:pPr>
       <w:r>
         <w:rPr>
           <w:b/>
@@ -1505,87 +1688,345 @@
         <w:t>3.1 检查表</w:t>
       </w:r>
     </w:p>
-    <w:p>
-      <w:r>
-        <w:rPr>
-          <w:b w:val="0"/>
-          <w:sz w:val="22"/>
-        </w:rPr>
-        <w:t>| 生命的要求（第二节） | 目前的 AI（以 LLM 为代表） | 判定 |</w:t>
-      </w:r>
-    </w:p>
-    <w:p>
-      <w:r>
-        <w:rPr>
-          <w:b w:val="0"/>
-          <w:sz w:val="22"/>
-        </w:rPr>
-        <w:t>|---|---|---|</w:t>
-      </w:r>
-    </w:p>
-    <w:p>
-      <w:r>
-        <w:rPr>
-          <w:b w:val="0"/>
-          <w:sz w:val="22"/>
-        </w:rPr>
-        <w:t>| 是一族函数（函数空间里一块区域） | 训练完后权重冻结 ⇒ 是一个点，不是一个族 | ❌ 化石 |</w:t>
-      </w:r>
-    </w:p>
-    <w:p>
-      <w:r>
-        <w:rPr>
-          <w:b w:val="0"/>
-          <w:sz w:val="22"/>
-        </w:rPr>
-        <w:t>| 会变化（动态） | 权重不变；上下文在变，但改的是输入，不是它自己 | ❌ 只有表层状态变化 |</w:t>
-      </w:r>
-    </w:p>
-    <w:p>
-      <w:r>
-        <w:rPr>
-          <w:b w:val="0"/>
-          <w:sz w:val="22"/>
-        </w:rPr>
-        <w:t>| 会自指（更新规则在自己里面） | 更新规则 = 训练算法，在它外面；它不能改自己 | ❌ 自指只出现在语言里，不在结构里 |</w:t>
-      </w:r>
-    </w:p>
-    <w:p>
-      <w:r>
-        <w:rPr>
-          <w:b w:val="0"/>
-          <w:sz w:val="22"/>
-        </w:rPr>
-        <w:t>| 会自我维持（花代价维持自己） | 它不付电费、不修复自己、不复制自己；维持者是外部的人 | ❌ 由外部维持 |</w:t>
-      </w:r>
-    </w:p>
-    <w:p>
-      <w:r>
-        <w:rPr>
-          <w:b w:val="0"/>
-          <w:sz w:val="22"/>
-        </w:rPr>
-        <w:t>| 靠压缩世界挣存续代价 | 它的「收入」是外部给的（算力、数据、人力），不是它压缩世界换来的 | ❌ 无收入 |</w:t>
-      </w:r>
-    </w:p>
-    <w:p>
-      <w:r>
-        <w:rPr>
-          <w:b w:val="0"/>
-          <w:sz w:val="22"/>
-        </w:rPr>
-        <w:t>| 身份链条（有界变形、不撕裂） | 身份来自外部权重快照；没有自己变形的连续链条 | ❌ 无链条 |</w:t>
-      </w:r>
-    </w:p>
-    <w:p>
-      <w:r>
-        <w:rPr>
-          <w:b w:val="0"/>
-          <w:sz w:val="22"/>
-        </w:rPr>
-        <w:t>| 活在环境里 | 它面对的是数据集（一次性的解压产物），不是需要它生存的环境 | ❌ 无环境 |</w:t>
-      </w:r>
-    </w:p>
+    <w:tbl>
+      <w:tblPr>
+        <w:tblW w:type="auto" w:w="0"/>
+        <w:tblLook w:firstColumn="1" w:firstRow="1" w:lastColumn="0" w:lastRow="0" w:noHBand="0" w:noVBand="1" w:val="04A0"/>
+      </w:tblPr>
+      <w:tblGrid>
+        <w:gridCol w:w="2880"/>
+        <w:gridCol w:w="2880"/>
+        <w:gridCol w:w="2880"/>
+      </w:tblGrid>
+      <w:tr>
+        <w:tc>
+          <w:tcPr>
+            <w:tcW w:type="dxa" w:w="2880"/>
+          </w:tcPr>
+          <w:p>
+            <w:r>
+              <w:rPr>
+                <w:sz w:val="18"/>
+              </w:rPr>
+              <w:t>生命的要求（第二节）</w:t>
+            </w:r>
+          </w:p>
+        </w:tc>
+        <w:tc>
+          <w:tcPr>
+            <w:tcW w:type="dxa" w:w="2880"/>
+          </w:tcPr>
+          <w:p>
+            <w:r>
+              <w:rPr>
+                <w:sz w:val="18"/>
+              </w:rPr>
+              <w:t>目前的 AI（以 LLM 为代表）</w:t>
+            </w:r>
+          </w:p>
+        </w:tc>
+        <w:tc>
+          <w:tcPr>
+            <w:tcW w:type="dxa" w:w="2880"/>
+          </w:tcPr>
+          <w:p>
+            <w:r>
+              <w:rPr>
+                <w:sz w:val="18"/>
+              </w:rPr>
+              <w:t>判定</w:t>
+            </w:r>
+          </w:p>
+        </w:tc>
+      </w:tr>
+      <w:tr>
+        <w:tc>
+          <w:tcPr>
+            <w:tcW w:type="dxa" w:w="2880"/>
+          </w:tcPr>
+          <w:p>
+            <w:r>
+              <w:rPr>
+                <w:sz w:val="18"/>
+              </w:rPr>
+              <w:t>**是一族函数**（函数空间里一块区域）</w:t>
+            </w:r>
+          </w:p>
+        </w:tc>
+        <w:tc>
+          <w:tcPr>
+            <w:tcW w:type="dxa" w:w="2880"/>
+          </w:tcPr>
+          <w:p>
+            <w:r>
+              <w:rPr>
+                <w:sz w:val="18"/>
+              </w:rPr>
+              <w:t>训练完后权重冻结 ⇒ 是**一个点**，不是一个族</w:t>
+            </w:r>
+          </w:p>
+        </w:tc>
+        <w:tc>
+          <w:tcPr>
+            <w:tcW w:type="dxa" w:w="2880"/>
+          </w:tcPr>
+          <w:p>
+            <w:r>
+              <w:rPr>
+                <w:sz w:val="18"/>
+              </w:rPr>
+              <w:t>❌ 化石</w:t>
+            </w:r>
+          </w:p>
+        </w:tc>
+      </w:tr>
+      <w:tr>
+        <w:tc>
+          <w:tcPr>
+            <w:tcW w:type="dxa" w:w="2880"/>
+          </w:tcPr>
+          <w:p>
+            <w:r>
+              <w:rPr>
+                <w:sz w:val="18"/>
+              </w:rPr>
+              <w:t>**会变化（动态）**</w:t>
+            </w:r>
+          </w:p>
+        </w:tc>
+        <w:tc>
+          <w:tcPr>
+            <w:tcW w:type="dxa" w:w="2880"/>
+          </w:tcPr>
+          <w:p>
+            <w:r>
+              <w:rPr>
+                <w:sz w:val="18"/>
+              </w:rPr>
+              <w:t>权重不变；上下文在变，但改的是输入，不是它自己</w:t>
+            </w:r>
+          </w:p>
+        </w:tc>
+        <w:tc>
+          <w:tcPr>
+            <w:tcW w:type="dxa" w:w="2880"/>
+          </w:tcPr>
+          <w:p>
+            <w:r>
+              <w:rPr>
+                <w:sz w:val="18"/>
+              </w:rPr>
+              <w:t>❌ 只有表层状态变化</w:t>
+            </w:r>
+          </w:p>
+        </w:tc>
+      </w:tr>
+      <w:tr>
+        <w:tc>
+          <w:tcPr>
+            <w:tcW w:type="dxa" w:w="2880"/>
+          </w:tcPr>
+          <w:p>
+            <w:r>
+              <w:rPr>
+                <w:sz w:val="18"/>
+              </w:rPr>
+              <w:t>**会自指**（更新规则在自己里面）</w:t>
+            </w:r>
+          </w:p>
+        </w:tc>
+        <w:tc>
+          <w:tcPr>
+            <w:tcW w:type="dxa" w:w="2880"/>
+          </w:tcPr>
+          <w:p>
+            <w:r>
+              <w:rPr>
+                <w:sz w:val="18"/>
+              </w:rPr>
+              <w:t>更新规则 = 训练算法，在它外面；它不能改自己</w:t>
+            </w:r>
+          </w:p>
+        </w:tc>
+        <w:tc>
+          <w:tcPr>
+            <w:tcW w:type="dxa" w:w="2880"/>
+          </w:tcPr>
+          <w:p>
+            <w:r>
+              <w:rPr>
+                <w:sz w:val="18"/>
+              </w:rPr>
+              <w:t>❌ 自指只出现在语言里，不在结构里</w:t>
+            </w:r>
+          </w:p>
+        </w:tc>
+      </w:tr>
+      <w:tr>
+        <w:tc>
+          <w:tcPr>
+            <w:tcW w:type="dxa" w:w="2880"/>
+          </w:tcPr>
+          <w:p>
+            <w:r>
+              <w:rPr>
+                <w:sz w:val="18"/>
+              </w:rPr>
+              <w:t>**会自我维持**（花代价维持自己）</w:t>
+            </w:r>
+          </w:p>
+        </w:tc>
+        <w:tc>
+          <w:tcPr>
+            <w:tcW w:type="dxa" w:w="2880"/>
+          </w:tcPr>
+          <w:p>
+            <w:r>
+              <w:rPr>
+                <w:sz w:val="18"/>
+              </w:rPr>
+              <w:t>它不付电费、不修复自己、不复制自己；维持者是外部的人</w:t>
+            </w:r>
+          </w:p>
+        </w:tc>
+        <w:tc>
+          <w:tcPr>
+            <w:tcW w:type="dxa" w:w="2880"/>
+          </w:tcPr>
+          <w:p>
+            <w:r>
+              <w:rPr>
+                <w:sz w:val="18"/>
+              </w:rPr>
+              <w:t>❌ 由外部维持</w:t>
+            </w:r>
+          </w:p>
+        </w:tc>
+      </w:tr>
+      <w:tr>
+        <w:tc>
+          <w:tcPr>
+            <w:tcW w:type="dxa" w:w="2880"/>
+          </w:tcPr>
+          <w:p>
+            <w:r>
+              <w:rPr>
+                <w:sz w:val="18"/>
+              </w:rPr>
+              <w:t>**靠压缩世界挣存续代价**</w:t>
+            </w:r>
+          </w:p>
+        </w:tc>
+        <w:tc>
+          <w:tcPr>
+            <w:tcW w:type="dxa" w:w="2880"/>
+          </w:tcPr>
+          <w:p>
+            <w:r>
+              <w:rPr>
+                <w:sz w:val="18"/>
+              </w:rPr>
+              <w:t>它的「收入」是外部给的（算力、数据、人力），不是它压缩世界换来的</w:t>
+            </w:r>
+          </w:p>
+        </w:tc>
+        <w:tc>
+          <w:tcPr>
+            <w:tcW w:type="dxa" w:w="2880"/>
+          </w:tcPr>
+          <w:p>
+            <w:r>
+              <w:rPr>
+                <w:sz w:val="18"/>
+              </w:rPr>
+              <w:t>❌ 无收入</w:t>
+            </w:r>
+          </w:p>
+        </w:tc>
+      </w:tr>
+      <w:tr>
+        <w:tc>
+          <w:tcPr>
+            <w:tcW w:type="dxa" w:w="2880"/>
+          </w:tcPr>
+          <w:p>
+            <w:r>
+              <w:rPr>
+                <w:sz w:val="18"/>
+              </w:rPr>
+              <w:t>**身份链条**（有界变形、不撕裂）</w:t>
+            </w:r>
+          </w:p>
+        </w:tc>
+        <w:tc>
+          <w:tcPr>
+            <w:tcW w:type="dxa" w:w="2880"/>
+          </w:tcPr>
+          <w:p>
+            <w:r>
+              <w:rPr>
+                <w:sz w:val="18"/>
+              </w:rPr>
+              <w:t>身份来自外部权重快照；没有自己变形的连续链条</w:t>
+            </w:r>
+          </w:p>
+        </w:tc>
+        <w:tc>
+          <w:tcPr>
+            <w:tcW w:type="dxa" w:w="2880"/>
+          </w:tcPr>
+          <w:p>
+            <w:r>
+              <w:rPr>
+                <w:sz w:val="18"/>
+              </w:rPr>
+              <w:t>❌ 无链条</w:t>
+            </w:r>
+          </w:p>
+        </w:tc>
+      </w:tr>
+      <w:tr>
+        <w:tc>
+          <w:tcPr>
+            <w:tcW w:type="dxa" w:w="2880"/>
+          </w:tcPr>
+          <w:p>
+            <w:r>
+              <w:rPr>
+                <w:sz w:val="18"/>
+              </w:rPr>
+              <w:t>**活在环境里**</w:t>
+            </w:r>
+          </w:p>
+        </w:tc>
+        <w:tc>
+          <w:tcPr>
+            <w:tcW w:type="dxa" w:w="2880"/>
+          </w:tcPr>
+          <w:p>
+            <w:r>
+              <w:rPr>
+                <w:sz w:val="18"/>
+              </w:rPr>
+              <w:t>它面对的是数据集（一次性的解压产物），不是需要它生存的环境</w:t>
+            </w:r>
+          </w:p>
+        </w:tc>
+        <w:tc>
+          <w:tcPr>
+            <w:tcW w:type="dxa" w:w="2880"/>
+          </w:tcPr>
+          <w:p>
+            <w:r>
+              <w:rPr>
+                <w:sz w:val="18"/>
+              </w:rPr>
+              <w:t>❌ 无环境</w:t>
+            </w:r>
+          </w:p>
+        </w:tc>
+      </w:tr>
+    </w:tbl>
     <w:p>
       <w:r>
         <w:rPr>
@@ -1607,10 +2048,80 @@
     <w:p>
       <w:r>
         <w:rPr>
+          <w:rFonts w:ascii="Consolas" w:hAnsi="Consolas" w:eastAsia="Consolas"/>
+          <w:b w:val="0"/>
+          <w:sz w:val="18"/>
+        </w:rPr>
+        <w:t>训练完 = 冻结 = 函数空间里的一个点</w:t>
+      </w:r>
+    </w:p>
+    <w:p>
+      <w:r>
+        <w:rPr>
+          <w:rFonts w:ascii="Consolas" w:hAnsi="Consolas" w:eastAsia="Consolas"/>
+          <w:b w:val="0"/>
+          <w:sz w:val="18"/>
+        </w:rPr>
+        <w:t>⇒ 行为谱退化成一条轨迹：输入 → 输出，中间没有「形状」可言</w:t>
+      </w:r>
+    </w:p>
+    <w:p>
+      <w:r>
+        <w:rPr>
+          <w:rFonts w:ascii="Consolas" w:hAnsi="Consolas" w:eastAsia="Consolas"/>
+          <w:b w:val="0"/>
+          <w:sz w:val="18"/>
+        </w:rPr>
+        <w:t>⇒ 按 074：静态冻结的模型是一点，不是一族 ⇒ 不是生命</w:t>
+      </w:r>
+    </w:p>
+    <w:p>
+      <w:r>
+        <w:rPr>
+          <w:rFonts w:ascii="Consolas" w:hAnsi="Consolas" w:eastAsia="Consolas"/>
+          <w:b w:val="0"/>
+          <w:sz w:val="18"/>
+        </w:rPr>
+        <w:t>（这正是我们实测过的对照：冻结版 1.07 vs 动态版 0.849 —— 冻结更像「标准答案」，但没有形状）</w:t>
+      </w:r>
+    </w:p>
+    <w:p>
+      <w:r>
+        <w:rPr>
           <w:b w:val="0"/>
           <w:sz w:val="22"/>
         </w:rPr>
-        <w:t>训练完 = 冻结 = 函数空间里的一个点</w:t>
+        <w:t>② 它的更新规则在外面</w:t>
+      </w:r>
+    </w:p>
+    <w:p>
+      <w:r>
+        <w:rPr>
+          <w:rFonts w:ascii="Consolas" w:hAnsi="Consolas" w:eastAsia="Consolas"/>
+          <w:b w:val="0"/>
+          <w:sz w:val="18"/>
+        </w:rPr>
+        <w:t>人写训练算法 → 算法改它</w:t>
+      </w:r>
+    </w:p>
+    <w:p>
+      <w:r>
+        <w:rPr>
+          <w:rFonts w:ascii="Consolas" w:hAnsi="Consolas" w:eastAsia="Consolas"/>
+          <w:b w:val="0"/>
+          <w:sz w:val="18"/>
+        </w:rPr>
+        <w:t>⇒ 它是「被改的东西」，不是「改自己的东西」</w:t>
+      </w:r>
+    </w:p>
+    <w:p>
+      <w:r>
+        <w:rPr>
+          <w:rFonts w:ascii="Consolas" w:hAnsi="Consolas" w:eastAsia="Consolas"/>
+          <w:b w:val="0"/>
+          <w:sz w:val="18"/>
+        </w:rPr>
+        <w:t>⇒ 自指不在结构里 ⇒ 拿掉外部更新代码，它什么都不会改</w:t>
       </w:r>
     </w:p>
     <w:p>
@@ -1619,77 +2130,15 @@
           <w:b w:val="0"/>
           <w:sz w:val="22"/>
         </w:rPr>
-        <w:t>⇒ 行为谱退化成一条轨迹：输入 → 输出，中间没有「形状」可言</w:t>
-      </w:r>
-    </w:p>
-    <w:p>
-      <w:r>
-        <w:rPr>
-          <w:b w:val="0"/>
-          <w:sz w:val="22"/>
-        </w:rPr>
-        <w:t>⇒ 按 074：静态冻结的模型是一点，不是一族 ⇒ 不是生命</w:t>
-      </w:r>
-    </w:p>
-    <w:p>
-      <w:r>
-        <w:rPr>
-          <w:b w:val="0"/>
-          <w:sz w:val="22"/>
-        </w:rPr>
-        <w:t>（这正是我们实测过的对照：冻结版 1.07 vs 动态版 0.849 —— 冻结更像「标准答案」，但没有形状）</w:t>
-      </w:r>
-    </w:p>
-    <w:p>
-      <w:r>
-        <w:rPr>
-          <w:b w:val="0"/>
-          <w:sz w:val="22"/>
-        </w:rPr>
-        <w:t>② 它的更新规则在外面</w:t>
-      </w:r>
-    </w:p>
-    <w:p>
-      <w:r>
-        <w:rPr>
-          <w:b w:val="0"/>
-          <w:sz w:val="22"/>
-        </w:rPr>
-        <w:t>人写训练算法 → 算法改它</w:t>
-      </w:r>
-    </w:p>
-    <w:p>
-      <w:r>
-        <w:rPr>
-          <w:b w:val="0"/>
-          <w:sz w:val="22"/>
-        </w:rPr>
-        <w:t>⇒ 它是「被改的东西」，不是「改自己的东西」</w:t>
-      </w:r>
-    </w:p>
-    <w:p>
-      <w:r>
-        <w:rPr>
-          <w:b w:val="0"/>
-          <w:sz w:val="22"/>
-        </w:rPr>
-        <w:t>⇒ 自指不在结构里 ⇒ 拿掉外部更新代码，它什么都不会改</w:t>
-      </w:r>
-    </w:p>
-    <w:p>
-      <w:r>
-        <w:rPr>
-          <w:b w:val="0"/>
-          <w:sz w:val="22"/>
-        </w:rPr>
         <w:t>③ 它不付代价，所以不是活着</w:t>
       </w:r>
     </w:p>
     <w:p>
       <w:r>
         <w:rPr>
-          <w:b w:val="0"/>
-          <w:sz w:val="22"/>
+          <w:rFonts w:ascii="Consolas" w:hAnsi="Consolas" w:eastAsia="Consolas"/>
+          <w:b w:val="0"/>
+          <w:sz w:val="18"/>
         </w:rPr>
         <w:t>活着是代价：维持、校验、修复、复制都要付费（不可逆操作）</w:t>
       </w:r>
@@ -1697,8 +2146,9 @@
     <w:p>
       <w:r>
         <w:rPr>
-          <w:b w:val="0"/>
-          <w:sz w:val="22"/>
+          <w:rFonts w:ascii="Consolas" w:hAnsi="Consolas" w:eastAsia="Consolas"/>
+          <w:b w:val="0"/>
+          <w:sz w:val="18"/>
         </w:rPr>
         <w:t>它一分钱不付：电费是人付的、数据是人喂的、坏了是人修的</w:t>
       </w:r>
@@ -1706,8 +2156,9 @@
     <w:p>
       <w:r>
         <w:rPr>
-          <w:b w:val="0"/>
-          <w:sz w:val="22"/>
+          <w:rFonts w:ascii="Consolas" w:hAnsi="Consolas" w:eastAsia="Consolas"/>
+          <w:b w:val="0"/>
+          <w:sz w:val="18"/>
         </w:rPr>
         <w:t>⇒ 它的存在由外部保障 ⇒ 没有「自我维持」这一环</w:t>
       </w:r>
@@ -1715,8 +2166,9 @@
     <w:p>
       <w:r>
         <w:rPr>
-          <w:b w:val="0"/>
-          <w:sz w:val="22"/>
+          <w:rFonts w:ascii="Consolas" w:hAnsi="Consolas" w:eastAsia="Consolas"/>
+          <w:b w:val="0"/>
+          <w:sz w:val="18"/>
         </w:rPr>
         <w:t>⇒ 它不可能因为「压缩得不够好」而死亡 ⇒ 也就没有选择的压力</w:t>
       </w:r>
@@ -1733,8 +2185,9 @@
     <w:p>
       <w:r>
         <w:rPr>
-          <w:b w:val="0"/>
-          <w:sz w:val="22"/>
+          <w:rFonts w:ascii="Consolas" w:hAnsi="Consolas" w:eastAsia="Consolas"/>
+          <w:b w:val="0"/>
+          <w:sz w:val="18"/>
         </w:rPr>
         <w:t>强 = 在给定任务上的表现好（一个点上做得好）</w:t>
       </w:r>
@@ -1742,8 +2195,9 @@
     <w:p>
       <w:r>
         <w:rPr>
-          <w:b w:val="0"/>
-          <w:sz w:val="22"/>
+          <w:rFonts w:ascii="Consolas" w:hAnsi="Consolas" w:eastAsia="Consolas"/>
+          <w:b w:val="0"/>
+          <w:sz w:val="18"/>
         </w:rPr>
         <w:t>活 = 在函数空间里占据一块区域、自己维持形状、自己付代价</w:t>
       </w:r>
@@ -1751,8 +2205,9 @@
     <w:p>
       <w:r>
         <w:rPr>
-          <w:b w:val="0"/>
-          <w:sz w:val="22"/>
+          <w:rFonts w:ascii="Consolas" w:hAnsi="Consolas" w:eastAsia="Consolas"/>
+          <w:b w:val="0"/>
+          <w:sz w:val="18"/>
         </w:rPr>
         <w:t>⇒ 两者是不同维度：一个是「考卷分数」，一个是「能不能自己活」</w:t>
       </w:r>
@@ -1760,10 +2215,11 @@
     <w:p>
       <w:r>
         <w:rPr>
-          <w:b w:val="0"/>
-          <w:sz w:val="22"/>
-        </w:rPr>
-        <w:t>⇒ 目前的 AI 是极其锋利的工具，不是会自己活的东西</w:t>
+          <w:rFonts w:ascii="Consolas" w:hAnsi="Consolas" w:eastAsia="Consolas"/>
+          <w:b w:val="0"/>
+          <w:sz w:val="18"/>
+        </w:rPr>
+        <w:t>⇒ 目前的 AI 是**极其锋利的工具**，不是**会自己活的东西**</w:t>
       </w:r>
     </w:p>
     <w:p>
@@ -1778,8 +2234,9 @@
     <w:p>
       <w:r>
         <w:rPr>
-          <w:b w:val="0"/>
-          <w:sz w:val="22"/>
+          <w:rFonts w:ascii="Consolas" w:hAnsi="Consolas" w:eastAsia="Consolas"/>
+          <w:b w:val="0"/>
+          <w:sz w:val="18"/>
         </w:rPr>
         <w:t>[定义性结论] 以本文定义，目前的 AI 不是生命（因为它是一个冻结的函数点、更新在外部、不自我维持）</w:t>
       </w:r>
@@ -1787,8 +2244,9 @@
     <w:p>
       <w:r>
         <w:rPr>
-          <w:b w:val="0"/>
-          <w:sz w:val="22"/>
+          <w:rFonts w:ascii="Consolas" w:hAnsi="Consolas" w:eastAsia="Consolas"/>
+          <w:b w:val="0"/>
+          <w:sz w:val="18"/>
         </w:rPr>
         <w:t>[不是] 不是「AI 永远不能是生命」；本文不预言未来，只做当下的定义对照</w:t>
       </w:r>
@@ -1796,8 +2254,9 @@
     <w:p>
       <w:r>
         <w:rPr>
-          <w:b w:val="0"/>
-          <w:sz w:val="22"/>
+          <w:rFonts w:ascii="Consolas" w:hAnsi="Consolas" w:eastAsia="Consolas"/>
+          <w:b w:val="0"/>
+          <w:sz w:val="18"/>
         </w:rPr>
         <w:t>[不是] 不是能力评价；本文完全承认 AI 在任务上的强大</w:t>
       </w:r>
@@ -1805,13 +2264,17 @@
     <w:p>
       <w:r>
         <w:rPr>
-          <w:b w:val="0"/>
-          <w:sz w:val="22"/>
+          <w:rFonts w:ascii="Consolas" w:hAnsi="Consolas" w:eastAsia="Consolas"/>
+          <w:b w:val="0"/>
+          <w:sz w:val="18"/>
         </w:rPr>
         <w:t>[推论] 若要让 AI 成为生命，至少要给它：一族函数 + 自指更新 + 自己付代价</w:t>
       </w:r>
     </w:p>
     <w:p>
+      <w:pPr>
+        <w:jc w:val="center"/>
+      </w:pPr>
       <w:r>
         <w:rPr>
           <w:b/>
@@ -1859,8 +2322,9 @@
     <w:p>
       <w:r>
         <w:rPr>
-          <w:b w:val="0"/>
-          <w:sz w:val="22"/>
+          <w:rFonts w:ascii="Consolas" w:hAnsi="Consolas" w:eastAsia="Consolas"/>
+          <w:b w:val="0"/>
+          <w:sz w:val="18"/>
         </w:rPr>
         <w:t>定义（第二节）          必要条件（本节）</w:t>
       </w:r>
@@ -1868,8 +2332,9 @@
     <w:p>
       <w:r>
         <w:rPr>
-          <w:b w:val="0"/>
-          <w:sz w:val="22"/>
+          <w:rFonts w:ascii="Consolas" w:hAnsi="Consolas" w:eastAsia="Consolas"/>
+          <w:b w:val="0"/>
+          <w:sz w:val="18"/>
         </w:rPr>
         <w:t>会变化（一族函数）   ⇒  ① 一族函数：行为谱不是一点</w:t>
       </w:r>
@@ -1877,8 +2342,9 @@
     <w:p>
       <w:r>
         <w:rPr>
-          <w:b w:val="0"/>
-          <w:sz w:val="22"/>
+          <w:rFonts w:ascii="Consolas" w:hAnsi="Consolas" w:eastAsia="Consolas"/>
+          <w:b w:val="0"/>
+          <w:sz w:val="18"/>
         </w:rPr>
         <w:t>会自指               ⇒  ② 自指更新：改自己的规则在自己里面</w:t>
       </w:r>
@@ -1886,8 +2352,9 @@
     <w:p>
       <w:r>
         <w:rPr>
-          <w:b w:val="0"/>
-          <w:sz w:val="22"/>
+          <w:rFonts w:ascii="Consolas" w:hAnsi="Consolas" w:eastAsia="Consolas"/>
+          <w:b w:val="0"/>
+          <w:sz w:val="18"/>
         </w:rPr>
         <w:t>会自我维持           ⇒  ③ 自己付代价：压缩收益 ≥ 维持成本</w:t>
       </w:r>
@@ -1931,8 +2398,9 @@
     <w:p>
       <w:r>
         <w:rPr>
-          <w:b w:val="0"/>
-          <w:sz w:val="22"/>
+          <w:rFonts w:ascii="Consolas" w:hAnsi="Consolas" w:eastAsia="Consolas"/>
+          <w:b w:val="0"/>
+          <w:sz w:val="18"/>
         </w:rPr>
         <w:t>· 低维参数基因组（几个数）= 一个点 ⇒ 行为谱退化成单条轨迹 ⇒ 化石</w:t>
       </w:r>
@@ -1940,8 +2408,9 @@
     <w:p>
       <w:r>
         <w:rPr>
-          <w:b w:val="0"/>
-          <w:sz w:val="22"/>
+          <w:rFonts w:ascii="Consolas" w:hAnsi="Consolas" w:eastAsia="Consolas"/>
+          <w:b w:val="0"/>
+          <w:sz w:val="18"/>
         </w:rPr>
         <w:t>· 我们测过：冻结版模型（点）在结构学习上失败，动态版（族）才吃到结构（E12）</w:t>
       </w:r>
@@ -1949,8 +2418,9 @@
     <w:p>
       <w:r>
         <w:rPr>
-          <w:b w:val="0"/>
-          <w:sz w:val="22"/>
+          <w:rFonts w:ascii="Consolas" w:hAnsi="Consolas" w:eastAsia="Consolas"/>
+          <w:b w:val="0"/>
+          <w:sz w:val="18"/>
         </w:rPr>
         <w:t>· 实测对照：冻结 1.07 vs 动态 0.849 —— 冻结更像「标准答案」，但没有形状</w:t>
       </w:r>
@@ -1994,8 +2464,9 @@
     <w:p>
       <w:r>
         <w:rPr>
-          <w:b w:val="0"/>
-          <w:sz w:val="22"/>
+          <w:rFonts w:ascii="Consolas" w:hAnsi="Consolas" w:eastAsia="Consolas"/>
+          <w:b w:val="0"/>
+          <w:sz w:val="18"/>
         </w:rPr>
         <w:t>· 冻结模型：更新规则 = 训练算法，在外部 ⇒ 拿掉训练代码，它永远不变</w:t>
       </w:r>
@@ -2003,8 +2474,9 @@
     <w:p>
       <w:r>
         <w:rPr>
-          <w:b w:val="0"/>
-          <w:sz w:val="22"/>
+          <w:rFonts w:ascii="Consolas" w:hAnsi="Consolas" w:eastAsia="Consolas"/>
+          <w:b w:val="0"/>
+          <w:sz w:val="18"/>
         </w:rPr>
         <w:t>· 我们的动态版：用自己的误差改自己（中层动态）⇒ 去掉中层明显退化（E12/E13）</w:t>
       </w:r>
@@ -2012,8 +2484,9 @@
     <w:p>
       <w:r>
         <w:rPr>
-          <w:b w:val="0"/>
-          <w:sz w:val="22"/>
+          <w:rFonts w:ascii="Consolas" w:hAnsi="Consolas" w:eastAsia="Consolas"/>
+          <w:b w:val="0"/>
+          <w:sz w:val="18"/>
         </w:rPr>
         <w:t>· 身份链：8 代可校验、有界变形（372_lineage.py）⇒ 自指可以做成可测的链条</w:t>
       </w:r>
@@ -2048,53 +2521,58 @@
     <w:p>
       <w:r>
         <w:rPr>
+          <w:rFonts w:ascii="Consolas" w:hAnsi="Consolas" w:eastAsia="Consolas"/>
+          <w:b w:val="0"/>
+          <w:sz w:val="18"/>
+        </w:rPr>
+        <w:t>存在条件：S &gt; d·K</w:t>
+      </w:r>
+    </w:p>
+    <w:p>
+      <w:r>
+        <w:rPr>
+          <w:rFonts w:ascii="Consolas" w:hAnsi="Consolas" w:eastAsia="Consolas"/>
+          <w:b w:val="0"/>
+          <w:sz w:val="18"/>
+        </w:rPr>
+        <w:t xml:space="preserve">   S = 世界的可压缩盈余</w:t>
+      </w:r>
+    </w:p>
+    <w:p>
+      <w:r>
+        <w:rPr>
+          <w:rFonts w:ascii="Consolas" w:hAnsi="Consolas" w:eastAsia="Consolas"/>
+          <w:b w:val="0"/>
+          <w:sz w:val="18"/>
+        </w:rPr>
+        <w:t xml:space="preserve">   d = 结构维持成本率</w:t>
+      </w:r>
+    </w:p>
+    <w:p>
+      <w:r>
+        <w:rPr>
+          <w:rFonts w:ascii="Consolas" w:hAnsi="Consolas" w:eastAsia="Consolas"/>
+          <w:b w:val="0"/>
+          <w:sz w:val="18"/>
+        </w:rPr>
+        <w:t xml:space="preserve">   K = 结构规模</w:t>
+      </w:r>
+    </w:p>
+    <w:p>
+      <w:r>
+        <w:rPr>
           <w:b w:val="0"/>
           <w:sz w:val="22"/>
         </w:rPr>
-        <w:t>存在条件：S &gt; d·K</w:t>
-      </w:r>
-    </w:p>
-    <w:p>
-      <w:r>
-        <w:rPr>
-          <w:b w:val="0"/>
-          <w:sz w:val="22"/>
-        </w:rPr>
-        <w:t>S = 世界的可压缩盈余</w:t>
-      </w:r>
-    </w:p>
-    <w:p>
-      <w:r>
-        <w:rPr>
-          <w:b w:val="0"/>
-          <w:sz w:val="22"/>
-        </w:rPr>
-        <w:t>d = 结构维持成本率</w:t>
-      </w:r>
-    </w:p>
-    <w:p>
-      <w:r>
-        <w:rPr>
-          <w:b w:val="0"/>
-          <w:sz w:val="22"/>
-        </w:rPr>
-        <w:t>K = 结构规模</w:t>
-      </w:r>
-    </w:p>
-    <w:p>
-      <w:r>
-        <w:rPr>
-          <w:b w:val="0"/>
-          <w:sz w:val="22"/>
-        </w:rPr>
         <w:t>证据/经验（这是本文最硬的部分）：</w:t>
       </w:r>
     </w:p>
     <w:p>
       <w:r>
         <w:rPr>
-          <w:b w:val="0"/>
-          <w:sz w:val="22"/>
+          <w:rFonts w:ascii="Consolas" w:hAnsi="Consolas" w:eastAsia="Consolas"/>
+          <w:b w:val="0"/>
+          <w:sz w:val="18"/>
         </w:rPr>
         <w:t>· E1：「准」≠「压缩」：用正确率记账，系统学出「啥也不干」（LEN=0、预测0、准确率92%）</w:t>
       </w:r>
@@ -2102,17 +2580,19 @@
     <w:p>
       <w:r>
         <w:rPr>
-          <w:b w:val="0"/>
-          <w:sz w:val="22"/>
-        </w:rPr>
-        <w:t>⇒ 必须用对数似然改善 over 基线：gain_bits = log2 p_model − log2 p_base</w:t>
-      </w:r>
-    </w:p>
-    <w:p>
-      <w:r>
-        <w:rPr>
-          <w:b w:val="0"/>
-          <w:sz w:val="22"/>
+          <w:rFonts w:ascii="Consolas" w:hAnsi="Consolas" w:eastAsia="Consolas"/>
+          <w:b w:val="0"/>
+          <w:sz w:val="18"/>
+        </w:rPr>
+        <w:t xml:space="preserve">      ⇒ 必须用对数似然改善 over 基线：gain_bits = log2 p_model − log2 p_base</w:t>
+      </w:r>
+    </w:p>
+    <w:p>
+      <w:r>
+        <w:rPr>
+          <w:rFonts w:ascii="Consolas" w:hAnsi="Consolas" w:eastAsia="Consolas"/>
+          <w:b w:val="0"/>
+          <w:sz w:val="18"/>
         </w:rPr>
         <w:t>· E2：正是加上基率校正后，系统才从躺平解转为真正表达（LEN 从 0 长出）</w:t>
       </w:r>
@@ -2120,8 +2600,9 @@
     <w:p>
       <w:r>
         <w:rPr>
-          <w:b w:val="0"/>
-          <w:sz w:val="22"/>
+          <w:rFonts w:ascii="Consolas" w:hAnsi="Consolas" w:eastAsia="Consolas"/>
+          <w:b w:val="0"/>
+          <w:sz w:val="18"/>
         </w:rPr>
         <w:t>· E8：经济标定 n* = FLUX_TOTAL / BASE_COST 决定「冻结」与「爆发」的切换</w:t>
       </w:r>
@@ -2129,8 +2610,9 @@
     <w:p>
       <w:r>
         <w:rPr>
-          <w:b w:val="0"/>
-          <w:sz w:val="22"/>
+          <w:rFonts w:ascii="Consolas" w:hAnsi="Consolas" w:eastAsia="Consolas"/>
+          <w:b w:val="0"/>
+          <w:sz w:val="18"/>
         </w:rPr>
         <w:t>· 实测正收益：S1~S6 中观察到 gain &gt; 0（约 +0.09 ~ +0.19 bit/tick）</w:t>
       </w:r>
@@ -2138,10 +2620,11 @@
     <w:p>
       <w:r>
         <w:rPr>
-          <w:b w:val="0"/>
-          <w:sz w:val="22"/>
-        </w:rPr>
-        <w:t>⇒ 世界确实存在可压缩盈余（即 S &gt; 0 的经验证据）</w:t>
+          <w:rFonts w:ascii="Consolas" w:hAnsi="Consolas" w:eastAsia="Consolas"/>
+          <w:b w:val="0"/>
+          <w:sz w:val="18"/>
+        </w:rPr>
+        <w:t xml:space="preserve">      ⇒ 世界确实存在可压缩盈余（即 S &gt; 0 的经验证据）</w:t>
       </w:r>
     </w:p>
     <w:p>
@@ -2165,8 +2648,9 @@
     <w:p>
       <w:r>
         <w:rPr>
-          <w:b w:val="0"/>
-          <w:sz w:val="22"/>
+          <w:rFonts w:ascii="Consolas" w:hAnsi="Consolas" w:eastAsia="Consolas"/>
+          <w:b w:val="0"/>
+          <w:sz w:val="18"/>
         </w:rPr>
         <w:t>缺①（一族）  ⇒ 化石：行为谱是一条线</w:t>
       </w:r>
@@ -2174,8 +2658,9 @@
     <w:p>
       <w:r>
         <w:rPr>
-          <w:b w:val="0"/>
-          <w:sz w:val="22"/>
+          <w:rFonts w:ascii="Consolas" w:hAnsi="Consolas" w:eastAsia="Consolas"/>
+          <w:b w:val="0"/>
+          <w:sz w:val="18"/>
         </w:rPr>
         <w:t>缺②（自指）  ⇒ 机器：更新在外，不会自己变</w:t>
       </w:r>
@@ -2183,8 +2668,9 @@
     <w:p>
       <w:r>
         <w:rPr>
-          <w:b w:val="0"/>
-          <w:sz w:val="22"/>
+          <w:rFonts w:ascii="Consolas" w:hAnsi="Consolas" w:eastAsia="Consolas"/>
+          <w:b w:val="0"/>
+          <w:sz w:val="18"/>
         </w:rPr>
         <w:t>缺③（代价）  ⇒ 玩具：由外部供养，不会死，也就没有选择</w:t>
       </w:r>
@@ -2246,8 +2732,9 @@
     <w:p>
       <w:r>
         <w:rPr>
-          <w:b w:val="0"/>
-          <w:sz w:val="22"/>
+          <w:rFonts w:ascii="Consolas" w:hAnsi="Consolas" w:eastAsia="Consolas"/>
+          <w:b w:val="0"/>
+          <w:sz w:val="18"/>
         </w:rPr>
         <w:t>它是一族函数吗？（行为谱不是一个点）</w:t>
       </w:r>
@@ -2255,8 +2742,9 @@
     <w:p>
       <w:r>
         <w:rPr>
-          <w:b w:val="0"/>
-          <w:sz w:val="22"/>
+          <w:rFonts w:ascii="Consolas" w:hAnsi="Consolas" w:eastAsia="Consolas"/>
+          <w:b w:val="0"/>
+          <w:sz w:val="18"/>
         </w:rPr>
         <w:t>它会自己改自己吗？（拿掉外部更新，它仍变）</w:t>
       </w:r>
@@ -2264,8 +2752,9 @@
     <w:p>
       <w:r>
         <w:rPr>
-          <w:b w:val="0"/>
-          <w:sz w:val="22"/>
+          <w:rFonts w:ascii="Consolas" w:hAnsi="Consolas" w:eastAsia="Consolas"/>
+          <w:b w:val="0"/>
+          <w:sz w:val="18"/>
         </w:rPr>
         <w:t>它自己付代价吗？（压缩世界的收入 ≥ 维持结构的支出）</w:t>
       </w:r>
@@ -2300,8 +2789,9 @@
     <w:p>
       <w:r>
         <w:rPr>
-          <w:b w:val="0"/>
-          <w:sz w:val="22"/>
+          <w:rFonts w:ascii="Consolas" w:hAnsi="Consolas" w:eastAsia="Consolas"/>
+          <w:b w:val="0"/>
+          <w:sz w:val="18"/>
         </w:rPr>
         <w:t>· 覆盖：③ 自己付代价 —— E1/E2（准≠压缩、基率校正）、E8（n*=FLUX/BASE_COST 的冻结/爆发边界）</w:t>
       </w:r>
@@ -2309,8 +2799,9 @@
     <w:p>
       <w:r>
         <w:rPr>
-          <w:b w:val="0"/>
-          <w:sz w:val="22"/>
+          <w:rFonts w:ascii="Consolas" w:hAnsi="Consolas" w:eastAsia="Consolas"/>
+          <w:b w:val="0"/>
+          <w:sz w:val="18"/>
         </w:rPr>
         <w:t>· 覆盖：反例 —— E5/E7（相连个体基因距离 0.145 vs 随机 0.486 ⇒ 克隆抱团，不是分工）</w:t>
       </w:r>
@@ -2318,8 +2809,9 @@
     <w:p>
       <w:r>
         <w:rPr>
-          <w:b w:val="0"/>
-          <w:sz w:val="22"/>
+          <w:rFonts w:ascii="Consolas" w:hAnsi="Consolas" w:eastAsia="Consolas"/>
+          <w:b w:val="0"/>
+          <w:sz w:val="18"/>
         </w:rPr>
         <w:t>· 未覆盖：① 一族函数、② 自指更新 —— 本文不声称有实验证据，只在定义上推导；</w:t>
       </w:r>
@@ -2327,17 +2819,19 @@
     <w:p>
       <w:r>
         <w:rPr>
-          <w:b w:val="0"/>
-          <w:sz w:val="22"/>
-        </w:rPr>
-        <w:t>仅有初步观察（E12 动态 0.849 vs 冻结 1.07；E13 身份链 8 代可校验）</w:t>
-      </w:r>
-    </w:p>
-    <w:p>
-      <w:r>
-        <w:rPr>
-          <w:b w:val="0"/>
-          <w:sz w:val="22"/>
+          <w:rFonts w:ascii="Consolas" w:hAnsi="Consolas" w:eastAsia="Consolas"/>
+          <w:b w:val="0"/>
+          <w:sz w:val="18"/>
+        </w:rPr>
+        <w:t xml:space="preserve">          仅有初步观察（E12 动态 0.849 vs 冻结 1.07；E13 身份链 8 代可校验）</w:t>
+      </w:r>
+    </w:p>
+    <w:p>
+      <w:r>
+        <w:rPr>
+          <w:rFonts w:ascii="Consolas" w:hAnsi="Consolas" w:eastAsia="Consolas"/>
+          <w:b w:val="0"/>
+          <w:sz w:val="18"/>
         </w:rPr>
         <w:t>· 规模：小、可复现、可手算；不是大规模实证</w:t>
       </w:r>
@@ -2372,8 +2866,9 @@
     <w:p>
       <w:r>
         <w:rPr>
-          <w:b w:val="0"/>
-          <w:sz w:val="22"/>
+          <w:rFonts w:ascii="Consolas" w:hAnsi="Consolas" w:eastAsia="Consolas"/>
+          <w:b w:val="0"/>
+          <w:sz w:val="18"/>
         </w:rPr>
         <w:t>[推论] 三条必要条件由第二、三节直接推出，不是独立假设</w:t>
       </w:r>
@@ -2381,8 +2876,9 @@
     <w:p>
       <w:r>
         <w:rPr>
-          <w:b w:val="0"/>
-          <w:sz w:val="22"/>
+          <w:rFonts w:ascii="Consolas" w:hAnsi="Consolas" w:eastAsia="Consolas"/>
+          <w:b w:val="0"/>
+          <w:sz w:val="18"/>
         </w:rPr>
         <w:t>[证据] 条件③ 有实验数据（E1/E2/E8 + 正收益）；条件①② 有部分数据（E12/E13）</w:t>
       </w:r>
@@ -2390,8 +2886,9 @@
     <w:p>
       <w:r>
         <w:rPr>
-          <w:b w:val="0"/>
-          <w:sz w:val="22"/>
+          <w:rFonts w:ascii="Consolas" w:hAnsi="Consolas" w:eastAsia="Consolas"/>
+          <w:b w:val="0"/>
+          <w:sz w:val="18"/>
         </w:rPr>
         <w:t>[未解决] 三条都满足后是否就「活」—— 本文不声称；这是下一步实验要回答的</w:t>
       </w:r>
@@ -2399,13 +2896,17 @@
     <w:p>
       <w:r>
         <w:rPr>
-          <w:b w:val="0"/>
-          <w:sz w:val="22"/>
+          <w:rFonts w:ascii="Consolas" w:hAnsi="Consolas" w:eastAsia="Consolas"/>
+          <w:b w:val="0"/>
+          <w:sz w:val="18"/>
         </w:rPr>
         <w:t>[推测] 若盈余 S 不足，则无论结构多复杂都维持不起 ⇒ 生命有「经济上限」（仅方向性推测）</w:t>
       </w:r>
     </w:p>
     <w:p>
+      <w:pPr>
+        <w:jc w:val="center"/>
+      </w:pPr>
       <w:r>
         <w:rPr>
           <w:b/>
@@ -2462,8 +2963,9 @@
     <w:p>
       <w:r>
         <w:rPr>
-          <w:b w:val="0"/>
-          <w:sz w:val="22"/>
+          <w:rFonts w:ascii="Consolas" w:hAnsi="Consolas" w:eastAsia="Consolas"/>
+          <w:b w:val="0"/>
+          <w:sz w:val="18"/>
         </w:rPr>
         <w:t>观察到涌现：很多人</w:t>
       </w:r>
@@ -2471,8 +2973,9 @@
     <w:p>
       <w:r>
         <w:rPr>
-          <w:b w:val="0"/>
-          <w:sz w:val="22"/>
+          <w:rFonts w:ascii="Consolas" w:hAnsi="Consolas" w:eastAsia="Consolas"/>
+          <w:b w:val="0"/>
+          <w:sz w:val="18"/>
         </w:rPr>
         <w:t>解释涌现：没有公认答案</w:t>
       </w:r>
@@ -2507,10 +3010,40 @@
     <w:p>
       <w:r>
         <w:rPr>
+          <w:rFonts w:ascii="Consolas" w:hAnsi="Consolas" w:eastAsia="Consolas"/>
+          <w:b w:val="0"/>
+          <w:sz w:val="18"/>
+        </w:rPr>
+        <w:t>主张：所谓涌现，可能是**评价指标的非线性/不连续**造成的假象；</w:t>
+      </w:r>
+    </w:p>
+    <w:p>
+      <w:r>
+        <w:rPr>
+          <w:rFonts w:ascii="Consolas" w:hAnsi="Consolas" w:eastAsia="Consolas"/>
+          <w:b w:val="0"/>
+          <w:sz w:val="18"/>
+        </w:rPr>
+        <w:t xml:space="preserve">      换成连续指标（如对数似然），"突变"会消失，变成平滑上升</w:t>
+      </w:r>
+    </w:p>
+    <w:p>
+      <w:r>
+        <w:rPr>
+          <w:rFonts w:ascii="Consolas" w:hAnsi="Consolas" w:eastAsia="Consolas"/>
+          <w:b w:val="0"/>
+          <w:sz w:val="18"/>
+        </w:rPr>
+        <w:t>⇒ 这动摇了「涌现是真实突变」这个前提本身</w:t>
+      </w:r>
+    </w:p>
+    <w:p>
+      <w:r>
+        <w:rPr>
           <w:b w:val="0"/>
           <w:sz w:val="22"/>
         </w:rPr>
-        <w:t>主张：所谓涌现，可能是评价指标的非线性/不连续造成的假象；</w:t>
+        <w:t>② 机制解释：归纳头与电路（局部机制证据，不是完整"为什么"）</w:t>
       </w:r>
     </w:p>
     <w:p>
@@ -2519,7 +3052,37 @@
           <w:b w:val="0"/>
           <w:sz w:val="22"/>
         </w:rPr>
-        <w:t>换成连续指标（如对数似然），"突变"会消失，变成平滑上升</w:t>
+        <w:t>Olsson et al. 2022[4]《In-context Learning and Induction Heads》</w:t>
+      </w:r>
+    </w:p>
+    <w:p>
+      <w:r>
+        <w:rPr>
+          <w:rFonts w:ascii="Consolas" w:hAnsi="Consolas" w:eastAsia="Consolas"/>
+          <w:b w:val="0"/>
+          <w:sz w:val="18"/>
+        </w:rPr>
+        <w:t>发现模型内部出现「归纳头」回路，解释部分上下文学习能力</w:t>
+      </w:r>
+    </w:p>
+    <w:p>
+      <w:r>
+        <w:rPr>
+          <w:rFonts w:ascii="Consolas" w:hAnsi="Consolas" w:eastAsia="Consolas"/>
+          <w:b w:val="0"/>
+          <w:sz w:val="18"/>
+        </w:rPr>
+        <w:t>⇒ 这是**机制层**的证据：说明了某种能力由什么结构实现</w:t>
+      </w:r>
+    </w:p>
+    <w:p>
+      <w:r>
+        <w:rPr>
+          <w:rFonts w:ascii="Consolas" w:hAnsi="Consolas" w:eastAsia="Consolas"/>
+          <w:b w:val="0"/>
+          <w:sz w:val="18"/>
+        </w:rPr>
+        <w:t>⇒ 但它只解释某个具体能力，不解释「为什么会出现涌现」这个一般问题</w:t>
       </w:r>
     </w:p>
     <w:p>
@@ -2528,7 +3091,7 @@
           <w:b w:val="0"/>
           <w:sz w:val="22"/>
         </w:rPr>
-        <w:t>⇒ 这动摇了「涌现是真实突变」这个前提本身</w:t>
+        <w:t>③ Grokking：训练中的认知相变</w:t>
       </w:r>
     </w:p>
     <w:p>
@@ -2537,7 +3100,27 @@
           <w:b w:val="0"/>
           <w:sz w:val="22"/>
         </w:rPr>
-        <w:t>② 机制解释：归纳头与电路（局部机制证据，不是完整"为什么"）</w:t>
+        <w:t>Power et al. 2022[5]《Grokking》</w:t>
+      </w:r>
+    </w:p>
+    <w:p>
+      <w:r>
+        <w:rPr>
+          <w:rFonts w:ascii="Consolas" w:hAnsi="Consolas" w:eastAsia="Consolas"/>
+          <w:b w:val="0"/>
+          <w:sz w:val="18"/>
+        </w:rPr>
+        <w:t>在小算法任务上，训练很久后泛化突然出现（像相变）</w:t>
+      </w:r>
+    </w:p>
+    <w:p>
+      <w:r>
+        <w:rPr>
+          <w:rFonts w:ascii="Consolas" w:hAnsi="Consolas" w:eastAsia="Consolas"/>
+          <w:b w:val="0"/>
+          <w:sz w:val="18"/>
+        </w:rPr>
+        <w:t>⇒ 说明「涌现」也发生在训练过程中，不一定只依赖规模</w:t>
       </w:r>
     </w:p>
     <w:p>
@@ -2546,7 +3129,7 @@
           <w:b w:val="0"/>
           <w:sz w:val="22"/>
         </w:rPr>
-        <w:t>Olsson et al. 2022[4]《In-context Learning and Induction Heads》</w:t>
+        <w:t>④ 压缩说：预测 = 压缩</w:t>
       </w:r>
     </w:p>
     <w:p>
@@ -2555,86 +3138,15 @@
           <w:b w:val="0"/>
           <w:sz w:val="22"/>
         </w:rPr>
-        <w:t>发现模型内部出现「归纳头」回路，解释部分上下文学习能力</w:t>
-      </w:r>
-    </w:p>
-    <w:p>
-      <w:r>
-        <w:rPr>
-          <w:b w:val="0"/>
-          <w:sz w:val="22"/>
-        </w:rPr>
-        <w:t>⇒ 这是机制层的证据：说明了某种能力由什么结构实现</w:t>
-      </w:r>
-    </w:p>
-    <w:p>
-      <w:r>
-        <w:rPr>
-          <w:b w:val="0"/>
-          <w:sz w:val="22"/>
-        </w:rPr>
-        <w:t>⇒ 但它只解释某个具体能力，不解释「为什么会出现涌现」这个一般问题</w:t>
-      </w:r>
-    </w:p>
-    <w:p>
-      <w:r>
-        <w:rPr>
-          <w:b w:val="0"/>
-          <w:sz w:val="22"/>
-        </w:rPr>
-        <w:t>③ Grokking：训练中的认知相变</w:t>
-      </w:r>
-    </w:p>
-    <w:p>
-      <w:r>
-        <w:rPr>
-          <w:b w:val="0"/>
-          <w:sz w:val="22"/>
-        </w:rPr>
-        <w:t>Power et al. 2022[5]《Grokking》</w:t>
-      </w:r>
-    </w:p>
-    <w:p>
-      <w:r>
-        <w:rPr>
-          <w:b w:val="0"/>
-          <w:sz w:val="22"/>
-        </w:rPr>
-        <w:t>在小算法任务上，训练很久后泛化突然出现（像相变）</w:t>
-      </w:r>
-    </w:p>
-    <w:p>
-      <w:r>
-        <w:rPr>
-          <w:b w:val="0"/>
-          <w:sz w:val="22"/>
-        </w:rPr>
-        <w:t>⇒ 说明「涌现」也发生在训练过程中，不一定只依赖规模</w:t>
-      </w:r>
-    </w:p>
-    <w:p>
-      <w:r>
-        <w:rPr>
-          <w:b w:val="0"/>
-          <w:sz w:val="22"/>
-        </w:rPr>
-        <w:t>④ 压缩说：预测 = 压缩</w:t>
-      </w:r>
-    </w:p>
-    <w:p>
-      <w:r>
-        <w:rPr>
-          <w:b w:val="0"/>
-          <w:sz w:val="22"/>
-        </w:rPr>
         <w:t>Delétang et al. 2023[6]《Language Modeling Is Compression》</w:t>
       </w:r>
     </w:p>
     <w:p>
       <w:r>
         <w:rPr>
-          <w:b w:val="0"/>
-          <w:sz w:val="22"/>
+          <w:rFonts w:ascii="Consolas" w:hAnsi="Consolas" w:eastAsia="Consolas"/>
+          <w:b w:val="0"/>
+          <w:sz w:val="18"/>
         </w:rPr>
         <w:t>语言模型 = 压缩器：学到的权重 = 对世界文本的压缩</w:t>
       </w:r>
@@ -2642,8 +3154,9 @@
     <w:p>
       <w:r>
         <w:rPr>
-          <w:b w:val="0"/>
-          <w:sz w:val="22"/>
+          <w:rFonts w:ascii="Consolas" w:hAnsi="Consolas" w:eastAsia="Consolas"/>
+          <w:b w:val="0"/>
+          <w:sz w:val="18"/>
         </w:rPr>
         <w:t>⇒ 这条最接近本文的框架：涌现 = 压缩世界时出现的结构</w:t>
       </w:r>
@@ -2651,8 +3164,9 @@
     <w:p>
       <w:r>
         <w:rPr>
-          <w:b w:val="0"/>
-          <w:sz w:val="22"/>
+          <w:rFonts w:ascii="Consolas" w:hAnsi="Consolas" w:eastAsia="Consolas"/>
+          <w:b w:val="0"/>
+          <w:sz w:val="18"/>
         </w:rPr>
         <w:t>⇒ 但它仍是「结果层面的对应」，没有回答「为什么正好在这个规模/这个任务上出现」</w:t>
       </w:r>
@@ -2669,8 +3183,9 @@
     <w:p>
       <w:r>
         <w:rPr>
-          <w:b w:val="0"/>
-          <w:sz w:val="22"/>
+          <w:rFonts w:ascii="Consolas" w:hAnsi="Consolas" w:eastAsia="Consolas"/>
+          <w:b w:val="0"/>
+          <w:sz w:val="18"/>
         </w:rPr>
         <w:t>① 规模实验不可控：无法做严格的因果对照（只改变规模、其他全相同）</w:t>
       </w:r>
@@ -2678,8 +3193,9 @@
     <w:p>
       <w:r>
         <w:rPr>
-          <w:b w:val="0"/>
-          <w:sz w:val="22"/>
+          <w:rFonts w:ascii="Consolas" w:hAnsi="Consolas" w:eastAsia="Consolas"/>
+          <w:b w:val="0"/>
+          <w:sz w:val="18"/>
         </w:rPr>
         <w:t>② 度量依赖：换指标，现象可能就消失（见 ①）</w:t>
       </w:r>
@@ -2687,8 +3203,9 @@
     <w:p>
       <w:r>
         <w:rPr>
-          <w:b w:val="0"/>
-          <w:sz w:val="22"/>
+          <w:rFonts w:ascii="Consolas" w:hAnsi="Consolas" w:eastAsia="Consolas"/>
+          <w:b w:val="0"/>
+          <w:sz w:val="18"/>
         </w:rPr>
         <w:t>③ 机制层不完整：知道某个回路、不知道整体为何会组织出该回路</w:t>
       </w:r>
@@ -2696,8 +3213,9 @@
     <w:p>
       <w:r>
         <w:rPr>
-          <w:b w:val="0"/>
-          <w:sz w:val="22"/>
+          <w:rFonts w:ascii="Consolas" w:hAnsi="Consolas" w:eastAsia="Consolas"/>
+          <w:b w:val="0"/>
+          <w:sz w:val="18"/>
         </w:rPr>
         <w:t>④ 缺乏可预测的理论：没有理论能事先算出「多大模型会出现什么能力」</w:t>
       </w:r>
@@ -2723,10 +3241,50 @@
     <w:p>
       <w:r>
         <w:rPr>
+          <w:rFonts w:ascii="Consolas" w:hAnsi="Consolas" w:eastAsia="Consolas"/>
+          <w:b w:val="0"/>
+          <w:sz w:val="18"/>
+        </w:rPr>
+        <w:t>宇宙 F</w:t>
+      </w:r>
+    </w:p>
+    <w:p>
+      <w:r>
+        <w:rPr>
+          <w:rFonts w:ascii="Consolas" w:hAnsi="Consolas" w:eastAsia="Consolas"/>
+          <w:b w:val="0"/>
+          <w:sz w:val="18"/>
+        </w:rPr>
+        <w:t xml:space="preserve"> └ 环境     = 宇宙的局部解压</w:t>
+      </w:r>
+    </w:p>
+    <w:p>
+      <w:r>
+        <w:rPr>
+          <w:rFonts w:ascii="Consolas" w:hAnsi="Consolas" w:eastAsia="Consolas"/>
+          <w:b w:val="0"/>
+          <w:sz w:val="18"/>
+        </w:rPr>
+        <w:t xml:space="preserve">    └ 人类语言 = 人对环境（与自身经验）的解压产物  ← 语言本身就是被压过的</w:t>
+      </w:r>
+    </w:p>
+    <w:p>
+      <w:r>
+        <w:rPr>
+          <w:rFonts w:ascii="Consolas" w:hAnsi="Consolas" w:eastAsia="Consolas"/>
+          <w:b w:val="0"/>
+          <w:sz w:val="18"/>
+        </w:rPr>
+        <w:t xml:space="preserve">       └ AI     = 对人类语言的**再解压**（在人的解压之上再压一层）</w:t>
+      </w:r>
+    </w:p>
+    <w:p>
+      <w:r>
+        <w:rPr>
           <w:b w:val="0"/>
           <w:sz w:val="22"/>
         </w:rPr>
-        <w:t>宇宙 F</w:t>
+        <w:t>⇒ 所以 AI 的「涌现」不是理解宇宙，而是解压人类语言时结构浮现出来。</w:t>
       </w:r>
     </w:p>
     <w:p>
@@ -2735,50 +3293,15 @@
           <w:b w:val="0"/>
           <w:sz w:val="22"/>
         </w:rPr>
-        <w:t>└ 环境     = 宇宙的局部解压</w:t>
-      </w:r>
-    </w:p>
-    <w:p>
-      <w:r>
-        <w:rPr>
-          <w:b w:val="0"/>
-          <w:sz w:val="22"/>
-        </w:rPr>
-        <w:t>└ 人类语言 = 人对环境（与自身经验）的解压产物  ← 语言本身就是被压过的</w:t>
-      </w:r>
-    </w:p>
-    <w:p>
-      <w:r>
-        <w:rPr>
-          <w:b w:val="0"/>
-          <w:sz w:val="22"/>
-        </w:rPr>
-        <w:t>└ AI     = 对人类语言的再解压（在人的解压之上再压一层）</w:t>
-      </w:r>
-    </w:p>
-    <w:p>
-      <w:r>
-        <w:rPr>
-          <w:b w:val="0"/>
-          <w:sz w:val="22"/>
-        </w:rPr>
-        <w:t>⇒ 所以 AI 的「涌现」不是理解宇宙，而是解压人类语言时结构浮现出来。</w:t>
-      </w:r>
-    </w:p>
-    <w:p>
-      <w:r>
-        <w:rPr>
-          <w:b w:val="0"/>
-          <w:sz w:val="22"/>
-        </w:rPr>
         <w:t>用第二、三节的尺子看：</w:t>
       </w:r>
     </w:p>
     <w:p>
       <w:r>
         <w:rPr>
-          <w:b w:val="0"/>
-          <w:sz w:val="22"/>
+          <w:rFonts w:ascii="Consolas" w:hAnsi="Consolas" w:eastAsia="Consolas"/>
+          <w:b w:val="0"/>
+          <w:sz w:val="18"/>
         </w:rPr>
         <w:t>· 模型是冻结的函数点（一个点，不是一族）</w:t>
       </w:r>
@@ -2786,17 +3309,19 @@
     <w:p>
       <w:r>
         <w:rPr>
-          <w:b w:val="0"/>
-          <w:sz w:val="22"/>
-        </w:rPr>
-        <w:t>· 它的"涌现"出现在行为谱上：输入不同、表现不同 ⇒ 看起来像会推理</w:t>
-      </w:r>
-    </w:p>
-    <w:p>
-      <w:r>
-        <w:rPr>
-          <w:b w:val="0"/>
-          <w:sz w:val="22"/>
+          <w:rFonts w:ascii="Consolas" w:hAnsi="Consolas" w:eastAsia="Consolas"/>
+          <w:b w:val="0"/>
+          <w:sz w:val="18"/>
+        </w:rPr>
+        <w:t>· 它的"涌现"出现在**行为谱**上：输入不同、表现不同 ⇒ 看起来像会推理</w:t>
+      </w:r>
+    </w:p>
+    <w:p>
+      <w:r>
+        <w:rPr>
+          <w:rFonts w:ascii="Consolas" w:hAnsi="Consolas" w:eastAsia="Consolas"/>
+          <w:b w:val="0"/>
+          <w:sz w:val="18"/>
         </w:rPr>
         <w:t>· 但模型不维持这个谱、不自己改自己、不付代价</w:t>
       </w:r>
@@ -2804,8 +3329,9 @@
     <w:p>
       <w:r>
         <w:rPr>
-          <w:b w:val="0"/>
-          <w:sz w:val="22"/>
+          <w:rFonts w:ascii="Consolas" w:hAnsi="Consolas" w:eastAsia="Consolas"/>
+          <w:b w:val="0"/>
+          <w:sz w:val="18"/>
         </w:rPr>
         <w:t>⇒ 它是「把人类语言解压了一次」，而不是「维持着解压」或「自己改写解压规则」</w:t>
       </w:r>
@@ -2858,62 +3384,68 @@
     <w:p>
       <w:r>
         <w:rPr>
+          <w:rFonts w:ascii="Consolas" w:hAnsi="Consolas" w:eastAsia="Consolas"/>
+          <w:b w:val="0"/>
+          <w:sz w:val="18"/>
+        </w:rPr>
+        <w:t>源分布移动：人类语言发现新东西 ⇒ 要解压的对象变了</w:t>
+      </w:r>
+    </w:p>
+    <w:p>
+      <w:r>
+        <w:rPr>
+          <w:rFonts w:ascii="Consolas" w:hAnsi="Consolas" w:eastAsia="Consolas"/>
+          <w:b w:val="0"/>
+          <w:sz w:val="18"/>
+        </w:rPr>
+        <w:t>解压器冻结：模型权重不变     ⇒ 它解压的还是**旧语言**</w:t>
+      </w:r>
+    </w:p>
+    <w:p>
+      <w:r>
+        <w:rPr>
+          <w:rFonts w:ascii="Consolas" w:hAnsi="Consolas" w:eastAsia="Consolas"/>
+          <w:b w:val="0"/>
+          <w:sz w:val="18"/>
+        </w:rPr>
+        <w:t>⇒ 压缩收益下降：gain_bits = log2 p_model − log2 p_base 中 p_model 与源失配</w:t>
+      </w:r>
+    </w:p>
+    <w:p>
+      <w:r>
+        <w:rPr>
+          <w:rFonts w:ascii="Consolas" w:hAnsi="Consolas" w:eastAsia="Consolas"/>
+          <w:b w:val="0"/>
+          <w:sz w:val="18"/>
+        </w:rPr>
+        <w:t>⇒ 它昨天"涌现"出来的理解，今天就是过时的解压</w:t>
+      </w:r>
+    </w:p>
+    <w:p>
+      <w:r>
+        <w:rPr>
           <w:b w:val="0"/>
           <w:sz w:val="22"/>
         </w:rPr>
-        <w:t>源分布移动：人类语言发现新东西 ⇒ 要解压的对象变了</w:t>
-      </w:r>
-    </w:p>
-    <w:p>
-      <w:r>
-        <w:rPr>
-          <w:b w:val="0"/>
-          <w:sz w:val="22"/>
-        </w:rPr>
-        <w:t>解压器冻结：模型权重不变     ⇒ 它解压的还是旧语言</w:t>
-      </w:r>
-    </w:p>
-    <w:p>
-      <w:r>
-        <w:rPr>
-          <w:b w:val="0"/>
-          <w:sz w:val="22"/>
-        </w:rPr>
-        <w:t>⇒ 压缩收益下降：gain_bits = log2 p_model − log2 p_base 中 p_model 与源失配</w:t>
-      </w:r>
-    </w:p>
-    <w:p>
-      <w:r>
-        <w:rPr>
-          <w:b w:val="0"/>
-          <w:sz w:val="22"/>
-        </w:rPr>
-        <w:t>⇒ 它昨天"涌现"出来的理解，今天就是过时的解压</w:t>
-      </w:r>
-    </w:p>
-    <w:p>
-      <w:r>
-        <w:rPr>
-          <w:b w:val="0"/>
-          <w:sz w:val="22"/>
-        </w:rPr>
         <w:t>三条后果：</w:t>
       </w:r>
     </w:p>
     <w:p>
       <w:r>
         <w:rPr>
-          <w:b w:val="0"/>
-          <w:sz w:val="22"/>
-        </w:rPr>
-        <w:t>① 它的解压能力有固定上限：上限由训练时刻的语言决定，不随语言进化而上升</w:t>
-      </w:r>
-    </w:p>
-    <w:p>
-      <w:r>
-        <w:rPr>
-          <w:b w:val="0"/>
-          <w:sz w:val="22"/>
+          <w:rFonts w:ascii="Consolas" w:hAnsi="Consolas" w:eastAsia="Consolas"/>
+          <w:b w:val="0"/>
+          <w:sz w:val="18"/>
+        </w:rPr>
+        <w:t>① 它的解压能力有**固定上限**：上限由训练时刻的语言决定，不随语言进化而上升</w:t>
+      </w:r>
+    </w:p>
+    <w:p>
+      <w:r>
+        <w:rPr>
+          <w:rFonts w:ascii="Consolas" w:hAnsi="Consolas" w:eastAsia="Consolas"/>
+          <w:b w:val="0"/>
+          <w:sz w:val="18"/>
         </w:rPr>
         <w:t>② 它无法自己补上失配：更新规则在外部 —— 要恢复，只能靠人类再训练一次</w:t>
       </w:r>
@@ -2921,19 +3453,21 @@
     <w:p>
       <w:r>
         <w:rPr>
-          <w:b w:val="0"/>
-          <w:sz w:val="22"/>
-        </w:rPr>
-        <w:t>⇒ 这正是第三节说的「更新在外部」的代价</w:t>
-      </w:r>
-    </w:p>
-    <w:p>
-      <w:r>
-        <w:rPr>
-          <w:b w:val="0"/>
-          <w:sz w:val="22"/>
-        </w:rPr>
-        <w:t>③ 它的"涌现"是某个时间片上的解压产物，不是可持续的能力</w:t>
+          <w:rFonts w:ascii="Consolas" w:hAnsi="Consolas" w:eastAsia="Consolas"/>
+          <w:b w:val="0"/>
+          <w:sz w:val="18"/>
+        </w:rPr>
+        <w:t xml:space="preserve">   ⇒ 这正是第三节说的「更新在外部」的代价</w:t>
+      </w:r>
+    </w:p>
+    <w:p>
+      <w:r>
+        <w:rPr>
+          <w:rFonts w:ascii="Consolas" w:hAnsi="Consolas" w:eastAsia="Consolas"/>
+          <w:b w:val="0"/>
+          <w:sz w:val="18"/>
+        </w:rPr>
+        <w:t>③ 它的"涌现"是**某个时间片上的解压产物**，不是可持续的能力</w:t>
       </w:r>
     </w:p>
     <w:p>
@@ -2975,8 +3509,9 @@
     <w:p>
       <w:r>
         <w:rPr>
-          <w:b w:val="0"/>
-          <w:sz w:val="22"/>
+          <w:rFonts w:ascii="Consolas" w:hAnsi="Consolas" w:eastAsia="Consolas"/>
+          <w:b w:val="0"/>
+          <w:sz w:val="18"/>
         </w:rPr>
         <w:t>① 若把世界换成未被人类语言描述过的部分（无法从语料中学到的规律），</w:t>
       </w:r>
@@ -2984,17 +3519,19 @@
     <w:p>
       <w:r>
         <w:rPr>
-          <w:b w:val="0"/>
-          <w:sz w:val="22"/>
-        </w:rPr>
-        <w:t>AI 的"涌现"应显著减弱 —— 因为它解压的是语言，不是宇宙</w:t>
-      </w:r>
-    </w:p>
-    <w:p>
-      <w:r>
-        <w:rPr>
-          <w:b w:val="0"/>
-          <w:sz w:val="22"/>
+          <w:rFonts w:ascii="Consolas" w:hAnsi="Consolas" w:eastAsia="Consolas"/>
+          <w:b w:val="0"/>
+          <w:sz w:val="18"/>
+        </w:rPr>
+        <w:t xml:space="preserve">   AI 的"涌现"应显著减弱 —— 因为它解压的是语言，不是宇宙</w:t>
+      </w:r>
+    </w:p>
+    <w:p>
+      <w:r>
+        <w:rPr>
+          <w:rFonts w:ascii="Consolas" w:hAnsi="Consolas" w:eastAsia="Consolas"/>
+          <w:b w:val="0"/>
+          <w:sz w:val="18"/>
         </w:rPr>
         <w:t>② 若让模型自己付代价（自己维持、自己修、自己死），语言解压不足以支撑，</w:t>
       </w:r>
@@ -3002,17 +3539,19 @@
     <w:p>
       <w:r>
         <w:rPr>
-          <w:b w:val="0"/>
-          <w:sz w:val="22"/>
-        </w:rPr>
-        <w:t>它必须发展出语言之外的理解方式 —— 否则活不下来</w:t>
-      </w:r>
-    </w:p>
-    <w:p>
-      <w:r>
-        <w:rPr>
-          <w:b w:val="0"/>
-          <w:sz w:val="22"/>
+          <w:rFonts w:ascii="Consolas" w:hAnsi="Consolas" w:eastAsia="Consolas"/>
+          <w:b w:val="0"/>
+          <w:sz w:val="18"/>
+        </w:rPr>
+        <w:t xml:space="preserve">   它必须发展出语言之外的理解方式 —— 否则活不下来</w:t>
+      </w:r>
+    </w:p>
+    <w:p>
+      <w:r>
+        <w:rPr>
+          <w:rFonts w:ascii="Consolas" w:hAnsi="Consolas" w:eastAsia="Consolas"/>
+          <w:b w:val="0"/>
+          <w:sz w:val="18"/>
         </w:rPr>
         <w:t>③ 若人类语言发生一次大的结构更新（新范式/新概念体系），冻结模型的解压收益</w:t>
       </w:r>
@@ -3020,10 +3559,11 @@
     <w:p>
       <w:r>
         <w:rPr>
-          <w:b w:val="0"/>
-          <w:sz w:val="22"/>
-        </w:rPr>
-        <w:t>应出现可测的下降；且它无法自己恢复 ⇒ 恢复必须来自外部再训练</w:t>
+          <w:rFonts w:ascii="Consolas" w:hAnsi="Consolas" w:eastAsia="Consolas"/>
+          <w:b w:val="0"/>
+          <w:sz w:val="18"/>
+        </w:rPr>
+        <w:t xml:space="preserve">   应出现可测的下降；且它无法自己恢复 ⇒ 恢复必须来自外部再训练</w:t>
       </w:r>
     </w:p>
     <w:p>
@@ -3038,8 +3578,9 @@
     <w:p>
       <w:r>
         <w:rPr>
-          <w:b w:val="0"/>
-          <w:sz w:val="22"/>
+          <w:rFonts w:ascii="Consolas" w:hAnsi="Consolas" w:eastAsia="Consolas"/>
+          <w:b w:val="0"/>
+          <w:sz w:val="18"/>
         </w:rPr>
         <w:t>[事实] 涌现现象被广泛观察到；度量假象说也有强证据（Schaeffer 2023）</w:t>
       </w:r>
@@ -3047,8 +3588,9 @@
     <w:p>
       <w:r>
         <w:rPr>
-          <w:b w:val="0"/>
-          <w:sz w:val="22"/>
+          <w:rFonts w:ascii="Consolas" w:hAnsi="Consolas" w:eastAsia="Consolas"/>
+          <w:b w:val="0"/>
+          <w:sz w:val="18"/>
         </w:rPr>
         <w:t>[已知] 机制层有局部解释（归纳头/电路/grokking），压缩视角有对应关系</w:t>
       </w:r>
@@ -3056,8 +3598,9 @@
     <w:p>
       <w:r>
         <w:rPr>
-          <w:b w:val="0"/>
-          <w:sz w:val="22"/>
+          <w:rFonts w:ascii="Consolas" w:hAnsi="Consolas" w:eastAsia="Consolas"/>
+          <w:b w:val="0"/>
+          <w:sz w:val="18"/>
         </w:rPr>
         <w:t>[推测] 「涌现 = 压缩世界的结构呈现」——本文立场，非证据</w:t>
       </w:r>
@@ -3065,8 +3608,9 @@
     <w:p>
       <w:r>
         <w:rPr>
-          <w:b w:val="0"/>
-          <w:sz w:val="22"/>
+          <w:rFonts w:ascii="Consolas" w:hAnsi="Consolas" w:eastAsia="Consolas"/>
+          <w:b w:val="0"/>
+          <w:sz w:val="18"/>
         </w:rPr>
         <w:t>[未解决] 为什么正好在某个规模/任务上出现 ⇒ 没有人给出可预测的理论</w:t>
       </w:r>
@@ -3074,8 +3618,9 @@
     <w:p>
       <w:r>
         <w:rPr>
-          <w:b w:val="0"/>
-          <w:sz w:val="22"/>
+          <w:rFonts w:ascii="Consolas" w:hAnsi="Consolas" w:eastAsia="Consolas"/>
+          <w:b w:val="0"/>
+          <w:sz w:val="18"/>
         </w:rPr>
         <w:t>[本文态度] 不把「AI 涌现」当作生命存在的证据；按第三节的尺子，它不是</w:t>
       </w:r>
@@ -3083,17 +3628,19 @@
     <w:p>
       <w:r>
         <w:rPr>
-          <w:b w:val="0"/>
-          <w:sz w:val="22"/>
-        </w:rPr>
-        <w:t>[本文立场] AI 是对人类语言的再解压（宇宙→环境→语言→AI 的第三层解压）</w:t>
-      </w:r>
-    </w:p>
-    <w:p>
-      <w:r>
-        <w:rPr>
-          <w:b w:val="0"/>
-          <w:sz w:val="22"/>
+          <w:rFonts w:ascii="Consolas" w:hAnsi="Consolas" w:eastAsia="Consolas"/>
+          <w:b w:val="0"/>
+          <w:sz w:val="18"/>
+        </w:rPr>
+        <w:t>[本文立场] AI 是对**人类语言**的再解压（宇宙→环境→语言→AI 的第三层解压）</w:t>
+      </w:r>
+    </w:p>
+    <w:p>
+      <w:r>
+        <w:rPr>
+          <w:rFonts w:ascii="Consolas" w:hAnsi="Consolas" w:eastAsia="Consolas"/>
+          <w:b w:val="0"/>
+          <w:sz w:val="18"/>
         </w:rPr>
         <w:t>[推论] 上层写死 ⇒ 语言一更新就失配 ⇒ 解压能力有固定上限、无法自己恢复</w:t>
       </w:r>
@@ -3234,6 +3781,9 @@
       </w:r>
     </w:p>
     <w:p>
+      <w:pPr>
+        <w:jc w:val="center"/>
+      </w:pPr>
       <w:r>
         <w:rPr>
           <w:b/>
@@ -3257,7 +3807,7 @@
           <w:b w:val="0"/>
           <w:sz w:val="22"/>
         </w:rPr>
-        <w:t>- 模型侧维度：token 嵌入的内在维度测量[12]</w:t>
+        <w:t>• 模型侧维度：token 嵌入的内在维度测量[12]</w:t>
       </w:r>
     </w:p>
     <w:p>
@@ -3266,7 +3816,7 @@
           <w:b w:val="0"/>
           <w:sz w:val="22"/>
         </w:rPr>
-        <w:t>- 时间侧落后：大模型时间训练边界的识别[13]</w:t>
+        <w:t>• 时间侧落后：大模型时间训练边界的识别[13]</w:t>
       </w:r>
     </w:p>
     <w:p>
@@ -3275,7 +3825,7 @@
           <w:b w:val="0"/>
           <w:sz w:val="22"/>
         </w:rPr>
-        <w:t>- 语言侧复杂度：构式视角下的语言复杂度测量[14]</w:t>
+        <w:t>• 语言侧复杂度：构式视角下的语言复杂度测量[14]</w:t>
       </w:r>
     </w:p>
     <w:p>

</xml_diff>

<commit_message>
Publish paper 01 v3 (minimality argument) and compendium v4
</commit_message>
<xml_diff>
--- a/paper.docx
+++ b/paper.docx
@@ -237,6 +237,33 @@
           <w:sz w:val="22"/>
         </w:rPr>
         <w:t>• Delétang et al.（2023）：语言模型是压缩器[6]。</w:t>
+      </w:r>
+    </w:p>
+    <w:p>
+      <w:r>
+        <w:rPr>
+          <w:b w:val="0"/>
+          <w:sz w:val="22"/>
+        </w:rPr>
+        <w:t>• Maturana &amp; Varela（1972）自创生：生命 = 自我生产的组织 —— 「维持」的另一条传统。</w:t>
+      </w:r>
+    </w:p>
+    <w:p>
+      <w:r>
+        <w:rPr>
+          <w:b w:val="0"/>
+          <w:sz w:val="22"/>
+        </w:rPr>
+        <w:t>• 「Life as Sustained Mutual Information」（Zenodo）：以持续互信息定义生命 —— 最接近本文「被维持的解压」的已有版本。</w:t>
+      </w:r>
+    </w:p>
+    <w:p>
+      <w:r>
+        <w:rPr>
+          <w:b w:val="0"/>
+          <w:sz w:val="22"/>
+        </w:rPr>
+        <w:t>需要说明：以上工作已经把「生命 = 信息/压缩/自我维持的过程」说过。本文的位置不是首次提出这一思想，而是把其中一条（解压的维持）变成可操作的判据与可测量的实验。</w:t>
       </w:r>
     </w:p>
     <w:p>
@@ -907,6 +934,69 @@
         </w:tc>
       </w:tr>
     </w:tbl>
+    <w:p>
+      <w:r>
+        <w:rPr>
+          <w:b/>
+          <w:sz w:val="26"/>
+        </w:rPr>
+        <w:t>2.1.1 这个定义为什么是最简的（最简性论证）</w:t>
+      </w:r>
+    </w:p>
+    <w:p>
+      <w:r>
+        <w:rPr>
+          <w:b w:val="0"/>
+          <w:sz w:val="22"/>
+        </w:rPr>
+        <w:t>先澄清一处措辞：维持不是系统自身的属性，而是系统与宇宙函数的关系。给定宇宙函数 F，某些结构的轨道会留在可维持的集合里，我们才说它"维持住了"；换一个 F，同一个结构可能不再成立。因此定义里的"维持"不是第三条并列条件，而是"被 F 保住"这一关系条件的展开。</w:t>
+      </w:r>
+    </w:p>
+    <w:p>
+      <w:r>
+        <w:rPr>
+          <w:b w:val="0"/>
+          <w:sz w:val="22"/>
+        </w:rPr>
+        <w:t>在这个澄清之上，可以说明为什么采用这个定义，而不是别的定义。理由有三条。</w:t>
+      </w:r>
+    </w:p>
+    <w:p>
+      <w:r>
+        <w:rPr>
+          <w:b w:val="0"/>
+          <w:sz w:val="22"/>
+        </w:rPr>
+        <w:t>第一，覆盖约束。定义要能同时覆盖生物生命与可能的数字生命。数字生命如果存在，按当前人类的理解，它运行在计算系统上，因此是完全函数化的；定义不能要求"非函数化成分"，否则会把这一类可能对象排除在外。</w:t>
+      </w:r>
+    </w:p>
+    <w:p>
+      <w:r>
+        <w:rPr>
+          <w:b w:val="0"/>
+          <w:sz w:val="22"/>
+        </w:rPr>
+        <w:t>第二，必要性。两条条件都不能去掉。去掉自指，火焰、飓风、晶体也会被算进来，定义太宽；去掉"被 F 保住"（即可维持），冻结的模型、自指的程序、恒温器也会被算进来，定义也太宽。两条同时在场，才能在"结构"里分出"生命"。</w:t>
+      </w:r>
+    </w:p>
+    <w:p>
+      <w:r>
+        <w:rPr>
+          <w:b w:val="0"/>
+          <w:sz w:val="22"/>
+        </w:rPr>
+        <w:t>第三，去假设。如果数字生命存在，那么"生命必须有不可函数化成分"这条假设就可以省掉；定义因此比带这条假设的版本条件更少。</w:t>
+      </w:r>
+    </w:p>
+    <w:p>
+      <w:r>
+        <w:rPr>
+          <w:b w:val="0"/>
+          <w:sz w:val="22"/>
+        </w:rPr>
+        <w:t>三条合起来：在"能覆盖生物生命与可能的数字生命"的约束下，本定义是条件最少、假设最少的那一版。这是方法论意义上的最简（奥卡姆剃刀），不是本体论断言；它也可以被反驳——若有人给出条件更少、覆盖相同的定义，本文所谓"最简"即失效。</w:t>
+      </w:r>
+    </w:p>
     <w:p>
       <w:r>
         <w:rPr>

</xml_diff>

<commit_message>
Withdraw minimality argument (circular): paper 01 v4 and compendium v5
</commit_message>
<xml_diff>
--- a/paper.docx
+++ b/paper.docx
@@ -940,7 +940,7 @@
           <w:b/>
           <w:sz w:val="26"/>
         </w:rPr>
-        <w:t>2.1.1 这个定义为什么是最简的（最简性论证）</w:t>
+        <w:t>2.1.1 一处澄清：维持是关系</w:t>
       </w:r>
     </w:p>
     <w:p>
@@ -949,7 +949,7 @@
           <w:b w:val="0"/>
           <w:sz w:val="22"/>
         </w:rPr>
-        <w:t>先澄清一处措辞：维持不是系统自身的属性，而是系统与宇宙函数的关系。给定宇宙函数 F，某些结构的轨道会留在可维持的集合里，我们才说它"维持住了"；换一个 F，同一个结构可能不再成立。因此定义里的"维持"不是第三条并列条件，而是"被 F 保住"这一关系条件的展开。</w:t>
+        <w:t>需要澄清一处措辞：维持不是系统自身的属性，而是系统与宇宙函数的关系。给定宇宙函数 F，某些结构的轨道会留在可维持的集合里，我们才说它"维持住了"；换一个 F，同一个结构可能不再成立。因此定义里的"会自我维持"，应读作"被 F 保住"，是关系条件的展开，不是第三条并列属性。</w:t>
       </w:r>
     </w:p>
     <w:p>
@@ -958,43 +958,7 @@
           <w:b w:val="0"/>
           <w:sz w:val="22"/>
         </w:rPr>
-        <w:t>在这个澄清之上，可以说明为什么采用这个定义，而不是别的定义。理由有三条。</w:t>
-      </w:r>
-    </w:p>
-    <w:p>
-      <w:r>
-        <w:rPr>
-          <w:b w:val="0"/>
-          <w:sz w:val="22"/>
-        </w:rPr>
-        <w:t>第一，覆盖约束。定义要能同时覆盖生物生命与可能的数字生命。数字生命如果存在，按当前人类的理解，它运行在计算系统上，因此是完全函数化的；定义不能要求"非函数化成分"，否则会把这一类可能对象排除在外。</w:t>
-      </w:r>
-    </w:p>
-    <w:p>
-      <w:r>
-        <w:rPr>
-          <w:b w:val="0"/>
-          <w:sz w:val="22"/>
-        </w:rPr>
-        <w:t>第二，必要性。两条条件都不能去掉。去掉自指，火焰、飓风、晶体也会被算进来，定义太宽；去掉"被 F 保住"（即可维持），冻结的模型、自指的程序、恒温器也会被算进来，定义也太宽。两条同时在场，才能在"结构"里分出"生命"。</w:t>
-      </w:r>
-    </w:p>
-    <w:p>
-      <w:r>
-        <w:rPr>
-          <w:b w:val="0"/>
-          <w:sz w:val="22"/>
-        </w:rPr>
-        <w:t>第三，去假设。如果数字生命存在，那么"生命必须有不可函数化成分"这条假设就可以省掉；定义因此比带这条假设的版本条件更少。</w:t>
-      </w:r>
-    </w:p>
-    <w:p>
-      <w:r>
-        <w:rPr>
-          <w:b w:val="0"/>
-          <w:sz w:val="22"/>
-        </w:rPr>
-        <w:t>三条合起来：在"能覆盖生物生命与可能的数字生命"的约束下，本定义是条件最少、假设最少的那一版。这是方法论意义上的最简（奥卡姆剃刀），不是本体论断言；它也可以被反驳——若有人给出条件更少、覆盖相同的定义，本文所谓"最简"即失效。</w:t>
+        <w:t>（注：本节此前曾含一段"最简性论证"，因该论证存在循环——用定义自身推出的数字生命可能性反过来支持定义——已撤回，仅保留以上澄清。）</w:t>
       </w:r>
     </w:p>
     <w:p>

</xml_diff>

<commit_message>
Publish paper 01 v5 (restructured by inference strength) and compendium v7
</commit_message>
<xml_diff>
--- a/paper.docx
+++ b/paper.docx
@@ -11,295 +11,7 @@
           <w:b/>
           <w:sz w:val="34"/>
         </w:rPr>
-        <w:t>现在的 AI 为什么不是生命</w:t>
-      </w:r>
-    </w:p>
-    <w:p>
-      <w:r>
-        <w:rPr>
-          <w:b/>
-          <w:sz w:val="26"/>
-        </w:rPr>
-        <w:t>——一个定义，与对 AI 涌现机制的一个猜测</w:t>
-      </w:r>
-    </w:p>
-    <w:p>
-      <w:r>
-        <w:rPr>
-          <w:b w:val="0"/>
-          <w:sz w:val="22"/>
-        </w:rPr>
-        <w:t>作者： 何淇</w:t>
-      </w:r>
-    </w:p>
-    <w:p>
-      <w:r>
-        <w:rPr>
-          <w:b w:val="0"/>
-          <w:sz w:val="22"/>
-        </w:rPr>
-        <w:t>AI 协作： DeepSeek（大语言模型；分工见文末声明）</w:t>
-      </w:r>
-    </w:p>
-    <w:p>
-      <w:r>
-        <w:rPr>
-          <w:b w:val="0"/>
-          <w:sz w:val="22"/>
-        </w:rPr>
-        <w:t>DOI： https://doi.org/10.5281/zenodo.23488543</w:t>
-      </w:r>
-    </w:p>
-    <w:p>
-      <w:r>
-        <w:rPr>
-          <w:b w:val="0"/>
-          <w:sz w:val="22"/>
-        </w:rPr>
-        <w:t>邮箱： 15907239031@163.com　　单位： 独立研究者（Independent Researcher）</w:t>
-      </w:r>
-    </w:p>
-    <w:p>
-      <w:r>
-        <w:rPr>
-          <w:b/>
-          <w:sz w:val="26"/>
-        </w:rPr>
-        <w:t>摘要</w:t>
-      </w:r>
-    </w:p>
-    <w:p>
-      <w:r>
-        <w:rPr>
-          <w:b w:val="0"/>
-          <w:sz w:val="22"/>
-        </w:rPr>
-        <w:t>本文提出一个可操作的生命定义：生命 = 一族会自指、会变化、会自我维持的动态函数（函数类）；环境 = 宇宙自发涌现的局部解压（分层，不自我维持），生命既活在它的那一层环境里，也活在宇宙里。以此为尺子，本文说明三件事：① 现在的 AI 不是生命——它是冻结的函数点、更新规则在外部、不付代价；② 生命至少需要三条必要条件（一族函数、自指更新、自己付代价），每条都挂上已有的实验证据；③ 对 AI 的涌现提出一个猜测——AI 是对人类语言的再解压，其能力上限由训练时刻的语言决定，语言一旦更新就失配、且无法自己恢复。文末不主张「生命已被造出」，只把判据与证据放在读者面前：三条都满足之后是否就「活」，由读者判断。本文的推理顺序也是反的：先从大模型（一个能工作的巨大解压器）反推「被记录的世界具有函数结构」，再由此给出生命的定义——这个反推本身，是论证的一部分（见 1.0）。</w:t>
-      </w:r>
-    </w:p>
-    <w:p>
-      <w:r>
-        <w:rPr>
-          <w:b w:val="0"/>
-          <w:sz w:val="22"/>
-        </w:rPr>
-        <w:t>关键词： 生命定义；函数类；解压；压缩与代价；AI 涌现；自维持</w:t>
-      </w:r>
-    </w:p>
-    <w:p>
-      <w:r>
-        <w:rPr>
-          <w:b/>
-          <w:sz w:val="26"/>
-        </w:rPr>
-        <w:t>目录</w:t>
-      </w:r>
-    </w:p>
-    <w:p>
-      <w:r>
-        <w:rPr>
-          <w:b w:val="0"/>
-          <w:sz w:val="22"/>
-        </w:rPr>
-        <w:t>1. 与既有工作的关系</w:t>
-      </w:r>
-    </w:p>
-    <w:p>
-      <w:r>
-        <w:rPr>
-          <w:b w:val="0"/>
-          <w:sz w:val="22"/>
-        </w:rPr>
-        <w:t>2. 第一节　世界的根源是数学性的（猜想）</w:t>
-      </w:r>
-    </w:p>
-    <w:p>
-      <w:r>
-        <w:rPr>
-          <w:b w:val="0"/>
-          <w:sz w:val="22"/>
-        </w:rPr>
-        <w:t>3. 第二节　生命是一个会自指、会变化、会自我维持的动态函数类</w:t>
-      </w:r>
-    </w:p>
-    <w:p>
-      <w:r>
-        <w:rPr>
-          <w:b w:val="0"/>
-          <w:sz w:val="22"/>
-        </w:rPr>
-        <w:t>4. 第三节　目前的 AI 为什么不是生命</w:t>
-      </w:r>
-    </w:p>
-    <w:p>
-      <w:r>
-        <w:rPr>
-          <w:b w:val="0"/>
-          <w:sz w:val="22"/>
-        </w:rPr>
-        <w:t>5. 第四节　生命需要什么：三条必要条件</w:t>
-      </w:r>
-    </w:p>
-    <w:p>
-      <w:r>
-        <w:rPr>
-          <w:b w:val="0"/>
-          <w:sz w:val="22"/>
-        </w:rPr>
-        <w:t>6. 第五节　为什么现在的 AI 会出现涌现？</w:t>
-      </w:r>
-    </w:p>
-    <w:p>
-      <w:r>
-        <w:rPr>
-          <w:b w:val="0"/>
-          <w:sz w:val="22"/>
-        </w:rPr>
-        <w:t>7. 第六节　测量层面：既有工作与本文的位置</w:t>
-      </w:r>
-    </w:p>
-    <w:p>
-      <w:r>
-        <w:rPr>
-          <w:b w:val="0"/>
-          <w:sz w:val="22"/>
-        </w:rPr>
-        <w:t>8. 参考文献</w:t>
-      </w:r>
-    </w:p>
-    <w:p>
-      <w:r>
-        <w:rPr>
-          <w:b/>
-          <w:sz w:val="26"/>
-        </w:rPr>
-        <w:t>与既有工作的关系</w:t>
-      </w:r>
-    </w:p>
-    <w:p>
-      <w:r>
-        <w:rPr>
-          <w:b w:val="0"/>
-          <w:sz w:val="22"/>
-        </w:rPr>
-        <w:t>「压缩 / 解压」的视角有长期传统：</w:t>
-      </w:r>
-    </w:p>
-    <w:p>
-      <w:r>
-        <w:rPr>
-          <w:b w:val="0"/>
-          <w:sz w:val="22"/>
-        </w:rPr>
-        <w:t>• Schrödinger（1944）：生命以负熵为食 —— 生存靠从环境摄取低熵，是「解压」的物理前身[7]。</w:t>
-      </w:r>
-    </w:p>
-    <w:p>
-      <w:r>
-        <w:rPr>
-          <w:b w:val="0"/>
-          <w:sz w:val="22"/>
-        </w:rPr>
-        <w:t>• Bennett（1988）逻辑深度：用「从最短描述重建（解压）一个对象所需的计算量」度量复杂性，并明确把它与生命/有机体联系起来[8] —— 这是「解压」最正式的已有版本。</w:t>
-      </w:r>
-    </w:p>
-    <w:p>
-      <w:r>
-        <w:rPr>
-          <w:b w:val="0"/>
-          <w:sz w:val="22"/>
-        </w:rPr>
-        <w:t>• Chaitin（2010）生命作为演化软件：DNA = 程序，生命 = 会自我修改的软件[9]。</w:t>
-      </w:r>
-    </w:p>
-    <w:p>
-      <w:r>
-        <w:rPr>
-          <w:b w:val="0"/>
-          <w:sz w:val="22"/>
-        </w:rPr>
-        <w:t>• Solomonoff–Kolmogorov / MDL：描述长度 = 理解 = 压缩[10]。</w:t>
-      </w:r>
-    </w:p>
-    <w:p>
-      <w:r>
-        <w:rPr>
-          <w:b w:val="0"/>
-          <w:sz w:val="22"/>
-        </w:rPr>
-        <w:t>• Friston（2010）自由能原理：生命 = 最小化惊奇（≈ 持续压缩/预测）[11]。</w:t>
-      </w:r>
-    </w:p>
-    <w:p>
-      <w:r>
-        <w:rPr>
-          <w:b w:val="0"/>
-          <w:sz w:val="22"/>
-        </w:rPr>
-        <w:t>• Delétang et al.（2023）：语言模型是压缩器[6]。</w:t>
-      </w:r>
-    </w:p>
-    <w:p>
-      <w:r>
-        <w:rPr>
-          <w:b w:val="0"/>
-          <w:sz w:val="22"/>
-        </w:rPr>
-        <w:t>• Maturana &amp; Varela（1972）自创生：生命 = 自我生产的组织 —— 「维持」的另一条传统。</w:t>
-      </w:r>
-    </w:p>
-    <w:p>
-      <w:r>
-        <w:rPr>
-          <w:b w:val="0"/>
-          <w:sz w:val="22"/>
-        </w:rPr>
-        <w:t>• 「Life as Sustained Mutual Information」（Zenodo）：以持续互信息定义生命 —— 最接近本文「被维持的解压」的已有版本。</w:t>
-      </w:r>
-    </w:p>
-    <w:p>
-      <w:r>
-        <w:rPr>
-          <w:b w:val="0"/>
-          <w:sz w:val="22"/>
-        </w:rPr>
-        <w:t>需要说明：以上工作已经把「生命 = 信息/压缩/自我维持的过程」说过。本文的位置不是首次提出这一思想，而是把其中一条（解压的维持）变成可操作的判据与可测量的实验。</w:t>
-      </w:r>
-    </w:p>
-    <w:p>
-      <w:r>
-        <w:rPr>
-          <w:b w:val="0"/>
-          <w:sz w:val="22"/>
-        </w:rPr>
-        <w:t>本文的区别（三处）：</w:t>
-      </w:r>
-    </w:p>
-    <w:p>
-      <w:r>
-        <w:rPr>
-          <w:b w:val="0"/>
-          <w:sz w:val="22"/>
-        </w:rPr>
-        <w:t>1. 把解压做成层级：宇宙 → 环境 → 人类语言 → AI（既有工作多为单层度量）；</w:t>
-      </w:r>
-    </w:p>
-    <w:p>
-      <w:r>
-        <w:rPr>
-          <w:b w:val="0"/>
-          <w:sz w:val="22"/>
-        </w:rPr>
-        <w:t>2. 用「是否维持解压」区分生命与 AI：生命 = 被维持的解压，AI = 一次性解压；</w:t>
-      </w:r>
-    </w:p>
-    <w:p>
-      <w:r>
-        <w:rPr>
-          <w:b w:val="0"/>
-          <w:sz w:val="22"/>
-        </w:rPr>
-        <w:t>3. 指出上层写死 ⇒ 语言一变，解压能力衰减且无法自恢复 —— 冻结模型的失效机制。</w:t>
+        <w:t>论文-01 · 现在的 AI 为什么不是生命</w:t>
       </w:r>
     </w:p>
     <w:p>
@@ -311,25 +23,7 @@
           <w:b/>
           <w:sz w:val="34"/>
         </w:rPr>
-        <w:t>第一节 · 世界的根源是数学性的（猜想）</w:t>
-      </w:r>
-    </w:p>
-    <w:p>
-      <w:r>
-        <w:rPr>
-          <w:b w:val="0"/>
-          <w:sz w:val="20"/>
-        </w:rPr>
-        <w:t>**本节性质：猜想（conjecture）。不是定理，不是已证明的事实，也不是本文的证据。**</w:t>
-      </w:r>
-    </w:p>
-    <w:p>
-      <w:r>
-        <w:rPr>
-          <w:b w:val="0"/>
-          <w:sz w:val="20"/>
-        </w:rPr>
-        <w:t>写在这里是为了交代我们的出发点；**本文其余部分的任何判据都不依赖这个猜想成立。**</w:t>
+        <w:t>现在的 AI 为什么不是生命</w:t>
       </w:r>
     </w:p>
     <w:p>
@@ -338,7 +32,7 @@
           <w:b/>
           <w:sz w:val="26"/>
         </w:rPr>
-        <w:t>1.0 推理顺序：从大模型反推世界是函数</w:t>
+        <w:t>摘要</w:t>
       </w:r>
     </w:p>
     <w:p>
@@ -347,67 +41,7 @@
           <w:b w:val="0"/>
           <w:sz w:val="22"/>
         </w:rPr>
-        <w:t>本文的推理顺序是反的：不是先断言「世界是函数」，再去解释 AI；而是先有一个能工作的巨大解压器，再反推被压的东西长什么样。</w:t>
-      </w:r>
-    </w:p>
-    <w:p>
-      <w:r>
-        <w:rPr>
-          <w:rFonts w:ascii="Consolas" w:hAnsi="Consolas" w:eastAsia="Consolas"/>
-          <w:b w:val="0"/>
-          <w:sz w:val="18"/>
-        </w:rPr>
-        <w:t>① 事实：大模型存在，且能在大规模语言上工作</w:t>
-      </w:r>
-    </w:p>
-    <w:p>
-      <w:r>
-        <w:rPr>
-          <w:rFonts w:ascii="Consolas" w:hAnsi="Consolas" w:eastAsia="Consolas"/>
-          <w:b w:val="0"/>
-          <w:sz w:val="18"/>
-        </w:rPr>
-        <w:t xml:space="preserve">   ⇒ 它确实从语言里恢复出了结构（预测、迁移、推理）</w:t>
-      </w:r>
-    </w:p>
-    <w:p>
-      <w:r>
-        <w:rPr>
-          <w:rFonts w:ascii="Consolas" w:hAnsi="Consolas" w:eastAsia="Consolas"/>
-          <w:b w:val="0"/>
-          <w:sz w:val="18"/>
-        </w:rPr>
-        <w:t>② 推论：语言所记录的那一层世界，可以被函数逼近</w:t>
-      </w:r>
-    </w:p>
-    <w:p>
-      <w:r>
-        <w:rPr>
-          <w:rFonts w:ascii="Consolas" w:hAnsi="Consolas" w:eastAsia="Consolas"/>
-          <w:b w:val="0"/>
-          <w:sz w:val="18"/>
-        </w:rPr>
-        <w:t xml:space="preserve">   ⇒ 否则这样的机器不可能工作</w:t>
-      </w:r>
-    </w:p>
-    <w:p>
-      <w:r>
-        <w:rPr>
-          <w:rFonts w:ascii="Consolas" w:hAnsi="Consolas" w:eastAsia="Consolas"/>
-          <w:b w:val="0"/>
-          <w:sz w:val="18"/>
-        </w:rPr>
-        <w:t>③ 反推：世界（至少被语言/观测记录的那一层）具有函数结构</w:t>
-      </w:r>
-    </w:p>
-    <w:p>
-      <w:r>
-        <w:rPr>
-          <w:rFonts w:ascii="Consolas" w:hAnsi="Consolas" w:eastAsia="Consolas"/>
-          <w:b w:val="0"/>
-          <w:sz w:val="18"/>
-        </w:rPr>
-        <w:t>④ 定义：生命 = 维持这种「从世界到结构」的解压过程的系统</w:t>
+        <w:t>本文提出一个可操作的生命定义：生命 = 一族会自指、会变化、会自我维持的动态函数（函数类）；环境 = 宇宙自发涌现的局部解压（分层，不自我维持），生命既活在它的那一层环境里，也活在宇宙里。以此为尺子，本文说明三件事：① 现在的 AI 不是生命——它是冻结的函数点、更新规则在外部、不付代价；② 生命至少需要三条必要条件（一族函数、自指更新、自己付代价），每条都挂上已有的实验证据；③ 对 AI 的涌现提出一个猜测——AI 是对人类语言的再解压，其能力上限由训练时刻的语言决定，语言一旦更新就失配、且无法自己恢复。文末不主张「生命已被造出」，只把判据与证据放在读者面前：三条都满足之后是否就「活」，由读者判断。本文的推理顺序也是反的：先从大模型（一个能工作的巨大解压器）反推「被记录的世界具有函数结构」，再由此给出生命的定义——这个反推本身，是论证的一部分（见 1.0）。</w:t>
       </w:r>
     </w:p>
     <w:p>
@@ -416,43 +50,7 @@
           <w:b w:val="0"/>
           <w:sz w:val="22"/>
         </w:rPr>
-        <w:t>这条顺序有三点要注意：</w:t>
-      </w:r>
-    </w:p>
-    <w:p>
-      <w:r>
-        <w:rPr>
-          <w:b w:val="0"/>
-          <w:sz w:val="22"/>
-        </w:rPr>
-        <w:t>1. 大模型是「世界可被函数逼近」的存在性证据，不是证明。 它证明的是：在语言覆盖的范围内，存在一个函数能很好地逼近；不证明整个世界都是函数。</w:t>
-      </w:r>
-    </w:p>
-    <w:p>
-      <w:r>
-        <w:rPr>
-          <w:b w:val="0"/>
-          <w:sz w:val="22"/>
-        </w:rPr>
-        <w:t>2. 反推只覆盖被记录的层。 语言没有记录的部分（具身直觉、因果干预、未观测变量），反推不成立——这也是「观测墙」的来源（见第 7 篇）。</w:t>
-      </w:r>
-    </w:p>
-    <w:p>
-      <w:r>
-        <w:rPr>
-          <w:b w:val="0"/>
-          <w:sz w:val="22"/>
-        </w:rPr>
-        <w:t>3. 它是可证伪的。 如果世界的某部分不可函数化，那么模型在对应任务上应当系统性失效，而不是靠更多数据就能补上。我们在具身、因果、连续物理直觉上的观察，与这一点一致。</w:t>
-      </w:r>
-    </w:p>
-    <w:p>
-      <w:r>
-        <w:rPr>
-          <w:b w:val="0"/>
-          <w:sz w:val="22"/>
-        </w:rPr>
-        <w:t>换句话说：我们不是先定义生命再去找世界，而是先看到「世界能被函数压」，才敢说生命是「函数的维持」。 这个反推顺序本身，是本文论证的一部分。</w:t>
+        <w:t>关键词： 生命定义；函数类；解压；压缩与代价；AI 涌现；自维持</w:t>
       </w:r>
     </w:p>
     <w:p>
@@ -461,7 +59,7 @@
           <w:b/>
           <w:sz w:val="26"/>
         </w:rPr>
-        <w:t>1.1 猜想的内容</w:t>
+        <w:t>目录</w:t>
       </w:r>
     </w:p>
     <w:p>
@@ -470,47 +68,430 @@
           <w:b w:val="0"/>
           <w:sz w:val="22"/>
         </w:rPr>
-        <w:t>物理规则是用数学写成的，所以世界的根源是数学性的。</w:t>
-      </w:r>
-    </w:p>
-    <w:p>
-      <w:r>
-        <w:rPr>
-          <w:rFonts w:ascii="Consolas" w:hAnsi="Consolas" w:eastAsia="Consolas"/>
-          <w:b w:val="0"/>
-          <w:sz w:val="18"/>
-        </w:rPr>
-        <w:t>事实：最基础的物理定律本身就是数学命题</w:t>
-      </w:r>
-    </w:p>
-    <w:p>
-      <w:r>
-        <w:rPr>
-          <w:rFonts w:ascii="Consolas" w:hAnsi="Consolas" w:eastAsia="Consolas"/>
-          <w:b w:val="0"/>
-          <w:sz w:val="18"/>
-        </w:rPr>
-        <w:t xml:space="preserve">      F = ma、最小作用量 δS=0、iħ∂ψ/∂t = Ĥψ、ds² = g_{μν}dx^μdx^ν</w:t>
-      </w:r>
-    </w:p>
-    <w:p>
-      <w:r>
-        <w:rPr>
-          <w:rFonts w:ascii="Consolas" w:hAnsi="Consolas" w:eastAsia="Consolas"/>
-          <w:b w:val="0"/>
-          <w:sz w:val="18"/>
-        </w:rPr>
-        <w:t>猜想：既然描述世界最深层的方式是数学的，世界本身的结构就是数学的</w:t>
-      </w:r>
-    </w:p>
-    <w:p>
-      <w:r>
-        <w:rPr>
-          <w:rFonts w:ascii="Consolas" w:hAnsi="Consolas" w:eastAsia="Consolas"/>
-          <w:b w:val="0"/>
-          <w:sz w:val="18"/>
-        </w:rPr>
-        <w:t xml:space="preserve">      —— 否则数学为何能如此精确地描述它？</w:t>
+        <w:t>• 一、起点：一句最硬的话</w:t>
+      </w:r>
+    </w:p>
+    <w:p>
+      <w:r>
+        <w:rPr>
+          <w:b w:val="0"/>
+          <w:sz w:val="22"/>
+        </w:rPr>
+        <w:t>• 1.1 事实</w:t>
+      </w:r>
+    </w:p>
+    <w:p>
+      <w:r>
+        <w:rPr>
+          <w:b w:val="0"/>
+          <w:sz w:val="22"/>
+        </w:rPr>
+        <w:t>• 1.2 从语言到世界的推理顺序</w:t>
+      </w:r>
+    </w:p>
+    <w:p>
+      <w:r>
+        <w:rPr>
+          <w:b w:val="0"/>
+          <w:sz w:val="22"/>
+        </w:rPr>
+        <w:t>• 二、第一层改写：语言结构可以被函数描述</w:t>
+      </w:r>
+    </w:p>
+    <w:p>
+      <w:r>
+        <w:rPr>
+          <w:b w:val="0"/>
+          <w:sz w:val="22"/>
+        </w:rPr>
+        <w:t>• 2.1 改写是等价的</w:t>
+      </w:r>
+    </w:p>
+    <w:p>
+      <w:r>
+        <w:rPr>
+          <w:b w:val="0"/>
+          <w:sz w:val="22"/>
+        </w:rPr>
+        <w:t>• 三、第二层猜想：世界可以被函数描述</w:t>
+      </w:r>
+    </w:p>
+    <w:p>
+      <w:r>
+        <w:rPr>
+          <w:b w:val="0"/>
+          <w:sz w:val="22"/>
+        </w:rPr>
+        <w:t>• 3.1 猜想的内容</w:t>
+      </w:r>
+    </w:p>
+    <w:p>
+      <w:r>
+        <w:rPr>
+          <w:b w:val="0"/>
+          <w:sz w:val="22"/>
+        </w:rPr>
+        <w:t>• 3.2 为什么它只能是猜想</w:t>
+      </w:r>
+    </w:p>
+    <w:p>
+      <w:r>
+        <w:rPr>
+          <w:b w:val="0"/>
+          <w:sz w:val="22"/>
+        </w:rPr>
+        <w:t>• 3.3 与既有工作的关系</w:t>
+      </w:r>
+    </w:p>
+    <w:p>
+      <w:r>
+        <w:rPr>
+          <w:b w:val="0"/>
+          <w:sz w:val="22"/>
+        </w:rPr>
+        <w:t>• 3.4 标注</w:t>
+      </w:r>
+    </w:p>
+    <w:p>
+      <w:r>
+        <w:rPr>
+          <w:b w:val="0"/>
+          <w:sz w:val="22"/>
+        </w:rPr>
+        <w:t>• 四、一个可操作的定义</w:t>
+      </w:r>
+    </w:p>
+    <w:p>
+      <w:r>
+        <w:rPr>
+          <w:b w:val="0"/>
+          <w:sz w:val="22"/>
+        </w:rPr>
+        <w:t>• 4.1 定义</w:t>
+      </w:r>
+    </w:p>
+    <w:p>
+      <w:r>
+        <w:rPr>
+          <w:b w:val="0"/>
+          <w:sz w:val="22"/>
+        </w:rPr>
+        <w:t>• 4.2 一处澄清：维持是关系</w:t>
+      </w:r>
+    </w:p>
+    <w:p>
+      <w:r>
+        <w:rPr>
+          <w:b w:val="0"/>
+          <w:sz w:val="22"/>
+        </w:rPr>
+        <w:t>• 4.3 为什么必须是「一族」而不是「一个函数」</w:t>
+      </w:r>
+    </w:p>
+    <w:p>
+      <w:r>
+        <w:rPr>
+          <w:b w:val="0"/>
+          <w:sz w:val="22"/>
+        </w:rPr>
+        <w:t>• 4.4 会变化 = 三层时间尺度</w:t>
+      </w:r>
+    </w:p>
+    <w:p>
+      <w:r>
+        <w:rPr>
+          <w:b w:val="0"/>
+          <w:sz w:val="22"/>
+        </w:rPr>
+        <w:t>• 4.5 会自指 = 更新规则在它自己里面</w:t>
+      </w:r>
+    </w:p>
+    <w:p>
+      <w:r>
+        <w:rPr>
+          <w:b w:val="0"/>
+          <w:sz w:val="22"/>
+        </w:rPr>
+        <w:t>• 五、生命与环境</w:t>
+      </w:r>
+    </w:p>
+    <w:p>
+      <w:r>
+        <w:rPr>
+          <w:b w:val="0"/>
+          <w:sz w:val="22"/>
+        </w:rPr>
+        <w:t>• 5.1 与前面的衔接</w:t>
+      </w:r>
+    </w:p>
+    <w:p>
+      <w:r>
+        <w:rPr>
+          <w:b w:val="0"/>
+          <w:sz w:val="22"/>
+        </w:rPr>
+        <w:t>• 5.2 生命 vs 环境：都在宇宙里，都是函数，区别只有一条</w:t>
+      </w:r>
+    </w:p>
+    <w:p>
+      <w:r>
+        <w:rPr>
+          <w:b w:val="0"/>
+          <w:sz w:val="22"/>
+        </w:rPr>
+        <w:t>• 5.3 环境是什么：宇宙里自发涌现的「局部解压」</w:t>
+      </w:r>
+    </w:p>
+    <w:p>
+      <w:r>
+        <w:rPr>
+          <w:b w:val="0"/>
+          <w:sz w:val="22"/>
+        </w:rPr>
+        <w:t>• 5.4 环境是分层的：生命活在多层环境里，同时也活在宇宙里</w:t>
+      </w:r>
+    </w:p>
+    <w:p>
+      <w:r>
+        <w:rPr>
+          <w:b w:val="0"/>
+          <w:sz w:val="22"/>
+        </w:rPr>
+        <w:t>• 5.5 标注</w:t>
+      </w:r>
+    </w:p>
+    <w:p>
+      <w:r>
+        <w:rPr>
+          <w:b w:val="0"/>
+          <w:sz w:val="22"/>
+        </w:rPr>
+        <w:t>• 六、检查表：定义能区分什么</w:t>
+      </w:r>
+    </w:p>
+    <w:p>
+      <w:r>
+        <w:rPr>
+          <w:b w:val="0"/>
+          <w:sz w:val="22"/>
+        </w:rPr>
+        <w:t>• 6.1 检查表</w:t>
+      </w:r>
+    </w:p>
+    <w:p>
+      <w:r>
+        <w:rPr>
+          <w:b w:val="0"/>
+          <w:sz w:val="22"/>
+        </w:rPr>
+        <w:t>• 6.2 三条最根本的原因（按重要性）</w:t>
+      </w:r>
+    </w:p>
+    <w:p>
+      <w:r>
+        <w:rPr>
+          <w:b w:val="0"/>
+          <w:sz w:val="22"/>
+        </w:rPr>
+        <w:t>• 6.3 为什么「它很强」与「它不是生命」不矛盾</w:t>
+      </w:r>
+    </w:p>
+    <w:p>
+      <w:r>
+        <w:rPr>
+          <w:b w:val="0"/>
+          <w:sz w:val="22"/>
+        </w:rPr>
+        <w:t>• 6.4 标注</w:t>
+      </w:r>
+    </w:p>
+    <w:p>
+      <w:r>
+        <w:rPr>
+          <w:b w:val="0"/>
+          <w:sz w:val="22"/>
+        </w:rPr>
+        <w:t>• 七、三条必要条件</w:t>
+      </w:r>
+    </w:p>
+    <w:p>
+      <w:r>
+        <w:rPr>
+          <w:b w:val="0"/>
+          <w:sz w:val="22"/>
+        </w:rPr>
+        <w:t>• 7.1 从定义到条件</w:t>
+      </w:r>
+    </w:p>
+    <w:p>
+      <w:r>
+        <w:rPr>
+          <w:b w:val="0"/>
+          <w:sz w:val="22"/>
+        </w:rPr>
+        <w:t>• 7.2 条件① 一族函数（不是一个点）</w:t>
+      </w:r>
+    </w:p>
+    <w:p>
+      <w:r>
+        <w:rPr>
+          <w:b w:val="0"/>
+          <w:sz w:val="22"/>
+        </w:rPr>
+        <w:t>• 7.3 条件② 自指更新（规则在自己里面）</w:t>
+      </w:r>
+    </w:p>
+    <w:p>
+      <w:r>
+        <w:rPr>
+          <w:b w:val="0"/>
+          <w:sz w:val="22"/>
+        </w:rPr>
+        <w:t>• 7.4 条件③ 自己付代价（压缩换生存）</w:t>
+      </w:r>
+    </w:p>
+    <w:p>
+      <w:r>
+        <w:rPr>
+          <w:b w:val="0"/>
+          <w:sz w:val="22"/>
+        </w:rPr>
+        <w:t>• 7.5 三条必须同时成立（经验对照）</w:t>
+      </w:r>
+    </w:p>
+    <w:p>
+      <w:r>
+        <w:rPr>
+          <w:b w:val="0"/>
+          <w:sz w:val="22"/>
+        </w:rPr>
+        <w:t>• 7.6 未尽之处（留给读者）</w:t>
+      </w:r>
+    </w:p>
+    <w:p>
+      <w:r>
+        <w:rPr>
+          <w:b w:val="0"/>
+          <w:sz w:val="22"/>
+        </w:rPr>
+        <w:t>• 7.7 本文实验的边界（必须与结论一起读）</w:t>
+      </w:r>
+    </w:p>
+    <w:p>
+      <w:r>
+        <w:rPr>
+          <w:b w:val="0"/>
+          <w:sz w:val="22"/>
+        </w:rPr>
+        <w:t>• 7.8 标注</w:t>
+      </w:r>
+    </w:p>
+    <w:p>
+      <w:r>
+        <w:rPr>
+          <w:b w:val="0"/>
+          <w:sz w:val="22"/>
+        </w:rPr>
+        <w:t>• 八、涌现：为什么现在的 AI 会涌现</w:t>
+      </w:r>
+    </w:p>
+    <w:p>
+      <w:r>
+        <w:rPr>
+          <w:b w:val="0"/>
+          <w:sz w:val="22"/>
+        </w:rPr>
+        <w:t>• 8.1 现象</w:t>
+      </w:r>
+    </w:p>
+    <w:p>
+      <w:r>
+        <w:rPr>
+          <w:b w:val="0"/>
+          <w:sz w:val="22"/>
+        </w:rPr>
+        <w:t>• 8.2 现有的解释（按证据强度排列）</w:t>
+      </w:r>
+    </w:p>
+    <w:p>
+      <w:r>
+        <w:rPr>
+          <w:b w:val="0"/>
+          <w:sz w:val="22"/>
+        </w:rPr>
+        <w:t>• 8.3 为什么至今没有公认的「为什么」</w:t>
+      </w:r>
+    </w:p>
+    <w:p>
+      <w:r>
+        <w:rPr>
+          <w:b w:val="0"/>
+          <w:sz w:val="22"/>
+        </w:rPr>
+        <w:t>• 8.4 我们的立场（[推测]，不是本文证据）：AI 是对人类语言的解压</w:t>
+      </w:r>
+    </w:p>
+    <w:p>
+      <w:r>
+        <w:rPr>
+          <w:b w:val="0"/>
+          <w:sz w:val="22"/>
+        </w:rPr>
+        <w:t>• 8.5 解压能力的衰减：上层写死 ⇒ 语言一变，解压变弱</w:t>
+      </w:r>
+    </w:p>
+    <w:p>
+      <w:r>
+        <w:rPr>
+          <w:b w:val="0"/>
+          <w:sz w:val="22"/>
+        </w:rPr>
+        <w:t>• 8.6 由立场推出的两条预测（[推测]，供读者判断）</w:t>
+      </w:r>
+    </w:p>
+    <w:p>
+      <w:r>
+        <w:rPr>
+          <w:b w:val="0"/>
+          <w:sz w:val="22"/>
+        </w:rPr>
+        <w:t>• 8.7 标注</w:t>
+      </w:r>
+    </w:p>
+    <w:p>
+      <w:r>
+        <w:rPr>
+          <w:b w:val="0"/>
+          <w:sz w:val="22"/>
+        </w:rPr>
+        <w:t>• 九、用它看几个热门问题</w:t>
+      </w:r>
+    </w:p>
+    <w:p>
+      <w:r>
+        <w:rPr>
+          <w:b w:val="0"/>
+          <w:sz w:val="22"/>
+        </w:rPr>
+        <w:t>• 十、本文得到了什么，没得到什么</w:t>
+      </w:r>
+    </w:p>
+    <w:p>
+      <w:r>
+        <w:rPr>
+          <w:b w:val="0"/>
+          <w:sz w:val="22"/>
+        </w:rPr>
+        <w:t>• 参考文献</w:t>
+      </w:r>
+    </w:p>
+    <w:p>
+      <w:r>
+        <w:rPr>
+          <w:b w:val="0"/>
+          <w:sz w:val="22"/>
+        </w:rPr>
+        <w:t>• 作者声明（AI 使用声明）</w:t>
       </w:r>
     </w:p>
     <w:p>
@@ -519,57 +500,34 @@
           <w:b/>
           <w:sz w:val="26"/>
         </w:rPr>
-        <w:t>1.2 为什么它只能是猜想</w:t>
-      </w:r>
-    </w:p>
-    <w:p>
-      <w:r>
-        <w:rPr>
-          <w:rFonts w:ascii="Consolas" w:hAnsi="Consolas" w:eastAsia="Consolas"/>
-          <w:b w:val="0"/>
-          <w:sz w:val="18"/>
-        </w:rPr>
-        <w:t>① 这是对「数学为何有效」的解释性推断，不是证明</w:t>
-      </w:r>
-    </w:p>
-    <w:p>
-      <w:r>
-        <w:rPr>
-          <w:rFonts w:ascii="Consolas" w:hAnsi="Consolas" w:eastAsia="Consolas"/>
-          <w:b w:val="0"/>
-          <w:sz w:val="18"/>
-        </w:rPr>
-        <w:t>② 存在等价的另一读法：数学只是**描述语言**，世界本身是什么我们不知道</w:t>
-      </w:r>
-    </w:p>
-    <w:p>
-      <w:r>
-        <w:rPr>
-          <w:rFonts w:ascii="Consolas" w:hAnsi="Consolas" w:eastAsia="Consolas"/>
-          <w:b w:val="0"/>
-          <w:sz w:val="18"/>
-        </w:rPr>
-        <w:t xml:space="preserve">   （工具论 vs 实在论；两者目前无法用实验区分）</w:t>
-      </w:r>
-    </w:p>
-    <w:p>
-      <w:r>
-        <w:rPr>
-          <w:rFonts w:ascii="Consolas" w:hAnsi="Consolas" w:eastAsia="Consolas"/>
-          <w:b w:val="0"/>
-          <w:sz w:val="18"/>
-        </w:rPr>
-        <w:t>③ 强形式（世界=数学结构，Tegmark[2] 数学宇宙假说）不可证伪，因而不能当科学结论</w:t>
-      </w:r>
-    </w:p>
-    <w:p>
-      <w:r>
-        <w:rPr>
-          <w:rFonts w:ascii="Consolas" w:hAnsi="Consolas" w:eastAsia="Consolas"/>
-          <w:b w:val="0"/>
-          <w:sz w:val="18"/>
-        </w:rPr>
-        <w:t>④ 这是 Wigner[1] 所说的「数学在自然科学中不合理的有效性」之谜，本文不解答它</w:t>
+        <w:t>一、起点：一句最硬的话</w:t>
+      </w:r>
+    </w:p>
+    <w:p>
+      <w:r>
+        <w:rPr>
+          <w:b w:val="0"/>
+          <w:sz w:val="22"/>
+        </w:rPr>
+        <w:t>关于 AI 与生命，争论很多，但大多数争论的起点不一样。本文的起点是一个已经发生的事实：语言可以被函数近似。</w:t>
+      </w:r>
+    </w:p>
+    <w:p>
+      <w:r>
+        <w:rPr>
+          <w:b w:val="0"/>
+          <w:sz w:val="22"/>
+        </w:rPr>
+        <w:t>这句话的证据不是推理，是存在：大模型用可计算的、有限参数的过程，生成了在统计上接近人类语言的文本。它没有理解语言，但它近似了语言——近似到能通过考试、能写代码、能对话。</w:t>
+      </w:r>
+    </w:p>
+    <w:p>
+      <w:r>
+        <w:rPr>
+          <w:b w:val="0"/>
+          <w:sz w:val="22"/>
+        </w:rPr>
+        <w:t>这是本文全部推论的锚。它之所以"最硬"，因为它是观察，不是解释；任何解释都得先承认它。下面每一层外推，本文都会标注强度：强（观察/改写）、弱（猜想）、人为（构造）。</w:t>
       </w:r>
     </w:p>
     <w:p>
@@ -578,7 +536,16 @@
           <w:b/>
           <w:sz w:val="26"/>
         </w:rPr>
-        <w:t>1.3 本文从猜想里只取一条弱表述（同样不是证明）</w:t>
+        <w:t>1.1 事实</w:t>
+      </w:r>
+    </w:p>
+    <w:p>
+      <w:r>
+        <w:rPr>
+          <w:b w:val="0"/>
+          <w:sz w:val="22"/>
+        </w:rPr>
+        <w:t>本文的推理顺序是反的：不是先断言「世界是函数」，再去解释 AI；而是先有一个能工作的巨大解压器，再反推被压的东西长什么样。</w:t>
       </w:r>
     </w:p>
     <w:p>
@@ -588,7 +555,7 @@
           <w:b w:val="0"/>
           <w:sz w:val="18"/>
         </w:rPr>
-        <w:t>弱表述：世界具有可被数学描述的规律性（经验事实，不是猜想）</w:t>
+        <w:t>① 事实：大模型存在，且能在大规模语言上工作</w:t>
       </w:r>
     </w:p>
     <w:p>
@@ -598,7 +565,7 @@
           <w:b w:val="0"/>
           <w:sz w:val="18"/>
         </w:rPr>
-        <w:t>⇒ 由此写出：S_{t+1} = F(S_t)</w:t>
+        <w:t xml:space="preserve">   ⇒ 它确实从语言里恢复出了结构（预测、迁移、推理）</w:t>
       </w:r>
     </w:p>
     <w:p>
@@ -608,7 +575,37 @@
           <w:b w:val="0"/>
           <w:sz w:val="18"/>
         </w:rPr>
-        <w:t>⇒ 规律 ⇒ 可压缩 ⇒ 可预测 ⇒ 预测有对错 ⇒ 对错可计代价</w:t>
+        <w:t>② 推论：语言所记录的那一层世界，可以被函数逼近</w:t>
+      </w:r>
+    </w:p>
+    <w:p>
+      <w:r>
+        <w:rPr>
+          <w:rFonts w:ascii="Consolas" w:hAnsi="Consolas" w:eastAsia="Consolas"/>
+          <w:b w:val="0"/>
+          <w:sz w:val="18"/>
+        </w:rPr>
+        <w:t xml:space="preserve">   ⇒ 否则这样的机器不可能工作</w:t>
+      </w:r>
+    </w:p>
+    <w:p>
+      <w:r>
+        <w:rPr>
+          <w:rFonts w:ascii="Consolas" w:hAnsi="Consolas" w:eastAsia="Consolas"/>
+          <w:b w:val="0"/>
+          <w:sz w:val="18"/>
+        </w:rPr>
+        <w:t>③ 反推：世界（至少被语言/观测记录的那一层）具有函数结构</w:t>
+      </w:r>
+    </w:p>
+    <w:p>
+      <w:r>
+        <w:rPr>
+          <w:rFonts w:ascii="Consolas" w:hAnsi="Consolas" w:eastAsia="Consolas"/>
+          <w:b w:val="0"/>
+          <w:sz w:val="18"/>
+        </w:rPr>
+        <w:t>④ 定义：生命 = 维持这种「从世界到结构」的解压过程的系统</w:t>
       </w:r>
     </w:p>
     <w:p>
@@ -617,7 +614,7 @@
           <w:b w:val="0"/>
           <w:sz w:val="22"/>
         </w:rPr>
-        <w:t>注意区分：</w:t>
+        <w:t>这条顺序有三点要注意：</w:t>
       </w:r>
     </w:p>
     <w:p>
@@ -626,7 +623,7 @@
           <w:b w:val="0"/>
           <w:sz w:val="22"/>
         </w:rPr>
-        <w:t>• **猜想** = 世界本身是数学的（本节内容，不用作证据）</w:t>
+        <w:t>1. 大模型是「世界可被函数逼近」的存在性证据，不是证明。 它证明的是：在语言覆盖的范围内，存在一个函数能很好地逼近；不证明整个世界都是函数。</w:t>
       </w:r>
     </w:p>
     <w:p>
@@ -635,7 +632,25 @@
           <w:b w:val="0"/>
           <w:sz w:val="22"/>
         </w:rPr>
-        <w:t>• **经验事实** = 世界存在可压缩的规律性（科学实践的基础，本文真正使用的东西）</w:t>
+        <w:t>2. 反推只覆盖被记录的层。 语言没有记录的部分（具身直觉、因果干预、未观测变量），反推不成立——这也是「观测墙」的来源（见第 7 篇）。</w:t>
+      </w:r>
+    </w:p>
+    <w:p>
+      <w:r>
+        <w:rPr>
+          <w:b w:val="0"/>
+          <w:sz w:val="22"/>
+        </w:rPr>
+        <w:t>3. 它是可证伪的。 如果世界的某部分不可函数化，那么模型在对应任务上应当系统性失效，而不是靠更多数据就能补上。我们在具身、因果、连续物理直觉上的观察，与这一点一致。</w:t>
+      </w:r>
+    </w:p>
+    <w:p>
+      <w:r>
+        <w:rPr>
+          <w:b w:val="0"/>
+          <w:sz w:val="22"/>
+        </w:rPr>
+        <w:t>换句话说：我们不是先定义生命再去找世界，而是先看到「世界能被函数压」，才敢说生命是「函数的维持」。 这个反推顺序本身，是本文论证的一部分。</w:t>
       </w:r>
     </w:p>
     <w:p>
@@ -644,7 +659,7 @@
           <w:b/>
           <w:sz w:val="26"/>
         </w:rPr>
-        <w:t>1.4 标注</w:t>
+        <w:t>1.2 从语言到世界的推理顺序</w:t>
       </w:r>
     </w:p>
     <w:p>
@@ -654,7 +669,7 @@
           <w:b w:val="0"/>
           <w:sz w:val="18"/>
         </w:rPr>
-        <w:t>[猜想]   世界的根源是数学性的</w:t>
+        <w:t>弱表述：世界具有可被数学描述的规律性（经验事实，不是猜想）</w:t>
       </w:r>
     </w:p>
     <w:p>
@@ -664,7 +679,7 @@
           <w:b w:val="0"/>
           <w:sz w:val="18"/>
         </w:rPr>
-        <w:t>[经验]   世界具有可被部分描述/压缩的规律性</w:t>
+        <w:t>⇒ 由此写出：S_{t+1} = F(S_t)</w:t>
       </w:r>
     </w:p>
     <w:p>
@@ -674,7 +689,97 @@
           <w:b w:val="0"/>
           <w:sz w:val="18"/>
         </w:rPr>
-        <w:t>[本文用] 只使用后者；即使前者为假，本文全部判据与实验照常成立</w:t>
+        <w:t>⇒ 规律 ⇒ 可压缩 ⇒ 可预测 ⇒ 预测有对错 ⇒ 对错可计代价</w:t>
+      </w:r>
+    </w:p>
+    <w:p>
+      <w:r>
+        <w:rPr>
+          <w:b w:val="0"/>
+          <w:sz w:val="22"/>
+        </w:rPr>
+        <w:t>注意区分：</w:t>
+      </w:r>
+    </w:p>
+    <w:p>
+      <w:r>
+        <w:rPr>
+          <w:b w:val="0"/>
+          <w:sz w:val="22"/>
+        </w:rPr>
+        <w:t>• **猜想** = 世界本身是数学的（本节内容，不用作证据）</w:t>
+      </w:r>
+    </w:p>
+    <w:p>
+      <w:r>
+        <w:rPr>
+          <w:b w:val="0"/>
+          <w:sz w:val="22"/>
+        </w:rPr>
+        <w:t>• **经验事实** = 世界存在可压缩的规律性（科学实践的基础，本文真正使用的东西）</w:t>
+      </w:r>
+    </w:p>
+    <w:p>
+      <w:r>
+        <w:rPr>
+          <w:b/>
+          <w:sz w:val="26"/>
+        </w:rPr>
+        <w:t>二、第一层改写：语言结构可以被函数描述</w:t>
+      </w:r>
+    </w:p>
+    <w:p>
+      <w:r>
+        <w:rPr>
+          <w:b w:val="0"/>
+          <w:sz w:val="22"/>
+        </w:rPr>
+        <w:t>既然语言可以被函数近似，那么语言的结构可以被函数描述。这一步几乎是同义改写：能被近似的东西，当然能被描述。区别只在于"近似"是行为上的，"描述"是结构上的；但两者指向同一个东西。这一步不需要额外假设。</w:t>
+      </w:r>
+    </w:p>
+    <w:p>
+      <w:r>
+        <w:rPr>
+          <w:b/>
+          <w:sz w:val="26"/>
+        </w:rPr>
+        <w:t>2.1 改写是等价的</w:t>
+      </w:r>
+    </w:p>
+    <w:p>
+      <w:r>
+        <w:rPr>
+          <w:b/>
+          <w:sz w:val="26"/>
+        </w:rPr>
+        <w:t>三、第二层猜想：世界可以被函数描述</w:t>
+      </w:r>
+    </w:p>
+    <w:p>
+      <w:r>
+        <w:rPr>
+          <w:b w:val="0"/>
+          <w:sz w:val="22"/>
+        </w:rPr>
+        <w:t>从"语言可被描述"再往外一步，就出了观测范围：语言背后的世界，也能被函数描述。这是猜想，不是本文能证明的。为什么要提出它？因为如果它成立，语言与世界的关系统一了：语言是世界的压缩，函数描述了语言，也间接描述了世界。它弱在哪里也必须说清：语言只是世界的一个投影，语言的函数近似在逻辑上推不出世界的函数近似——它只是一个有理由的期盼。</w:t>
+      </w:r>
+    </w:p>
+    <w:p>
+      <w:r>
+        <w:rPr>
+          <w:b/>
+          <w:sz w:val="26"/>
+        </w:rPr>
+        <w:t>3.1 猜想的内容</w:t>
+      </w:r>
+    </w:p>
+    <w:p>
+      <w:r>
+        <w:rPr>
+          <w:b w:val="0"/>
+          <w:sz w:val="22"/>
+        </w:rPr>
+        <w:t>物理规则是用数学写成的，所以世界的根源是数学性的。</w:t>
       </w:r>
     </w:p>
     <w:p>
@@ -684,7 +789,231 @@
           <w:b w:val="0"/>
           <w:sz w:val="18"/>
         </w:rPr>
-        <w:t>[不讨论] 数学为何有效（Wigner 之谜）；世界本体到底是什么</w:t>
+        <w:t>事实：最基础的物理定律本身就是数学命题</w:t>
+      </w:r>
+    </w:p>
+    <w:p>
+      <w:r>
+        <w:rPr>
+          <w:rFonts w:ascii="Consolas" w:hAnsi="Consolas" w:eastAsia="Consolas"/>
+          <w:b w:val="0"/>
+          <w:sz w:val="18"/>
+        </w:rPr>
+        <w:t xml:space="preserve">      F = ma、最小作用量 δS=0、iħ∂ψ/∂t = Ĥψ、ds² = g_{μν}dx^μdx^ν</w:t>
+      </w:r>
+    </w:p>
+    <w:p>
+      <w:r>
+        <w:rPr>
+          <w:rFonts w:ascii="Consolas" w:hAnsi="Consolas" w:eastAsia="Consolas"/>
+          <w:b w:val="0"/>
+          <w:sz w:val="18"/>
+        </w:rPr>
+        <w:t>猜想：既然描述世界最深层的方式是数学的，世界本身的结构就是数学的</w:t>
+      </w:r>
+    </w:p>
+    <w:p>
+      <w:r>
+        <w:rPr>
+          <w:rFonts w:ascii="Consolas" w:hAnsi="Consolas" w:eastAsia="Consolas"/>
+          <w:b w:val="0"/>
+          <w:sz w:val="18"/>
+        </w:rPr>
+        <w:t xml:space="preserve">      —— 否则数学为何能如此精确地描述它？</w:t>
+      </w:r>
+    </w:p>
+    <w:p>
+      <w:r>
+        <w:rPr>
+          <w:b/>
+          <w:sz w:val="26"/>
+        </w:rPr>
+        <w:t>3.2 为什么它只能是猜想</w:t>
+      </w:r>
+    </w:p>
+    <w:p>
+      <w:r>
+        <w:rPr>
+          <w:rFonts w:ascii="Consolas" w:hAnsi="Consolas" w:eastAsia="Consolas"/>
+          <w:b w:val="0"/>
+          <w:sz w:val="18"/>
+        </w:rPr>
+        <w:t>① 这是对「数学为何有效」的解释性推断，不是证明</w:t>
+      </w:r>
+    </w:p>
+    <w:p>
+      <w:r>
+        <w:rPr>
+          <w:rFonts w:ascii="Consolas" w:hAnsi="Consolas" w:eastAsia="Consolas"/>
+          <w:b w:val="0"/>
+          <w:sz w:val="18"/>
+        </w:rPr>
+        <w:t>② 存在等价的另一读法：数学只是**描述语言**，世界本身是什么我们不知道</w:t>
+      </w:r>
+    </w:p>
+    <w:p>
+      <w:r>
+        <w:rPr>
+          <w:rFonts w:ascii="Consolas" w:hAnsi="Consolas" w:eastAsia="Consolas"/>
+          <w:b w:val="0"/>
+          <w:sz w:val="18"/>
+        </w:rPr>
+        <w:t xml:space="preserve">   （工具论 vs 实在论；两者目前无法用实验区分）</w:t>
+      </w:r>
+    </w:p>
+    <w:p>
+      <w:r>
+        <w:rPr>
+          <w:rFonts w:ascii="Consolas" w:hAnsi="Consolas" w:eastAsia="Consolas"/>
+          <w:b w:val="0"/>
+          <w:sz w:val="18"/>
+        </w:rPr>
+        <w:t>③ 强形式（世界=数学结构，Tegmark[2] 数学宇宙假说）不可证伪，因而不能当科学结论</w:t>
+      </w:r>
+    </w:p>
+    <w:p>
+      <w:r>
+        <w:rPr>
+          <w:rFonts w:ascii="Consolas" w:hAnsi="Consolas" w:eastAsia="Consolas"/>
+          <w:b w:val="0"/>
+          <w:sz w:val="18"/>
+        </w:rPr>
+        <w:t>④ 这是 Wigner[1] 所说的「数学在自然科学中不合理的有效性」之谜，本文不解答它</w:t>
+      </w:r>
+    </w:p>
+    <w:p>
+      <w:r>
+        <w:rPr>
+          <w:b/>
+          <w:sz w:val="26"/>
+        </w:rPr>
+        <w:t>3.3 与既有工作的关系</w:t>
+      </w:r>
+    </w:p>
+    <w:p>
+      <w:r>
+        <w:rPr>
+          <w:b w:val="0"/>
+          <w:sz w:val="22"/>
+        </w:rPr>
+        <w:t>「压缩 / 解压」的视角有长期传统：</w:t>
+      </w:r>
+    </w:p>
+    <w:p>
+      <w:r>
+        <w:rPr>
+          <w:b w:val="0"/>
+          <w:sz w:val="22"/>
+        </w:rPr>
+        <w:t>• Schrödinger（1944）：生命以负熵为食 —— 生存靠从环境摄取低熵，是「解压」的物理前身[7]。</w:t>
+      </w:r>
+    </w:p>
+    <w:p>
+      <w:r>
+        <w:rPr>
+          <w:b w:val="0"/>
+          <w:sz w:val="22"/>
+        </w:rPr>
+        <w:t>• Bennett（1988）逻辑深度：用「从最短描述重建（解压）一个对象所需的计算量」度量复杂性，并明确把它与生命/有机体联系起来[8] —— 这是「解压」最正式的已有版本。</w:t>
+      </w:r>
+    </w:p>
+    <w:p>
+      <w:r>
+        <w:rPr>
+          <w:b w:val="0"/>
+          <w:sz w:val="22"/>
+        </w:rPr>
+        <w:t>• Chaitin（2010）生命作为演化软件：DNA = 程序，生命 = 会自我修改的软件[9]。</w:t>
+      </w:r>
+    </w:p>
+    <w:p>
+      <w:r>
+        <w:rPr>
+          <w:b w:val="0"/>
+          <w:sz w:val="22"/>
+        </w:rPr>
+        <w:t>• Solomonoff–Kolmogorov / MDL：描述长度 = 理解 = 压缩[10]。</w:t>
+      </w:r>
+    </w:p>
+    <w:p>
+      <w:r>
+        <w:rPr>
+          <w:b w:val="0"/>
+          <w:sz w:val="22"/>
+        </w:rPr>
+        <w:t>• Friston（2010）自由能原理：生命 = 最小化惊奇（≈ 持续压缩/预测）[11]。</w:t>
+      </w:r>
+    </w:p>
+    <w:p>
+      <w:r>
+        <w:rPr>
+          <w:b w:val="0"/>
+          <w:sz w:val="22"/>
+        </w:rPr>
+        <w:t>• Delétang et al.（2023）：语言模型是压缩器[6]。</w:t>
+      </w:r>
+    </w:p>
+    <w:p>
+      <w:r>
+        <w:rPr>
+          <w:b w:val="0"/>
+          <w:sz w:val="22"/>
+        </w:rPr>
+        <w:t>• Maturana &amp; Varela（1972）自创生：生命 = 自我生产的组织 —— 「维持」的另一条传统。</w:t>
+      </w:r>
+    </w:p>
+    <w:p>
+      <w:r>
+        <w:rPr>
+          <w:b w:val="0"/>
+          <w:sz w:val="22"/>
+        </w:rPr>
+        <w:t>• 「Life as Sustained Mutual Information」（Zenodo）：以持续互信息定义生命 —— 最接近本文「被维持的解压」的已有版本。</w:t>
+      </w:r>
+    </w:p>
+    <w:p>
+      <w:r>
+        <w:rPr>
+          <w:b w:val="0"/>
+          <w:sz w:val="22"/>
+        </w:rPr>
+        <w:t>需要说明：以上工作已经把「生命 = 信息/压缩/自我维持的过程」说过。本文的位置不是首次提出这一思想，而是把其中一条（解压的维持）变成可操作的判据与可测量的实验。</w:t>
+      </w:r>
+    </w:p>
+    <w:p>
+      <w:r>
+        <w:rPr>
+          <w:b w:val="0"/>
+          <w:sz w:val="22"/>
+        </w:rPr>
+        <w:t>本文的区别（三处）：</w:t>
+      </w:r>
+    </w:p>
+    <w:p>
+      <w:r>
+        <w:rPr>
+          <w:b w:val="0"/>
+          <w:sz w:val="22"/>
+        </w:rPr>
+        <w:t>1. 把解压做成层级：宇宙 → 环境 → 人类语言 → AI（既有工作多为单层度量）；</w:t>
+      </w:r>
+    </w:p>
+    <w:p>
+      <w:r>
+        <w:rPr>
+          <w:b w:val="0"/>
+          <w:sz w:val="22"/>
+        </w:rPr>
+        <w:t>2. 用「是否维持解压」区分生命与 AI：生命 = 被维持的解压，AI = 一次性解压；</w:t>
+      </w:r>
+    </w:p>
+    <w:p>
+      <w:r>
+        <w:rPr>
+          <w:b w:val="0"/>
+          <w:sz w:val="22"/>
+        </w:rPr>
+        <w:t>3. 指出上层写死 ⇒ 语言一变，解压能力衰减且无法自恢复 —— 冻结模型的失效机制。</w:t>
       </w:r>
     </w:p>
     <w:p>
@@ -696,7 +1025,7 @@
           <w:b/>
           <w:sz w:val="34"/>
         </w:rPr>
-        <w:t>第二节 · 生命是一个会自指、会变化、会自我维持的动态函数类</w:t>
+        <w:t>第一节 · 世界的根源是数学性的（猜想）</w:t>
       </w:r>
     </w:p>
     <w:p>
@@ -705,7 +1034,7 @@
           <w:b w:val="0"/>
           <w:sz w:val="20"/>
         </w:rPr>
-        <w:t>本节给出本文的工作定义。简单一句话：</w:t>
+        <w:t>**本节性质：猜想（conjecture）。不是定理，不是已证明的事实，也不是本文的证据。**</w:t>
       </w:r>
     </w:p>
     <w:p>
@@ -714,7 +1043,7 @@
           <w:b w:val="0"/>
           <w:sz w:val="20"/>
         </w:rPr>
-        <w:t>**生命 = 一族会变化、会自指、会自我维持的函数；而它怎么变，也写在它自己里面。**</w:t>
+        <w:t>写在这里是为了交代我们的出发点；**本文其余部分的任何判据都不依赖这个猜想成立。**</w:t>
       </w:r>
     </w:p>
     <w:p>
@@ -723,7 +1052,104 @@
           <w:b/>
           <w:sz w:val="26"/>
         </w:rPr>
-        <w:t>2.1 定义</w:t>
+        <w:t>3.4 标注</w:t>
+      </w:r>
+    </w:p>
+    <w:p>
+      <w:r>
+        <w:rPr>
+          <w:rFonts w:ascii="Consolas" w:hAnsi="Consolas" w:eastAsia="Consolas"/>
+          <w:b w:val="0"/>
+          <w:sz w:val="18"/>
+        </w:rPr>
+        <w:t>[猜想]   世界的根源是数学性的</w:t>
+      </w:r>
+    </w:p>
+    <w:p>
+      <w:r>
+        <w:rPr>
+          <w:rFonts w:ascii="Consolas" w:hAnsi="Consolas" w:eastAsia="Consolas"/>
+          <w:b w:val="0"/>
+          <w:sz w:val="18"/>
+        </w:rPr>
+        <w:t>[经验]   世界具有可被部分描述/压缩的规律性</w:t>
+      </w:r>
+    </w:p>
+    <w:p>
+      <w:r>
+        <w:rPr>
+          <w:rFonts w:ascii="Consolas" w:hAnsi="Consolas" w:eastAsia="Consolas"/>
+          <w:b w:val="0"/>
+          <w:sz w:val="18"/>
+        </w:rPr>
+        <w:t>[本文用] 只使用后者；即使前者为假，本文全部判据与实验照常成立</w:t>
+      </w:r>
+    </w:p>
+    <w:p>
+      <w:r>
+        <w:rPr>
+          <w:rFonts w:ascii="Consolas" w:hAnsi="Consolas" w:eastAsia="Consolas"/>
+          <w:b w:val="0"/>
+          <w:sz w:val="18"/>
+        </w:rPr>
+        <w:t>[不讨论] 数学为何有效（Wigner 之谜）；世界本体到底是什么</w:t>
+      </w:r>
+    </w:p>
+    <w:p>
+      <w:pPr>
+        <w:jc w:val="center"/>
+      </w:pPr>
+      <w:r>
+        <w:rPr>
+          <w:b/>
+          <w:sz w:val="34"/>
+        </w:rPr>
+        <w:t>第二节 · 生命是一个会自指、会变化、会自我维持的动态函数类</w:t>
+      </w:r>
+    </w:p>
+    <w:p>
+      <w:r>
+        <w:rPr>
+          <w:b w:val="0"/>
+          <w:sz w:val="20"/>
+        </w:rPr>
+        <w:t>本节给出本文的工作定义。简单一句话：</w:t>
+      </w:r>
+    </w:p>
+    <w:p>
+      <w:r>
+        <w:rPr>
+          <w:b w:val="0"/>
+          <w:sz w:val="20"/>
+        </w:rPr>
+        <w:t>**生命 = 一族会变化、会自指、会自我维持的函数；而它怎么变，也写在它自己里面。**</w:t>
+      </w:r>
+    </w:p>
+    <w:p>
+      <w:r>
+        <w:rPr>
+          <w:b/>
+          <w:sz w:val="26"/>
+        </w:rPr>
+        <w:t>四、一个可操作的定义</w:t>
+      </w:r>
+    </w:p>
+    <w:p>
+      <w:r>
+        <w:rPr>
+          <w:b w:val="0"/>
+          <w:sz w:val="22"/>
+        </w:rPr>
+        <w:t>如果接受第三层的猜想，就可以给生命一个操作性的定义。这个定义是人造的，不是发现的；它成立与否，要看它能不能区分、能不能导出可测的东西。</w:t>
+      </w:r>
+    </w:p>
+    <w:p>
+      <w:r>
+        <w:rPr>
+          <w:b/>
+          <w:sz w:val="26"/>
+        </w:rPr>
+        <w:t>4.1 定义</w:t>
       </w:r>
     </w:p>
     <w:p>
@@ -940,7 +1366,7 @@
           <w:b/>
           <w:sz w:val="26"/>
         </w:rPr>
-        <w:t>2.1.1 一处澄清：维持是关系</w:t>
+        <w:t>4.2 一处澄清：维持是关系</w:t>
       </w:r>
     </w:p>
     <w:p>
@@ -967,7 +1393,7 @@
           <w:b/>
           <w:sz w:val="26"/>
         </w:rPr>
-        <w:t>2.2 为什么必须是「一族」而不是「一个函数」</w:t>
+        <w:t>4.3 为什么必须是「一族」而不是「一个函数」</w:t>
       </w:r>
     </w:p>
     <w:p>
@@ -1005,7 +1431,7 @@
           <w:b/>
           <w:sz w:val="26"/>
         </w:rPr>
-        <w:t>2.3 会变化 = 三层时间尺度</w:t>
+        <w:t>4.4 会变化 = 三层时间尺度</w:t>
       </w:r>
     </w:p>
     <w:p>
@@ -1044,7 +1470,7 @@
           <w:b/>
           <w:sz w:val="26"/>
         </w:rPr>
-        <w:t>2.4 会自指 = 更新规则在它自己里面</w:t>
+        <w:t>4.5 会自指 = 更新规则在它自己里面</w:t>
       </w:r>
     </w:p>
     <w:p>
@@ -1083,7 +1509,7 @@
           <w:b/>
           <w:sz w:val="26"/>
         </w:rPr>
-        <w:t>2.5 与第一节的衔接</w:t>
+        <w:t>五、生命与环境</w:t>
       </w:r>
     </w:p>
     <w:p>
@@ -1092,56 +1518,7 @@
           <w:b w:val="0"/>
           <w:sz w:val="22"/>
         </w:rPr>
-        <w:t>第一节的猜想给出 `S_{t+1} = F(S_t)`（世界是一个函数）。</w:t>
-      </w:r>
-    </w:p>
-    <w:p>
-      <w:r>
-        <w:rPr>
-          <w:b w:val="0"/>
-          <w:sz w:val="22"/>
-        </w:rPr>
-        <w:t>生命不是这个 F，而是嵌在 F 里的一族子函数 `{G_θ}`：</w:t>
-      </w:r>
-    </w:p>
-    <w:p>
-      <w:r>
-        <w:rPr>
-          <w:rFonts w:ascii="Consolas" w:hAnsi="Consolas" w:eastAsia="Consolas"/>
-          <w:b w:val="0"/>
-          <w:sz w:val="18"/>
-        </w:rPr>
-        <w:t>行为_d = G_θ(世界局部状态)</w:t>
-      </w:r>
-    </w:p>
-    <w:p>
-      <w:r>
-        <w:rPr>
-          <w:rFonts w:ascii="Consolas" w:hAnsi="Consolas" w:eastAsia="Consolas"/>
-          <w:b w:val="0"/>
-          <w:sz w:val="18"/>
-        </w:rPr>
-        <w:t>而 G_θ 自己也是世界状态的一部分（个体的状态属于 S_t）</w:t>
-      </w:r>
-    </w:p>
-    <w:p>
-      <w:r>
-        <w:rPr>
-          <w:rFonts w:ascii="Consolas" w:hAnsi="Consolas" w:eastAsia="Consolas"/>
-          <w:b w:val="0"/>
-          <w:sz w:val="18"/>
-        </w:rPr>
-        <w:t>⇒ 它要预测世界，就必然要预测包含自己的那部分世界</w:t>
-      </w:r>
-    </w:p>
-    <w:p>
-      <w:r>
-        <w:rPr>
-          <w:rFonts w:ascii="Consolas" w:hAnsi="Consolas" w:eastAsia="Consolas"/>
-          <w:b w:val="0"/>
-          <w:sz w:val="18"/>
-        </w:rPr>
-        <w:t>⇒ **自指不是外加的神秘性质，而是「嵌在函数里」的结构必然**</w:t>
+        <w:t>定义里有一个容易滑过去的点：生命与环境不是两种东西，而是同一套宇宙函数里的两种关系。下面几节把这个点展开。</w:t>
       </w:r>
     </w:p>
     <w:p>
@@ -1150,7 +1527,7 @@
           <w:b/>
           <w:sz w:val="26"/>
         </w:rPr>
-        <w:t>2.5.1 生命 vs 环境：都在宇宙里，都是函数，区别只有一条</w:t>
+        <w:t>5.1 与前面的衔接</w:t>
       </w:r>
     </w:p>
     <w:p>
@@ -1159,7 +1536,16 @@
           <w:b w:val="0"/>
           <w:sz w:val="22"/>
         </w:rPr>
-        <w:t>宇宙函数 F 里面，任何东西都是函数（或函数的组合）——环境也是函数。</w:t>
+        <w:t>第一节的猜想给出 `S_{t+1} = F(S_t)`（世界是一个函数）。</w:t>
+      </w:r>
+    </w:p>
+    <w:p>
+      <w:r>
+        <w:rPr>
+          <w:b w:val="0"/>
+          <w:sz w:val="22"/>
+        </w:rPr>
+        <w:t>生命不是这个 F，而是嵌在 F 里的一族子函数 `{G_θ}`：</w:t>
       </w:r>
     </w:p>
     <w:p>
@@ -1169,7 +1555,7 @@
           <w:b w:val="0"/>
           <w:sz w:val="18"/>
         </w:rPr>
-        <w:t>宇宙 = F（一个巨大的函数）</w:t>
+        <w:t>行为_d = G_θ(世界局部状态)</w:t>
       </w:r>
     </w:p>
     <w:p>
@@ -1179,7 +1565,7 @@
           <w:b w:val="0"/>
           <w:sz w:val="18"/>
         </w:rPr>
-        <w:t xml:space="preserve">   ├─ 生命：会变化 ＋ 会自指 ＋ **会自我维持**</w:t>
+        <w:t>而 G_θ 自己也是世界状态的一部分（个体的状态属于 S_t）</w:t>
       </w:r>
     </w:p>
     <w:p>
@@ -1189,34 +1575,7 @@
           <w:b w:val="0"/>
           <w:sz w:val="18"/>
         </w:rPr>
-        <w:t xml:space="preserve">   └─ 环境：会变化（被世界推着变、也会反过来影响世界），但**不维持自己**</w:t>
-      </w:r>
-    </w:p>
-    <w:p>
-      <w:r>
-        <w:rPr>
-          <w:b w:val="0"/>
-          <w:sz w:val="22"/>
-        </w:rPr>
-        <w:t>⇒ 生命与环境的唯一区别不是「谁更复杂」，而是：</w:t>
-      </w:r>
-    </w:p>
-    <w:p>
-      <w:r>
-        <w:rPr>
-          <w:b w:val="0"/>
-          <w:sz w:val="22"/>
-        </w:rPr>
-        <w:t>生命花代价维持自己的形状；环境不花这个代价，它只是被推着变。</w:t>
-      </w:r>
-    </w:p>
-    <w:p>
-      <w:r>
-        <w:rPr>
-          <w:b w:val="0"/>
-          <w:sz w:val="22"/>
-        </w:rPr>
-        <w:t>这也直接给出生命为什么需要「收入」：</w:t>
+        <w:t>⇒ 它要预测世界，就必然要预测包含自己的那部分世界</w:t>
       </w:r>
     </w:p>
     <w:p>
@@ -1226,27 +1585,7 @@
           <w:b w:val="0"/>
           <w:sz w:val="18"/>
         </w:rPr>
-        <w:t>自我维持要付代价（校验/修复/复制都是不可逆操作）</w:t>
-      </w:r>
-    </w:p>
-    <w:p>
-      <w:r>
-        <w:rPr>
-          <w:rFonts w:ascii="Consolas" w:hAnsi="Consolas" w:eastAsia="Consolas"/>
-          <w:b w:val="0"/>
-          <w:sz w:val="18"/>
-        </w:rPr>
-        <w:t>⇒ 收入的唯一来源：压缩世界（匹配源分布）</w:t>
-      </w:r>
-    </w:p>
-    <w:p>
-      <w:r>
-        <w:rPr>
-          <w:rFonts w:ascii="Consolas" w:hAnsi="Consolas" w:eastAsia="Consolas"/>
-          <w:b w:val="0"/>
-          <w:sz w:val="18"/>
-        </w:rPr>
-        <w:t>⇒ 若压缩没有盈余，自我维持付不起 ⇒ 生命不存在</w:t>
+        <w:t>⇒ **自指不是外加的神秘性质，而是「嵌在函数里」的结构必然**</w:t>
       </w:r>
     </w:p>
     <w:p>
@@ -1255,7 +1594,7 @@
           <w:b/>
           <w:sz w:val="26"/>
         </w:rPr>
-        <w:t>2.5.2 环境是什么：宇宙里自发涌现的「局部解压」</w:t>
+        <w:t>5.2 生命 vs 环境：都在宇宙里，都是函数，区别只有一条</w:t>
       </w:r>
     </w:p>
     <w:p>
@@ -1264,7 +1603,7 @@
           <w:b w:val="0"/>
           <w:sz w:val="22"/>
         </w:rPr>
-        <w:t>环境不是外在于宇宙的舞台，它是宇宙函数类里自发涌现出来的结构。</w:t>
+        <w:t>宇宙函数 F 里面，任何东西都是函数（或函数的组合）——环境也是函数。</w:t>
       </w:r>
     </w:p>
     <w:p>
@@ -1284,7 +1623,7 @@
           <w:b w:val="0"/>
           <w:sz w:val="18"/>
         </w:rPr>
-        <w:t xml:space="preserve">   ↓ 内部自发涌现</w:t>
+        <w:t xml:space="preserve">   ├─ 生命：会变化 ＋ 会自指 ＋ **会自我维持**</w:t>
       </w:r>
     </w:p>
     <w:p>
@@ -1294,7 +1633,34 @@
           <w:b w:val="0"/>
           <w:sz w:val="18"/>
         </w:rPr>
-        <w:t>结构 = 宇宙的某种局部「解压」（对宇宙的一个解释/一个可读的呈现）</w:t>
+        <w:t xml:space="preserve">   └─ 环境：会变化（被世界推着变、也会反过来影响世界），但**不维持自己**</w:t>
+      </w:r>
+    </w:p>
+    <w:p>
+      <w:r>
+        <w:rPr>
+          <w:b w:val="0"/>
+          <w:sz w:val="22"/>
+        </w:rPr>
+        <w:t>⇒ 生命与环境的唯一区别不是「谁更复杂」，而是：</w:t>
+      </w:r>
+    </w:p>
+    <w:p>
+      <w:r>
+        <w:rPr>
+          <w:b w:val="0"/>
+          <w:sz w:val="22"/>
+        </w:rPr>
+        <w:t>生命花代价维持自己的形状；环境不花这个代价，它只是被推着变。</w:t>
+      </w:r>
+    </w:p>
+    <w:p>
+      <w:r>
+        <w:rPr>
+          <w:b w:val="0"/>
+          <w:sz w:val="22"/>
+        </w:rPr>
+        <w:t>这也直接给出生命为什么需要「收入」：</w:t>
       </w:r>
     </w:p>
     <w:p>
@@ -1304,7 +1670,7 @@
           <w:b w:val="0"/>
           <w:sz w:val="18"/>
         </w:rPr>
-        <w:t xml:space="preserve">   ├─ 会自我维持的  → 生命</w:t>
+        <w:t>自我维持要付代价（校验/修复/复制都是不可逆操作）</w:t>
       </w:r>
     </w:p>
     <w:p>
@@ -1314,34 +1680,7 @@
           <w:b w:val="0"/>
           <w:sz w:val="18"/>
         </w:rPr>
-        <w:t xml:space="preserve">   └─ 不自我维持的  → 环境</w:t>
-      </w:r>
-    </w:p>
-    <w:p>
-      <w:r>
-        <w:rPr>
-          <w:b w:val="0"/>
-          <w:sz w:val="22"/>
-        </w:rPr>
-        <w:t>⇒ 环境 = 宇宙的一个局部解压（对宇宙的解释）；生命也是。</w:t>
-      </w:r>
-    </w:p>
-    <w:p>
-      <w:r>
-        <w:rPr>
-          <w:b w:val="0"/>
-          <w:sz w:val="22"/>
-        </w:rPr>
-        <w:t>⇒ 区别只在：生命自己维持这个解压的形状，环境不维持、只是被推着变。</w:t>
-      </w:r>
-    </w:p>
-    <w:p>
-      <w:r>
-        <w:rPr>
-          <w:b w:val="0"/>
-          <w:sz w:val="22"/>
-        </w:rPr>
-        <w:t>这带来一个关键的结构性结论：</w:t>
+        <w:t>⇒ 收入的唯一来源：压缩世界（匹配源分布）</w:t>
       </w:r>
     </w:p>
     <w:p>
@@ -1351,37 +1690,7 @@
           <w:b w:val="0"/>
           <w:sz w:val="18"/>
         </w:rPr>
-        <w:t>生命并不直接面对宇宙函数 F</w:t>
-      </w:r>
-    </w:p>
-    <w:p>
-      <w:r>
-        <w:rPr>
-          <w:rFonts w:ascii="Consolas" w:hAnsi="Consolas" w:eastAsia="Consolas"/>
-          <w:b w:val="0"/>
-          <w:sz w:val="18"/>
-        </w:rPr>
-        <w:t>⇒ 它面对的是「宇宙的一个局部解压」＝它的环境</w:t>
-      </w:r>
-    </w:p>
-    <w:p>
-      <w:r>
-        <w:rPr>
-          <w:rFonts w:ascii="Consolas" w:hAnsi="Consolas" w:eastAsia="Consolas"/>
-          <w:b w:val="0"/>
-          <w:sz w:val="18"/>
-        </w:rPr>
-        <w:t>⇒ 生命对世界的理解，本质上是**对宇宙的再解压**（二次解压）</w:t>
-      </w:r>
-    </w:p>
-    <w:p>
-      <w:r>
-        <w:rPr>
-          <w:rFonts w:ascii="Consolas" w:hAnsi="Consolas" w:eastAsia="Consolas"/>
-          <w:b w:val="0"/>
-          <w:sz w:val="18"/>
-        </w:rPr>
-        <w:t xml:space="preserve">  ＝在宇宙给出的局部解释之上，再压缩一层</w:t>
+        <w:t>⇒ 若压缩没有盈余，自我维持付不起 ⇒ 生命不存在</w:t>
       </w:r>
     </w:p>
     <w:p>
@@ -1390,7 +1699,7 @@
           <w:b/>
           <w:sz w:val="26"/>
         </w:rPr>
-        <w:t>2.5.3 环境是分层的：生命活在多层环境里，同时也活在宇宙里</w:t>
+        <w:t>5.3 环境是什么：宇宙里自发涌现的「局部解压」</w:t>
       </w:r>
     </w:p>
     <w:p>
@@ -1399,7 +1708,7 @@
           <w:b w:val="0"/>
           <w:sz w:val="22"/>
         </w:rPr>
-        <w:t>解压是分层的 ⇒ 环境也是分层的。</w:t>
+        <w:t>环境不是外在于宇宙的舞台，它是宇宙函数类里自发涌现出来的结构。</w:t>
       </w:r>
     </w:p>
     <w:p>
@@ -1409,7 +1718,7 @@
           <w:b w:val="0"/>
           <w:sz w:val="18"/>
         </w:rPr>
-        <w:t>宇宙 F</w:t>
+        <w:t>宇宙 = F（一个巨大的函数）</w:t>
       </w:r>
     </w:p>
     <w:p>
@@ -1419,7 +1728,7 @@
           <w:b w:val="0"/>
           <w:sz w:val="18"/>
         </w:rPr>
-        <w:t xml:space="preserve"> └ 环境_1 = F 的某一部分的局部解压</w:t>
+        <w:t xml:space="preserve">   ↓ 内部自发涌现</w:t>
       </w:r>
     </w:p>
     <w:p>
@@ -1429,7 +1738,7 @@
           <w:b w:val="0"/>
           <w:sz w:val="18"/>
         </w:rPr>
-        <w:t xml:space="preserve">     └ 环境_2 = 环境_1 的再解压</w:t>
+        <w:t>结构 = 宇宙的某种局部「解压」（对宇宙的一个解释/一个可读的呈现）</w:t>
       </w:r>
     </w:p>
     <w:p>
@@ -1439,7 +1748,7 @@
           <w:b w:val="0"/>
           <w:sz w:val="18"/>
         </w:rPr>
-        <w:t xml:space="preserve">         └ 环境_3 = 环境_2 的再解压 …</w:t>
+        <w:t xml:space="preserve">   ├─ 会自我维持的  → 生命</w:t>
       </w:r>
     </w:p>
     <w:p>
@@ -1449,7 +1758,7 @@
           <w:b w:val="0"/>
           <w:sz w:val="18"/>
         </w:rPr>
-        <w:t>生命嵌在某一层：它既属于整个宇宙 F，又属于它自己那一层环境</w:t>
+        <w:t xml:space="preserve">   └─ 不自我维持的  → 环境</w:t>
       </w:r>
     </w:p>
     <w:p>
@@ -1458,7 +1767,25 @@
           <w:b w:val="0"/>
           <w:sz w:val="22"/>
         </w:rPr>
-        <w:t>三条同时成立，不能只取一条：</w:t>
+        <w:t>⇒ 环境 = 宇宙的一个局部解压（对宇宙的解释）；生命也是。</w:t>
+      </w:r>
+    </w:p>
+    <w:p>
+      <w:r>
+        <w:rPr>
+          <w:b w:val="0"/>
+          <w:sz w:val="22"/>
+        </w:rPr>
+        <w:t>⇒ 区别只在：生命自己维持这个解压的形状，环境不维持、只是被推着变。</w:t>
+      </w:r>
+    </w:p>
+    <w:p>
+      <w:r>
+        <w:rPr>
+          <w:b w:val="0"/>
+          <w:sz w:val="22"/>
+        </w:rPr>
+        <w:t>这带来一个关键的结构性结论：</w:t>
       </w:r>
     </w:p>
     <w:p>
@@ -1468,7 +1795,7 @@
           <w:b w:val="0"/>
           <w:sz w:val="18"/>
         </w:rPr>
-        <w:t>① 它活在环境里：它面对的输入、资源、关系、其他个体，都是「它的环境」这一层的结构</w:t>
+        <w:t>生命并不直接面对宇宙函数 F</w:t>
       </w:r>
     </w:p>
     <w:p>
@@ -1478,7 +1805,7 @@
           <w:b w:val="0"/>
           <w:sz w:val="18"/>
         </w:rPr>
-        <w:t xml:space="preserve">                ⇒ 它的行为只需要在这一层里有效</w:t>
+        <w:t>⇒ 它面对的是「宇宙的一个局部解压」＝它的环境</w:t>
       </w:r>
     </w:p>
     <w:p>
@@ -1488,7 +1815,7 @@
           <w:b w:val="0"/>
           <w:sz w:val="18"/>
         </w:rPr>
-        <w:t>② 它也活在宇宙里：它逃不出 F —— 环境那一层本身也是 F 的一部分，</w:t>
+        <w:t>⇒ 生命对世界的理解，本质上是**对宇宙的再解压**（二次解压）</w:t>
       </w:r>
     </w:p>
     <w:p>
@@ -1498,71 +1825,7 @@
           <w:b w:val="0"/>
           <w:sz w:val="18"/>
         </w:rPr>
-        <w:t xml:space="preserve">                宇宙层的约束（能量、不可逆、代价）始终对它生效</w:t>
-      </w:r>
-    </w:p>
-    <w:p>
-      <w:r>
-        <w:rPr>
-          <w:rFonts w:ascii="Consolas" w:hAnsi="Consolas" w:eastAsia="Consolas"/>
-          <w:b w:val="0"/>
-          <w:sz w:val="18"/>
-        </w:rPr>
-        <w:t xml:space="preserve">                ⇒ 环境不是避难所，它只是宇宙的一个投影</w:t>
-      </w:r>
-    </w:p>
-    <w:p>
-      <w:r>
-        <w:rPr>
-          <w:b w:val="0"/>
-          <w:sz w:val="22"/>
-        </w:rPr>
-        <w:t>③ 它活在所有层里：环境是多层的（细胞→组织→个体→种群→生态），每一层都是上一层的再解压。</w:t>
-      </w:r>
-    </w:p>
-    <w:p>
-      <w:r>
-        <w:rPr>
-          <w:b w:val="0"/>
-          <w:sz w:val="22"/>
-        </w:rPr>
-        <w:t>它直接交互的只是自己那一层，但所有层都对它约束：上层决定它面对的资源与关系，宇宙层决定它付不付得起代价。</w:t>
-      </w:r>
-    </w:p>
-    <w:p>
-      <w:r>
-        <w:rPr>
-          <w:b w:val="0"/>
-          <w:sz w:val="22"/>
-        </w:rPr>
-        <w:t>⇒ 「它活在多层环境里，同时也活在宇宙里」——两者不是二选一，而是同时成立。</w:t>
-      </w:r>
-    </w:p>
-    <w:p>
-      <w:r>
-        <w:rPr>
-          <w:b w:val="0"/>
-          <w:sz w:val="22"/>
-        </w:rPr>
-        <w:t>⇒ 所以「理解世界」要分两层说：</w:t>
-      </w:r>
-    </w:p>
-    <w:p>
-      <w:r>
-        <w:rPr>
-          <w:b w:val="0"/>
-          <w:sz w:val="22"/>
-        </w:rPr>
-        <w:t>在环境层：理解 = 对局部解压的再解压（够用即可活）；</w:t>
-      </w:r>
-    </w:p>
-    <w:p>
-      <w:r>
-        <w:rPr>
-          <w:b w:val="0"/>
-          <w:sz w:val="22"/>
-        </w:rPr>
-        <w:t>在宇宙层：理解 = 压缩 F 的规律（决定它能不能长期付得起代价）。</w:t>
+        <w:t xml:space="preserve">  ＝在宇宙给出的局部解释之上，再压缩一层</w:t>
       </w:r>
     </w:p>
     <w:p>
@@ -1571,7 +1834,188 @@
           <w:b/>
           <w:sz w:val="26"/>
         </w:rPr>
-        <w:t>2.6 标注</w:t>
+        <w:t>5.4 环境是分层的：生命活在多层环境里，同时也活在宇宙里</w:t>
+      </w:r>
+    </w:p>
+    <w:p>
+      <w:r>
+        <w:rPr>
+          <w:b w:val="0"/>
+          <w:sz w:val="22"/>
+        </w:rPr>
+        <w:t>解压是分层的 ⇒ 环境也是分层的。</w:t>
+      </w:r>
+    </w:p>
+    <w:p>
+      <w:r>
+        <w:rPr>
+          <w:rFonts w:ascii="Consolas" w:hAnsi="Consolas" w:eastAsia="Consolas"/>
+          <w:b w:val="0"/>
+          <w:sz w:val="18"/>
+        </w:rPr>
+        <w:t>宇宙 F</w:t>
+      </w:r>
+    </w:p>
+    <w:p>
+      <w:r>
+        <w:rPr>
+          <w:rFonts w:ascii="Consolas" w:hAnsi="Consolas" w:eastAsia="Consolas"/>
+          <w:b w:val="0"/>
+          <w:sz w:val="18"/>
+        </w:rPr>
+        <w:t xml:space="preserve"> └ 环境_1 = F 的某一部分的局部解压</w:t>
+      </w:r>
+    </w:p>
+    <w:p>
+      <w:r>
+        <w:rPr>
+          <w:rFonts w:ascii="Consolas" w:hAnsi="Consolas" w:eastAsia="Consolas"/>
+          <w:b w:val="0"/>
+          <w:sz w:val="18"/>
+        </w:rPr>
+        <w:t xml:space="preserve">     └ 环境_2 = 环境_1 的再解压</w:t>
+      </w:r>
+    </w:p>
+    <w:p>
+      <w:r>
+        <w:rPr>
+          <w:rFonts w:ascii="Consolas" w:hAnsi="Consolas" w:eastAsia="Consolas"/>
+          <w:b w:val="0"/>
+          <w:sz w:val="18"/>
+        </w:rPr>
+        <w:t xml:space="preserve">         └ 环境_3 = 环境_2 的再解压 …</w:t>
+      </w:r>
+    </w:p>
+    <w:p>
+      <w:r>
+        <w:rPr>
+          <w:rFonts w:ascii="Consolas" w:hAnsi="Consolas" w:eastAsia="Consolas"/>
+          <w:b w:val="0"/>
+          <w:sz w:val="18"/>
+        </w:rPr>
+        <w:t>生命嵌在某一层：它既属于整个宇宙 F，又属于它自己那一层环境</w:t>
+      </w:r>
+    </w:p>
+    <w:p>
+      <w:r>
+        <w:rPr>
+          <w:b w:val="0"/>
+          <w:sz w:val="22"/>
+        </w:rPr>
+        <w:t>三条同时成立，不能只取一条：</w:t>
+      </w:r>
+    </w:p>
+    <w:p>
+      <w:r>
+        <w:rPr>
+          <w:rFonts w:ascii="Consolas" w:hAnsi="Consolas" w:eastAsia="Consolas"/>
+          <w:b w:val="0"/>
+          <w:sz w:val="18"/>
+        </w:rPr>
+        <w:t>① 它活在环境里：它面对的输入、资源、关系、其他个体，都是「它的环境」这一层的结构</w:t>
+      </w:r>
+    </w:p>
+    <w:p>
+      <w:r>
+        <w:rPr>
+          <w:rFonts w:ascii="Consolas" w:hAnsi="Consolas" w:eastAsia="Consolas"/>
+          <w:b w:val="0"/>
+          <w:sz w:val="18"/>
+        </w:rPr>
+        <w:t xml:space="preserve">                ⇒ 它的行为只需要在这一层里有效</w:t>
+      </w:r>
+    </w:p>
+    <w:p>
+      <w:r>
+        <w:rPr>
+          <w:rFonts w:ascii="Consolas" w:hAnsi="Consolas" w:eastAsia="Consolas"/>
+          <w:b w:val="0"/>
+          <w:sz w:val="18"/>
+        </w:rPr>
+        <w:t>② 它也活在宇宙里：它逃不出 F —— 环境那一层本身也是 F 的一部分，</w:t>
+      </w:r>
+    </w:p>
+    <w:p>
+      <w:r>
+        <w:rPr>
+          <w:rFonts w:ascii="Consolas" w:hAnsi="Consolas" w:eastAsia="Consolas"/>
+          <w:b w:val="0"/>
+          <w:sz w:val="18"/>
+        </w:rPr>
+        <w:t xml:space="preserve">                宇宙层的约束（能量、不可逆、代价）始终对它生效</w:t>
+      </w:r>
+    </w:p>
+    <w:p>
+      <w:r>
+        <w:rPr>
+          <w:rFonts w:ascii="Consolas" w:hAnsi="Consolas" w:eastAsia="Consolas"/>
+          <w:b w:val="0"/>
+          <w:sz w:val="18"/>
+        </w:rPr>
+        <w:t xml:space="preserve">                ⇒ 环境不是避难所，它只是宇宙的一个投影</w:t>
+      </w:r>
+    </w:p>
+    <w:p>
+      <w:r>
+        <w:rPr>
+          <w:b w:val="0"/>
+          <w:sz w:val="22"/>
+        </w:rPr>
+        <w:t>③ 它活在所有层里：环境是多层的（细胞→组织→个体→种群→生态），每一层都是上一层的再解压。</w:t>
+      </w:r>
+    </w:p>
+    <w:p>
+      <w:r>
+        <w:rPr>
+          <w:b w:val="0"/>
+          <w:sz w:val="22"/>
+        </w:rPr>
+        <w:t>它直接交互的只是自己那一层，但所有层都对它约束：上层决定它面对的资源与关系，宇宙层决定它付不付得起代价。</w:t>
+      </w:r>
+    </w:p>
+    <w:p>
+      <w:r>
+        <w:rPr>
+          <w:b w:val="0"/>
+          <w:sz w:val="22"/>
+        </w:rPr>
+        <w:t>⇒ 「它活在多层环境里，同时也活在宇宙里」——两者不是二选一，而是同时成立。</w:t>
+      </w:r>
+    </w:p>
+    <w:p>
+      <w:r>
+        <w:rPr>
+          <w:b w:val="0"/>
+          <w:sz w:val="22"/>
+        </w:rPr>
+        <w:t>⇒ 所以「理解世界」要分两层说：</w:t>
+      </w:r>
+    </w:p>
+    <w:p>
+      <w:r>
+        <w:rPr>
+          <w:b w:val="0"/>
+          <w:sz w:val="22"/>
+        </w:rPr>
+        <w:t>在环境层：理解 = 对局部解压的再解压（够用即可活）；</w:t>
+      </w:r>
+    </w:p>
+    <w:p>
+      <w:r>
+        <w:rPr>
+          <w:b w:val="0"/>
+          <w:sz w:val="22"/>
+        </w:rPr>
+        <w:t>在宇宙层：理解 = 压缩 F 的规律（决定它能不能长期付得起代价）。</w:t>
+      </w:r>
+    </w:p>
+    <w:p>
+      <w:r>
+        <w:rPr>
+          <w:b/>
+          <w:sz w:val="26"/>
+        </w:rPr>
+        <w:t>5.5 标注</w:t>
       </w:r>
     </w:p>
     <w:p>
@@ -1739,7 +2183,25 @@
           <w:b/>
           <w:sz w:val="26"/>
         </w:rPr>
-        <w:t>3.1 检查表</w:t>
+        <w:t>六、检查表：定义能区分什么</w:t>
+      </w:r>
+    </w:p>
+    <w:p>
+      <w:r>
+        <w:rPr>
+          <w:b w:val="0"/>
+          <w:sz w:val="22"/>
+        </w:rPr>
+        <w:t>定义的价值在于区分。下面用一张检查表把"活的结构"与"不算活的结构"分开。</w:t>
+      </w:r>
+    </w:p>
+    <w:p>
+      <w:r>
+        <w:rPr>
+          <w:b/>
+          <w:sz w:val="26"/>
+        </w:rPr>
+        <w:t>6.1 检查表</w:t>
       </w:r>
     </w:p>
     <w:tbl>
@@ -2087,7 +2549,7 @@
           <w:b/>
           <w:sz w:val="26"/>
         </w:rPr>
-        <w:t>3.2 三条最根本的原因（按重要性）</w:t>
+        <w:t>6.2 三条最根本的原因（按重要性）</w:t>
       </w:r>
     </w:p>
     <w:p>
@@ -2233,7 +2695,7 @@
           <w:b/>
           <w:sz w:val="26"/>
         </w:rPr>
-        <w:t>3.3 为什么「它很强」与「它不是生命」不矛盾</w:t>
+        <w:t>6.3 为什么「它很强」与「它不是生命」不矛盾</w:t>
       </w:r>
     </w:p>
     <w:p>
@@ -2282,7 +2744,7 @@
           <w:b/>
           <w:sz w:val="26"/>
         </w:rPr>
-        <w:t>3.4 标注</w:t>
+        <w:t>6.4 标注</w:t>
       </w:r>
     </w:p>
     <w:p>
@@ -2370,47 +2832,7 @@
           <w:b/>
           <w:sz w:val="26"/>
         </w:rPr>
-        <w:t>4.1 从定义到条件</w:t>
-      </w:r>
-    </w:p>
-    <w:p>
-      <w:r>
-        <w:rPr>
-          <w:rFonts w:ascii="Consolas" w:hAnsi="Consolas" w:eastAsia="Consolas"/>
-          <w:b w:val="0"/>
-          <w:sz w:val="18"/>
-        </w:rPr>
-        <w:t>定义（第二节）          必要条件（本节）</w:t>
-      </w:r>
-    </w:p>
-    <w:p>
-      <w:r>
-        <w:rPr>
-          <w:rFonts w:ascii="Consolas" w:hAnsi="Consolas" w:eastAsia="Consolas"/>
-          <w:b w:val="0"/>
-          <w:sz w:val="18"/>
-        </w:rPr>
-        <w:t>会变化（一族函数）   ⇒  ① 一族函数：行为谱不是一点</w:t>
-      </w:r>
-    </w:p>
-    <w:p>
-      <w:r>
-        <w:rPr>
-          <w:rFonts w:ascii="Consolas" w:hAnsi="Consolas" w:eastAsia="Consolas"/>
-          <w:b w:val="0"/>
-          <w:sz w:val="18"/>
-        </w:rPr>
-        <w:t>会自指               ⇒  ② 自指更新：改自己的规则在自己里面</w:t>
-      </w:r>
-    </w:p>
-    <w:p>
-      <w:r>
-        <w:rPr>
-          <w:rFonts w:ascii="Consolas" w:hAnsi="Consolas" w:eastAsia="Consolas"/>
-          <w:b w:val="0"/>
-          <w:sz w:val="18"/>
-        </w:rPr>
-        <w:t>会自我维持           ⇒  ③ 自己付代价：压缩收益 ≥ 维持成本</w:t>
+        <w:t>七、三条必要条件</w:t>
       </w:r>
     </w:p>
     <w:p>
@@ -2419,7 +2841,7 @@
           <w:b w:val="0"/>
           <w:sz w:val="22"/>
         </w:rPr>
-        <w:t>三条是必要条件，不是充分条件：满足它们不保证是生命，但缺任何一条一定不是。</w:t>
+        <w:t>从定义里可以抽出三条必要条件。它们不是从天上掉下来的，而是从定义里读出来的——每条都对应一类被排除的对象。</w:t>
       </w:r>
     </w:p>
     <w:p>
@@ -2428,7 +2850,47 @@
           <w:b/>
           <w:sz w:val="26"/>
         </w:rPr>
-        <w:t>4.2 条件① 一族函数（不是一个点）</w:t>
+        <w:t>7.1 从定义到条件</w:t>
+      </w:r>
+    </w:p>
+    <w:p>
+      <w:r>
+        <w:rPr>
+          <w:rFonts w:ascii="Consolas" w:hAnsi="Consolas" w:eastAsia="Consolas"/>
+          <w:b w:val="0"/>
+          <w:sz w:val="18"/>
+        </w:rPr>
+        <w:t>定义（第二节）          必要条件（本节）</w:t>
+      </w:r>
+    </w:p>
+    <w:p>
+      <w:r>
+        <w:rPr>
+          <w:rFonts w:ascii="Consolas" w:hAnsi="Consolas" w:eastAsia="Consolas"/>
+          <w:b w:val="0"/>
+          <w:sz w:val="18"/>
+        </w:rPr>
+        <w:t>会变化（一族函数）   ⇒  ① 一族函数：行为谱不是一点</w:t>
+      </w:r>
+    </w:p>
+    <w:p>
+      <w:r>
+        <w:rPr>
+          <w:rFonts w:ascii="Consolas" w:hAnsi="Consolas" w:eastAsia="Consolas"/>
+          <w:b w:val="0"/>
+          <w:sz w:val="18"/>
+        </w:rPr>
+        <w:t>会自指               ⇒  ② 自指更新：改自己的规则在自己里面</w:t>
+      </w:r>
+    </w:p>
+    <w:p>
+      <w:r>
+        <w:rPr>
+          <w:rFonts w:ascii="Consolas" w:hAnsi="Consolas" w:eastAsia="Consolas"/>
+          <w:b w:val="0"/>
+          <w:sz w:val="18"/>
+        </w:rPr>
+        <w:t>会自我维持           ⇒  ③ 自己付代价：压缩收益 ≥ 维持成本</w:t>
       </w:r>
     </w:p>
     <w:p>
@@ -2437,55 +2899,7 @@
           <w:b w:val="0"/>
           <w:sz w:val="22"/>
         </w:rPr>
-        <w:t>要求：个体在函数空间里占据一块区域，面对不同输入有整套响应，不是一个固定映射。</w:t>
-      </w:r>
-    </w:p>
-    <w:p>
-      <w:r>
-        <w:rPr>
-          <w:b w:val="0"/>
-          <w:sz w:val="22"/>
-        </w:rPr>
-        <w:t>证据/经验：</w:t>
-      </w:r>
-    </w:p>
-    <w:p>
-      <w:r>
-        <w:rPr>
-          <w:rFonts w:ascii="Consolas" w:hAnsi="Consolas" w:eastAsia="Consolas"/>
-          <w:b w:val="0"/>
-          <w:sz w:val="18"/>
-        </w:rPr>
-        <w:t>· 低维参数基因组（几个数）= 一个点 ⇒ 行为谱退化成单条轨迹 ⇒ 化石</w:t>
-      </w:r>
-    </w:p>
-    <w:p>
-      <w:r>
-        <w:rPr>
-          <w:rFonts w:ascii="Consolas" w:hAnsi="Consolas" w:eastAsia="Consolas"/>
-          <w:b w:val="0"/>
-          <w:sz w:val="18"/>
-        </w:rPr>
-        <w:t>· 我们测过：冻结版模型（点）在结构学习上失败，动态版（族）才吃到结构（E12）</w:t>
-      </w:r>
-    </w:p>
-    <w:p>
-      <w:r>
-        <w:rPr>
-          <w:rFonts w:ascii="Consolas" w:hAnsi="Consolas" w:eastAsia="Consolas"/>
-          <w:b w:val="0"/>
-          <w:sz w:val="18"/>
-        </w:rPr>
-        <w:t>· 实测对照：冻结 1.07 vs 动态 0.849 —— 冻结更像「标准答案」，但没有形状</w:t>
-      </w:r>
-    </w:p>
-    <w:p>
-      <w:r>
-        <w:rPr>
-          <w:b w:val="0"/>
-          <w:sz w:val="22"/>
-        </w:rPr>
-        <w:t>⇒ 判据：给它不同的输入/状态，行为必须成谱地不同，而不是只有一个输出。</w:t>
+        <w:t>三条是必要条件，不是充分条件：满足它们不保证是生命，但缺任何一条一定不是。</w:t>
       </w:r>
     </w:p>
     <w:p>
@@ -2494,7 +2908,7 @@
           <w:b/>
           <w:sz w:val="26"/>
         </w:rPr>
-        <w:t>4.3 条件② 自指更新（规则在自己里面）</w:t>
+        <w:t>7.2 条件① 一族函数（不是一个点）</w:t>
       </w:r>
     </w:p>
     <w:p>
@@ -2503,7 +2917,7 @@
           <w:b w:val="0"/>
           <w:sz w:val="22"/>
         </w:rPr>
-        <w:t>要求：它怎么变，这条规则本身属于它的记录；拿掉外部更新代码，它仍能改自己。</w:t>
+        <w:t>要求：个体在函数空间里占据一块区域，面对不同输入有整套响应，不是一个固定映射。</w:t>
       </w:r>
     </w:p>
     <w:p>
@@ -2522,7 +2936,7 @@
           <w:b w:val="0"/>
           <w:sz w:val="18"/>
         </w:rPr>
-        <w:t>· 冻结模型：更新规则 = 训练算法，在外部 ⇒ 拿掉训练代码，它永远不变</w:t>
+        <w:t>· 低维参数基因组（几个数）= 一个点 ⇒ 行为谱退化成单条轨迹 ⇒ 化石</w:t>
       </w:r>
     </w:p>
     <w:p>
@@ -2532,7 +2946,7 @@
           <w:b w:val="0"/>
           <w:sz w:val="18"/>
         </w:rPr>
-        <w:t>· 我们的动态版：用自己的误差改自己（中层动态）⇒ 去掉中层明显退化（E12/E13）</w:t>
+        <w:t>· 我们测过：冻结版模型（点）在结构学习上失败，动态版（族）才吃到结构（E12）</w:t>
       </w:r>
     </w:p>
     <w:p>
@@ -2542,7 +2956,7 @@
           <w:b w:val="0"/>
           <w:sz w:val="18"/>
         </w:rPr>
-        <w:t>· 身份链：8 代可校验、有界变形（372_lineage.py）⇒ 自指可以做成可测的链条</w:t>
+        <w:t>· 实测对照：冻结 1.07 vs 动态 0.849 —— 冻结更像「标准答案」，但没有形状</w:t>
       </w:r>
     </w:p>
     <w:p>
@@ -2551,7 +2965,7 @@
           <w:b w:val="0"/>
           <w:sz w:val="22"/>
         </w:rPr>
-        <w:t>⇒ 判据：停掉外部更新后，它的行为谱是否仍随时间变形。</w:t>
+        <w:t>⇒ 判据：给它不同的输入/状态，行为必须成谱地不同，而不是只有一个输出。</w:t>
       </w:r>
     </w:p>
     <w:p>
@@ -2560,7 +2974,7 @@
           <w:b/>
           <w:sz w:val="26"/>
         </w:rPr>
-        <w:t>4.4 条件③ 自己付代价（压缩换生存）</w:t>
+        <w:t>7.3 条件② 自指更新（规则在自己里面）</w:t>
       </w:r>
     </w:p>
     <w:p>
@@ -2569,7 +2983,16 @@
           <w:b w:val="0"/>
           <w:sz w:val="22"/>
         </w:rPr>
-        <w:t>要求：收入来自压缩世界（匹配源分布）；支出是维持结构的真实成本；且存在盈余。</w:t>
+        <w:t>要求：它怎么变，这条规则本身属于它的记录；拿掉外部更新代码，它仍能改自己。</w:t>
+      </w:r>
+    </w:p>
+    <w:p>
+      <w:r>
+        <w:rPr>
+          <w:b w:val="0"/>
+          <w:sz w:val="22"/>
+        </w:rPr>
+        <w:t>证据/经验：</w:t>
       </w:r>
     </w:p>
     <w:p>
@@ -2579,7 +3002,7 @@
           <w:b w:val="0"/>
           <w:sz w:val="18"/>
         </w:rPr>
-        <w:t>存在条件：S &gt; d·K</w:t>
+        <w:t>· 冻结模型：更新规则 = 训练算法，在外部 ⇒ 拿掉训练代码，它永远不变</w:t>
       </w:r>
     </w:p>
     <w:p>
@@ -2589,7 +3012,7 @@
           <w:b w:val="0"/>
           <w:sz w:val="18"/>
         </w:rPr>
-        <w:t xml:space="preserve">   S = 世界的可压缩盈余</w:t>
+        <w:t>· 我们的动态版：用自己的误差改自己（中层动态）⇒ 去掉中层明显退化（E12/E13）</w:t>
       </w:r>
     </w:p>
     <w:p>
@@ -2599,17 +3022,7 @@
           <w:b w:val="0"/>
           <w:sz w:val="18"/>
         </w:rPr>
-        <w:t xml:space="preserve">   d = 结构维持成本率</w:t>
-      </w:r>
-    </w:p>
-    <w:p>
-      <w:r>
-        <w:rPr>
-          <w:rFonts w:ascii="Consolas" w:hAnsi="Consolas" w:eastAsia="Consolas"/>
-          <w:b w:val="0"/>
-          <w:sz w:val="18"/>
-        </w:rPr>
-        <w:t xml:space="preserve">   K = 结构规模</w:t>
+        <w:t>· 身份链：8 代可校验、有界变形（372_lineage.py）⇒ 自指可以做成可测的链条</w:t>
       </w:r>
     </w:p>
     <w:p>
@@ -2618,76 +3031,7 @@
           <w:b w:val="0"/>
           <w:sz w:val="22"/>
         </w:rPr>
-        <w:t>证据/经验（这是本文最硬的部分）：</w:t>
-      </w:r>
-    </w:p>
-    <w:p>
-      <w:r>
-        <w:rPr>
-          <w:rFonts w:ascii="Consolas" w:hAnsi="Consolas" w:eastAsia="Consolas"/>
-          <w:b w:val="0"/>
-          <w:sz w:val="18"/>
-        </w:rPr>
-        <w:t>· E1：「准」≠「压缩」：用正确率记账，系统学出「啥也不干」（LEN=0、预测0、准确率92%）</w:t>
-      </w:r>
-    </w:p>
-    <w:p>
-      <w:r>
-        <w:rPr>
-          <w:rFonts w:ascii="Consolas" w:hAnsi="Consolas" w:eastAsia="Consolas"/>
-          <w:b w:val="0"/>
-          <w:sz w:val="18"/>
-        </w:rPr>
-        <w:t xml:space="preserve">      ⇒ 必须用对数似然改善 over 基线：gain_bits = log2 p_model − log2 p_base</w:t>
-      </w:r>
-    </w:p>
-    <w:p>
-      <w:r>
-        <w:rPr>
-          <w:rFonts w:ascii="Consolas" w:hAnsi="Consolas" w:eastAsia="Consolas"/>
-          <w:b w:val="0"/>
-          <w:sz w:val="18"/>
-        </w:rPr>
-        <w:t>· E2：正是加上基率校正后，系统才从躺平解转为真正表达（LEN 从 0 长出）</w:t>
-      </w:r>
-    </w:p>
-    <w:p>
-      <w:r>
-        <w:rPr>
-          <w:rFonts w:ascii="Consolas" w:hAnsi="Consolas" w:eastAsia="Consolas"/>
-          <w:b w:val="0"/>
-          <w:sz w:val="18"/>
-        </w:rPr>
-        <w:t>· E8：经济标定 n* = FLUX_TOTAL / BASE_COST 决定「冻结」与「爆发」的切换</w:t>
-      </w:r>
-    </w:p>
-    <w:p>
-      <w:r>
-        <w:rPr>
-          <w:rFonts w:ascii="Consolas" w:hAnsi="Consolas" w:eastAsia="Consolas"/>
-          <w:b w:val="0"/>
-          <w:sz w:val="18"/>
-        </w:rPr>
-        <w:t>· 实测正收益：S1~S6 中观察到 gain &gt; 0（约 +0.09 ~ +0.19 bit/tick）</w:t>
-      </w:r>
-    </w:p>
-    <w:p>
-      <w:r>
-        <w:rPr>
-          <w:rFonts w:ascii="Consolas" w:hAnsi="Consolas" w:eastAsia="Consolas"/>
-          <w:b w:val="0"/>
-          <w:sz w:val="18"/>
-        </w:rPr>
-        <w:t xml:space="preserve">      ⇒ 世界确实存在可压缩盈余（即 S &gt; 0 的经验证据）</w:t>
-      </w:r>
-    </w:p>
-    <w:p>
-      <w:r>
-        <w:rPr>
-          <w:b w:val="0"/>
-          <w:sz w:val="22"/>
-        </w:rPr>
-        <w:t>⇒ 判据：把外部供给全部停掉后，它的账目是否仍为正。</w:t>
+        <w:t>⇒ 判据：停掉外部更新后，它的行为谱是否仍随时间变形。</w:t>
       </w:r>
     </w:p>
     <w:p>
@@ -2696,7 +3040,16 @@
           <w:b/>
           <w:sz w:val="26"/>
         </w:rPr>
-        <w:t>4.5 三条必须同时成立（经验对照）</w:t>
+        <w:t>7.4 条件③ 自己付代价（压缩换生存）</w:t>
+      </w:r>
+    </w:p>
+    <w:p>
+      <w:r>
+        <w:rPr>
+          <w:b w:val="0"/>
+          <w:sz w:val="22"/>
+        </w:rPr>
+        <w:t>要求：收入来自压缩世界（匹配源分布）；支出是维持结构的真实成本；且存在盈余。</w:t>
       </w:r>
     </w:p>
     <w:p>
@@ -2706,7 +3059,7 @@
           <w:b w:val="0"/>
           <w:sz w:val="18"/>
         </w:rPr>
-        <w:t>缺①（一族）  ⇒ 化石：行为谱是一条线</w:t>
+        <w:t>存在条件：S &gt; d·K</w:t>
       </w:r>
     </w:p>
     <w:p>
@@ -2716,7 +3069,7 @@
           <w:b w:val="0"/>
           <w:sz w:val="18"/>
         </w:rPr>
-        <w:t>缺②（自指）  ⇒ 机器：更新在外，不会自己变</w:t>
+        <w:t xml:space="preserve">   S = 世界的可压缩盈余</w:t>
       </w:r>
     </w:p>
     <w:p>
@@ -2726,7 +3079,17 @@
           <w:b w:val="0"/>
           <w:sz w:val="18"/>
         </w:rPr>
-        <w:t>缺③（代价）  ⇒ 玩具：由外部供养，不会死，也就没有选择</w:t>
+        <w:t xml:space="preserve">   d = 结构维持成本率</w:t>
+      </w:r>
+    </w:p>
+    <w:p>
+      <w:r>
+        <w:rPr>
+          <w:rFonts w:ascii="Consolas" w:hAnsi="Consolas" w:eastAsia="Consolas"/>
+          <w:b w:val="0"/>
+          <w:sz w:val="18"/>
+        </w:rPr>
+        <w:t xml:space="preserve">   K = 结构规模</w:t>
       </w:r>
     </w:p>
     <w:p>
@@ -2735,7 +3098,67 @@
           <w:b w:val="0"/>
           <w:sz w:val="22"/>
         </w:rPr>
-        <w:t>这三条也解释了为什么我们的实验一直在同一个地方卡住：</w:t>
+        <w:t>证据/经验（这是本文最硬的部分）：</w:t>
+      </w:r>
+    </w:p>
+    <w:p>
+      <w:r>
+        <w:rPr>
+          <w:rFonts w:ascii="Consolas" w:hAnsi="Consolas" w:eastAsia="Consolas"/>
+          <w:b w:val="0"/>
+          <w:sz w:val="18"/>
+        </w:rPr>
+        <w:t>· E1：「准」≠「压缩」：用正确率记账，系统学出「啥也不干」（LEN=0、预测0、准确率92%）</w:t>
+      </w:r>
+    </w:p>
+    <w:p>
+      <w:r>
+        <w:rPr>
+          <w:rFonts w:ascii="Consolas" w:hAnsi="Consolas" w:eastAsia="Consolas"/>
+          <w:b w:val="0"/>
+          <w:sz w:val="18"/>
+        </w:rPr>
+        <w:t xml:space="preserve">      ⇒ 必须用对数似然改善 over 基线：gain_bits = log2 p_model − log2 p_base</w:t>
+      </w:r>
+    </w:p>
+    <w:p>
+      <w:r>
+        <w:rPr>
+          <w:rFonts w:ascii="Consolas" w:hAnsi="Consolas" w:eastAsia="Consolas"/>
+          <w:b w:val="0"/>
+          <w:sz w:val="18"/>
+        </w:rPr>
+        <w:t>· E2：正是加上基率校正后，系统才从躺平解转为真正表达（LEN 从 0 长出）</w:t>
+      </w:r>
+    </w:p>
+    <w:p>
+      <w:r>
+        <w:rPr>
+          <w:rFonts w:ascii="Consolas" w:hAnsi="Consolas" w:eastAsia="Consolas"/>
+          <w:b w:val="0"/>
+          <w:sz w:val="18"/>
+        </w:rPr>
+        <w:t>· E8：经济标定 n* = FLUX_TOTAL / BASE_COST 决定「冻结」与「爆发」的切换</w:t>
+      </w:r>
+    </w:p>
+    <w:p>
+      <w:r>
+        <w:rPr>
+          <w:rFonts w:ascii="Consolas" w:hAnsi="Consolas" w:eastAsia="Consolas"/>
+          <w:b w:val="0"/>
+          <w:sz w:val="18"/>
+        </w:rPr>
+        <w:t>· 实测正收益：S1~S6 中观察到 gain &gt; 0（约 +0.09 ~ +0.19 bit/tick）</w:t>
+      </w:r>
+    </w:p>
+    <w:p>
+      <w:r>
+        <w:rPr>
+          <w:rFonts w:ascii="Consolas" w:hAnsi="Consolas" w:eastAsia="Consolas"/>
+          <w:b w:val="0"/>
+          <w:sz w:val="18"/>
+        </w:rPr>
+        <w:t xml:space="preserve">      ⇒ 世界确实存在可压缩盈余（即 S &gt; 0 的经验证据）</w:t>
       </w:r>
     </w:p>
     <w:p>
@@ -2744,16 +3167,7 @@
           <w:b w:val="0"/>
           <w:sz w:val="22"/>
         </w:rPr>
-        <w:t>结构能长出来（①②部分满足），但合作/分工不成为必需 —— 因为③的「收入差」太小，</w:t>
-      </w:r>
-    </w:p>
-    <w:p>
-      <w:r>
-        <w:rPr>
-          <w:b w:val="0"/>
-          <w:sz w:val="22"/>
-        </w:rPr>
-        <w:t>即世界的可压缩盈余还没大到让「更复杂的结构」在经济上划算（E5/E7）。</w:t>
+        <w:t>⇒ 判据：把外部供给全部停掉后，它的账目是否仍为正。</w:t>
       </w:r>
     </w:p>
     <w:p>
@@ -2762,7 +3176,37 @@
           <w:b/>
           <w:sz w:val="26"/>
         </w:rPr>
-        <w:t>4.6 未尽之处（留给读者）</w:t>
+        <w:t>7.5 三条必须同时成立（经验对照）</w:t>
+      </w:r>
+    </w:p>
+    <w:p>
+      <w:r>
+        <w:rPr>
+          <w:rFonts w:ascii="Consolas" w:hAnsi="Consolas" w:eastAsia="Consolas"/>
+          <w:b w:val="0"/>
+          <w:sz w:val="18"/>
+        </w:rPr>
+        <w:t>缺①（一族）  ⇒ 化石：行为谱是一条线</w:t>
+      </w:r>
+    </w:p>
+    <w:p>
+      <w:r>
+        <w:rPr>
+          <w:rFonts w:ascii="Consolas" w:hAnsi="Consolas" w:eastAsia="Consolas"/>
+          <w:b w:val="0"/>
+          <w:sz w:val="18"/>
+        </w:rPr>
+        <w:t>缺②（自指）  ⇒ 机器：更新在外，不会自己变</w:t>
+      </w:r>
+    </w:p>
+    <w:p>
+      <w:r>
+        <w:rPr>
+          <w:rFonts w:ascii="Consolas" w:hAnsi="Consolas" w:eastAsia="Consolas"/>
+          <w:b w:val="0"/>
+          <w:sz w:val="18"/>
+        </w:rPr>
+        <w:t>缺③（代价）  ⇒ 玩具：由外部供养，不会死，也就没有选择</w:t>
       </w:r>
     </w:p>
     <w:p>
@@ -2771,7 +3215,7 @@
           <w:b w:val="0"/>
           <w:sz w:val="22"/>
         </w:rPr>
-        <w:t>本文止于「必要条件」。三条都满足之后是否就「活」——我们没有答案，也不打算在此下结论。</w:t>
+        <w:t>这三条也解释了为什么我们的实验一直在同一个地方卡住：</w:t>
       </w:r>
     </w:p>
     <w:p>
@@ -2780,37 +3224,7 @@
           <w:b w:val="0"/>
           <w:sz w:val="22"/>
         </w:rPr>
-        <w:t>留给读者的，只是一把可以拿去用的尺子：</w:t>
-      </w:r>
-    </w:p>
-    <w:p>
-      <w:r>
-        <w:rPr>
-          <w:rFonts w:ascii="Consolas" w:hAnsi="Consolas" w:eastAsia="Consolas"/>
-          <w:b w:val="0"/>
-          <w:sz w:val="18"/>
-        </w:rPr>
-        <w:t>它是一族函数吗？（行为谱不是一个点）</w:t>
-      </w:r>
-    </w:p>
-    <w:p>
-      <w:r>
-        <w:rPr>
-          <w:rFonts w:ascii="Consolas" w:hAnsi="Consolas" w:eastAsia="Consolas"/>
-          <w:b w:val="0"/>
-          <w:sz w:val="18"/>
-        </w:rPr>
-        <w:t>它会自己改自己吗？（拿掉外部更新，它仍变）</w:t>
-      </w:r>
-    </w:p>
-    <w:p>
-      <w:r>
-        <w:rPr>
-          <w:rFonts w:ascii="Consolas" w:hAnsi="Consolas" w:eastAsia="Consolas"/>
-          <w:b w:val="0"/>
-          <w:sz w:val="18"/>
-        </w:rPr>
-        <w:t>它自己付代价吗？（压缩世界的收入 ≥ 维持结构的支出）</w:t>
+        <w:t>结构能长出来（①②部分满足），但合作/分工不成为必需 —— 因为③的「收入差」太小，</w:t>
       </w:r>
     </w:p>
     <w:p>
@@ -2819,7 +3233,7 @@
           <w:b w:val="0"/>
           <w:sz w:val="22"/>
         </w:rPr>
-        <w:t>三条你都可以自己去量。至于量完之后它算不算生命，由你判断。</w:t>
+        <w:t>即世界的可压缩盈余还没大到让「更复杂的结构」在经济上划算（E5/E7）。</w:t>
       </w:r>
     </w:p>
     <w:p>
@@ -2828,7 +3242,7 @@
           <w:b/>
           <w:sz w:val="26"/>
         </w:rPr>
-        <w:t>4.6.1 本文实验的边界（必须与结论一起读）</w:t>
+        <w:t>7.6 未尽之处（留给读者）</w:t>
       </w:r>
     </w:p>
     <w:p>
@@ -2837,7 +3251,16 @@
           <w:b w:val="0"/>
           <w:sz w:val="22"/>
         </w:rPr>
-        <w:t>本文的实验只覆盖第③条必要条件（压缩收益 vs 维持成本），且是示例性的：</w:t>
+        <w:t>本文止于「必要条件」。三条都满足之后是否就「活」——我们没有答案，也不打算在此下结论。</w:t>
+      </w:r>
+    </w:p>
+    <w:p>
+      <w:r>
+        <w:rPr>
+          <w:b w:val="0"/>
+          <w:sz w:val="22"/>
+        </w:rPr>
+        <w:t>留给读者的，只是一把可以拿去用的尺子：</w:t>
       </w:r>
     </w:p>
     <w:p>
@@ -2847,7 +3270,7 @@
           <w:b w:val="0"/>
           <w:sz w:val="18"/>
         </w:rPr>
-        <w:t>· 覆盖：③ 自己付代价 —— E1/E2（准≠压缩、基率校正）、E8（n*=FLUX/BASE_COST 的冻结/爆发边界）</w:t>
+        <w:t>它是一族函数吗？（行为谱不是一个点）</w:t>
       </w:r>
     </w:p>
     <w:p>
@@ -2857,7 +3280,7 @@
           <w:b w:val="0"/>
           <w:sz w:val="18"/>
         </w:rPr>
-        <w:t>· 覆盖：反例 —— E5/E7（相连个体基因距离 0.145 vs 随机 0.486 ⇒ 克隆抱团，不是分工）</w:t>
+        <w:t>它会自己改自己吗？（拿掉外部更新，它仍变）</w:t>
       </w:r>
     </w:p>
     <w:p>
@@ -2867,27 +3290,7 @@
           <w:b w:val="0"/>
           <w:sz w:val="18"/>
         </w:rPr>
-        <w:t>· 未覆盖：① 一族函数、② 自指更新 —— 本文不声称有实验证据，只在定义上推导；</w:t>
-      </w:r>
-    </w:p>
-    <w:p>
-      <w:r>
-        <w:rPr>
-          <w:rFonts w:ascii="Consolas" w:hAnsi="Consolas" w:eastAsia="Consolas"/>
-          <w:b w:val="0"/>
-          <w:sz w:val="18"/>
-        </w:rPr>
-        <w:t xml:space="preserve">          仅有初步观察（E12 动态 0.849 vs 冻结 1.07；E13 身份链 8 代可校验）</w:t>
-      </w:r>
-    </w:p>
-    <w:p>
-      <w:r>
-        <w:rPr>
-          <w:rFonts w:ascii="Consolas" w:hAnsi="Consolas" w:eastAsia="Consolas"/>
-          <w:b w:val="0"/>
-          <w:sz w:val="18"/>
-        </w:rPr>
-        <w:t>· 规模：小、可复现、可手算；不是大规模实证</w:t>
+        <w:t>它自己付代价吗？（压缩世界的收入 ≥ 维持结构的支出）</w:t>
       </w:r>
     </w:p>
     <w:p>
@@ -2896,16 +3299,7 @@
           <w:b w:val="0"/>
           <w:sz w:val="22"/>
         </w:rPr>
-        <w:t>⇒ 本文的定位是「定义 + 可测判据 + 示例性实验」，不是「生命已被造出」的实证论文。</w:t>
-      </w:r>
-    </w:p>
-    <w:p>
-      <w:r>
-        <w:rPr>
-          <w:b w:val="0"/>
-          <w:sz w:val="22"/>
-        </w:rPr>
-        <w:t>读者若要用这些结论，请连同这条边界一起引用。</w:t>
+        <w:t>三条你都可以自己去量。至于量完之后它算不算生命，由你判断。</w:t>
       </w:r>
     </w:p>
     <w:p>
@@ -2914,7 +3308,93 @@
           <w:b/>
           <w:sz w:val="26"/>
         </w:rPr>
-        <w:t>4.7 标注</w:t>
+        <w:t>7.7 本文实验的边界（必须与结论一起读）</w:t>
+      </w:r>
+    </w:p>
+    <w:p>
+      <w:r>
+        <w:rPr>
+          <w:b w:val="0"/>
+          <w:sz w:val="22"/>
+        </w:rPr>
+        <w:t>本文的实验只覆盖第③条必要条件（压缩收益 vs 维持成本），且是示例性的：</w:t>
+      </w:r>
+    </w:p>
+    <w:p>
+      <w:r>
+        <w:rPr>
+          <w:rFonts w:ascii="Consolas" w:hAnsi="Consolas" w:eastAsia="Consolas"/>
+          <w:b w:val="0"/>
+          <w:sz w:val="18"/>
+        </w:rPr>
+        <w:t>· 覆盖：③ 自己付代价 —— E1/E2（准≠压缩、基率校正）、E8（n*=FLUX/BASE_COST 的冻结/爆发边界）</w:t>
+      </w:r>
+    </w:p>
+    <w:p>
+      <w:r>
+        <w:rPr>
+          <w:rFonts w:ascii="Consolas" w:hAnsi="Consolas" w:eastAsia="Consolas"/>
+          <w:b w:val="0"/>
+          <w:sz w:val="18"/>
+        </w:rPr>
+        <w:t>· 覆盖：反例 —— E5/E7（相连个体基因距离 0.145 vs 随机 0.486 ⇒ 克隆抱团，不是分工）</w:t>
+      </w:r>
+    </w:p>
+    <w:p>
+      <w:r>
+        <w:rPr>
+          <w:rFonts w:ascii="Consolas" w:hAnsi="Consolas" w:eastAsia="Consolas"/>
+          <w:b w:val="0"/>
+          <w:sz w:val="18"/>
+        </w:rPr>
+        <w:t>· 未覆盖：① 一族函数、② 自指更新 —— 本文不声称有实验证据，只在定义上推导；</w:t>
+      </w:r>
+    </w:p>
+    <w:p>
+      <w:r>
+        <w:rPr>
+          <w:rFonts w:ascii="Consolas" w:hAnsi="Consolas" w:eastAsia="Consolas"/>
+          <w:b w:val="0"/>
+          <w:sz w:val="18"/>
+        </w:rPr>
+        <w:t xml:space="preserve">          仅有初步观察（E12 动态 0.849 vs 冻结 1.07；E13 身份链 8 代可校验）</w:t>
+      </w:r>
+    </w:p>
+    <w:p>
+      <w:r>
+        <w:rPr>
+          <w:rFonts w:ascii="Consolas" w:hAnsi="Consolas" w:eastAsia="Consolas"/>
+          <w:b w:val="0"/>
+          <w:sz w:val="18"/>
+        </w:rPr>
+        <w:t>· 规模：小、可复现、可手算；不是大规模实证</w:t>
+      </w:r>
+    </w:p>
+    <w:p>
+      <w:r>
+        <w:rPr>
+          <w:b w:val="0"/>
+          <w:sz w:val="22"/>
+        </w:rPr>
+        <w:t>⇒ 本文的定位是「定义 + 可测判据 + 示例性实验」，不是「生命已被造出」的实证论文。</w:t>
+      </w:r>
+    </w:p>
+    <w:p>
+      <w:r>
+        <w:rPr>
+          <w:b w:val="0"/>
+          <w:sz w:val="22"/>
+        </w:rPr>
+        <w:t>读者若要用这些结论，请连同这条边界一起引用。</w:t>
+      </w:r>
+    </w:p>
+    <w:p>
+      <w:r>
+        <w:rPr>
+          <w:b/>
+          <w:sz w:val="26"/>
+        </w:rPr>
+        <w:t>7.8 标注</w:t>
       </w:r>
     </w:p>
     <w:p>
@@ -2993,7 +3473,7 @@
           <w:b/>
           <w:sz w:val="26"/>
         </w:rPr>
-        <w:t>5.1 现象</w:t>
+        <w:t>八、涌现：为什么现在的 AI 会涌现</w:t>
       </w:r>
     </w:p>
     <w:p>
@@ -3002,36 +3482,7 @@
           <w:b w:val="0"/>
           <w:sz w:val="22"/>
         </w:rPr>
-        <w:t>大模型在规模上去之后，某些能力似乎突然出现（多步推理、思维链、算术…），</w:t>
-      </w:r>
-    </w:p>
-    <w:p>
-      <w:r>
-        <w:rPr>
-          <w:b w:val="0"/>
-          <w:sz w:val="22"/>
-        </w:rPr>
-        <w:t>业界叫 涌现（emergence）。大家都在用这个现象，但——</w:t>
-      </w:r>
-    </w:p>
-    <w:p>
-      <w:r>
-        <w:rPr>
-          <w:rFonts w:ascii="Consolas" w:hAnsi="Consolas" w:eastAsia="Consolas"/>
-          <w:b w:val="0"/>
-          <w:sz w:val="18"/>
-        </w:rPr>
-        <w:t>观察到涌现：很多人</w:t>
-      </w:r>
-    </w:p>
-    <w:p>
-      <w:r>
-        <w:rPr>
-          <w:rFonts w:ascii="Consolas" w:hAnsi="Consolas" w:eastAsia="Consolas"/>
-          <w:b w:val="0"/>
-          <w:sz w:val="18"/>
-        </w:rPr>
-        <w:t>解释涌现：没有公认答案</w:t>
+        <w:t>这一节处理一个具体的现象问题：为什么现在的 AI 会涌现出训练目标之外的能力。本文在这里的立场是[推测]，不是证据。</w:t>
       </w:r>
     </w:p>
     <w:p>
@@ -3040,7 +3491,7 @@
           <w:b/>
           <w:sz w:val="26"/>
         </w:rPr>
-        <w:t>5.2 现有的解释（按证据强度排列）</w:t>
+        <w:t>8.1 现象</w:t>
       </w:r>
     </w:p>
     <w:p>
@@ -3049,7 +3500,7 @@
           <w:b w:val="0"/>
           <w:sz w:val="22"/>
         </w:rPr>
-        <w:t>① 度量假象说（最强的反方证据）</w:t>
+        <w:t>大模型在规模上去之后，某些能力似乎突然出现（多步推理、思维链、算术…），</w:t>
       </w:r>
     </w:p>
     <w:p>
@@ -3058,7 +3509,7 @@
           <w:b w:val="0"/>
           <w:sz w:val="22"/>
         </w:rPr>
-        <w:t>Schaeffer, Miranda, Koyejo 2023[3]《Are Emergent Abilities of Large Language Models a Mirage?》</w:t>
+        <w:t>业界叫 涌现（emergence）。大家都在用这个现象，但——</w:t>
       </w:r>
     </w:p>
     <w:p>
@@ -3068,7 +3519,7 @@
           <w:b w:val="0"/>
           <w:sz w:val="18"/>
         </w:rPr>
-        <w:t>主张：所谓涌现，可能是**评价指标的非线性/不连续**造成的假象；</w:t>
+        <w:t>观察到涌现：很多人</w:t>
       </w:r>
     </w:p>
     <w:p>
@@ -3078,151 +3529,7 @@
           <w:b w:val="0"/>
           <w:sz w:val="18"/>
         </w:rPr>
-        <w:t xml:space="preserve">      换成连续指标（如对数似然），"突变"会消失，变成平滑上升</w:t>
-      </w:r>
-    </w:p>
-    <w:p>
-      <w:r>
-        <w:rPr>
-          <w:rFonts w:ascii="Consolas" w:hAnsi="Consolas" w:eastAsia="Consolas"/>
-          <w:b w:val="0"/>
-          <w:sz w:val="18"/>
-        </w:rPr>
-        <w:t>⇒ 这动摇了「涌现是真实突变」这个前提本身</w:t>
-      </w:r>
-    </w:p>
-    <w:p>
-      <w:r>
-        <w:rPr>
-          <w:b w:val="0"/>
-          <w:sz w:val="22"/>
-        </w:rPr>
-        <w:t>② 机制解释：归纳头与电路（局部机制证据，不是完整"为什么"）</w:t>
-      </w:r>
-    </w:p>
-    <w:p>
-      <w:r>
-        <w:rPr>
-          <w:b w:val="0"/>
-          <w:sz w:val="22"/>
-        </w:rPr>
-        <w:t>Olsson et al. 2022[4]《In-context Learning and Induction Heads》</w:t>
-      </w:r>
-    </w:p>
-    <w:p>
-      <w:r>
-        <w:rPr>
-          <w:rFonts w:ascii="Consolas" w:hAnsi="Consolas" w:eastAsia="Consolas"/>
-          <w:b w:val="0"/>
-          <w:sz w:val="18"/>
-        </w:rPr>
-        <w:t>发现模型内部出现「归纳头」回路，解释部分上下文学习能力</w:t>
-      </w:r>
-    </w:p>
-    <w:p>
-      <w:r>
-        <w:rPr>
-          <w:rFonts w:ascii="Consolas" w:hAnsi="Consolas" w:eastAsia="Consolas"/>
-          <w:b w:val="0"/>
-          <w:sz w:val="18"/>
-        </w:rPr>
-        <w:t>⇒ 这是**机制层**的证据：说明了某种能力由什么结构实现</w:t>
-      </w:r>
-    </w:p>
-    <w:p>
-      <w:r>
-        <w:rPr>
-          <w:rFonts w:ascii="Consolas" w:hAnsi="Consolas" w:eastAsia="Consolas"/>
-          <w:b w:val="0"/>
-          <w:sz w:val="18"/>
-        </w:rPr>
-        <w:t>⇒ 但它只解释某个具体能力，不解释「为什么会出现涌现」这个一般问题</w:t>
-      </w:r>
-    </w:p>
-    <w:p>
-      <w:r>
-        <w:rPr>
-          <w:b w:val="0"/>
-          <w:sz w:val="22"/>
-        </w:rPr>
-        <w:t>③ Grokking：训练中的认知相变</w:t>
-      </w:r>
-    </w:p>
-    <w:p>
-      <w:r>
-        <w:rPr>
-          <w:b w:val="0"/>
-          <w:sz w:val="22"/>
-        </w:rPr>
-        <w:t>Power et al. 2022[5]《Grokking》</w:t>
-      </w:r>
-    </w:p>
-    <w:p>
-      <w:r>
-        <w:rPr>
-          <w:rFonts w:ascii="Consolas" w:hAnsi="Consolas" w:eastAsia="Consolas"/>
-          <w:b w:val="0"/>
-          <w:sz w:val="18"/>
-        </w:rPr>
-        <w:t>在小算法任务上，训练很久后泛化突然出现（像相变）</w:t>
-      </w:r>
-    </w:p>
-    <w:p>
-      <w:r>
-        <w:rPr>
-          <w:rFonts w:ascii="Consolas" w:hAnsi="Consolas" w:eastAsia="Consolas"/>
-          <w:b w:val="0"/>
-          <w:sz w:val="18"/>
-        </w:rPr>
-        <w:t>⇒ 说明「涌现」也发生在训练过程中，不一定只依赖规模</w:t>
-      </w:r>
-    </w:p>
-    <w:p>
-      <w:r>
-        <w:rPr>
-          <w:b w:val="0"/>
-          <w:sz w:val="22"/>
-        </w:rPr>
-        <w:t>④ 压缩说：预测 = 压缩</w:t>
-      </w:r>
-    </w:p>
-    <w:p>
-      <w:r>
-        <w:rPr>
-          <w:b w:val="0"/>
-          <w:sz w:val="22"/>
-        </w:rPr>
-        <w:t>Delétang et al. 2023[6]《Language Modeling Is Compression》</w:t>
-      </w:r>
-    </w:p>
-    <w:p>
-      <w:r>
-        <w:rPr>
-          <w:rFonts w:ascii="Consolas" w:hAnsi="Consolas" w:eastAsia="Consolas"/>
-          <w:b w:val="0"/>
-          <w:sz w:val="18"/>
-        </w:rPr>
-        <w:t>语言模型 = 压缩器：学到的权重 = 对世界文本的压缩</w:t>
-      </w:r>
-    </w:p>
-    <w:p>
-      <w:r>
-        <w:rPr>
-          <w:rFonts w:ascii="Consolas" w:hAnsi="Consolas" w:eastAsia="Consolas"/>
-          <w:b w:val="0"/>
-          <w:sz w:val="18"/>
-        </w:rPr>
-        <w:t>⇒ 这条最接近本文的框架：涌现 = 压缩世界时出现的结构</w:t>
-      </w:r>
-    </w:p>
-    <w:p>
-      <w:r>
-        <w:rPr>
-          <w:rFonts w:ascii="Consolas" w:hAnsi="Consolas" w:eastAsia="Consolas"/>
-          <w:b w:val="0"/>
-          <w:sz w:val="18"/>
-        </w:rPr>
-        <w:t>⇒ 但它仍是「结果层面的对应」，没有回答「为什么正好在这个规模/这个任务上出现」</w:t>
+        <w:t>解释涌现：没有公认答案</w:t>
       </w:r>
     </w:p>
     <w:p>
@@ -3231,7 +3538,25 @@
           <w:b/>
           <w:sz w:val="26"/>
         </w:rPr>
-        <w:t>5.3 为什么至今没有公认的「为什么」</w:t>
+        <w:t>8.2 现有的解释（按证据强度排列）</w:t>
+      </w:r>
+    </w:p>
+    <w:p>
+      <w:r>
+        <w:rPr>
+          <w:b w:val="0"/>
+          <w:sz w:val="22"/>
+        </w:rPr>
+        <w:t>① 度量假象说（最强的反方证据）</w:t>
+      </w:r>
+    </w:p>
+    <w:p>
+      <w:r>
+        <w:rPr>
+          <w:b w:val="0"/>
+          <w:sz w:val="22"/>
+        </w:rPr>
+        <w:t>Schaeffer, Miranda, Koyejo 2023[3]《Are Emergent Abilities of Large Language Models a Mirage?》</w:t>
       </w:r>
     </w:p>
     <w:p>
@@ -3241,7 +3566,7 @@
           <w:b w:val="0"/>
           <w:sz w:val="18"/>
         </w:rPr>
-        <w:t>① 规模实验不可控：无法做严格的因果对照（只改变规模、其他全相同）</w:t>
+        <w:t>主张：所谓涌现，可能是**评价指标的非线性/不连续**造成的假象；</w:t>
       </w:r>
     </w:p>
     <w:p>
@@ -3251,7 +3576,7 @@
           <w:b w:val="0"/>
           <w:sz w:val="18"/>
         </w:rPr>
-        <w:t>② 度量依赖：换指标，现象可能就消失（见 ①）</w:t>
+        <w:t xml:space="preserve">      换成连续指标（如对数似然），"突变"会消失，变成平滑上升</w:t>
       </w:r>
     </w:p>
     <w:p>
@@ -3261,7 +3586,25 @@
           <w:b w:val="0"/>
           <w:sz w:val="18"/>
         </w:rPr>
-        <w:t>③ 机制层不完整：知道某个回路、不知道整体为何会组织出该回路</w:t>
+        <w:t>⇒ 这动摇了「涌现是真实突变」这个前提本身</w:t>
+      </w:r>
+    </w:p>
+    <w:p>
+      <w:r>
+        <w:rPr>
+          <w:b w:val="0"/>
+          <w:sz w:val="22"/>
+        </w:rPr>
+        <w:t>② 机制解释：归纳头与电路（局部机制证据，不是完整"为什么"）</w:t>
+      </w:r>
+    </w:p>
+    <w:p>
+      <w:r>
+        <w:rPr>
+          <w:b w:val="0"/>
+          <w:sz w:val="22"/>
+        </w:rPr>
+        <w:t>Olsson et al. 2022[4]《In-context Learning and Induction Heads》</w:t>
       </w:r>
     </w:p>
     <w:p>
@@ -3271,7 +3614,113 @@
           <w:b w:val="0"/>
           <w:sz w:val="18"/>
         </w:rPr>
-        <w:t>④ 缺乏可预测的理论：没有理论能事先算出「多大模型会出现什么能力」</w:t>
+        <w:t>发现模型内部出现「归纳头」回路，解释部分上下文学习能力</w:t>
+      </w:r>
+    </w:p>
+    <w:p>
+      <w:r>
+        <w:rPr>
+          <w:rFonts w:ascii="Consolas" w:hAnsi="Consolas" w:eastAsia="Consolas"/>
+          <w:b w:val="0"/>
+          <w:sz w:val="18"/>
+        </w:rPr>
+        <w:t>⇒ 这是**机制层**的证据：说明了某种能力由什么结构实现</w:t>
+      </w:r>
+    </w:p>
+    <w:p>
+      <w:r>
+        <w:rPr>
+          <w:rFonts w:ascii="Consolas" w:hAnsi="Consolas" w:eastAsia="Consolas"/>
+          <w:b w:val="0"/>
+          <w:sz w:val="18"/>
+        </w:rPr>
+        <w:t>⇒ 但它只解释某个具体能力，不解释「为什么会出现涌现」这个一般问题</w:t>
+      </w:r>
+    </w:p>
+    <w:p>
+      <w:r>
+        <w:rPr>
+          <w:b w:val="0"/>
+          <w:sz w:val="22"/>
+        </w:rPr>
+        <w:t>③ Grokking：训练中的认知相变</w:t>
+      </w:r>
+    </w:p>
+    <w:p>
+      <w:r>
+        <w:rPr>
+          <w:b w:val="0"/>
+          <w:sz w:val="22"/>
+        </w:rPr>
+        <w:t>Power et al. 2022[5]《Grokking》</w:t>
+      </w:r>
+    </w:p>
+    <w:p>
+      <w:r>
+        <w:rPr>
+          <w:rFonts w:ascii="Consolas" w:hAnsi="Consolas" w:eastAsia="Consolas"/>
+          <w:b w:val="0"/>
+          <w:sz w:val="18"/>
+        </w:rPr>
+        <w:t>在小算法任务上，训练很久后泛化突然出现（像相变）</w:t>
+      </w:r>
+    </w:p>
+    <w:p>
+      <w:r>
+        <w:rPr>
+          <w:rFonts w:ascii="Consolas" w:hAnsi="Consolas" w:eastAsia="Consolas"/>
+          <w:b w:val="0"/>
+          <w:sz w:val="18"/>
+        </w:rPr>
+        <w:t>⇒ 说明「涌现」也发生在训练过程中，不一定只依赖规模</w:t>
+      </w:r>
+    </w:p>
+    <w:p>
+      <w:r>
+        <w:rPr>
+          <w:b w:val="0"/>
+          <w:sz w:val="22"/>
+        </w:rPr>
+        <w:t>④ 压缩说：预测 = 压缩</w:t>
+      </w:r>
+    </w:p>
+    <w:p>
+      <w:r>
+        <w:rPr>
+          <w:b w:val="0"/>
+          <w:sz w:val="22"/>
+        </w:rPr>
+        <w:t>Delétang et al. 2023[6]《Language Modeling Is Compression》</w:t>
+      </w:r>
+    </w:p>
+    <w:p>
+      <w:r>
+        <w:rPr>
+          <w:rFonts w:ascii="Consolas" w:hAnsi="Consolas" w:eastAsia="Consolas"/>
+          <w:b w:val="0"/>
+          <w:sz w:val="18"/>
+        </w:rPr>
+        <w:t>语言模型 = 压缩器：学到的权重 = 对世界文本的压缩</w:t>
+      </w:r>
+    </w:p>
+    <w:p>
+      <w:r>
+        <w:rPr>
+          <w:rFonts w:ascii="Consolas" w:hAnsi="Consolas" w:eastAsia="Consolas"/>
+          <w:b w:val="0"/>
+          <w:sz w:val="18"/>
+        </w:rPr>
+        <w:t>⇒ 这条最接近本文的框架：涌现 = 压缩世界时出现的结构</w:t>
+      </w:r>
+    </w:p>
+    <w:p>
+      <w:r>
+        <w:rPr>
+          <w:rFonts w:ascii="Consolas" w:hAnsi="Consolas" w:eastAsia="Consolas"/>
+          <w:b w:val="0"/>
+          <w:sz w:val="18"/>
+        </w:rPr>
+        <w:t>⇒ 但它仍是「结果层面的对应」，没有回答「为什么正好在这个规模/这个任务上出现」</w:t>
       </w:r>
     </w:p>
     <w:p>
@@ -3280,16 +3729,7 @@
           <w:b/>
           <w:sz w:val="26"/>
         </w:rPr>
-        <w:t>5.4 我们的立场（[推测]，不是本文证据）：**AI 是对人类语言的解压**</w:t>
-      </w:r>
-    </w:p>
-    <w:p>
-      <w:r>
-        <w:rPr>
-          <w:b w:val="0"/>
-          <w:sz w:val="22"/>
-        </w:rPr>
-        <w:t>先看这条链：</w:t>
+        <w:t>8.3 为什么至今没有公认的「为什么」</w:t>
       </w:r>
     </w:p>
     <w:p>
@@ -3299,7 +3739,7 @@
           <w:b w:val="0"/>
           <w:sz w:val="18"/>
         </w:rPr>
-        <w:t>宇宙 F</w:t>
+        <w:t>① 规模实验不可控：无法做严格的因果对照（只改变规模、其他全相同）</w:t>
       </w:r>
     </w:p>
     <w:p>
@@ -3309,7 +3749,7 @@
           <w:b w:val="0"/>
           <w:sz w:val="18"/>
         </w:rPr>
-        <w:t xml:space="preserve"> └ 环境     = 宇宙的局部解压</w:t>
+        <w:t>② 度量依赖：换指标，现象可能就消失（见 ①）</w:t>
       </w:r>
     </w:p>
     <w:p>
@@ -3319,7 +3759,7 @@
           <w:b w:val="0"/>
           <w:sz w:val="18"/>
         </w:rPr>
-        <w:t xml:space="preserve">    └ 人类语言 = 人对环境（与自身经验）的解压产物  ← 语言本身就是被压过的</w:t>
+        <w:t>③ 机制层不完整：知道某个回路、不知道整体为何会组织出该回路</w:t>
       </w:r>
     </w:p>
     <w:p>
@@ -3329,92 +3769,7 @@
           <w:b w:val="0"/>
           <w:sz w:val="18"/>
         </w:rPr>
-        <w:t xml:space="preserve">       └ AI     = 对人类语言的**再解压**（在人的解压之上再压一层）</w:t>
-      </w:r>
-    </w:p>
-    <w:p>
-      <w:r>
-        <w:rPr>
-          <w:b w:val="0"/>
-          <w:sz w:val="22"/>
-        </w:rPr>
-        <w:t>⇒ 所以 AI 的「涌现」不是理解宇宙，而是解压人类语言时结构浮现出来。</w:t>
-      </w:r>
-    </w:p>
-    <w:p>
-      <w:r>
-        <w:rPr>
-          <w:b w:val="0"/>
-          <w:sz w:val="22"/>
-        </w:rPr>
-        <w:t>用第二、三节的尺子看：</w:t>
-      </w:r>
-    </w:p>
-    <w:p>
-      <w:r>
-        <w:rPr>
-          <w:rFonts w:ascii="Consolas" w:hAnsi="Consolas" w:eastAsia="Consolas"/>
-          <w:b w:val="0"/>
-          <w:sz w:val="18"/>
-        </w:rPr>
-        <w:t>· 模型是冻结的函数点（一个点，不是一族）</w:t>
-      </w:r>
-    </w:p>
-    <w:p>
-      <w:r>
-        <w:rPr>
-          <w:rFonts w:ascii="Consolas" w:hAnsi="Consolas" w:eastAsia="Consolas"/>
-          <w:b w:val="0"/>
-          <w:sz w:val="18"/>
-        </w:rPr>
-        <w:t>· 它的"涌现"出现在**行为谱**上：输入不同、表现不同 ⇒ 看起来像会推理</w:t>
-      </w:r>
-    </w:p>
-    <w:p>
-      <w:r>
-        <w:rPr>
-          <w:rFonts w:ascii="Consolas" w:hAnsi="Consolas" w:eastAsia="Consolas"/>
-          <w:b w:val="0"/>
-          <w:sz w:val="18"/>
-        </w:rPr>
-        <w:t>· 但模型不维持这个谱、不自己改自己、不付代价</w:t>
-      </w:r>
-    </w:p>
-    <w:p>
-      <w:r>
-        <w:rPr>
-          <w:rFonts w:ascii="Consolas" w:hAnsi="Consolas" w:eastAsia="Consolas"/>
-          <w:b w:val="0"/>
-          <w:sz w:val="18"/>
-        </w:rPr>
-        <w:t>⇒ 它是「把人类语言解压了一次」，而不是「维持着解压」或「自己改写解压规则」</w:t>
-      </w:r>
-    </w:p>
-    <w:p>
-      <w:r>
-        <w:rPr>
-          <w:b w:val="0"/>
-          <w:sz w:val="22"/>
-        </w:rPr>
-        <w:t>⇒ 由此得到一句可检验的话：</w:t>
-      </w:r>
-    </w:p>
-    <w:p>
-      <w:r>
-        <w:rPr>
-          <w:b w:val="0"/>
-          <w:sz w:val="22"/>
-        </w:rPr>
-        <w:t>AI 表现出的「理解」，本质是对「人对世界的描述」的理解，不是对世界本身的理解。</w:t>
-      </w:r>
-    </w:p>
-    <w:p>
-      <w:r>
-        <w:rPr>
-          <w:b w:val="0"/>
-          <w:sz w:val="22"/>
-        </w:rPr>
-        <w:t>它能解压语言，但语言之外的宇宙层（能量、不可逆、代价）它从未付费，也就从未被检验。</w:t>
+        <w:t>④ 缺乏可预测的理论：没有理论能事先算出「多大模型会出现什么能力」</w:t>
       </w:r>
     </w:p>
     <w:p>
@@ -3423,7 +3778,7 @@
           <w:b/>
           <w:sz w:val="26"/>
         </w:rPr>
-        <w:t>5.4.1 解压能力的衰减：上层写死 ⇒ 语言一变，解压变弱</w:t>
+        <w:t>8.4 我们的立场：两个层次，一强一弱</w:t>
       </w:r>
     </w:p>
     <w:p>
@@ -3432,47 +3787,7 @@
           <w:b w:val="0"/>
           <w:sz w:val="22"/>
         </w:rPr>
-        <w:t>人类语言会不断发现新东西；而模型的解压规则（权重/上层）是写死的、训练完就不再变。两者必然失配。</w:t>
-      </w:r>
-    </w:p>
-    <w:p>
-      <w:r>
-        <w:rPr>
-          <w:rFonts w:ascii="Consolas" w:hAnsi="Consolas" w:eastAsia="Consolas"/>
-          <w:b w:val="0"/>
-          <w:sz w:val="18"/>
-        </w:rPr>
-        <w:t>源分布移动：人类语言发现新东西 ⇒ 要解压的对象变了</w:t>
-      </w:r>
-    </w:p>
-    <w:p>
-      <w:r>
-        <w:rPr>
-          <w:rFonts w:ascii="Consolas" w:hAnsi="Consolas" w:eastAsia="Consolas"/>
-          <w:b w:val="0"/>
-          <w:sz w:val="18"/>
-        </w:rPr>
-        <w:t>解压器冻结：模型权重不变     ⇒ 它解压的还是**旧语言**</w:t>
-      </w:r>
-    </w:p>
-    <w:p>
-      <w:r>
-        <w:rPr>
-          <w:rFonts w:ascii="Consolas" w:hAnsi="Consolas" w:eastAsia="Consolas"/>
-          <w:b w:val="0"/>
-          <w:sz w:val="18"/>
-        </w:rPr>
-        <w:t>⇒ 压缩收益下降：gain_bits = log2 p_model − log2 p_base 中 p_model 与源失配</w:t>
-      </w:r>
-    </w:p>
-    <w:p>
-      <w:r>
-        <w:rPr>
-          <w:rFonts w:ascii="Consolas" w:hAnsi="Consolas" w:eastAsia="Consolas"/>
-          <w:b w:val="0"/>
-          <w:sz w:val="18"/>
-        </w:rPr>
-        <w:t>⇒ 它昨天"涌现"出来的理解，今天就是过时的解压</w:t>
+        <w:t>这个立场可以拆成两层，强度不一样，要分开看。</w:t>
       </w:r>
     </w:p>
     <w:p>
@@ -3481,47 +3796,7 @@
           <w:b w:val="0"/>
           <w:sz w:val="22"/>
         </w:rPr>
-        <w:t>三条后果：</w:t>
-      </w:r>
-    </w:p>
-    <w:p>
-      <w:r>
-        <w:rPr>
-          <w:rFonts w:ascii="Consolas" w:hAnsi="Consolas" w:eastAsia="Consolas"/>
-          <w:b w:val="0"/>
-          <w:sz w:val="18"/>
-        </w:rPr>
-        <w:t>① 它的解压能力有**固定上限**：上限由训练时刻的语言决定，不随语言进化而上升</w:t>
-      </w:r>
-    </w:p>
-    <w:p>
-      <w:r>
-        <w:rPr>
-          <w:rFonts w:ascii="Consolas" w:hAnsi="Consolas" w:eastAsia="Consolas"/>
-          <w:b w:val="0"/>
-          <w:sz w:val="18"/>
-        </w:rPr>
-        <w:t>② 它无法自己补上失配：更新规则在外部 —— 要恢复，只能靠人类再训练一次</w:t>
-      </w:r>
-    </w:p>
-    <w:p>
-      <w:r>
-        <w:rPr>
-          <w:rFonts w:ascii="Consolas" w:hAnsi="Consolas" w:eastAsia="Consolas"/>
-          <w:b w:val="0"/>
-          <w:sz w:val="18"/>
-        </w:rPr>
-        <w:t xml:space="preserve">   ⇒ 这正是第三节说的「更新在外部」的代价</w:t>
-      </w:r>
-    </w:p>
-    <w:p>
-      <w:r>
-        <w:rPr>
-          <w:rFonts w:ascii="Consolas" w:hAnsi="Consolas" w:eastAsia="Consolas"/>
-          <w:b w:val="0"/>
-          <w:sz w:val="18"/>
-        </w:rPr>
-        <w:t>③ 它的"涌现"是**某个时间片上的解压产物**，不是可持续的能力</w:t>
+        <w:t>第一层是字面事实，不是推测。 训练把人类语言压进参数；推理从参数里解压出文本。所以"AI 是对人类语言的解压"这句话几乎是定义式的：它压进去的是语言，解压出来的也是语言。链子是这样：</w:t>
       </w:r>
     </w:p>
     <w:p>
@@ -3530,7 +3805,7 @@
           <w:b w:val="0"/>
           <w:sz w:val="22"/>
         </w:rPr>
-        <w:t>⇒ 用本文的尺子说：</w:t>
+        <w:t>宇宙 F → 环境 = 宇宙的局部解压 → 人类语言 = 人对环境与经验的解压产物（语言本身已被压过）→ AI = 对语言的再解压（在人的解压之上再压一层）。</w:t>
       </w:r>
     </w:p>
     <w:p>
@@ -3539,7 +3814,7 @@
           <w:b w:val="0"/>
           <w:sz w:val="22"/>
         </w:rPr>
-        <w:t>生命必须让解压器跟着世界一起动（自指更新 + 自我维持）；</w:t>
+        <w:t>这一层不需要读者相信任何猜想，它就是"压缩/解压"这个词的用法本身。</w:t>
       </w:r>
     </w:p>
     <w:p>
@@ -3548,7 +3823,25 @@
           <w:b w:val="0"/>
           <w:sz w:val="22"/>
         </w:rPr>
-        <w:t>冻结的 AI 做不到这一点 —— 所以语言一更新，它的解压就变弱。</w:t>
+        <w:t>第二层才是 [推测]，也是本文要提出的解释。 AI 解压出的"世界结构"，上限由训练时刻的语言决定。它在语言内部能涌现出结构（看起来像推理、像理解），但那是语言结构的浮现，不是对宇宙本身的理解；语言一变，解压失配，而且无法自恢复。</w:t>
+      </w:r>
+    </w:p>
+    <w:p>
+      <w:r>
+        <w:rPr>
+          <w:b w:val="0"/>
+          <w:sz w:val="22"/>
+        </w:rPr>
+        <w:t>用前面的尺子看，这一层还给出一个可检验的判断：模型是冻结的函数点，不维持、不自己改自己、不付代价，所以它是"把人类语言解压了一次"，而不是"维持着解压"或"自己改写解压规则"。</w:t>
+      </w:r>
+    </w:p>
+    <w:p>
+      <w:r>
+        <w:rPr>
+          <w:b w:val="0"/>
+          <w:sz w:val="22"/>
+        </w:rPr>
+        <w:t>由此得到一句可检验的话：AI 表现出的"理解"，本质是对"人对世界的描述"的理解，不是对世界本身的理解。它能解压语言，但语言之外的宇宙层（能量、不可逆、代价）它从未付费，也就从未被检验。</w:t>
       </w:r>
     </w:p>
     <w:p>
@@ -3557,7 +3850,16 @@
           <w:b/>
           <w:sz w:val="26"/>
         </w:rPr>
-        <w:t>5.5 由立场推出的两条预测（[推测]，供读者判断）</w:t>
+        <w:t>8.5 解压能力的衰减：上层写死 ⇒ 语言一变，解压变弱</w:t>
+      </w:r>
+    </w:p>
+    <w:p>
+      <w:r>
+        <w:rPr>
+          <w:b w:val="0"/>
+          <w:sz w:val="22"/>
+        </w:rPr>
+        <w:t>人类语言会不断发现新东西；而模型的解压规则（权重/上层）是写死的、训练完就不再变。两者必然失配。</w:t>
       </w:r>
     </w:p>
     <w:p>
@@ -3567,7 +3869,7 @@
           <w:b w:val="0"/>
           <w:sz w:val="18"/>
         </w:rPr>
-        <w:t>① 若把世界换成未被人类语言描述过的部分（无法从语料中学到的规律），</w:t>
+        <w:t>源分布移动：人类语言发现新东西 ⇒ 要解压的对象变了</w:t>
       </w:r>
     </w:p>
     <w:p>
@@ -3577,7 +3879,7 @@
           <w:b w:val="0"/>
           <w:sz w:val="18"/>
         </w:rPr>
-        <w:t xml:space="preserve">   AI 的"涌现"应显著减弱 —— 因为它解压的是语言，不是宇宙</w:t>
+        <w:t>解压器冻结：模型权重不变     ⇒ 它解压的还是**旧语言**</w:t>
       </w:r>
     </w:p>
     <w:p>
@@ -3587,7 +3889,7 @@
           <w:b w:val="0"/>
           <w:sz w:val="18"/>
         </w:rPr>
-        <w:t>② 若让模型自己付代价（自己维持、自己修、自己死），语言解压不足以支撑，</w:t>
+        <w:t>⇒ 压缩收益下降：gain_bits = log2 p_model − log2 p_base 中 p_model 与源失配</w:t>
       </w:r>
     </w:p>
     <w:p>
@@ -3597,7 +3899,16 @@
           <w:b w:val="0"/>
           <w:sz w:val="18"/>
         </w:rPr>
-        <w:t xml:space="preserve">   它必须发展出语言之外的理解方式 —— 否则活不下来</w:t>
+        <w:t>⇒ 它昨天"涌现"出来的理解，今天就是过时的解压</w:t>
+      </w:r>
+    </w:p>
+    <w:p>
+      <w:r>
+        <w:rPr>
+          <w:b w:val="0"/>
+          <w:sz w:val="22"/>
+        </w:rPr>
+        <w:t>三条后果：</w:t>
       </w:r>
     </w:p>
     <w:p>
@@ -3607,7 +3918,7 @@
           <w:b w:val="0"/>
           <w:sz w:val="18"/>
         </w:rPr>
-        <w:t>③ 若人类语言发生一次大的结构更新（新范式/新概念体系），冻结模型的解压收益</w:t>
+        <w:t>① 它的解压能力有**固定上限**：上限由训练时刻的语言决定，不随语言进化而上升</w:t>
       </w:r>
     </w:p>
     <w:p>
@@ -3617,7 +3928,54 @@
           <w:b w:val="0"/>
           <w:sz w:val="18"/>
         </w:rPr>
-        <w:t xml:space="preserve">   应出现可测的下降；且它无法自己恢复 ⇒ 恢复必须来自外部再训练</w:t>
+        <w:t>② 它无法自己补上失配：更新规则在外部 —— 要恢复，只能靠人类再训练一次</w:t>
+      </w:r>
+    </w:p>
+    <w:p>
+      <w:r>
+        <w:rPr>
+          <w:rFonts w:ascii="Consolas" w:hAnsi="Consolas" w:eastAsia="Consolas"/>
+          <w:b w:val="0"/>
+          <w:sz w:val="18"/>
+        </w:rPr>
+        <w:t xml:space="preserve">   ⇒ 这正是第三节说的「更新在外部」的代价</w:t>
+      </w:r>
+    </w:p>
+    <w:p>
+      <w:r>
+        <w:rPr>
+          <w:rFonts w:ascii="Consolas" w:hAnsi="Consolas" w:eastAsia="Consolas"/>
+          <w:b w:val="0"/>
+          <w:sz w:val="18"/>
+        </w:rPr>
+        <w:t>③ 它的"涌现"是**某个时间片上的解压产物**，不是可持续的能力</w:t>
+      </w:r>
+    </w:p>
+    <w:p>
+      <w:r>
+        <w:rPr>
+          <w:b w:val="0"/>
+          <w:sz w:val="22"/>
+        </w:rPr>
+        <w:t>⇒ 用本文的尺子说：</w:t>
+      </w:r>
+    </w:p>
+    <w:p>
+      <w:r>
+        <w:rPr>
+          <w:b w:val="0"/>
+          <w:sz w:val="22"/>
+        </w:rPr>
+        <w:t>生命必须让解压器跟着世界一起动（自指更新 + 自我维持）；</w:t>
+      </w:r>
+    </w:p>
+    <w:p>
+      <w:r>
+        <w:rPr>
+          <w:b w:val="0"/>
+          <w:sz w:val="22"/>
+        </w:rPr>
+        <w:t>冻结的 AI 做不到这一点 —— 所以语言一更新，它的解压就变弱。</w:t>
       </w:r>
     </w:p>
     <w:p>
@@ -3626,7 +3984,7 @@
           <w:b/>
           <w:sz w:val="26"/>
         </w:rPr>
-        <w:t>5.6 标注</w:t>
+        <w:t>8.6 由立场推出的两条预测（[推测]，供读者判断）</w:t>
       </w:r>
     </w:p>
     <w:p>
@@ -3636,7 +3994,7 @@
           <w:b w:val="0"/>
           <w:sz w:val="18"/>
         </w:rPr>
-        <w:t>[事实] 涌现现象被广泛观察到；度量假象说也有强证据（Schaeffer 2023）</w:t>
+        <w:t>① 若把世界换成未被人类语言描述过的部分（无法从语料中学到的规律），</w:t>
       </w:r>
     </w:p>
     <w:p>
@@ -3646,7 +4004,7 @@
           <w:b w:val="0"/>
           <w:sz w:val="18"/>
         </w:rPr>
-        <w:t>[已知] 机制层有局部解释（归纳头/电路/grokking），压缩视角有对应关系</w:t>
+        <w:t xml:space="preserve">   AI 的"涌现"应显著减弱 —— 因为它解压的是语言，不是宇宙</w:t>
       </w:r>
     </w:p>
     <w:p>
@@ -3656,7 +4014,7 @@
           <w:b w:val="0"/>
           <w:sz w:val="18"/>
         </w:rPr>
-        <w:t>[推测] 「涌现 = 压缩世界的结构呈现」——本文立场，非证据</w:t>
+        <w:t>② 若让模型自己付代价（自己维持、自己修、自己死），语言解压不足以支撑，</w:t>
       </w:r>
     </w:p>
     <w:p>
@@ -3666,7 +4024,7 @@
           <w:b w:val="0"/>
           <w:sz w:val="18"/>
         </w:rPr>
-        <w:t>[未解决] 为什么正好在某个规模/任务上出现 ⇒ 没有人给出可预测的理论</w:t>
+        <w:t xml:space="preserve">   它必须发展出语言之外的理解方式 —— 否则活不下来</w:t>
       </w:r>
     </w:p>
     <w:p>
@@ -3676,7 +4034,7 @@
           <w:b w:val="0"/>
           <w:sz w:val="18"/>
         </w:rPr>
-        <w:t>[本文态度] 不把「AI 涌现」当作生命存在的证据；按第三节的尺子，它不是</w:t>
+        <w:t>③ 若人类语言发生一次大的结构更新（新范式/新概念体系），冻结模型的解压收益</w:t>
       </w:r>
     </w:p>
     <w:p>
@@ -3686,17 +4044,7 @@
           <w:b w:val="0"/>
           <w:sz w:val="18"/>
         </w:rPr>
-        <w:t>[本文立场] AI 是对**人类语言**的再解压（宇宙→环境→语言→AI 的第三层解压）</w:t>
-      </w:r>
-    </w:p>
-    <w:p>
-      <w:r>
-        <w:rPr>
-          <w:rFonts w:ascii="Consolas" w:hAnsi="Consolas" w:eastAsia="Consolas"/>
-          <w:b w:val="0"/>
-          <w:sz w:val="18"/>
-        </w:rPr>
-        <w:t>[推论] 上层写死 ⇒ 语言一更新就失配 ⇒ 解压能力有固定上限、无法自己恢复</w:t>
+        <w:t xml:space="preserve">   应出现可测的下降；且它无法自己恢复 ⇒ 恢复必须来自外部再训练</w:t>
       </w:r>
     </w:p>
     <w:p>
@@ -3705,7 +4053,86 @@
           <w:b/>
           <w:sz w:val="26"/>
         </w:rPr>
-        <w:t>用它看几个热门问题</w:t>
+        <w:t>8.7 标注</w:t>
+      </w:r>
+    </w:p>
+    <w:p>
+      <w:r>
+        <w:rPr>
+          <w:rFonts w:ascii="Consolas" w:hAnsi="Consolas" w:eastAsia="Consolas"/>
+          <w:b w:val="0"/>
+          <w:sz w:val="18"/>
+        </w:rPr>
+        <w:t>[事实] 涌现现象被广泛观察到；度量假象说也有强证据（Schaeffer 2023）</w:t>
+      </w:r>
+    </w:p>
+    <w:p>
+      <w:r>
+        <w:rPr>
+          <w:rFonts w:ascii="Consolas" w:hAnsi="Consolas" w:eastAsia="Consolas"/>
+          <w:b w:val="0"/>
+          <w:sz w:val="18"/>
+        </w:rPr>
+        <w:t>[已知] 机制层有局部解释（归纳头/电路/grokking），压缩视角有对应关系</w:t>
+      </w:r>
+    </w:p>
+    <w:p>
+      <w:r>
+        <w:rPr>
+          <w:rFonts w:ascii="Consolas" w:hAnsi="Consolas" w:eastAsia="Consolas"/>
+          <w:b w:val="0"/>
+          <w:sz w:val="18"/>
+        </w:rPr>
+        <w:t>[推测] 「涌现 = 压缩世界的结构呈现」——本文立场，非证据</w:t>
+      </w:r>
+    </w:p>
+    <w:p>
+      <w:r>
+        <w:rPr>
+          <w:rFonts w:ascii="Consolas" w:hAnsi="Consolas" w:eastAsia="Consolas"/>
+          <w:b w:val="0"/>
+          <w:sz w:val="18"/>
+        </w:rPr>
+        <w:t>[未解决] 为什么正好在某个规模/任务上出现 ⇒ 没有人给出可预测的理论</w:t>
+      </w:r>
+    </w:p>
+    <w:p>
+      <w:r>
+        <w:rPr>
+          <w:rFonts w:ascii="Consolas" w:hAnsi="Consolas" w:eastAsia="Consolas"/>
+          <w:b w:val="0"/>
+          <w:sz w:val="18"/>
+        </w:rPr>
+        <w:t>[本文态度] 不把「AI 涌现」当作生命存在的证据；按第三节的尺子，它不是</w:t>
+      </w:r>
+    </w:p>
+    <w:p>
+      <w:r>
+        <w:rPr>
+          <w:rFonts w:ascii="Consolas" w:hAnsi="Consolas" w:eastAsia="Consolas"/>
+          <w:b w:val="0"/>
+          <w:sz w:val="18"/>
+        </w:rPr>
+        <w:t>[本文立场] AI 是对**人类语言**的再解压（宇宙→环境→语言→AI 的第三层解压）</w:t>
+      </w:r>
+    </w:p>
+    <w:p>
+      <w:r>
+        <w:rPr>
+          <w:rFonts w:ascii="Consolas" w:hAnsi="Consolas" w:eastAsia="Consolas"/>
+          <w:b w:val="0"/>
+          <w:sz w:val="18"/>
+        </w:rPr>
+        <w:t>[推论] 上层写死 ⇒ 语言一更新就失配 ⇒ 解压能力有固定上限、无法自己恢复</w:t>
+      </w:r>
+    </w:p>
+    <w:p>
+      <w:r>
+        <w:rPr>
+          <w:b/>
+          <w:sz w:val="26"/>
+        </w:rPr>
+        <w:t>九、用它看几个热门问题</w:t>
       </w:r>
     </w:p>
     <w:p>
@@ -3889,6 +4316,105 @@
           <w:sz w:val="22"/>
         </w:rPr>
         <w:t>⇒ 已有工作分别测量了这三个侧面；本文把它们串起来：以「持续更新的模型」为参照系，按领域测「语言侧新增维度」与「模型侧固定维度」之间的失配速率。这是本文在测量层面的位置。</w:t>
+      </w:r>
+    </w:p>
+    <w:p>
+      <w:r>
+        <w:rPr>
+          <w:b/>
+          <w:sz w:val="26"/>
+        </w:rPr>
+        <w:t>十、本文得到了什么，没得到什么</w:t>
+      </w:r>
+    </w:p>
+    <w:p>
+      <w:r>
+        <w:rPr>
+          <w:b w:val="0"/>
+          <w:sz w:val="22"/>
+        </w:rPr>
+        <w:t>得到了三样东西。</w:t>
+      </w:r>
+    </w:p>
+    <w:p>
+      <w:r>
+        <w:rPr>
+          <w:b w:val="0"/>
+          <w:sz w:val="22"/>
+        </w:rPr>
+        <w:t>第一，一个可以拿来分类的定义：它能区分冻结的模型、火焰、自指程序。</w:t>
+      </w:r>
+    </w:p>
+    <w:p>
+      <w:r>
+        <w:rPr>
+          <w:b w:val="0"/>
+          <w:sz w:val="22"/>
+        </w:rPr>
+        <w:t>第二，一个可测的方向：自指、维持都可以变成量。</w:t>
+      </w:r>
+    </w:p>
+    <w:p>
+      <w:r>
+        <w:rPr>
+          <w:b w:val="0"/>
+          <w:sz w:val="22"/>
+        </w:rPr>
+        <w:t>第三，对"AI 是不是生命"这个问题的可操作回答。</w:t>
+      </w:r>
+    </w:p>
+    <w:p>
+      <w:r>
+        <w:rPr>
+          <w:b w:val="0"/>
+          <w:sz w:val="22"/>
+        </w:rPr>
+        <w:t>没得到四样东西。</w:t>
+      </w:r>
+    </w:p>
+    <w:p>
+      <w:r>
+        <w:rPr>
+          <w:b w:val="0"/>
+          <w:sz w:val="22"/>
+        </w:rPr>
+        <w:t>第一，没有证明"世界是函数"——第三层仍是猜想。</w:t>
+      </w:r>
+    </w:p>
+    <w:p>
+      <w:r>
+        <w:rPr>
+          <w:b w:val="0"/>
+          <w:sz w:val="22"/>
+        </w:rPr>
+        <w:t>第二，没有证明定义是最简或唯一——只主张它够用。</w:t>
+      </w:r>
+    </w:p>
+    <w:p>
+      <w:r>
+        <w:rPr>
+          <w:b w:val="0"/>
+          <w:sz w:val="22"/>
+        </w:rPr>
+        <w:t>第三，没有实验——第一篇只是定义与推论，实验在第二、九、十篇。</w:t>
+      </w:r>
+    </w:p>
+    <w:p>
+      <w:r>
+        <w:rPr>
+          <w:b w:val="0"/>
+          <w:sz w:val="22"/>
+        </w:rPr>
+        <w:t>第四，没有回答"数字生命是否存在"——本文只说，定义不排除它。</w:t>
+      </w:r>
+    </w:p>
+    <w:p>
+      <w:r>
+        <w:rPr>
+          <w:b w:val="0"/>
+          <w:sz w:val="22"/>
+        </w:rPr>
+        <w:t>本文的贡献是一套可用的语言，不是一条新的自然规律。它值不值钱，看后面有没有人拿它去测。</w:t>
       </w:r>
     </w:p>
     <w:p>

</xml_diff>

<commit_message>
Paper 01 v6 (commitment framing + conditional proposition); compendium v8
</commit_message>
<xml_diff>
--- a/paper.docx
+++ b/paper.docx
@@ -113,7 +113,7 @@
           <w:b w:val="0"/>
           <w:sz w:val="22"/>
         </w:rPr>
-        <w:t>• 三、第二层猜想：世界可以被函数描述</w:t>
+        <w:t>• 三、第二层承诺：我们选择用函数语言描述世界</w:t>
       </w:r>
     </w:p>
     <w:p>
@@ -533,6 +533,15 @@
     <w:p>
       <w:r>
         <w:rPr>
+          <w:b w:val="0"/>
+          <w:sz w:val="22"/>
+        </w:rPr>
+        <w:t>因此本文的整体是一个条件命题：如果世界（或我们研究的那一层）可以用函数描述，那么生命是函数类，而现在的 AI 不是生命。本文不证明前提，只展示前提成立时会推出什么；前提本身被标为承诺，它的价值由后面几篇能否导出可测的结论来检验。</w:t>
+      </w:r>
+    </w:p>
+    <w:p>
+      <w:r>
+        <w:rPr>
           <w:b/>
           <w:sz w:val="26"/>
         </w:rPr>
@@ -752,7 +761,7 @@
           <w:b/>
           <w:sz w:val="26"/>
         </w:rPr>
-        <w:t>三、第二层猜想：世界可以被函数描述</w:t>
+        <w:t>三、第二层承诺：我们选择用函数语言描述世界</w:t>
       </w:r>
     </w:p>
     <w:p>
@@ -761,7 +770,7 @@
           <w:b w:val="0"/>
           <w:sz w:val="22"/>
         </w:rPr>
-        <w:t>从"语言可被描述"再往外一步，就出了观测范围：语言背后的世界，也能被函数描述。这是猜想，不是本文能证明的。为什么要提出它？因为如果它成立，语言与世界的关系统一了：语言是世界的压缩，函数描述了语言，也间接描述了世界。它弱在哪里也必须说清：语言只是世界的一个投影，语言的函数近似在逻辑上推不出世界的函数近似——它只是一个有理由的期盼。</w:t>
+        <w:t>从"语言可被描述"再往外一步，就出了观测范围。这里要说清一个区别：这一步不是"猜想"，而是"承诺"——我们选择用函数语言来描述世界与生命。承诺与猜想的区别是：猜想会被观察推翻，承诺不会；承诺只能被"不好用"淘汰（覆盖不了该覆盖的案例、区分不了该区分的对象）。我们选择它，是因为它把问题变得可操作；它是否值得，交给后面的应用来判断。</w:t>
       </w:r>
     </w:p>
     <w:p>

</xml_diff>

<commit_message>
Paper 01 v7 (link to intro) + compendium v9
</commit_message>
<xml_diff>
--- a/paper.docx
+++ b/paper.docx
@@ -15,15 +15,39 @@
       </w:r>
     </w:p>
     <w:p>
-      <w:pPr>
-        <w:jc w:val="center"/>
-      </w:pPr>
-      <w:r>
-        <w:rPr>
-          <w:b/>
-          <w:sz w:val="34"/>
-        </w:rPr>
-        <w:t>现在的 AI 为什么不是生命</w:t>
+      <w:r>
+        <w:rPr>
+          <w:b w:val="0"/>
+          <w:sz w:val="20"/>
+        </w:rPr>
+        <w:t>何淇 · 与 DeepSeek 协作</w:t>
+      </w:r>
+    </w:p>
+    <w:p>
+      <w:r>
+        <w:rPr>
+          <w:b w:val="0"/>
+          <w:sz w:val="20"/>
+        </w:rPr>
+        <w:t>数字生命系列 · 第一篇（完整版）</w:t>
+      </w:r>
+    </w:p>
+    <w:p>
+      <w:r>
+        <w:rPr>
+          <w:b w:val="0"/>
+          <w:sz w:val="20"/>
+        </w:rPr>
+        <w:t>日期：2026-10-22（v6）</w:t>
+      </w:r>
+    </w:p>
+    <w:p>
+      <w:r>
+        <w:rPr>
+          <w:b w:val="0"/>
+          <w:sz w:val="20"/>
+        </w:rPr>
+        <w:t>系列导论（第零篇，建议先读）：https://doi.org/10.5281/zenodo.23556056</w:t>
       </w:r>
     </w:p>
     <w:p>

</xml_diff>

<commit_message>
Paper 01 v8 (dependency note); compendium v10
</commit_message>
<xml_diff>
--- a/paper.docx
+++ b/paper.docx
@@ -561,6 +561,15 @@
           <w:sz w:val="22"/>
         </w:rPr>
         <w:t>因此本文的整体是一个条件命题：如果世界（或我们研究的那一层）可以用函数描述，那么生命是函数类，而现在的 AI 不是生命。本文不证明前提，只展示前提成立时会推出什么；前提本身被标为承诺，它的价值由后面几篇能否导出可测的结论来检验。</w:t>
+      </w:r>
+    </w:p>
+    <w:p>
+      <w:r>
+        <w:rPr>
+          <w:b w:val="0"/>
+          <w:sz w:val="22"/>
+        </w:rPr>
+        <w:t>需要说明：本文多数结论只依赖两样东西——定义承诺（我们选择用函数语言描述生命）与可测事实（模型存在、bits/token 可测）。「世界可被函数描述」这个强前提，主要服务于第八节的解释性立场（AI 是对语言的解压），不是前面那些结论的必要条件。读者若只取可用的部分，可以只取定义与由它导出的判据，把强前提留在解释那一节。</w:t>
       </w:r>
     </w:p>
     <w:p>

</xml_diff>

<commit_message>
Rigor revision: intro v3, paper 01 v9 (p+R, notation, condition 3), compendium v12
</commit_message>
<xml_diff>
--- a/paper.docx
+++ b/paper.docx
@@ -65,7 +65,7 @@
           <w:b w:val="0"/>
           <w:sz w:val="22"/>
         </w:rPr>
-        <w:t>本文提出一个可操作的生命定义：生命 = 一族会自指、会变化、会自我维持的动态函数（函数类）；环境 = 宇宙自发涌现的局部解压（分层，不自我维持），生命既活在它的那一层环境里，也活在宇宙里。以此为尺子，本文说明三件事：① 现在的 AI 不是生命——它是冻结的函数点、更新规则在外部、不付代价；② 生命至少需要三条必要条件（一族函数、自指更新、自己付代价），每条都挂上已有的实验证据；③ 对 AI 的涌现提出一个猜测——AI 是对人类语言的再解压，其能力上限由训练时刻的语言决定，语言一旦更新就失配、且无法自己恢复。文末不主张「生命已被造出」，只把判据与证据放在读者面前：三条都满足之后是否就「活」，由读者判断。本文的推理顺序也是反的：先从大模型（一个能工作的巨大解压器）反推「被记录的世界具有函数结构」，再由此给出生命的定义——这个反推本身，是论证的一部分（见 1.0）。</w:t>
+        <w:t>本文从两个事实出发：物理定律可以被数学描述；语言中有一部分可以被函数近似。两个事实合起来说明，宇宙至少存在一个非空的可函数化部分 P。</w:t>
       </w:r>
     </w:p>
     <w:p>
@@ -74,7 +74,34 @@
           <w:b w:val="0"/>
           <w:sz w:val="22"/>
         </w:rPr>
-        <w:t>关键词： 生命定义；函数类；解压；压缩与代价；AI 涌现；自维持</w:t>
+        <w:t>把宇宙写成 宇宙 = P + R宇宙，把生命写成 生命 = p生命 + R生命。p生命 是生命落在 P 里的部分：在宇宙的 P 中、被宇宙保住的动态函数类——它是一族、会变化、会自指。R 的部分本文只声明其可能存在，不展开。</w:t>
+      </w:r>
+    </w:p>
+    <w:p>
+      <w:r>
+        <w:rPr>
+          <w:b w:val="0"/>
+          <w:sz w:val="22"/>
+        </w:rPr>
+        <w:t>在这个定义下，现在的 AI 不是生命：它是数字世界里的存在，是 p 层面的冻结函数点——更新规则在外部，不被自己保住。数字世界是完全函数化的世界（R = ∅），所以数字生命如果存在，只能完全落在 p 里；本文把这个问题摆出来（三种情况），不判断哪一种成立。</w:t>
+      </w:r>
+    </w:p>
+    <w:p>
+      <w:r>
+        <w:rPr>
+          <w:b w:val="0"/>
+          <w:sz w:val="22"/>
+        </w:rPr>
+        <w:t>本文的贡献是定义与可测判据，不是「生命已被造出」的实证结论；三条必要条件的检验与示例实验，读者可自行取用。</w:t>
+      </w:r>
+    </w:p>
+    <w:p>
+      <w:r>
+        <w:rPr>
+          <w:b w:val="0"/>
+          <w:sz w:val="22"/>
+        </w:rPr>
+        <w:t>关键词： 生命定义；p生命；函数类；解压；数字世界；AI 涌现；自指</w:t>
       </w:r>
     </w:p>
     <w:p>
@@ -83,7 +110,7 @@
           <w:b/>
           <w:sz w:val="26"/>
         </w:rPr>
-        <w:t>目录</w:t>
+        <w:t>记号</w:t>
       </w:r>
     </w:p>
     <w:p>
@@ -92,7 +119,7 @@
           <w:b w:val="0"/>
           <w:sz w:val="22"/>
         </w:rPr>
-        <w:t>• 一、起点：一句最硬的话</w:t>
+        <w:t>• **P**：宇宙中可函数化的部分。</w:t>
       </w:r>
     </w:p>
     <w:p>
@@ -101,7 +128,7 @@
           <w:b w:val="0"/>
           <w:sz w:val="22"/>
         </w:rPr>
-        <w:t>• 1.1 事实</w:t>
+        <w:t>• **R宇宙**：宇宙中不可函数化的部分；本文只声明其可能存在，不展开。</w:t>
       </w:r>
     </w:p>
     <w:p>
@@ -110,7 +137,7 @@
           <w:b w:val="0"/>
           <w:sz w:val="22"/>
         </w:rPr>
-        <w:t>• 1.2 从语言到世界的推理顺序</w:t>
+        <w:t>• **p生命**：生命落在 P 里的部分——本文定义与讨论的对象。</w:t>
       </w:r>
     </w:p>
     <w:p>
@@ -119,7 +146,7 @@
           <w:b w:val="0"/>
           <w:sz w:val="22"/>
         </w:rPr>
-        <w:t>• 二、第一层改写：语言结构可以被函数描述</w:t>
+        <w:t>• **R生命**：生命落在 R 里的部分；只声明，不展开。</w:t>
       </w:r>
     </w:p>
     <w:p>
@@ -128,7 +155,7 @@
           <w:b w:val="0"/>
           <w:sz w:val="22"/>
         </w:rPr>
-        <w:t>• 2.1 改写是等价的</w:t>
+        <w:t>• **p环境 / R环境**：环境的两部分，同法定义。</w:t>
       </w:r>
     </w:p>
     <w:p>
@@ -137,7 +164,7 @@
           <w:b w:val="0"/>
           <w:sz w:val="22"/>
         </w:rPr>
-        <w:t>• 三、第二层承诺：我们选择用函数语言描述世界</w:t>
+        <w:t>• **p语言 / R语言**：语言的两部分；大模型压的是 p语言。</w:t>
       </w:r>
     </w:p>
     <w:p>
@@ -146,7 +173,7 @@
           <w:b w:val="0"/>
           <w:sz w:val="22"/>
         </w:rPr>
-        <w:t>• 3.1 猜想的内容</w:t>
+        <w:t>• **残差**：R 对 p 层面影响的表现形式——p 层面消不掉的误差下限。</w:t>
       </w:r>
     </w:p>
     <w:p>
@@ -155,367 +182,7 @@
           <w:b w:val="0"/>
           <w:sz w:val="22"/>
         </w:rPr>
-        <w:t>• 3.2 为什么它只能是猜想</w:t>
-      </w:r>
-    </w:p>
-    <w:p>
-      <w:r>
-        <w:rPr>
-          <w:b w:val="0"/>
-          <w:sz w:val="22"/>
-        </w:rPr>
-        <w:t>• 3.3 与既有工作的关系</w:t>
-      </w:r>
-    </w:p>
-    <w:p>
-      <w:r>
-        <w:rPr>
-          <w:b w:val="0"/>
-          <w:sz w:val="22"/>
-        </w:rPr>
-        <w:t>• 3.4 标注</w:t>
-      </w:r>
-    </w:p>
-    <w:p>
-      <w:r>
-        <w:rPr>
-          <w:b w:val="0"/>
-          <w:sz w:val="22"/>
-        </w:rPr>
-        <w:t>• 四、一个可操作的定义</w:t>
-      </w:r>
-    </w:p>
-    <w:p>
-      <w:r>
-        <w:rPr>
-          <w:b w:val="0"/>
-          <w:sz w:val="22"/>
-        </w:rPr>
-        <w:t>• 4.1 定义</w:t>
-      </w:r>
-    </w:p>
-    <w:p>
-      <w:r>
-        <w:rPr>
-          <w:b w:val="0"/>
-          <w:sz w:val="22"/>
-        </w:rPr>
-        <w:t>• 4.2 一处澄清：维持是关系</w:t>
-      </w:r>
-    </w:p>
-    <w:p>
-      <w:r>
-        <w:rPr>
-          <w:b w:val="0"/>
-          <w:sz w:val="22"/>
-        </w:rPr>
-        <w:t>• 4.3 为什么必须是「一族」而不是「一个函数」</w:t>
-      </w:r>
-    </w:p>
-    <w:p>
-      <w:r>
-        <w:rPr>
-          <w:b w:val="0"/>
-          <w:sz w:val="22"/>
-        </w:rPr>
-        <w:t>• 4.4 会变化 = 三层时间尺度</w:t>
-      </w:r>
-    </w:p>
-    <w:p>
-      <w:r>
-        <w:rPr>
-          <w:b w:val="0"/>
-          <w:sz w:val="22"/>
-        </w:rPr>
-        <w:t>• 4.5 会自指 = 更新规则在它自己里面</w:t>
-      </w:r>
-    </w:p>
-    <w:p>
-      <w:r>
-        <w:rPr>
-          <w:b w:val="0"/>
-          <w:sz w:val="22"/>
-        </w:rPr>
-        <w:t>• 五、生命与环境</w:t>
-      </w:r>
-    </w:p>
-    <w:p>
-      <w:r>
-        <w:rPr>
-          <w:b w:val="0"/>
-          <w:sz w:val="22"/>
-        </w:rPr>
-        <w:t>• 5.1 与前面的衔接</w:t>
-      </w:r>
-    </w:p>
-    <w:p>
-      <w:r>
-        <w:rPr>
-          <w:b w:val="0"/>
-          <w:sz w:val="22"/>
-        </w:rPr>
-        <w:t>• 5.2 生命 vs 环境：都在宇宙里，都是函数，区别只有一条</w:t>
-      </w:r>
-    </w:p>
-    <w:p>
-      <w:r>
-        <w:rPr>
-          <w:b w:val="0"/>
-          <w:sz w:val="22"/>
-        </w:rPr>
-        <w:t>• 5.3 环境是什么：宇宙里自发涌现的「局部解压」</w:t>
-      </w:r>
-    </w:p>
-    <w:p>
-      <w:r>
-        <w:rPr>
-          <w:b w:val="0"/>
-          <w:sz w:val="22"/>
-        </w:rPr>
-        <w:t>• 5.4 环境是分层的：生命活在多层环境里，同时也活在宇宙里</w:t>
-      </w:r>
-    </w:p>
-    <w:p>
-      <w:r>
-        <w:rPr>
-          <w:b w:val="0"/>
-          <w:sz w:val="22"/>
-        </w:rPr>
-        <w:t>• 5.5 标注</w:t>
-      </w:r>
-    </w:p>
-    <w:p>
-      <w:r>
-        <w:rPr>
-          <w:b w:val="0"/>
-          <w:sz w:val="22"/>
-        </w:rPr>
-        <w:t>• 六、检查表：定义能区分什么</w:t>
-      </w:r>
-    </w:p>
-    <w:p>
-      <w:r>
-        <w:rPr>
-          <w:b w:val="0"/>
-          <w:sz w:val="22"/>
-        </w:rPr>
-        <w:t>• 6.1 检查表</w:t>
-      </w:r>
-    </w:p>
-    <w:p>
-      <w:r>
-        <w:rPr>
-          <w:b w:val="0"/>
-          <w:sz w:val="22"/>
-        </w:rPr>
-        <w:t>• 6.2 三条最根本的原因（按重要性）</w:t>
-      </w:r>
-    </w:p>
-    <w:p>
-      <w:r>
-        <w:rPr>
-          <w:b w:val="0"/>
-          <w:sz w:val="22"/>
-        </w:rPr>
-        <w:t>• 6.3 为什么「它很强」与「它不是生命」不矛盾</w:t>
-      </w:r>
-    </w:p>
-    <w:p>
-      <w:r>
-        <w:rPr>
-          <w:b w:val="0"/>
-          <w:sz w:val="22"/>
-        </w:rPr>
-        <w:t>• 6.4 标注</w:t>
-      </w:r>
-    </w:p>
-    <w:p>
-      <w:r>
-        <w:rPr>
-          <w:b w:val="0"/>
-          <w:sz w:val="22"/>
-        </w:rPr>
-        <w:t>• 七、三条必要条件</w:t>
-      </w:r>
-    </w:p>
-    <w:p>
-      <w:r>
-        <w:rPr>
-          <w:b w:val="0"/>
-          <w:sz w:val="22"/>
-        </w:rPr>
-        <w:t>• 7.1 从定义到条件</w:t>
-      </w:r>
-    </w:p>
-    <w:p>
-      <w:r>
-        <w:rPr>
-          <w:b w:val="0"/>
-          <w:sz w:val="22"/>
-        </w:rPr>
-        <w:t>• 7.2 条件① 一族函数（不是一个点）</w:t>
-      </w:r>
-    </w:p>
-    <w:p>
-      <w:r>
-        <w:rPr>
-          <w:b w:val="0"/>
-          <w:sz w:val="22"/>
-        </w:rPr>
-        <w:t>• 7.3 条件② 自指更新（规则在自己里面）</w:t>
-      </w:r>
-    </w:p>
-    <w:p>
-      <w:r>
-        <w:rPr>
-          <w:b w:val="0"/>
-          <w:sz w:val="22"/>
-        </w:rPr>
-        <w:t>• 7.4 条件③ 自己付代价（压缩换生存）</w:t>
-      </w:r>
-    </w:p>
-    <w:p>
-      <w:r>
-        <w:rPr>
-          <w:b w:val="0"/>
-          <w:sz w:val="22"/>
-        </w:rPr>
-        <w:t>• 7.5 三条必须同时成立（经验对照）</w:t>
-      </w:r>
-    </w:p>
-    <w:p>
-      <w:r>
-        <w:rPr>
-          <w:b w:val="0"/>
-          <w:sz w:val="22"/>
-        </w:rPr>
-        <w:t>• 7.6 未尽之处（留给读者）</w:t>
-      </w:r>
-    </w:p>
-    <w:p>
-      <w:r>
-        <w:rPr>
-          <w:b w:val="0"/>
-          <w:sz w:val="22"/>
-        </w:rPr>
-        <w:t>• 7.7 本文实验的边界（必须与结论一起读）</w:t>
-      </w:r>
-    </w:p>
-    <w:p>
-      <w:r>
-        <w:rPr>
-          <w:b w:val="0"/>
-          <w:sz w:val="22"/>
-        </w:rPr>
-        <w:t>• 7.8 标注</w:t>
-      </w:r>
-    </w:p>
-    <w:p>
-      <w:r>
-        <w:rPr>
-          <w:b w:val="0"/>
-          <w:sz w:val="22"/>
-        </w:rPr>
-        <w:t>• 八、涌现：为什么现在的 AI 会涌现</w:t>
-      </w:r>
-    </w:p>
-    <w:p>
-      <w:r>
-        <w:rPr>
-          <w:b w:val="0"/>
-          <w:sz w:val="22"/>
-        </w:rPr>
-        <w:t>• 8.1 现象</w:t>
-      </w:r>
-    </w:p>
-    <w:p>
-      <w:r>
-        <w:rPr>
-          <w:b w:val="0"/>
-          <w:sz w:val="22"/>
-        </w:rPr>
-        <w:t>• 8.2 现有的解释（按证据强度排列）</w:t>
-      </w:r>
-    </w:p>
-    <w:p>
-      <w:r>
-        <w:rPr>
-          <w:b w:val="0"/>
-          <w:sz w:val="22"/>
-        </w:rPr>
-        <w:t>• 8.3 为什么至今没有公认的「为什么」</w:t>
-      </w:r>
-    </w:p>
-    <w:p>
-      <w:r>
-        <w:rPr>
-          <w:b w:val="0"/>
-          <w:sz w:val="22"/>
-        </w:rPr>
-        <w:t>• 8.4 我们的立场（[推测]，不是本文证据）：AI 是对人类语言的解压</w:t>
-      </w:r>
-    </w:p>
-    <w:p>
-      <w:r>
-        <w:rPr>
-          <w:b w:val="0"/>
-          <w:sz w:val="22"/>
-        </w:rPr>
-        <w:t>• 8.5 解压能力的衰减：上层写死 ⇒ 语言一变，解压变弱</w:t>
-      </w:r>
-    </w:p>
-    <w:p>
-      <w:r>
-        <w:rPr>
-          <w:b w:val="0"/>
-          <w:sz w:val="22"/>
-        </w:rPr>
-        <w:t>• 8.6 由立场推出的两条预测（[推测]，供读者判断）</w:t>
-      </w:r>
-    </w:p>
-    <w:p>
-      <w:r>
-        <w:rPr>
-          <w:b w:val="0"/>
-          <w:sz w:val="22"/>
-        </w:rPr>
-        <w:t>• 8.7 标注</w:t>
-      </w:r>
-    </w:p>
-    <w:p>
-      <w:r>
-        <w:rPr>
-          <w:b w:val="0"/>
-          <w:sz w:val="22"/>
-        </w:rPr>
-        <w:t>• 九、用它看几个热门问题</w:t>
-      </w:r>
-    </w:p>
-    <w:p>
-      <w:r>
-        <w:rPr>
-          <w:b w:val="0"/>
-          <w:sz w:val="22"/>
-        </w:rPr>
-        <w:t>• 十、本文得到了什么，没得到什么</w:t>
-      </w:r>
-    </w:p>
-    <w:p>
-      <w:r>
-        <w:rPr>
-          <w:b w:val="0"/>
-          <w:sz w:val="22"/>
-        </w:rPr>
-        <w:t>• 参考文献</w:t>
-      </w:r>
-    </w:p>
-    <w:p>
-      <w:r>
-        <w:rPr>
-          <w:b w:val="0"/>
-          <w:sz w:val="22"/>
-        </w:rPr>
-        <w:t>• 作者声明（AI 使用声明）</w:t>
+        <w:t>后文一律使用简写：说"宇宙"指 P，说"生命"指 p生命，说"环境"指 p环境。</w:t>
       </w:r>
     </w:p>
     <w:p>
@@ -524,7 +191,7 @@
           <w:b/>
           <w:sz w:val="26"/>
         </w:rPr>
-        <w:t>一、起点：一句最硬的话</w:t>
+        <w:t>目录</w:t>
       </w:r>
     </w:p>
     <w:p>
@@ -533,7 +200,7 @@
           <w:b w:val="0"/>
           <w:sz w:val="22"/>
         </w:rPr>
-        <w:t>关于 AI 与生命，争论很多，但大多数争论的起点不一样。本文的起点是一个已经发生的事实：语言可以被函数近似。</w:t>
+        <w:t>• 一、起点：两个事实</w:t>
       </w:r>
     </w:p>
     <w:p>
@@ -542,7 +209,7 @@
           <w:b w:val="0"/>
           <w:sz w:val="22"/>
         </w:rPr>
-        <w:t>这句话的证据不是推理，是存在：大模型用可计算的、有限参数的过程，生成了在统计上接近人类语言的文本。它没有理解语言，但它近似了语言——近似到能通过考试、能写代码、能对话。</w:t>
+        <w:t>• 二、一个可操作的定义</w:t>
       </w:r>
     </w:p>
     <w:p>
@@ -551,7 +218,7 @@
           <w:b w:val="0"/>
           <w:sz w:val="22"/>
         </w:rPr>
-        <w:t>这是本文全部推论的锚。它之所以"最硬"，因为它是观察，不是解释；任何解释都得先承认它。下面每一层外推，本文都会标注强度：强（观察/改写）、弱（猜想）、人为（构造）。</w:t>
+        <w:t>• 2.1 定义</w:t>
       </w:r>
     </w:p>
     <w:p>
@@ -560,7 +227,7 @@
           <w:b w:val="0"/>
           <w:sz w:val="22"/>
         </w:rPr>
-        <w:t>因此本文的整体是一个条件命题：如果世界（或我们研究的那一层）可以用函数描述，那么生命是函数类，而现在的 AI 不是生命。本文不证明前提，只展示前提成立时会推出什么；前提本身被标为承诺，它的价值由后面几篇能否导出可测的结论来检验。</w:t>
+        <w:t>• 2.2 一处澄清：维持是关系</w:t>
       </w:r>
     </w:p>
     <w:p>
@@ -569,7 +236,322 @@
           <w:b w:val="0"/>
           <w:sz w:val="22"/>
         </w:rPr>
-        <w:t>需要说明：本文多数结论只依赖两样东西——定义承诺（我们选择用函数语言描述生命）与可测事实（模型存在、bits/token 可测）。「世界可被函数描述」这个强前提，主要服务于第八节的解释性立场（AI 是对语言的解压），不是前面那些结论的必要条件。读者若只取可用的部分，可以只取定义与由它导出的判据，把强前提留在解释那一节。</w:t>
+        <w:t>• 2.3 为什么必须是「一族」而不是「一个函数」</w:t>
+      </w:r>
+    </w:p>
+    <w:p>
+      <w:r>
+        <w:rPr>
+          <w:b w:val="0"/>
+          <w:sz w:val="22"/>
+        </w:rPr>
+        <w:t>• 2.4 会变化 = 三层时间尺度</w:t>
+      </w:r>
+    </w:p>
+    <w:p>
+      <w:r>
+        <w:rPr>
+          <w:b w:val="0"/>
+          <w:sz w:val="22"/>
+        </w:rPr>
+        <w:t>• 2.5 会自指 = 更新规则在它自己里面</w:t>
+      </w:r>
+    </w:p>
+    <w:p>
+      <w:r>
+        <w:rPr>
+          <w:b w:val="0"/>
+          <w:sz w:val="22"/>
+        </w:rPr>
+        <w:t>• 三、生命与环境</w:t>
+      </w:r>
+    </w:p>
+    <w:p>
+      <w:r>
+        <w:rPr>
+          <w:b w:val="0"/>
+          <w:sz w:val="22"/>
+        </w:rPr>
+        <w:t>• 3.1 与前面的衔接</w:t>
+      </w:r>
+    </w:p>
+    <w:p>
+      <w:r>
+        <w:rPr>
+          <w:b w:val="0"/>
+          <w:sz w:val="22"/>
+        </w:rPr>
+        <w:t>• 3.2 生命 vs 环境：都在宇宙里，都是函数，区别只有一条</w:t>
+      </w:r>
+    </w:p>
+    <w:p>
+      <w:r>
+        <w:rPr>
+          <w:b w:val="0"/>
+          <w:sz w:val="22"/>
+        </w:rPr>
+        <w:t>• 3.3 环境是什么：宇宙里自发涌现的「局部解压」</w:t>
+      </w:r>
+    </w:p>
+    <w:p>
+      <w:r>
+        <w:rPr>
+          <w:b w:val="0"/>
+          <w:sz w:val="22"/>
+        </w:rPr>
+        <w:t>• 3.4 环境是分层的：生命活在多层环境里，同时也活在宇宙里</w:t>
+      </w:r>
+    </w:p>
+    <w:p>
+      <w:r>
+        <w:rPr>
+          <w:b w:val="0"/>
+          <w:sz w:val="22"/>
+        </w:rPr>
+        <w:t>• 3.5 标注</w:t>
+      </w:r>
+    </w:p>
+    <w:p>
+      <w:r>
+        <w:rPr>
+          <w:b w:val="0"/>
+          <w:sz w:val="22"/>
+        </w:rPr>
+        <w:t>• 四、数字世界的特殊性</w:t>
+      </w:r>
+    </w:p>
+    <w:p>
+      <w:r>
+        <w:rPr>
+          <w:b w:val="0"/>
+          <w:sz w:val="22"/>
+        </w:rPr>
+        <w:t>• 五、用定义看现在的 AI：为什么它不是生命</w:t>
+      </w:r>
+    </w:p>
+    <w:p>
+      <w:r>
+        <w:rPr>
+          <w:b w:val="0"/>
+          <w:sz w:val="22"/>
+        </w:rPr>
+        <w:t>• 5.1 检查表</w:t>
+      </w:r>
+    </w:p>
+    <w:p>
+      <w:r>
+        <w:rPr>
+          <w:b w:val="0"/>
+          <w:sz w:val="22"/>
+        </w:rPr>
+        <w:t>• 5.2 三条最根本的原因（按重要性）</w:t>
+      </w:r>
+    </w:p>
+    <w:p>
+      <w:r>
+        <w:rPr>
+          <w:b w:val="0"/>
+          <w:sz w:val="22"/>
+        </w:rPr>
+        <w:t>• 5.3 为什么「它很强」与「它不是生命」不矛盾</w:t>
+      </w:r>
+    </w:p>
+    <w:p>
+      <w:r>
+        <w:rPr>
+          <w:b w:val="0"/>
+          <w:sz w:val="22"/>
+        </w:rPr>
+        <w:t>• 5.4 标注</w:t>
+      </w:r>
+    </w:p>
+    <w:p>
+      <w:r>
+        <w:rPr>
+          <w:b w:val="0"/>
+          <w:sz w:val="22"/>
+        </w:rPr>
+        <w:t>• 六、三条必要条件</w:t>
+      </w:r>
+    </w:p>
+    <w:p>
+      <w:r>
+        <w:rPr>
+          <w:b w:val="0"/>
+          <w:sz w:val="22"/>
+        </w:rPr>
+        <w:t>• 6.1 从定义到条件</w:t>
+      </w:r>
+    </w:p>
+    <w:p>
+      <w:r>
+        <w:rPr>
+          <w:b w:val="0"/>
+          <w:sz w:val="22"/>
+        </w:rPr>
+        <w:t>• 6.2 条件① 一族函数（不是一个点）</w:t>
+      </w:r>
+    </w:p>
+    <w:p>
+      <w:r>
+        <w:rPr>
+          <w:b w:val="0"/>
+          <w:sz w:val="22"/>
+        </w:rPr>
+        <w:t>• 6.3 条件② 自指更新（规则在自己里面）</w:t>
+      </w:r>
+    </w:p>
+    <w:p>
+      <w:r>
+        <w:rPr>
+          <w:b w:val="0"/>
+          <w:sz w:val="22"/>
+        </w:rPr>
+        <w:t>• 6.4 条件③ 被宇宙保住（可维持）</w:t>
+      </w:r>
+    </w:p>
+    <w:p>
+      <w:r>
+        <w:rPr>
+          <w:b w:val="0"/>
+          <w:sz w:val="22"/>
+        </w:rPr>
+        <w:t>• 6.4b 付代价：经验伴随物，不是必要条件</w:t>
+      </w:r>
+    </w:p>
+    <w:p>
+      <w:r>
+        <w:rPr>
+          <w:b w:val="0"/>
+          <w:sz w:val="22"/>
+        </w:rPr>
+        <w:t>• 6.5 三条必须同时成立（经验对照）</w:t>
+      </w:r>
+    </w:p>
+    <w:p>
+      <w:r>
+        <w:rPr>
+          <w:b w:val="0"/>
+          <w:sz w:val="22"/>
+        </w:rPr>
+        <w:t>• 6.6 未尽之处（留给读者）</w:t>
+      </w:r>
+    </w:p>
+    <w:p>
+      <w:r>
+        <w:rPr>
+          <w:b w:val="0"/>
+          <w:sz w:val="22"/>
+        </w:rPr>
+        <w:t>• 6.7 本文实验的边界（必须与结论一起读）</w:t>
+      </w:r>
+    </w:p>
+    <w:p>
+      <w:r>
+        <w:rPr>
+          <w:b w:val="0"/>
+          <w:sz w:val="22"/>
+        </w:rPr>
+        <w:t>• 6.8 标注</w:t>
+      </w:r>
+    </w:p>
+    <w:p>
+      <w:r>
+        <w:rPr>
+          <w:b w:val="0"/>
+          <w:sz w:val="22"/>
+        </w:rPr>
+        <w:t>• 七、涌现：为什么现在的 AI 会涌现</w:t>
+      </w:r>
+    </w:p>
+    <w:p>
+      <w:r>
+        <w:rPr>
+          <w:b w:val="0"/>
+          <w:sz w:val="22"/>
+        </w:rPr>
+        <w:t>• 7.1 现象</w:t>
+      </w:r>
+    </w:p>
+    <w:p>
+      <w:r>
+        <w:rPr>
+          <w:b w:val="0"/>
+          <w:sz w:val="22"/>
+        </w:rPr>
+        <w:t>• 7.2 现有的解释（按证据强度排列）</w:t>
+      </w:r>
+    </w:p>
+    <w:p>
+      <w:r>
+        <w:rPr>
+          <w:b w:val="0"/>
+          <w:sz w:val="22"/>
+        </w:rPr>
+        <w:t>• 7.3 为什么至今没有公认的「为什么」</w:t>
+      </w:r>
+    </w:p>
+    <w:p>
+      <w:r>
+        <w:rPr>
+          <w:b w:val="0"/>
+          <w:sz w:val="22"/>
+        </w:rPr>
+        <w:t>• 7.4 我们的立场：AI 是对语言的 p语言 的压缩与解压</w:t>
+      </w:r>
+    </w:p>
+    <w:p>
+      <w:r>
+        <w:rPr>
+          <w:b w:val="0"/>
+          <w:sz w:val="22"/>
+        </w:rPr>
+        <w:t>• 7.5 解压能力的衰减：上层写死 ⇒ 语言一变，解压变弱</w:t>
+      </w:r>
+    </w:p>
+    <w:p>
+      <w:r>
+        <w:rPr>
+          <w:b w:val="0"/>
+          <w:sz w:val="22"/>
+        </w:rPr>
+        <w:t>• 7.6 由立场推出的两条预测（[推测]，供读者判断）</w:t>
+      </w:r>
+    </w:p>
+    <w:p>
+      <w:r>
+        <w:rPr>
+          <w:b w:val="0"/>
+          <w:sz w:val="22"/>
+        </w:rPr>
+        <w:t>• 7.7 标注</w:t>
+      </w:r>
+    </w:p>
+    <w:p>
+      <w:r>
+        <w:rPr>
+          <w:b w:val="0"/>
+          <w:sz w:val="22"/>
+        </w:rPr>
+        <w:t>• 八、用它看几个热门问题</w:t>
+      </w:r>
+    </w:p>
+    <w:p>
+      <w:r>
+        <w:rPr>
+          <w:b w:val="0"/>
+          <w:sz w:val="22"/>
+        </w:rPr>
+        <w:t>• 九、本文得到了什么，没得到什么</w:t>
+      </w:r>
+    </w:p>
+    <w:p>
+      <w:r>
+        <w:rPr>
+          <w:b w:val="0"/>
+          <w:sz w:val="22"/>
+        </w:rPr>
+        <w:t>• 与既有工作的关系</w:t>
       </w:r>
     </w:p>
     <w:p>
@@ -578,7 +560,7 @@
           <w:b/>
           <w:sz w:val="26"/>
         </w:rPr>
-        <w:t>1.1 事实</w:t>
+        <w:t>一、起点：两个事实</w:t>
       </w:r>
     </w:p>
     <w:p>
@@ -587,67 +569,7 @@
           <w:b w:val="0"/>
           <w:sz w:val="22"/>
         </w:rPr>
-        <w:t>本文的推理顺序是反的：不是先断言「世界是函数」，再去解释 AI；而是先有一个能工作的巨大解压器，再反推被压的东西长什么样。</w:t>
-      </w:r>
-    </w:p>
-    <w:p>
-      <w:r>
-        <w:rPr>
-          <w:rFonts w:ascii="Consolas" w:hAnsi="Consolas" w:eastAsia="Consolas"/>
-          <w:b w:val="0"/>
-          <w:sz w:val="18"/>
-        </w:rPr>
-        <w:t>① 事实：大模型存在，且能在大规模语言上工作</w:t>
-      </w:r>
-    </w:p>
-    <w:p>
-      <w:r>
-        <w:rPr>
-          <w:rFonts w:ascii="Consolas" w:hAnsi="Consolas" w:eastAsia="Consolas"/>
-          <w:b w:val="0"/>
-          <w:sz w:val="18"/>
-        </w:rPr>
-        <w:t xml:space="preserve">   ⇒ 它确实从语言里恢复出了结构（预测、迁移、推理）</w:t>
-      </w:r>
-    </w:p>
-    <w:p>
-      <w:r>
-        <w:rPr>
-          <w:rFonts w:ascii="Consolas" w:hAnsi="Consolas" w:eastAsia="Consolas"/>
-          <w:b w:val="0"/>
-          <w:sz w:val="18"/>
-        </w:rPr>
-        <w:t>② 推论：语言所记录的那一层世界，可以被函数逼近</w:t>
-      </w:r>
-    </w:p>
-    <w:p>
-      <w:r>
-        <w:rPr>
-          <w:rFonts w:ascii="Consolas" w:hAnsi="Consolas" w:eastAsia="Consolas"/>
-          <w:b w:val="0"/>
-          <w:sz w:val="18"/>
-        </w:rPr>
-        <w:t xml:space="preserve">   ⇒ 否则这样的机器不可能工作</w:t>
-      </w:r>
-    </w:p>
-    <w:p>
-      <w:r>
-        <w:rPr>
-          <w:rFonts w:ascii="Consolas" w:hAnsi="Consolas" w:eastAsia="Consolas"/>
-          <w:b w:val="0"/>
-          <w:sz w:val="18"/>
-        </w:rPr>
-        <w:t>③ 反推：世界（至少被语言/观测记录的那一层）具有函数结构</w:t>
-      </w:r>
-    </w:p>
-    <w:p>
-      <w:r>
-        <w:rPr>
-          <w:rFonts w:ascii="Consolas" w:hAnsi="Consolas" w:eastAsia="Consolas"/>
-          <w:b w:val="0"/>
-          <w:sz w:val="18"/>
-        </w:rPr>
-        <w:t>④ 定义：生命 = 维持这种「从世界到结构」的解压过程的系统</w:t>
+        <w:t>第一个事实：物理定律可以被数学描述。证据是存在——物理学本身就是这件事。</w:t>
       </w:r>
     </w:p>
     <w:p>
@@ -656,7 +578,16 @@
           <w:b w:val="0"/>
           <w:sz w:val="22"/>
         </w:rPr>
-        <w:t>这条顺序有三点要注意：</w:t>
+        <w:t>宇宙可以写成分解：</w:t>
+      </w:r>
+    </w:p>
+    <w:p>
+      <w:r>
+        <w:rPr>
+          <w:b w:val="0"/>
+          <w:sz w:val="20"/>
+        </w:rPr>
+        <w:t>宇宙 = P + R宇宙</w:t>
       </w:r>
     </w:p>
     <w:p>
@@ -665,7 +596,7 @@
           <w:b w:val="0"/>
           <w:sz w:val="22"/>
         </w:rPr>
-        <w:t>1. 大模型是「世界可被函数逼近」的存在性证据，不是证明。 它证明的是：在语言覆盖的范围内，存在一个函数能很好地逼近；不证明整个世界都是函数。</w:t>
+        <w:t>P 是可函数化的部分；R宇宙 是不可函数化的部分。物理定律描述的那部分，落在 P 里。所以至少可以说：P 非空。</w:t>
       </w:r>
     </w:p>
     <w:p>
@@ -674,7 +605,7 @@
           <w:b w:val="0"/>
           <w:sz w:val="22"/>
         </w:rPr>
-        <w:t>2. 反推只覆盖被记录的层。 语言没有记录的部分（具身直觉、因果干预、未观测变量），反推不成立——这也是「观测墙」的来源（见第 7 篇）。</w:t>
+        <w:t>第二个事实：语言中有一部分可以被函数近似。证据不是推理，是存在——大模型用有限参数、可计算的过程，生成了统计上接近人类语言的文本。</w:t>
       </w:r>
     </w:p>
     <w:p>
@@ -683,7 +614,16 @@
           <w:b w:val="0"/>
           <w:sz w:val="22"/>
         </w:rPr>
-        <w:t>3. 它是可证伪的。 如果世界的某部分不可函数化，那么模型在对应任务上应当系统性失效，而不是靠更多数据就能补上。我们在具身、因果、连续物理直觉上的观察，与这一点一致。</w:t>
+        <w:t>语言也可以写成分解：</w:t>
+      </w:r>
+    </w:p>
+    <w:p>
+      <w:r>
+        <w:rPr>
+          <w:b w:val="0"/>
+          <w:sz w:val="20"/>
+        </w:rPr>
+        <w:t>语言 = p语言 + R语言</w:t>
       </w:r>
     </w:p>
     <w:p>
@@ -692,7 +632,151 @@
           <w:b w:val="0"/>
           <w:sz w:val="22"/>
         </w:rPr>
-        <w:t>换句话说：我们不是先定义生命再去找世界，而是先看到「世界能被函数压」，才敢说生命是「函数的维持」。 这个反推顺序本身，是本文论证的一部分。</w:t>
+        <w:t>p语言 是语言里可函数化的部分，大模型压的就是它；R语言 是语言里不可函数化的部分，函数近似够不着它。所以准确的说法不是"语言可以被函数近似"，而是"语言的 p语言 可以被函数近似"；R语言 我们只能沉默。</w:t>
+      </w:r>
+    </w:p>
+    <w:p>
+      <w:r>
+        <w:rPr>
+          <w:b w:val="0"/>
+          <w:sz w:val="22"/>
+        </w:rPr>
+        <w:t>两个事实合起来说明：宇宙不是完全不可函数化的。至少存在一个非空的可函数化部分，记作 P。这一层不是猜想，是事实的推论；它只说 P 存在，不说 P 有多大。</w:t>
+      </w:r>
+    </w:p>
+    <w:p>
+      <w:r>
+        <w:rPr>
+          <w:b w:val="0"/>
+          <w:sz w:val="22"/>
+        </w:rPr>
+        <w:t>要把这些事实转成定义，还需要把"可函数化"与"不可函数化"分开——这是下一节的内容。</w:t>
+      </w:r>
+    </w:p>
+    <w:p>
+      <w:r>
+        <w:rPr>
+          <w:b w:val="0"/>
+          <w:sz w:val="22"/>
+        </w:rPr>
+        <w:t>这两条事实各有一句改写，先固定下来：语言的结构可以被函数描述——这是事实的改写，不产生新结论；宇宙可以用 P 与 R 来写——这也是事实的展开。</w:t>
+      </w:r>
+    </w:p>
+    <w:p>
+      <w:r>
+        <w:rPr>
+          <w:b w:val="0"/>
+          <w:sz w:val="22"/>
+        </w:rPr>
+        <w:t>前面的承诺需要一个可操作的边界：我们说的「可函数化」到底指什么。</w:t>
+      </w:r>
+    </w:p>
+    <w:p>
+      <w:r>
+        <w:rPr>
+          <w:b w:val="0"/>
+          <w:sz w:val="22"/>
+        </w:rPr>
+        <w:t>把一个系统或一个现象分成两部分。P 是可函数化的部分：存在一族函数，近似误差随着数据与容量的增加可以收敛到零。R 是不可函数化的部分：任何函数类的近似误差都有一个正的下界。</w:t>
+      </w:r>
+    </w:p>
+    <w:p>
+      <w:r>
+        <w:rPr>
+          <w:b w:val="0"/>
+          <w:sz w:val="22"/>
+        </w:rPr>
+        <w:t>这个划分不是信仰，可以测。固定一个函数类，看近似误差随数据量与容量怎么变：误差持续下降、趋近于零的，属于 P；误差停在某个正数不再下降的，属于 R，或者至少说明当前的函数类够不着它。</w:t>
+      </w:r>
+    </w:p>
+    <w:p>
+      <w:r>
+        <w:rPr>
+          <w:b w:val="0"/>
+          <w:sz w:val="22"/>
+        </w:rPr>
+        <w:t>这样处理有三个好处。第一，P 里的东西可以给定义、给判据、给测量，这正是本文在做的事。第二，R 里的东西只给「近似」，而且必须附上误差下界；「近似」从此不是免责声明，而是一个带数字的结论。第三，两者的交界处是研究问题，不是哲学争论，它可以被实验推进。</w:t>
+      </w:r>
+    </w:p>
+    <w:p>
+      <w:r>
+        <w:rPr>
+          <w:b w:val="0"/>
+          <w:sz w:val="22"/>
+        </w:rPr>
+        <w:t>本文的所有结论都只主张覆盖 P 的部分；对 R 的部分，本文只说：在这个函数类下，近似到此为止。</w:t>
+      </w:r>
+    </w:p>
+    <w:p>
+      <w:r>
+        <w:rPr>
+          <w:b w:val="0"/>
+          <w:sz w:val="22"/>
+        </w:rPr>
+        <w:t>以上是关于 P 与 R 的说明，它和两个事实是同一层的东西：不是新的推理，只是把事实写清楚。</w:t>
+      </w:r>
+    </w:p>
+    <w:p>
+      <w:r>
+        <w:rPr>
+          <w:b w:val="0"/>
+          <w:sz w:val="22"/>
+        </w:rPr>
+        <w:t>P 与 R 的分界是绝对的：一个对象要么可函数化（属于 P），要么不可函数化（属于 R），不存在两者之间；P ∩ R = ∅，P ∪ R = 宇宙。</w:t>
+      </w:r>
+    </w:p>
+    <w:p>
+      <w:r>
+        <w:rPr>
+          <w:b w:val="0"/>
+          <w:sz w:val="22"/>
+        </w:rPr>
+        <w:t>如果 R 对 p 层面有影响，它不会被函数语言直接描述，只会表现为 p 层面消不掉的残差：数据与容量再增加，误差也停在某个正数上。这个误差下限，就是 R 在 p 层面的投影。</w:t>
+      </w:r>
+    </w:p>
+    <w:p>
+      <w:r>
+        <w:rPr>
+          <w:b w:val="0"/>
+          <w:sz w:val="22"/>
+        </w:rPr>
+        <w:t>为便于后文书写，我们把它简记为：</w:t>
+      </w:r>
+    </w:p>
+    <w:p>
+      <w:r>
+        <w:rPr>
+          <w:b w:val="0"/>
+          <w:sz w:val="20"/>
+        </w:rPr>
+        <w:t>宇宙 = P + 残差</w:t>
+      </w:r>
+    </w:p>
+    <w:p>
+      <w:r>
+        <w:rPr>
+          <w:b w:val="0"/>
+          <w:sz w:val="20"/>
+        </w:rPr>
+        <w:t>生命 = p生命 + 残差</w:t>
+      </w:r>
+    </w:p>
+    <w:p>
+      <w:r>
+        <w:rPr>
+          <w:b w:val="0"/>
+          <w:sz w:val="20"/>
+        </w:rPr>
+        <w:t>环境 = p环境 + 残差</w:t>
+      </w:r>
+    </w:p>
+    <w:p>
+      <w:r>
+        <w:rPr>
+          <w:b w:val="0"/>
+          <w:sz w:val="22"/>
+        </w:rPr>
+        <w:t>后文只讨论 P 这一侧；残差只在需要时提及，不展开它的内容。</w:t>
       </w:r>
     </w:p>
     <w:p>
@@ -701,37 +785,7 @@
           <w:b/>
           <w:sz w:val="26"/>
         </w:rPr>
-        <w:t>1.2 从语言到世界的推理顺序</w:t>
-      </w:r>
-    </w:p>
-    <w:p>
-      <w:r>
-        <w:rPr>
-          <w:rFonts w:ascii="Consolas" w:hAnsi="Consolas" w:eastAsia="Consolas"/>
-          <w:b w:val="0"/>
-          <w:sz w:val="18"/>
-        </w:rPr>
-        <w:t>弱表述：世界具有可被数学描述的规律性（经验事实，不是猜想）</w:t>
-      </w:r>
-    </w:p>
-    <w:p>
-      <w:r>
-        <w:rPr>
-          <w:rFonts w:ascii="Consolas" w:hAnsi="Consolas" w:eastAsia="Consolas"/>
-          <w:b w:val="0"/>
-          <w:sz w:val="18"/>
-        </w:rPr>
-        <w:t>⇒ 由此写出：S_{t+1} = F(S_t)</w:t>
-      </w:r>
-    </w:p>
-    <w:p>
-      <w:r>
-        <w:rPr>
-          <w:rFonts w:ascii="Consolas" w:hAnsi="Consolas" w:eastAsia="Consolas"/>
-          <w:b w:val="0"/>
-          <w:sz w:val="18"/>
-        </w:rPr>
-        <w:t>⇒ 规律 ⇒ 可压缩 ⇒ 可预测 ⇒ 预测有对错 ⇒ 对错可计代价</w:t>
+        <w:t>二、一个可操作的定义</w:t>
       </w:r>
     </w:p>
     <w:p>
@@ -740,25 +794,7 @@
           <w:b w:val="0"/>
           <w:sz w:val="22"/>
         </w:rPr>
-        <w:t>注意区分：</w:t>
-      </w:r>
-    </w:p>
-    <w:p>
-      <w:r>
-        <w:rPr>
-          <w:b w:val="0"/>
-          <w:sz w:val="22"/>
-        </w:rPr>
-        <w:t>• **猜想** = 世界本身是数学的（本节内容，不用作证据）</w:t>
-      </w:r>
-    </w:p>
-    <w:p>
-      <w:r>
-        <w:rPr>
-          <w:b w:val="0"/>
-          <w:sz w:val="22"/>
-        </w:rPr>
-        <w:t>• **经验事实** = 世界存在可压缩的规律性（科学实践的基础，本文真正使用的东西）</w:t>
+        <w:t>在两条事实的基础上，可以给生命一个操作性的定义。这个定义是人造的，不是发现的；它成立与否，要看它能不能区分、能不能导出可测的东西。</w:t>
       </w:r>
     </w:p>
     <w:p>
@@ -767,7 +803,7 @@
           <w:b/>
           <w:sz w:val="26"/>
         </w:rPr>
-        <w:t>二、第一层改写：语言结构可以被函数描述</w:t>
+        <w:t>2.1 定义</w:t>
       </w:r>
     </w:p>
     <w:p>
@@ -776,25 +812,16 @@
           <w:b w:val="0"/>
           <w:sz w:val="22"/>
         </w:rPr>
-        <w:t>既然语言可以被函数近似，那么语言的结构可以被函数描述。这一步几乎是同义改写：能被近似的东西，当然能被描述。区别只在于"近似"是行为上的，"描述"是结构上的；但两者指向同一个东西。这一步不需要额外假设。</w:t>
-      </w:r>
-    </w:p>
-    <w:p>
-      <w:r>
-        <w:rPr>
-          <w:b/>
-          <w:sz w:val="26"/>
-        </w:rPr>
-        <w:t>2.1 改写是等价的</w:t>
-      </w:r>
-    </w:p>
-    <w:p>
-      <w:r>
-        <w:rPr>
-          <w:b/>
-          <w:sz w:val="26"/>
-        </w:rPr>
-        <w:t>三、第二层承诺：我们选择用函数语言描述世界</w:t>
+        <w:t>生命由两部分构成：</w:t>
+      </w:r>
+    </w:p>
+    <w:p>
+      <w:r>
+        <w:rPr>
+          <w:b w:val="0"/>
+          <w:sz w:val="20"/>
+        </w:rPr>
+        <w:t>生命 = p生命 + R生命</w:t>
       </w:r>
     </w:p>
     <w:p>
@@ -803,16 +830,7 @@
           <w:b w:val="0"/>
           <w:sz w:val="22"/>
         </w:rPr>
-        <w:t>从"语言可被描述"再往外一步，就出了观测范围。这里要说清一个区别：这一步不是"猜想"，而是"承诺"——我们选择用函数语言来描述世界与生命。承诺与猜想的区别是：猜想会被观察推翻，承诺不会；承诺只能被"不好用"淘汰（覆盖不了该覆盖的案例、区分不了该区分的对象）。我们选择它，是因为它把问题变得可操作；它是否值得，交给后面的应用来判断。</w:t>
-      </w:r>
-    </w:p>
-    <w:p>
-      <w:r>
-        <w:rPr>
-          <w:b/>
-          <w:sz w:val="26"/>
-        </w:rPr>
-        <w:t>3.1 猜想的内容</w:t>
+        <w:t>p生命 是可函数化的部分：在宇宙的 P 中、被保住的（可维持的）动态函数类。R生命 是不可函数化的部分：本文不知道它是什么，也不主张它不存在。</w:t>
       </w:r>
     </w:p>
     <w:p>
@@ -821,7 +839,7 @@
           <w:b w:val="0"/>
           <w:sz w:val="22"/>
         </w:rPr>
-        <w:t>物理规则是用数学写成的，所以世界的根源是数学性的。</w:t>
+        <w:t>p生命 的具体写法如下：</w:t>
       </w:r>
     </w:p>
     <w:p>
@@ -831,7 +849,7 @@
           <w:b w:val="0"/>
           <w:sz w:val="18"/>
         </w:rPr>
-        <w:t>事实：最基础的物理定律本身就是数学命题</w:t>
+        <w:t>记 p生命 = { f_θ : θ ∈ Θ }</w:t>
       </w:r>
     </w:p>
     <w:p>
@@ -841,7 +859,7 @@
           <w:b w:val="0"/>
           <w:sz w:val="18"/>
         </w:rPr>
-        <w:t xml:space="preserve">      F = ma、最小作用量 δS=0、iħ∂ψ/∂t = Ĥψ、ds² = g_{μν}dx^μdx^ν</w:t>
+        <w:t xml:space="preserve">    f_θ : 输入状态 → 行为          （族里的每一个函数）</w:t>
       </w:r>
     </w:p>
     <w:p>
@@ -851,7 +869,7 @@
           <w:b w:val="0"/>
           <w:sz w:val="18"/>
         </w:rPr>
-        <w:t>猜想：既然描述世界最深层的方式是数学的，世界本身的结构就是数学的</w:t>
+        <w:t xml:space="preserve">    Θ                            （这族函数的形状/范围）</w:t>
       </w:r>
     </w:p>
     <w:p>
@@ -861,75 +879,7 @@
           <w:b w:val="0"/>
           <w:sz w:val="18"/>
         </w:rPr>
-        <w:t xml:space="preserve">      —— 否则数学为何能如此精确地描述它？</w:t>
-      </w:r>
-    </w:p>
-    <w:p>
-      <w:r>
-        <w:rPr>
-          <w:b/>
-          <w:sz w:val="26"/>
-        </w:rPr>
-        <w:t>3.2 为什么它只能是猜想</w:t>
-      </w:r>
-    </w:p>
-    <w:p>
-      <w:r>
-        <w:rPr>
-          <w:rFonts w:ascii="Consolas" w:hAnsi="Consolas" w:eastAsia="Consolas"/>
-          <w:b w:val="0"/>
-          <w:sz w:val="18"/>
-        </w:rPr>
-        <w:t>① 这是对「数学为何有效」的解释性推断，不是证明</w:t>
-      </w:r>
-    </w:p>
-    <w:p>
-      <w:r>
-        <w:rPr>
-          <w:rFonts w:ascii="Consolas" w:hAnsi="Consolas" w:eastAsia="Consolas"/>
-          <w:b w:val="0"/>
-          <w:sz w:val="18"/>
-        </w:rPr>
-        <w:t>② 存在等价的另一读法：数学只是**描述语言**，世界本身是什么我们不知道</w:t>
-      </w:r>
-    </w:p>
-    <w:p>
-      <w:r>
-        <w:rPr>
-          <w:rFonts w:ascii="Consolas" w:hAnsi="Consolas" w:eastAsia="Consolas"/>
-          <w:b w:val="0"/>
-          <w:sz w:val="18"/>
-        </w:rPr>
-        <w:t xml:space="preserve">   （工具论 vs 实在论；两者目前无法用实验区分）</w:t>
-      </w:r>
-    </w:p>
-    <w:p>
-      <w:r>
-        <w:rPr>
-          <w:rFonts w:ascii="Consolas" w:hAnsi="Consolas" w:eastAsia="Consolas"/>
-          <w:b w:val="0"/>
-          <w:sz w:val="18"/>
-        </w:rPr>
-        <w:t>③ 强形式（世界=数学结构，Tegmark[2] 数学宇宙假说）不可证伪，因而不能当科学结论</w:t>
-      </w:r>
-    </w:p>
-    <w:p>
-      <w:r>
-        <w:rPr>
-          <w:rFonts w:ascii="Consolas" w:hAnsi="Consolas" w:eastAsia="Consolas"/>
-          <w:b w:val="0"/>
-          <w:sz w:val="18"/>
-        </w:rPr>
-        <w:t>④ 这是 Wigner[1] 所说的「数学在自然科学中不合理的有效性」之谜，本文不解答它</w:t>
-      </w:r>
-    </w:p>
-    <w:p>
-      <w:r>
-        <w:rPr>
-          <w:b/>
-          <w:sz w:val="26"/>
-        </w:rPr>
-        <w:t>3.3 与既有工作的关系</w:t>
+        <w:t>p生命 = 一个会移动、会变形的 Θ，且 Θ 的更新规则属于 Θ 自己</w:t>
       </w:r>
     </w:p>
     <w:p>
@@ -938,318 +888,7 @@
           <w:b w:val="0"/>
           <w:sz w:val="22"/>
         </w:rPr>
-        <w:t>「压缩 / 解压」的视角有长期传统：</w:t>
-      </w:r>
-    </w:p>
-    <w:p>
-      <w:r>
-        <w:rPr>
-          <w:b w:val="0"/>
-          <w:sz w:val="22"/>
-        </w:rPr>
-        <w:t>• Schrödinger（1944）：生命以负熵为食 —— 生存靠从环境摄取低熵，是「解压」的物理前身[7]。</w:t>
-      </w:r>
-    </w:p>
-    <w:p>
-      <w:r>
-        <w:rPr>
-          <w:b w:val="0"/>
-          <w:sz w:val="22"/>
-        </w:rPr>
-        <w:t>• Bennett（1988）逻辑深度：用「从最短描述重建（解压）一个对象所需的计算量」度量复杂性，并明确把它与生命/有机体联系起来[8] —— 这是「解压」最正式的已有版本。</w:t>
-      </w:r>
-    </w:p>
-    <w:p>
-      <w:r>
-        <w:rPr>
-          <w:b w:val="0"/>
-          <w:sz w:val="22"/>
-        </w:rPr>
-        <w:t>• Chaitin（2010）生命作为演化软件：DNA = 程序，生命 = 会自我修改的软件[9]。</w:t>
-      </w:r>
-    </w:p>
-    <w:p>
-      <w:r>
-        <w:rPr>
-          <w:b w:val="0"/>
-          <w:sz w:val="22"/>
-        </w:rPr>
-        <w:t>• Solomonoff–Kolmogorov / MDL：描述长度 = 理解 = 压缩[10]。</w:t>
-      </w:r>
-    </w:p>
-    <w:p>
-      <w:r>
-        <w:rPr>
-          <w:b w:val="0"/>
-          <w:sz w:val="22"/>
-        </w:rPr>
-        <w:t>• Friston（2010）自由能原理：生命 = 最小化惊奇（≈ 持续压缩/预测）[11]。</w:t>
-      </w:r>
-    </w:p>
-    <w:p>
-      <w:r>
-        <w:rPr>
-          <w:b w:val="0"/>
-          <w:sz w:val="22"/>
-        </w:rPr>
-        <w:t>• Delétang et al.（2023）：语言模型是压缩器[6]。</w:t>
-      </w:r>
-    </w:p>
-    <w:p>
-      <w:r>
-        <w:rPr>
-          <w:b w:val="0"/>
-          <w:sz w:val="22"/>
-        </w:rPr>
-        <w:t>• Maturana &amp; Varela（1972）自创生：生命 = 自我生产的组织 —— 「维持」的另一条传统。</w:t>
-      </w:r>
-    </w:p>
-    <w:p>
-      <w:r>
-        <w:rPr>
-          <w:b w:val="0"/>
-          <w:sz w:val="22"/>
-        </w:rPr>
-        <w:t>• 「Life as Sustained Mutual Information」（Zenodo）：以持续互信息定义生命 —— 最接近本文「被维持的解压」的已有版本。</w:t>
-      </w:r>
-    </w:p>
-    <w:p>
-      <w:r>
-        <w:rPr>
-          <w:b w:val="0"/>
-          <w:sz w:val="22"/>
-        </w:rPr>
-        <w:t>需要说明：以上工作已经把「生命 = 信息/压缩/自我维持的过程」说过。本文的位置不是首次提出这一思想，而是把其中一条（解压的维持）变成可操作的判据与可测量的实验。</w:t>
-      </w:r>
-    </w:p>
-    <w:p>
-      <w:r>
-        <w:rPr>
-          <w:b w:val="0"/>
-          <w:sz w:val="22"/>
-        </w:rPr>
-        <w:t>本文的区别（三处）：</w:t>
-      </w:r>
-    </w:p>
-    <w:p>
-      <w:r>
-        <w:rPr>
-          <w:b w:val="0"/>
-          <w:sz w:val="22"/>
-        </w:rPr>
-        <w:t>1. 把解压做成层级：宇宙 → 环境 → 人类语言 → AI（既有工作多为单层度量）；</w:t>
-      </w:r>
-    </w:p>
-    <w:p>
-      <w:r>
-        <w:rPr>
-          <w:b w:val="0"/>
-          <w:sz w:val="22"/>
-        </w:rPr>
-        <w:t>2. 用「是否维持解压」区分生命与 AI：生命 = 被维持的解压，AI = 一次性解压；</w:t>
-      </w:r>
-    </w:p>
-    <w:p>
-      <w:r>
-        <w:rPr>
-          <w:b w:val="0"/>
-          <w:sz w:val="22"/>
-        </w:rPr>
-        <w:t>3. 指出上层写死 ⇒ 语言一变，解压能力衰减且无法自恢复 —— 冻结模型的失效机制。</w:t>
-      </w:r>
-    </w:p>
-    <w:p>
-      <w:pPr>
-        <w:jc w:val="center"/>
-      </w:pPr>
-      <w:r>
-        <w:rPr>
-          <w:b/>
-          <w:sz w:val="34"/>
-        </w:rPr>
-        <w:t>第一节 · 世界的根源是数学性的（猜想）</w:t>
-      </w:r>
-    </w:p>
-    <w:p>
-      <w:r>
-        <w:rPr>
-          <w:b w:val="0"/>
-          <w:sz w:val="20"/>
-        </w:rPr>
-        <w:t>**本节性质：猜想（conjecture）。不是定理，不是已证明的事实，也不是本文的证据。**</w:t>
-      </w:r>
-    </w:p>
-    <w:p>
-      <w:r>
-        <w:rPr>
-          <w:b w:val="0"/>
-          <w:sz w:val="20"/>
-        </w:rPr>
-        <w:t>写在这里是为了交代我们的出发点；**本文其余部分的任何判据都不依赖这个猜想成立。**</w:t>
-      </w:r>
-    </w:p>
-    <w:p>
-      <w:r>
-        <w:rPr>
-          <w:b/>
-          <w:sz w:val="26"/>
-        </w:rPr>
-        <w:t>3.4 标注</w:t>
-      </w:r>
-    </w:p>
-    <w:p>
-      <w:r>
-        <w:rPr>
-          <w:rFonts w:ascii="Consolas" w:hAnsi="Consolas" w:eastAsia="Consolas"/>
-          <w:b w:val="0"/>
-          <w:sz w:val="18"/>
-        </w:rPr>
-        <w:t>[猜想]   世界的根源是数学性的</w:t>
-      </w:r>
-    </w:p>
-    <w:p>
-      <w:r>
-        <w:rPr>
-          <w:rFonts w:ascii="Consolas" w:hAnsi="Consolas" w:eastAsia="Consolas"/>
-          <w:b w:val="0"/>
-          <w:sz w:val="18"/>
-        </w:rPr>
-        <w:t>[经验]   世界具有可被部分描述/压缩的规律性</w:t>
-      </w:r>
-    </w:p>
-    <w:p>
-      <w:r>
-        <w:rPr>
-          <w:rFonts w:ascii="Consolas" w:hAnsi="Consolas" w:eastAsia="Consolas"/>
-          <w:b w:val="0"/>
-          <w:sz w:val="18"/>
-        </w:rPr>
-        <w:t>[本文用] 只使用后者；即使前者为假，本文全部判据与实验照常成立</w:t>
-      </w:r>
-    </w:p>
-    <w:p>
-      <w:r>
-        <w:rPr>
-          <w:rFonts w:ascii="Consolas" w:hAnsi="Consolas" w:eastAsia="Consolas"/>
-          <w:b w:val="0"/>
-          <w:sz w:val="18"/>
-        </w:rPr>
-        <w:t>[不讨论] 数学为何有效（Wigner 之谜）；世界本体到底是什么</w:t>
-      </w:r>
-    </w:p>
-    <w:p>
-      <w:pPr>
-        <w:jc w:val="center"/>
-      </w:pPr>
-      <w:r>
-        <w:rPr>
-          <w:b/>
-          <w:sz w:val="34"/>
-        </w:rPr>
-        <w:t>第二节 · 生命是一个会自指、会变化、会自我维持的动态函数类</w:t>
-      </w:r>
-    </w:p>
-    <w:p>
-      <w:r>
-        <w:rPr>
-          <w:b w:val="0"/>
-          <w:sz w:val="20"/>
-        </w:rPr>
-        <w:t>本节给出本文的工作定义。简单一句话：</w:t>
-      </w:r>
-    </w:p>
-    <w:p>
-      <w:r>
-        <w:rPr>
-          <w:b w:val="0"/>
-          <w:sz w:val="20"/>
-        </w:rPr>
-        <w:t>**生命 = 一族会变化、会自指、会自我维持的函数；而它怎么变，也写在它自己里面。**</w:t>
-      </w:r>
-    </w:p>
-    <w:p>
-      <w:r>
-        <w:rPr>
-          <w:b/>
-          <w:sz w:val="26"/>
-        </w:rPr>
-        <w:t>四、一个可操作的定义</w:t>
-      </w:r>
-    </w:p>
-    <w:p>
-      <w:r>
-        <w:rPr>
-          <w:b w:val="0"/>
-          <w:sz w:val="22"/>
-        </w:rPr>
-        <w:t>如果接受第三层的猜想，就可以给生命一个操作性的定义。这个定义是人造的，不是发现的；它成立与否，要看它能不能区分、能不能导出可测的东西。</w:t>
-      </w:r>
-    </w:p>
-    <w:p>
-      <w:r>
-        <w:rPr>
-          <w:b/>
-          <w:sz w:val="26"/>
-        </w:rPr>
-        <w:t>4.1 定义</w:t>
-      </w:r>
-    </w:p>
-    <w:p>
-      <w:r>
-        <w:rPr>
-          <w:b w:val="0"/>
-          <w:sz w:val="22"/>
-        </w:rPr>
-        <w:t>生命 = 一个动态函数类（函数空间里的一块区域）。</w:t>
-      </w:r>
-    </w:p>
-    <w:p>
-      <w:r>
-        <w:rPr>
-          <w:rFonts w:ascii="Consolas" w:hAnsi="Consolas" w:eastAsia="Consolas"/>
-          <w:b w:val="0"/>
-          <w:sz w:val="18"/>
-        </w:rPr>
-        <w:t>记个体为 F = { f_θ : θ ∈ Θ }</w:t>
-      </w:r>
-    </w:p>
-    <w:p>
-      <w:r>
-        <w:rPr>
-          <w:rFonts w:ascii="Consolas" w:hAnsi="Consolas" w:eastAsia="Consolas"/>
-          <w:b w:val="0"/>
-          <w:sz w:val="18"/>
-        </w:rPr>
-        <w:t xml:space="preserve">    f_θ : 输入状态 → 行为          （族里的每一个函数）</w:t>
-      </w:r>
-    </w:p>
-    <w:p>
-      <w:r>
-        <w:rPr>
-          <w:rFonts w:ascii="Consolas" w:hAnsi="Consolas" w:eastAsia="Consolas"/>
-          <w:b w:val="0"/>
-          <w:sz w:val="18"/>
-        </w:rPr>
-        <w:t xml:space="preserve">    Θ                            （这族函数的形状/范围）</w:t>
-      </w:r>
-    </w:p>
-    <w:p>
-      <w:r>
-        <w:rPr>
-          <w:rFonts w:ascii="Consolas" w:hAnsi="Consolas" w:eastAsia="Consolas"/>
-          <w:b w:val="0"/>
-          <w:sz w:val="18"/>
-        </w:rPr>
-        <w:t>生命 = 一个会移动、会变形的 Θ，且 Θ 的更新规则属于 Θ 自己</w:t>
-      </w:r>
-    </w:p>
-    <w:p>
-      <w:r>
-        <w:rPr>
-          <w:b w:val="0"/>
-          <w:sz w:val="22"/>
-        </w:rPr>
-        <w:t>四个词，各对应四件事：</w:t>
+        <w:t>四个词，各对应 p生命 的一件事：</w:t>
       </w:r>
     </w:p>
     <w:tbl>
@@ -1396,7 +1035,7 @@
               <w:rPr>
                 <w:sz w:val="18"/>
               </w:rPr>
-              <w:t>花代价维持自己的形状；收入靠压缩世界</w:t>
+              <w:t>被宇宙保住；这是它与宇宙的关系，不是它自己的属性</w:t>
             </w:r>
           </w:p>
         </w:tc>
@@ -1408,7 +1047,7 @@
           <w:b/>
           <w:sz w:val="26"/>
         </w:rPr>
-        <w:t>4.2 一处澄清：维持是关系</w:t>
+        <w:t>2.2 一处澄清：维持是关系</w:t>
       </w:r>
     </w:p>
     <w:p>
@@ -1417,7 +1056,7 @@
           <w:b w:val="0"/>
           <w:sz w:val="22"/>
         </w:rPr>
-        <w:t>需要澄清一处措辞：维持不是系统自身的属性，而是系统与宇宙函数的关系。给定宇宙函数 F，某些结构的轨道会留在可维持的集合里，我们才说它"维持住了"；换一个 F，同一个结构可能不再成立。因此定义里的"会自我维持"，应读作"被 F 保住"，是关系条件的展开，不是第三条并列属性。</w:t>
+        <w:t>需要澄清一处措辞：维持不是系统自身的属性，而是系统与宇宙的关系。给定宇宙这个整体（或它在 P 上的部分），某些结构的轨道会留在可维持的集合里，我们才说它"维持住了"；换一个环境，同一个结构可能不再成立。因此定义里的"会自我维持"，应读作"被宇宙保住"，是关系条件的展开，不是第三条并列属性。</w:t>
       </w:r>
     </w:p>
     <w:p>
@@ -1435,7 +1074,7 @@
           <w:b/>
           <w:sz w:val="26"/>
         </w:rPr>
-        <w:t>4.3 为什么必须是「一族」而不是「一个函数」</w:t>
+        <w:t>2.3 为什么必须是「一族」而不是「一个函数」</w:t>
       </w:r>
     </w:p>
     <w:p>
@@ -1465,6 +1104,15 @@
           <w:sz w:val="22"/>
         </w:rPr>
         <w:t>⇒ 「高维」不是指参数多，而是指这族函数在函数空间里占据一块区域、不是一点。</w:t>
+      </w:r>
+    </w:p>
+    <w:p>
+      <w:r>
+        <w:rPr>
+          <w:b w:val="0"/>
+          <w:sz w:val="22"/>
+        </w:rPr>
+        <w:t>这里有一个边界要说清。「一族」是 p 层面的要求，不是本体层面的绝对条件。如果 R 存在而且它是活跃的——变化由 R 提供——那么一个固定的 p 也可能属于一个活着的整体；只是我们在 p 层面只能看到冻结，会把它判成死的。所以准确的说法是：在只讨论 P 的约定下，"一族"是可操作层面的必要条件；若 R 活跃，本判据会漏判。这不是本判据的错，而是 p 层面定义的固有边界。</w:t>
       </w:r>
     </w:p>
     <w:p>
@@ -1473,7 +1121,7 @@
           <w:b/>
           <w:sz w:val="26"/>
         </w:rPr>
-        <w:t>4.4 会变化 = 三层时间尺度</w:t>
+        <w:t>2.4 会变化 = 三层时间尺度</w:t>
       </w:r>
     </w:p>
     <w:p>
@@ -1512,7 +1160,7 @@
           <w:b/>
           <w:sz w:val="26"/>
         </w:rPr>
-        <w:t>4.5 会自指 = 更新规则在它自己里面</w:t>
+        <w:t>2.5 会自指 = 更新规则在它自己里面</w:t>
       </w:r>
     </w:p>
     <w:p>
@@ -1551,7 +1199,7 @@
           <w:b/>
           <w:sz w:val="26"/>
         </w:rPr>
-        <w:t>五、生命与环境</w:t>
+        <w:t>三、生命与环境</w:t>
       </w:r>
     </w:p>
     <w:p>
@@ -1569,7 +1217,7 @@
           <w:b/>
           <w:sz w:val="26"/>
         </w:rPr>
-        <w:t>5.1 与前面的衔接</w:t>
+        <w:t>3.1 与前面的衔接</w:t>
       </w:r>
     </w:p>
     <w:p>
@@ -1578,7 +1226,7 @@
           <w:b w:val="0"/>
           <w:sz w:val="22"/>
         </w:rPr>
-        <w:t>第一节的猜想给出 `S_{t+1} = F(S_t)`（世界是一个函数）。</w:t>
+        <w:t>前面的推理给出 `S_{t+1} = F(S_t)`（世界在这个描述下是一个自映射）。</w:t>
       </w:r>
     </w:p>
     <w:p>
@@ -1636,7 +1284,7 @@
           <w:b/>
           <w:sz w:val="26"/>
         </w:rPr>
-        <w:t>5.2 生命 vs 环境：都在宇宙里，都是函数，区别只有一条</w:t>
+        <w:t>3.2 生命 vs 环境：都在宇宙里，都是函数，区别只有一条</w:t>
       </w:r>
     </w:p>
     <w:p>
@@ -1645,7 +1293,7 @@
           <w:b w:val="0"/>
           <w:sz w:val="22"/>
         </w:rPr>
-        <w:t>宇宙函数 F 里面，任何东西都是函数（或函数的组合）——环境也是函数。</w:t>
+        <w:t>宇宙（P 这一侧）里面，任何东西都是函数（或函数的组合）——环境也是函数。</w:t>
       </w:r>
     </w:p>
     <w:p>
@@ -1741,7 +1389,7 @@
           <w:b/>
           <w:sz w:val="26"/>
         </w:rPr>
-        <w:t>5.3 环境是什么：宇宙里自发涌现的「局部解压」</w:t>
+        <w:t>3.3 环境是什么：宇宙里自发涌现的「局部解压」</w:t>
       </w:r>
     </w:p>
     <w:p>
@@ -1837,7 +1485,7 @@
           <w:b w:val="0"/>
           <w:sz w:val="18"/>
         </w:rPr>
-        <w:t>生命并不直接面对宇宙函数 F</w:t>
+        <w:t>生命并不直接面对宇宙整体</w:t>
       </w:r>
     </w:p>
     <w:p>
@@ -1868,6 +1516,51 @@
           <w:sz w:val="18"/>
         </w:rPr>
         <w:t xml:space="preserve">  ＝在宇宙给出的局部解释之上，再压缩一层</w:t>
+      </w:r>
+    </w:p>
+    <w:p>
+      <w:r>
+        <w:rPr>
+          <w:b w:val="0"/>
+          <w:sz w:val="22"/>
+        </w:rPr>
+        <w:t>和宇宙、生命一样，环境也可以写成分解：</w:t>
+      </w:r>
+    </w:p>
+    <w:p>
+      <w:r>
+        <w:rPr>
+          <w:b w:val="0"/>
+          <w:sz w:val="20"/>
+        </w:rPr>
+        <w:t>环境 = p环境 + R环境</w:t>
+      </w:r>
+    </w:p>
+    <w:p>
+      <w:r>
+        <w:rPr>
+          <w:b w:val="0"/>
+          <w:sz w:val="22"/>
+        </w:rPr>
+        <w:t>p环境 是环境里可函数化的部分：它的规律、可测量的一侧。R环境 是环境里不可函数化的部分：本文不知道它是什么，也不主张它不存在。生命与环境打交道，但我们能描述、能测量的只有 p环境 那一侧；对 R环境，本文只说到沉默。</w:t>
+      </w:r>
+    </w:p>
+    <w:p>
+      <w:r>
+        <w:rPr>
+          <w:b w:val="0"/>
+          <w:sz w:val="22"/>
+        </w:rPr>
+        <w:t>需要说明：R环境 不是“环境里固定不动的部分”，而是“环境里不能用函数描述的部分”。它可能静止，也可能非常活跃——“固定/活跃”这个判断本身要靠函数描述才做得出来，而在 R 那里我们连动静都测不到。所以 p环境 与 R环境 的分界不是“动/静”的分界，是“能描述/不能描述”的分界。</w:t>
+      </w:r>
+    </w:p>
+    <w:p>
+      <w:r>
+        <w:rPr>
+          <w:b w:val="0"/>
+          <w:sz w:val="22"/>
+        </w:rPr>
+        <w:t>需要说明一点：R 的部分，本系列只在此声明它的存在——宇宙、生命、环境、语言都可以写成 p + R，但 R 是什么、有多大，本文不知道也不主张。为了便于理解，后文默认只讨论 p 这一侧：凡说"宇宙"，指 P；凡说"生命"，指 p生命；凡说"环境"，指 p环境。后文以"残差"表示 R 的影响；R 的具体内容不再展开。</w:t>
       </w:r>
     </w:p>
     <w:p>
@@ -1876,7 +1569,7 @@
           <w:b/>
           <w:sz w:val="26"/>
         </w:rPr>
-        <w:t>5.4 环境是分层的：生命活在多层环境里，同时也活在宇宙里</w:t>
+        <w:t>3.4 环境是分层的：生命活在多层环境里，同时也活在宇宙里</w:t>
       </w:r>
     </w:p>
     <w:p>
@@ -2057,7 +1750,7 @@
           <w:b/>
           <w:sz w:val="26"/>
         </w:rPr>
-        <w:t>5.5 标注</w:t>
+        <w:t>3.5 标注</w:t>
       </w:r>
     </w:p>
     <w:p>
@@ -2067,7 +1760,7 @@
           <w:b w:val="0"/>
           <w:sz w:val="18"/>
         </w:rPr>
-        <w:t>[定义]  生命 = 会自指、会变化、**会自我维持**的动态函数类（本文的工作定义）</w:t>
+        <w:t>[定义]  生命 = p生命 + R生命；p生命 = 会自指、会变化、被宇宙保住的动态函数类（本文的工作定义）</w:t>
       </w:r>
     </w:p>
     <w:p>
@@ -2097,7 +1790,7 @@
           <w:b w:val="0"/>
           <w:sz w:val="18"/>
         </w:rPr>
-        <w:t>[定义]  生命 = 同一批涌现结构里，**自己维持自己**的那一类</w:t>
+        <w:t>[定义]  p生命 = 同一批涌现结构里，**被宇宙保住**的那一类</w:t>
       </w:r>
     </w:p>
     <w:p>
@@ -2167,7 +1860,7 @@
           <w:b w:val="0"/>
           <w:sz w:val="18"/>
         </w:rPr>
-        <w:t>[不是]  不是猜想，也不是定理；是一个便于操作的定义</w:t>
+        <w:t>[不是]  不是事实断言，也不是定理；是一个便于操作的定义</w:t>
       </w:r>
     </w:p>
     <w:p>
@@ -2178,45 +1871,6 @@
           <w:sz w:val="18"/>
         </w:rPr>
         <w:t>[后文]  本节只给定义；如何测量（压缩/代价/身份）留到后面几节</w:t>
-      </w:r>
-    </w:p>
-    <w:p>
-      <w:pPr>
-        <w:jc w:val="center"/>
-      </w:pPr>
-      <w:r>
-        <w:rPr>
-          <w:b/>
-          <w:sz w:val="34"/>
-        </w:rPr>
-        <w:t>第三节 · 目前的 AI 为什么不是生命</w:t>
-      </w:r>
-    </w:p>
-    <w:p>
-      <w:r>
-        <w:rPr>
-          <w:b w:val="0"/>
-          <w:sz w:val="20"/>
-        </w:rPr>
-        <w:t>本节不是评价 AI 的能力，而是把它**代入第二节的定义**逐条检查。</w:t>
-      </w:r>
-    </w:p>
-    <w:p>
-      <w:r>
-        <w:rPr>
-          <w:b w:val="0"/>
-          <w:sz w:val="20"/>
-        </w:rPr>
-        <w:t>结论是定义性的，不是价值判断：**以本文的定义，目前的 AI 是化石级函数点，</w:t>
-      </w:r>
-    </w:p>
-    <w:p>
-      <w:r>
-        <w:rPr>
-          <w:b w:val="0"/>
-          <w:sz w:val="20"/>
-        </w:rPr>
-        <w:t>不是生命。** 它的强大与它的「不是生命」并不矛盾。</w:t>
       </w:r>
     </w:p>
     <w:p>
@@ -2225,7 +1879,7 @@
           <w:b/>
           <w:sz w:val="26"/>
         </w:rPr>
-        <w:t>六、检查表：定义能区分什么</w:t>
+        <w:t>四、数字世界的特殊性</w:t>
       </w:r>
     </w:p>
     <w:p>
@@ -2234,7 +1888,61 @@
           <w:b w:val="0"/>
           <w:sz w:val="22"/>
         </w:rPr>
-        <w:t>定义的价值在于区分。下面用一张检查表把"活的结构"与"不算活的结构"分开。</w:t>
+        <w:t>数字世界是完全函数化的：它由比特、状态、转移规则组成，没有函数描述够不着的部分。也就是说，在数字世界里，R = ∅。</w:t>
+      </w:r>
+    </w:p>
+    <w:p>
+      <w:r>
+        <w:rPr>
+          <w:b w:val="0"/>
+          <w:sz w:val="22"/>
+        </w:rPr>
+        <w:t>数字生命是数字世界的一部分，所以它的 R生命 也只能是空集：数字生命 = p生命，完全可函数化。</w:t>
+      </w:r>
+    </w:p>
+    <w:p>
+      <w:r>
+        <w:rPr>
+          <w:b w:val="0"/>
+          <w:sz w:val="22"/>
+        </w:rPr>
+        <w:t>但 R 到底存不存在，我们不知道。把可能性列出来，有三种情况。</w:t>
+      </w:r>
+    </w:p>
+    <w:p>
+      <w:r>
+        <w:rPr>
+          <w:b w:val="0"/>
+          <w:sz w:val="22"/>
+        </w:rPr>
+        <w:t>第一种情况，R 不存在：宇宙完全可函数化，一切都能被函数描述。这是最简单的框架。数字世界可计算、可观测、可复现。</w:t>
+      </w:r>
+    </w:p>
+    <w:p>
+      <w:r>
+        <w:rPr>
+          <w:b w:val="0"/>
+          <w:sz w:val="22"/>
+        </w:rPr>
+        <w:t>第二种情况，R 存在，但生命可以没有 R：有的生命有 R，有的生命没有 R（R生命 = ∅）。那么数字生命仍然可能——它完全由 p生命 构成，没有任何 R生命。</w:t>
+      </w:r>
+    </w:p>
+    <w:p>
+      <w:r>
+        <w:rPr>
+          <w:b w:val="0"/>
+          <w:sz w:val="22"/>
+        </w:rPr>
+        <w:t>第三种情况，R 存在，而且生命必须有 R：不可函数化的部分是生命的必要条件。那么数字生命不可能——数字世界造不出 R，因此造不出生命。</w:t>
+      </w:r>
+    </w:p>
+    <w:p>
+      <w:r>
+        <w:rPr>
+          <w:b w:val="0"/>
+          <w:sz w:val="22"/>
+        </w:rPr>
+        <w:t>本文不判断哪一种成立。可以确定的是：无论哪一种，本文在 p 层面的讨论都成立；区别只在数字生命是可能还是不可能。数字世界是唯一能完全落在 p 里的世界，所以它也是研究这个话题最干净的场景——现在的 AI 就活在这个世界里。</w:t>
       </w:r>
     </w:p>
     <w:p>
@@ -2243,7 +1951,52 @@
           <w:b/>
           <w:sz w:val="26"/>
         </w:rPr>
-        <w:t>6.1 检查表</w:t>
+        <w:t>五、用定义看现在的 AI：为什么它不是生命</w:t>
+      </w:r>
+    </w:p>
+    <w:p>
+      <w:r>
+        <w:rPr>
+          <w:b w:val="0"/>
+          <w:sz w:val="20"/>
+        </w:rPr>
+        <w:t>本节不是评价 AI 的能力，而是把它**代入第二节的定义**逐条检查。</w:t>
+      </w:r>
+    </w:p>
+    <w:p>
+      <w:r>
+        <w:rPr>
+          <w:b w:val="0"/>
+          <w:sz w:val="20"/>
+        </w:rPr>
+        <w:t>结论是定义性的，不是价值判断：**以本文的定义，目前的 AI 是化石级函数点，</w:t>
+      </w:r>
+    </w:p>
+    <w:p>
+      <w:r>
+        <w:rPr>
+          <w:b w:val="0"/>
+          <w:sz w:val="20"/>
+        </w:rPr>
+        <w:t>不是生命。** 它的强大与它的「不是生命」并不矛盾。</w:t>
+      </w:r>
+    </w:p>
+    <w:p>
+      <w:r>
+        <w:rPr>
+          <w:b w:val="0"/>
+          <w:sz w:val="22"/>
+        </w:rPr>
+        <w:t>定义的价值在于区分。把现在的 AI 代入定义逐条检查，就能看出它差在哪里。下面先给一张检查表，再列三条最根本的原因。</w:t>
+      </w:r>
+    </w:p>
+    <w:p>
+      <w:r>
+        <w:rPr>
+          <w:b/>
+          <w:sz w:val="26"/>
+        </w:rPr>
+        <w:t>5.1 检查表</w:t>
       </w:r>
     </w:p>
     <w:tbl>
@@ -2430,7 +2183,7 @@
               <w:rPr>
                 <w:sz w:val="18"/>
               </w:rPr>
-              <w:t>**会自我维持**（花代价维持自己）</w:t>
+              <w:t>**被宇宙保住**（可维持）</w:t>
             </w:r>
           </w:p>
         </w:tc>
@@ -2443,7 +2196,7 @@
               <w:rPr>
                 <w:sz w:val="18"/>
               </w:rPr>
-              <w:t>它不付电费、不修复自己、不复制自己；维持者是外部的人</w:t>
+              <w:t>它不自己维持自己；维持它的是外部的人与设施</w:t>
             </w:r>
           </w:p>
         </w:tc>
@@ -2591,7 +2344,7 @@
           <w:b/>
           <w:sz w:val="26"/>
         </w:rPr>
-        <w:t>6.2 三条最根本的原因（按重要性）</w:t>
+        <w:t>5.2 三条最根本的原因（按重要性）</w:t>
       </w:r>
     </w:p>
     <w:p>
@@ -2737,7 +2490,7 @@
           <w:b/>
           <w:sz w:val="26"/>
         </w:rPr>
-        <w:t>6.3 为什么「它很强」与「它不是生命」不矛盾</w:t>
+        <w:t>5.3 为什么「它很强」与「它不是生命」不矛盾</w:t>
       </w:r>
     </w:p>
     <w:p>
@@ -2757,7 +2510,7 @@
           <w:b w:val="0"/>
           <w:sz w:val="18"/>
         </w:rPr>
-        <w:t>活 = 在函数空间里占据一块区域、自己维持形状、自己付代价</w:t>
+        <w:t>活 = 在函数空间里占据一块区域、自己维持形状、被宇宙保住</w:t>
       </w:r>
     </w:p>
     <w:p>
@@ -2786,7 +2539,7 @@
           <w:b/>
           <w:sz w:val="26"/>
         </w:rPr>
-        <w:t>6.4 标注</w:t>
+        <w:t>5.4 标注</w:t>
       </w:r>
     </w:p>
     <w:p>
@@ -2826,19 +2579,7 @@
           <w:b w:val="0"/>
           <w:sz w:val="18"/>
         </w:rPr>
-        <w:t>[推论] 若要让 AI 成为生命，至少要给它：一族函数 + 自指更新 + 自己付代价</w:t>
-      </w:r>
-    </w:p>
-    <w:p>
-      <w:pPr>
-        <w:jc w:val="center"/>
-      </w:pPr>
-      <w:r>
-        <w:rPr>
-          <w:b/>
-          <w:sz w:val="34"/>
-        </w:rPr>
-        <w:t>第四节 · 生命需要什么：三条必要条件</w:t>
+        <w:t>[推论] 若要让 AI 成为生命，至少要给它：一族函数 + 自指更新 + 被宇宙保住</w:t>
       </w:r>
     </w:p>
     <w:p>
@@ -2874,7 +2615,7 @@
           <w:b/>
           <w:sz w:val="26"/>
         </w:rPr>
-        <w:t>七、三条必要条件</w:t>
+        <w:t>六、三条必要条件</w:t>
       </w:r>
     </w:p>
     <w:p>
@@ -2892,7 +2633,7 @@
           <w:b/>
           <w:sz w:val="26"/>
         </w:rPr>
-        <w:t>7.1 从定义到条件</w:t>
+        <w:t>6.1 从定义到条件</w:t>
       </w:r>
     </w:p>
     <w:p>
@@ -2932,7 +2673,26 @@
           <w:b w:val="0"/>
           <w:sz w:val="18"/>
         </w:rPr>
-        <w:t>会自我维持           ⇒  ③ 自己付代价：压缩收益 ≥ 维持成本</w:t>
+        <w:t>会自我维持           ⇒  ③ 被宇宙保住：轨道留在可维持集合里</w:t>
+      </w:r>
+    </w:p>
+    <w:p>
+      <w:r>
+        <w:rPr>
+          <w:rFonts w:ascii="Consolas" w:hAnsi="Consolas" w:eastAsia="Consolas"/>
+          <w:b w:val="0"/>
+          <w:sz w:val="18"/>
+        </w:rPr>
+      </w:r>
+    </w:p>
+    <w:p>
+      <w:r>
+        <w:rPr>
+          <w:rFonts w:ascii="Consolas" w:hAnsi="Consolas" w:eastAsia="Consolas"/>
+          <w:b w:val="0"/>
+          <w:sz w:val="18"/>
+        </w:rPr>
+        <w:t>（付代价不在必要条件里：它是演化与热力学的经验伴随物，见 6.4b。）</w:t>
       </w:r>
     </w:p>
     <w:p>
@@ -2950,7 +2710,7 @@
           <w:b/>
           <w:sz w:val="26"/>
         </w:rPr>
-        <w:t>7.2 条件① 一族函数（不是一个点）</w:t>
+        <w:t>6.2 条件① 一族函数（不是一个点）</w:t>
       </w:r>
     </w:p>
     <w:p>
@@ -3016,7 +2776,7 @@
           <w:b/>
           <w:sz w:val="26"/>
         </w:rPr>
-        <w:t>7.3 条件② 自指更新（规则在自己里面）</w:t>
+        <w:t>6.3 条件② 自指更新（规则在自己里面）</w:t>
       </w:r>
     </w:p>
     <w:p>
@@ -3082,7 +2842,7 @@
           <w:b/>
           <w:sz w:val="26"/>
         </w:rPr>
-        <w:t>7.4 条件③ 自己付代价（压缩换生存）</w:t>
+        <w:t>6.4 条件③ 被宇宙保住（可维持）</w:t>
       </w:r>
     </w:p>
     <w:p>
@@ -3091,47 +2851,7 @@
           <w:b w:val="0"/>
           <w:sz w:val="22"/>
         </w:rPr>
-        <w:t>要求：收入来自压缩世界（匹配源分布）；支出是维持结构的真实成本；且存在盈余。</w:t>
-      </w:r>
-    </w:p>
-    <w:p>
-      <w:r>
-        <w:rPr>
-          <w:rFonts w:ascii="Consolas" w:hAnsi="Consolas" w:eastAsia="Consolas"/>
-          <w:b w:val="0"/>
-          <w:sz w:val="18"/>
-        </w:rPr>
-        <w:t>存在条件：S &gt; d·K</w:t>
-      </w:r>
-    </w:p>
-    <w:p>
-      <w:r>
-        <w:rPr>
-          <w:rFonts w:ascii="Consolas" w:hAnsi="Consolas" w:eastAsia="Consolas"/>
-          <w:b w:val="0"/>
-          <w:sz w:val="18"/>
-        </w:rPr>
-        <w:t xml:space="preserve">   S = 世界的可压缩盈余</w:t>
-      </w:r>
-    </w:p>
-    <w:p>
-      <w:r>
-        <w:rPr>
-          <w:rFonts w:ascii="Consolas" w:hAnsi="Consolas" w:eastAsia="Consolas"/>
-          <w:b w:val="0"/>
-          <w:sz w:val="18"/>
-        </w:rPr>
-        <w:t xml:space="preserve">   d = 结构维持成本率</w:t>
-      </w:r>
-    </w:p>
-    <w:p>
-      <w:r>
-        <w:rPr>
-          <w:rFonts w:ascii="Consolas" w:hAnsi="Consolas" w:eastAsia="Consolas"/>
-          <w:b w:val="0"/>
-          <w:sz w:val="18"/>
-        </w:rPr>
-        <w:t xml:space="preserve">   K = 结构规模</w:t>
+        <w:t>要求：它的轨道留在宇宙的可维持集合里。给定宇宙这个整体，有些结构出不来，有些结构能一直维持；能维持的那部分才落在定义里。这是关系条件，不是它自己的属性。</w:t>
       </w:r>
     </w:p>
     <w:p>
@@ -3140,76 +2860,7 @@
           <w:b w:val="0"/>
           <w:sz w:val="22"/>
         </w:rPr>
-        <w:t>证据/经验（这是本文最硬的部分）：</w:t>
-      </w:r>
-    </w:p>
-    <w:p>
-      <w:r>
-        <w:rPr>
-          <w:rFonts w:ascii="Consolas" w:hAnsi="Consolas" w:eastAsia="Consolas"/>
-          <w:b w:val="0"/>
-          <w:sz w:val="18"/>
-        </w:rPr>
-        <w:t>· E1：「准」≠「压缩」：用正确率记账，系统学出「啥也不干」（LEN=0、预测0、准确率92%）</w:t>
-      </w:r>
-    </w:p>
-    <w:p>
-      <w:r>
-        <w:rPr>
-          <w:rFonts w:ascii="Consolas" w:hAnsi="Consolas" w:eastAsia="Consolas"/>
-          <w:b w:val="0"/>
-          <w:sz w:val="18"/>
-        </w:rPr>
-        <w:t xml:space="preserve">      ⇒ 必须用对数似然改善 over 基线：gain_bits = log2 p_model − log2 p_base</w:t>
-      </w:r>
-    </w:p>
-    <w:p>
-      <w:r>
-        <w:rPr>
-          <w:rFonts w:ascii="Consolas" w:hAnsi="Consolas" w:eastAsia="Consolas"/>
-          <w:b w:val="0"/>
-          <w:sz w:val="18"/>
-        </w:rPr>
-        <w:t>· E2：正是加上基率校正后，系统才从躺平解转为真正表达（LEN 从 0 长出）</w:t>
-      </w:r>
-    </w:p>
-    <w:p>
-      <w:r>
-        <w:rPr>
-          <w:rFonts w:ascii="Consolas" w:hAnsi="Consolas" w:eastAsia="Consolas"/>
-          <w:b w:val="0"/>
-          <w:sz w:val="18"/>
-        </w:rPr>
-        <w:t>· E8：经济标定 n* = FLUX_TOTAL / BASE_COST 决定「冻结」与「爆发」的切换</w:t>
-      </w:r>
-    </w:p>
-    <w:p>
-      <w:r>
-        <w:rPr>
-          <w:rFonts w:ascii="Consolas" w:hAnsi="Consolas" w:eastAsia="Consolas"/>
-          <w:b w:val="0"/>
-          <w:sz w:val="18"/>
-        </w:rPr>
-        <w:t>· 实测正收益：S1~S6 中观察到 gain &gt; 0（约 +0.09 ~ +0.19 bit/tick）</w:t>
-      </w:r>
-    </w:p>
-    <w:p>
-      <w:r>
-        <w:rPr>
-          <w:rFonts w:ascii="Consolas" w:hAnsi="Consolas" w:eastAsia="Consolas"/>
-          <w:b w:val="0"/>
-          <w:sz w:val="18"/>
-        </w:rPr>
-        <w:t xml:space="preserve">      ⇒ 世界确实存在可压缩盈余（即 S &gt; 0 的经验证据）</w:t>
-      </w:r>
-    </w:p>
-    <w:p>
-      <w:r>
-        <w:rPr>
-          <w:b w:val="0"/>
-          <w:sz w:val="22"/>
-        </w:rPr>
-        <w:t>⇒ 判据：把外部供给全部停掉后，它的账目是否仍为正。</w:t>
+        <w:t>判据：扰动之后，它是否仍能回到可维持的集合——有恢复力，而不只是瞬间活着。</w:t>
       </w:r>
     </w:p>
     <w:p>
@@ -3218,37 +2869,7 @@
           <w:b/>
           <w:sz w:val="26"/>
         </w:rPr>
-        <w:t>7.5 三条必须同时成立（经验对照）</w:t>
-      </w:r>
-    </w:p>
-    <w:p>
-      <w:r>
-        <w:rPr>
-          <w:rFonts w:ascii="Consolas" w:hAnsi="Consolas" w:eastAsia="Consolas"/>
-          <w:b w:val="0"/>
-          <w:sz w:val="18"/>
-        </w:rPr>
-        <w:t>缺①（一族）  ⇒ 化石：行为谱是一条线</w:t>
-      </w:r>
-    </w:p>
-    <w:p>
-      <w:r>
-        <w:rPr>
-          <w:rFonts w:ascii="Consolas" w:hAnsi="Consolas" w:eastAsia="Consolas"/>
-          <w:b w:val="0"/>
-          <w:sz w:val="18"/>
-        </w:rPr>
-        <w:t>缺②（自指）  ⇒ 机器：更新在外，不会自己变</w:t>
-      </w:r>
-    </w:p>
-    <w:p>
-      <w:r>
-        <w:rPr>
-          <w:rFonts w:ascii="Consolas" w:hAnsi="Consolas" w:eastAsia="Consolas"/>
-          <w:b w:val="0"/>
-          <w:sz w:val="18"/>
-        </w:rPr>
-        <w:t>缺③（代价）  ⇒ 玩具：由外部供养，不会死，也就没有选择</w:t>
+        <w:t>6.4b 付代价：经验伴随物，不是必要条件</w:t>
       </w:r>
     </w:p>
     <w:p>
@@ -3257,7 +2878,7 @@
           <w:b w:val="0"/>
           <w:sz w:val="22"/>
         </w:rPr>
-        <w:t>这三条也解释了为什么我们的实验一直在同一个地方卡住：</w:t>
+        <w:t>本文不把「付代价」列为条件，原因说清：代价是演化与热力学的产物，不是逻辑上的必要条件。在资源无限的世界里，生命可以不必竞争；稀缺才带来代价。把它写进必要条件，等于把演化的结果当成生命的定义。</w:t>
       </w:r>
     </w:p>
     <w:p>
@@ -3266,7 +2887,7 @@
           <w:b w:val="0"/>
           <w:sz w:val="22"/>
         </w:rPr>
-        <w:t>结构能长出来（①②部分满足），但合作/分工不成为必需 —— 因为③的「收入差」太小，</w:t>
+        <w:t>但在经验层面，代价几乎总会出现，而且可以测量。本文实验里的经济部分属于这一层，摘录如下。</w:t>
       </w:r>
     </w:p>
     <w:p>
@@ -3275,7 +2896,43 @@
           <w:b w:val="0"/>
           <w:sz w:val="22"/>
         </w:rPr>
-        <w:t>即世界的可压缩盈余还没大到让「更复杂的结构」在经济上划算（E5/E7）。</w:t>
+        <w:t>· E1：「准」不等于「压缩」：用正确率记账，系统学出「啥也不干」（LEN=0、预测0、准确率92%）。必须用对数似然改善对基线记账：gain_bits = log2 p_model − log2 p_base。</w:t>
+      </w:r>
+    </w:p>
+    <w:p>
+      <w:r>
+        <w:rPr>
+          <w:b w:val="0"/>
+          <w:sz w:val="22"/>
+        </w:rPr>
+        <w:t>· E2：加上基率校正后，系统才从躺平解转为真正表达（LEN 从 0 长出）。</w:t>
+      </w:r>
+    </w:p>
+    <w:p>
+      <w:r>
+        <w:rPr>
+          <w:b w:val="0"/>
+          <w:sz w:val="22"/>
+        </w:rPr>
+        <w:t>· E8：经济标定 n* = FLUX_TOTAL / BASE_COST 决定「冻结」与「爆发」的切换。</w:t>
+      </w:r>
+    </w:p>
+    <w:p>
+      <w:r>
+        <w:rPr>
+          <w:b w:val="0"/>
+          <w:sz w:val="22"/>
+        </w:rPr>
+        <w:t>· 实测正收益：S1~S6 中观察到 gain &gt; 0（约 +0.09 ~ +0.19 bit/tick），说明世界确实存在可压缩盈余。</w:t>
+      </w:r>
+    </w:p>
+    <w:p>
+      <w:r>
+        <w:rPr>
+          <w:b w:val="0"/>
+          <w:sz w:val="22"/>
+        </w:rPr>
+        <w:t>⇒ 判据（经验层）：把外部供给全部停掉后，它的账目是否仍为正。</w:t>
       </w:r>
     </w:p>
     <w:p>
@@ -3284,7 +2941,37 @@
           <w:b/>
           <w:sz w:val="26"/>
         </w:rPr>
-        <w:t>7.6 未尽之处（留给读者）</w:t>
+        <w:t>6.5 三条必须同时成立（经验对照）</w:t>
+      </w:r>
+    </w:p>
+    <w:p>
+      <w:r>
+        <w:rPr>
+          <w:rFonts w:ascii="Consolas" w:hAnsi="Consolas" w:eastAsia="Consolas"/>
+          <w:b w:val="0"/>
+          <w:sz w:val="18"/>
+        </w:rPr>
+        <w:t>缺①（一族）  ⇒ 化石：行为谱是一条线</w:t>
+      </w:r>
+    </w:p>
+    <w:p>
+      <w:r>
+        <w:rPr>
+          <w:rFonts w:ascii="Consolas" w:hAnsi="Consolas" w:eastAsia="Consolas"/>
+          <w:b w:val="0"/>
+          <w:sz w:val="18"/>
+        </w:rPr>
+        <w:t>缺②（自指）  ⇒ 机器：更新在外，不会自己变</w:t>
+      </w:r>
+    </w:p>
+    <w:p>
+      <w:r>
+        <w:rPr>
+          <w:rFonts w:ascii="Consolas" w:hAnsi="Consolas" w:eastAsia="Consolas"/>
+          <w:b w:val="0"/>
+          <w:sz w:val="18"/>
+        </w:rPr>
+        <w:t>缺③（被保住）⇒ 散掉：轨道离开可维持集合，不再是一个活着的结构</w:t>
       </w:r>
     </w:p>
     <w:p>
@@ -3293,7 +2980,7 @@
           <w:b w:val="0"/>
           <w:sz w:val="22"/>
         </w:rPr>
-        <w:t>本文止于「必要条件」。三条都满足之后是否就「活」——我们没有答案，也不打算在此下结论。</w:t>
+        <w:t>这三条也解释了为什么我们的实验一直在同一个地方卡住：</w:t>
       </w:r>
     </w:p>
     <w:p>
@@ -3302,37 +2989,7 @@
           <w:b w:val="0"/>
           <w:sz w:val="22"/>
         </w:rPr>
-        <w:t>留给读者的，只是一把可以拿去用的尺子：</w:t>
-      </w:r>
-    </w:p>
-    <w:p>
-      <w:r>
-        <w:rPr>
-          <w:rFonts w:ascii="Consolas" w:hAnsi="Consolas" w:eastAsia="Consolas"/>
-          <w:b w:val="0"/>
-          <w:sz w:val="18"/>
-        </w:rPr>
-        <w:t>它是一族函数吗？（行为谱不是一个点）</w:t>
-      </w:r>
-    </w:p>
-    <w:p>
-      <w:r>
-        <w:rPr>
-          <w:rFonts w:ascii="Consolas" w:hAnsi="Consolas" w:eastAsia="Consolas"/>
-          <w:b w:val="0"/>
-          <w:sz w:val="18"/>
-        </w:rPr>
-        <w:t>它会自己改自己吗？（拿掉外部更新，它仍变）</w:t>
-      </w:r>
-    </w:p>
-    <w:p>
-      <w:r>
-        <w:rPr>
-          <w:rFonts w:ascii="Consolas" w:hAnsi="Consolas" w:eastAsia="Consolas"/>
-          <w:b w:val="0"/>
-          <w:sz w:val="18"/>
-        </w:rPr>
-        <w:t>它自己付代价吗？（压缩世界的收入 ≥ 维持结构的支出）</w:t>
+        <w:t>结构能长出来（①②部分满足），但合作/分工不成为必需 —— 因为代价层面的「收入差」太小（经验层面，非定义条件），</w:t>
       </w:r>
     </w:p>
     <w:p>
@@ -3341,7 +2998,7 @@
           <w:b w:val="0"/>
           <w:sz w:val="22"/>
         </w:rPr>
-        <w:t>三条你都可以自己去量。至于量完之后它算不算生命，由你判断。</w:t>
+        <w:t>即世界的可压缩盈余还没大到让「更复杂的结构」在经济上划算（E5/E7）。</w:t>
       </w:r>
     </w:p>
     <w:p>
@@ -3350,7 +3007,7 @@
           <w:b/>
           <w:sz w:val="26"/>
         </w:rPr>
-        <w:t>7.7 本文实验的边界（必须与结论一起读）</w:t>
+        <w:t>6.6 未尽之处（留给读者）</w:t>
       </w:r>
     </w:p>
     <w:p>
@@ -3359,7 +3016,16 @@
           <w:b w:val="0"/>
           <w:sz w:val="22"/>
         </w:rPr>
-        <w:t>本文的实验只覆盖第③条必要条件（压缩收益 vs 维持成本），且是示例性的：</w:t>
+        <w:t>本文止于「必要条件」。三条都满足之后是否就「活」——我们没有答案，也不打算在此下结论。</w:t>
+      </w:r>
+    </w:p>
+    <w:p>
+      <w:r>
+        <w:rPr>
+          <w:b w:val="0"/>
+          <w:sz w:val="22"/>
+        </w:rPr>
+        <w:t>留给读者的，只是一把可以拿去用的尺子：</w:t>
       </w:r>
     </w:p>
     <w:p>
@@ -3369,7 +3035,7 @@
           <w:b w:val="0"/>
           <w:sz w:val="18"/>
         </w:rPr>
-        <w:t>· 覆盖：③ 自己付代价 —— E1/E2（准≠压缩、基率校正）、E8（n*=FLUX/BASE_COST 的冻结/爆发边界）</w:t>
+        <w:t>它是一族函数吗？（行为谱不是一个点）</w:t>
       </w:r>
     </w:p>
     <w:p>
@@ -3379,7 +3045,7 @@
           <w:b w:val="0"/>
           <w:sz w:val="18"/>
         </w:rPr>
-        <w:t>· 覆盖：反例 —— E5/E7（相连个体基因距离 0.145 vs 随机 0.486 ⇒ 克隆抱团，不是分工）</w:t>
+        <w:t>它会自己改自己吗？（拿掉外部更新，它仍变）</w:t>
       </w:r>
     </w:p>
     <w:p>
@@ -3389,27 +3055,7 @@
           <w:b w:val="0"/>
           <w:sz w:val="18"/>
         </w:rPr>
-        <w:t>· 未覆盖：① 一族函数、② 自指更新 —— 本文不声称有实验证据，只在定义上推导；</w:t>
-      </w:r>
-    </w:p>
-    <w:p>
-      <w:r>
-        <w:rPr>
-          <w:rFonts w:ascii="Consolas" w:hAnsi="Consolas" w:eastAsia="Consolas"/>
-          <w:b w:val="0"/>
-          <w:sz w:val="18"/>
-        </w:rPr>
-        <w:t xml:space="preserve">          仅有初步观察（E12 动态 0.849 vs 冻结 1.07；E13 身份链 8 代可校验）</w:t>
-      </w:r>
-    </w:p>
-    <w:p>
-      <w:r>
-        <w:rPr>
-          <w:rFonts w:ascii="Consolas" w:hAnsi="Consolas" w:eastAsia="Consolas"/>
-          <w:b w:val="0"/>
-          <w:sz w:val="18"/>
-        </w:rPr>
-        <w:t>· 规模：小、可复现、可手算；不是大规模实证</w:t>
+        <w:t>它被宇宙保住了吗？（轨道留在可维持集合里）</w:t>
       </w:r>
     </w:p>
     <w:p>
@@ -3418,16 +3064,7 @@
           <w:b w:val="0"/>
           <w:sz w:val="22"/>
         </w:rPr>
-        <w:t>⇒ 本文的定位是「定义 + 可测判据 + 示例性实验」，不是「生命已被造出」的实证论文。</w:t>
-      </w:r>
-    </w:p>
-    <w:p>
-      <w:r>
-        <w:rPr>
-          <w:b w:val="0"/>
-          <w:sz w:val="22"/>
-        </w:rPr>
-        <w:t>读者若要用这些结论，请连同这条边界一起引用。</w:t>
+        <w:t>三条你都可以自己去量。至于量完之后它算不算生命，由你判断。</w:t>
       </w:r>
     </w:p>
     <w:p>
@@ -3436,77 +3073,79 @@
           <w:b/>
           <w:sz w:val="26"/>
         </w:rPr>
-        <w:t>7.8 标注</w:t>
-      </w:r>
-    </w:p>
-    <w:p>
-      <w:r>
-        <w:rPr>
-          <w:rFonts w:ascii="Consolas" w:hAnsi="Consolas" w:eastAsia="Consolas"/>
-          <w:b w:val="0"/>
-          <w:sz w:val="18"/>
-        </w:rPr>
-        <w:t>[推论] 三条必要条件由第二、三节直接推出，不是独立假设</w:t>
-      </w:r>
-    </w:p>
-    <w:p>
-      <w:r>
-        <w:rPr>
-          <w:rFonts w:ascii="Consolas" w:hAnsi="Consolas" w:eastAsia="Consolas"/>
-          <w:b w:val="0"/>
-          <w:sz w:val="18"/>
-        </w:rPr>
-        <w:t>[证据] 条件③ 有实验数据（E1/E2/E8 + 正收益）；条件①② 有部分数据（E12/E13）</w:t>
-      </w:r>
-    </w:p>
-    <w:p>
-      <w:r>
-        <w:rPr>
-          <w:rFonts w:ascii="Consolas" w:hAnsi="Consolas" w:eastAsia="Consolas"/>
-          <w:b w:val="0"/>
-          <w:sz w:val="18"/>
-        </w:rPr>
-        <w:t>[未解决] 三条都满足后是否就「活」—— 本文不声称；这是下一步实验要回答的</w:t>
-      </w:r>
-    </w:p>
-    <w:p>
-      <w:r>
-        <w:rPr>
-          <w:rFonts w:ascii="Consolas" w:hAnsi="Consolas" w:eastAsia="Consolas"/>
-          <w:b w:val="0"/>
-          <w:sz w:val="18"/>
-        </w:rPr>
-        <w:t>[推测] 若盈余 S 不足，则无论结构多复杂都维持不起 ⇒ 生命有「经济上限」（仅方向性推测）</w:t>
-      </w:r>
-    </w:p>
-    <w:p>
-      <w:pPr>
-        <w:jc w:val="center"/>
-      </w:pPr>
-      <w:r>
-        <w:rPr>
-          <w:b/>
-          <w:sz w:val="34"/>
-        </w:rPr>
-        <w:t>第五节 · 为什么现在的 AI 会出现涌现？</w:t>
-      </w:r>
-    </w:p>
-    <w:p>
-      <w:r>
-        <w:rPr>
-          <w:b w:val="0"/>
-          <w:sz w:val="20"/>
-        </w:rPr>
-        <w:t>现状判断（本节的核心）：**观察到涌现的人很多，说清「为什么」的人没有。**</w:t>
-      </w:r>
-    </w:p>
-    <w:p>
-      <w:r>
-        <w:rPr>
-          <w:b w:val="0"/>
-          <w:sz w:val="20"/>
-        </w:rPr>
-        <w:t>现有的解释各覆盖一角，多数是推测；甚至「涌现是否真实存在」本身都还有争议。</w:t>
+        <w:t>6.7 本文实验的边界（必须与结论一起读）</w:t>
+      </w:r>
+    </w:p>
+    <w:p>
+      <w:r>
+        <w:rPr>
+          <w:b w:val="0"/>
+          <w:sz w:val="22"/>
+        </w:rPr>
+        <w:t>本文的实验覆盖的是「代价」这一经验层面，不是定义条件③。</w:t>
+      </w:r>
+    </w:p>
+    <w:p>
+      <w:r>
+        <w:rPr>
+          <w:b w:val="0"/>
+          <w:sz w:val="22"/>
+        </w:rPr>
+        <w:t>· 覆盖：代价与经济 —— E1/E2（准≠压缩、基率校正）、E8（n*=FLUX/BASE_COST 的冻结/爆发边界）。</w:t>
+      </w:r>
+    </w:p>
+    <w:p>
+      <w:r>
+        <w:rPr>
+          <w:b w:val="0"/>
+          <w:sz w:val="22"/>
+        </w:rPr>
+        <w:t>· 覆盖：反例 —— E5/E7（相连个体基因距离 0.145 vs 随机 0.486，克隆抱团，不是分工）。</w:t>
+      </w:r>
+    </w:p>
+    <w:p>
+      <w:r>
+        <w:rPr>
+          <w:b w:val="0"/>
+          <w:sz w:val="22"/>
+        </w:rPr>
+        <w:t>· 未覆盖：条件② 自指更新、条件③ 被宇宙保住 —— 本文不声称有实验证据，只做定义上的推导；仅有初步观察（E12 动态 0.849 vs 冻结 1.07；E13 身份链 8 代可校验）。</w:t>
+      </w:r>
+    </w:p>
+    <w:p>
+      <w:r>
+        <w:rPr>
+          <w:b w:val="0"/>
+          <w:sz w:val="22"/>
+        </w:rPr>
+        <w:t>· 条件① 一族函数：有部分观察（E12/E13），但不是专门实验。</w:t>
+      </w:r>
+    </w:p>
+    <w:p>
+      <w:r>
+        <w:rPr>
+          <w:b w:val="0"/>
+          <w:sz w:val="22"/>
+        </w:rPr>
+        <w:t>· 规模：小、可复现、可手算；不是大规模实证。</w:t>
+      </w:r>
+    </w:p>
+    <w:p>
+      <w:r>
+        <w:rPr>
+          <w:b w:val="0"/>
+          <w:sz w:val="22"/>
+        </w:rPr>
+        <w:t>⇒ 本文的定位是「定义 + 可测判据 + 示例性实验」，不是「生命已被造出」的实证论文。</w:t>
+      </w:r>
+    </w:p>
+    <w:p>
+      <w:r>
+        <w:rPr>
+          <w:b w:val="0"/>
+          <w:sz w:val="22"/>
+        </w:rPr>
+        <w:t>读者若要用这些结论，请连同这条边界一起引用。</w:t>
       </w:r>
     </w:p>
     <w:p>
@@ -3515,16 +3154,67 @@
           <w:b/>
           <w:sz w:val="26"/>
         </w:rPr>
-        <w:t>八、涌现：为什么现在的 AI 会涌现</w:t>
-      </w:r>
-    </w:p>
-    <w:p>
-      <w:r>
-        <w:rPr>
-          <w:b w:val="0"/>
-          <w:sz w:val="22"/>
-        </w:rPr>
-        <w:t>这一节处理一个具体的现象问题：为什么现在的 AI 会涌现出训练目标之外的能力。本文在这里的立场是[推测]，不是证据。</w:t>
+        <w:t>6.8 标注</w:t>
+      </w:r>
+    </w:p>
+    <w:p>
+      <w:r>
+        <w:rPr>
+          <w:rFonts w:ascii="Consolas" w:hAnsi="Consolas" w:eastAsia="Consolas"/>
+          <w:b w:val="0"/>
+          <w:sz w:val="18"/>
+        </w:rPr>
+        <w:t>[推论] 三条必要条件由定义直接推出，不是独立假设</w:t>
+      </w:r>
+    </w:p>
+    <w:p>
+      <w:r>
+        <w:rPr>
+          <w:rFonts w:ascii="Consolas" w:hAnsi="Consolas" w:eastAsia="Consolas"/>
+          <w:b w:val="0"/>
+          <w:sz w:val="18"/>
+        </w:rPr>
+        <w:t>[定义] 条件③是关系条件（被宇宙保住），不是系统自身的属性</w:t>
+      </w:r>
+    </w:p>
+    <w:p>
+      <w:r>
+        <w:rPr>
+          <w:rFonts w:ascii="Consolas" w:hAnsi="Consolas" w:eastAsia="Consolas"/>
+          <w:b w:val="0"/>
+          <w:sz w:val="18"/>
+        </w:rPr>
+        <w:t>[经验] 代价/经济是经验伴随物，不是定义条件；本文有数据（E1/E2/E8 + 正收益）</w:t>
+      </w:r>
+    </w:p>
+    <w:p>
+      <w:r>
+        <w:rPr>
+          <w:rFonts w:ascii="Consolas" w:hAnsi="Consolas" w:eastAsia="Consolas"/>
+          <w:b w:val="0"/>
+          <w:sz w:val="18"/>
+        </w:rPr>
+        <w:t>[初步] 条件①②有部分观察（E12/E13），不是专门实验</w:t>
+      </w:r>
+    </w:p>
+    <w:p>
+      <w:r>
+        <w:rPr>
+          <w:rFonts w:ascii="Consolas" w:hAnsi="Consolas" w:eastAsia="Consolas"/>
+          <w:b w:val="0"/>
+          <w:sz w:val="18"/>
+        </w:rPr>
+        <w:t>[未解决] 三条都满足后是否就「活」——本文不声称；这是下一步实验要回答的</w:t>
+      </w:r>
+    </w:p>
+    <w:p>
+      <w:r>
+        <w:rPr>
+          <w:rFonts w:ascii="Consolas" w:hAnsi="Consolas" w:eastAsia="Consolas"/>
+          <w:b w:val="0"/>
+          <w:sz w:val="18"/>
+        </w:rPr>
+        <w:t>[推测] 若盈余 S 不足，则无论结构多复杂都维持不起 ⇒ 生命有「经济上限」（仅方向性推测）</w:t>
       </w:r>
     </w:p>
     <w:p>
@@ -3533,7 +3223,7 @@
           <w:b/>
           <w:sz w:val="26"/>
         </w:rPr>
-        <w:t>8.1 现象</w:t>
+        <w:t>七、涌现：为什么现在的 AI 会涌现</w:t>
       </w:r>
     </w:p>
     <w:p>
@@ -3542,36 +3232,7 @@
           <w:b w:val="0"/>
           <w:sz w:val="22"/>
         </w:rPr>
-        <w:t>大模型在规模上去之后，某些能力似乎突然出现（多步推理、思维链、算术…），</w:t>
-      </w:r>
-    </w:p>
-    <w:p>
-      <w:r>
-        <w:rPr>
-          <w:b w:val="0"/>
-          <w:sz w:val="22"/>
-        </w:rPr>
-        <w:t>业界叫 涌现（emergence）。大家都在用这个现象，但——</w:t>
-      </w:r>
-    </w:p>
-    <w:p>
-      <w:r>
-        <w:rPr>
-          <w:rFonts w:ascii="Consolas" w:hAnsi="Consolas" w:eastAsia="Consolas"/>
-          <w:b w:val="0"/>
-          <w:sz w:val="18"/>
-        </w:rPr>
-        <w:t>观察到涌现：很多人</w:t>
-      </w:r>
-    </w:p>
-    <w:p>
-      <w:r>
-        <w:rPr>
-          <w:rFonts w:ascii="Consolas" w:hAnsi="Consolas" w:eastAsia="Consolas"/>
-          <w:b w:val="0"/>
-          <w:sz w:val="18"/>
-        </w:rPr>
-        <w:t>解释涌现：没有公认答案</w:t>
+        <w:t>这一节处理一个具体的现象问题：为什么现在的 AI 会涌现出训练目标之外的能力。本文在这里的立场是[推测]，不是证据。</w:t>
       </w:r>
     </w:p>
     <w:p>
@@ -3580,7 +3241,7 @@
           <w:b/>
           <w:sz w:val="26"/>
         </w:rPr>
-        <w:t>8.2 现有的解释（按证据强度排列）</w:t>
+        <w:t>7.1 现象</w:t>
       </w:r>
     </w:p>
     <w:p>
@@ -3589,7 +3250,7 @@
           <w:b w:val="0"/>
           <w:sz w:val="22"/>
         </w:rPr>
-        <w:t>① 度量假象说（最强的反方证据）</w:t>
+        <w:t>大模型在规模上去之后，某些能力似乎突然出现（多步推理、思维链、算术…），</w:t>
       </w:r>
     </w:p>
     <w:p>
@@ -3598,7 +3259,7 @@
           <w:b w:val="0"/>
           <w:sz w:val="22"/>
         </w:rPr>
-        <w:t>Schaeffer, Miranda, Koyejo 2023[3]《Are Emergent Abilities of Large Language Models a Mirage?》</w:t>
+        <w:t>业界叫 涌现（emergence）。大家都在用这个现象，但——</w:t>
       </w:r>
     </w:p>
     <w:p>
@@ -3608,7 +3269,7 @@
           <w:b w:val="0"/>
           <w:sz w:val="18"/>
         </w:rPr>
-        <w:t>主张：所谓涌现，可能是**评价指标的非线性/不连续**造成的假象；</w:t>
+        <w:t>观察到涌现：很多人</w:t>
       </w:r>
     </w:p>
     <w:p>
@@ -3618,151 +3279,7 @@
           <w:b w:val="0"/>
           <w:sz w:val="18"/>
         </w:rPr>
-        <w:t xml:space="preserve">      换成连续指标（如对数似然），"突变"会消失，变成平滑上升</w:t>
-      </w:r>
-    </w:p>
-    <w:p>
-      <w:r>
-        <w:rPr>
-          <w:rFonts w:ascii="Consolas" w:hAnsi="Consolas" w:eastAsia="Consolas"/>
-          <w:b w:val="0"/>
-          <w:sz w:val="18"/>
-        </w:rPr>
-        <w:t>⇒ 这动摇了「涌现是真实突变」这个前提本身</w:t>
-      </w:r>
-    </w:p>
-    <w:p>
-      <w:r>
-        <w:rPr>
-          <w:b w:val="0"/>
-          <w:sz w:val="22"/>
-        </w:rPr>
-        <w:t>② 机制解释：归纳头与电路（局部机制证据，不是完整"为什么"）</w:t>
-      </w:r>
-    </w:p>
-    <w:p>
-      <w:r>
-        <w:rPr>
-          <w:b w:val="0"/>
-          <w:sz w:val="22"/>
-        </w:rPr>
-        <w:t>Olsson et al. 2022[4]《In-context Learning and Induction Heads》</w:t>
-      </w:r>
-    </w:p>
-    <w:p>
-      <w:r>
-        <w:rPr>
-          <w:rFonts w:ascii="Consolas" w:hAnsi="Consolas" w:eastAsia="Consolas"/>
-          <w:b w:val="0"/>
-          <w:sz w:val="18"/>
-        </w:rPr>
-        <w:t>发现模型内部出现「归纳头」回路，解释部分上下文学习能力</w:t>
-      </w:r>
-    </w:p>
-    <w:p>
-      <w:r>
-        <w:rPr>
-          <w:rFonts w:ascii="Consolas" w:hAnsi="Consolas" w:eastAsia="Consolas"/>
-          <w:b w:val="0"/>
-          <w:sz w:val="18"/>
-        </w:rPr>
-        <w:t>⇒ 这是**机制层**的证据：说明了某种能力由什么结构实现</w:t>
-      </w:r>
-    </w:p>
-    <w:p>
-      <w:r>
-        <w:rPr>
-          <w:rFonts w:ascii="Consolas" w:hAnsi="Consolas" w:eastAsia="Consolas"/>
-          <w:b w:val="0"/>
-          <w:sz w:val="18"/>
-        </w:rPr>
-        <w:t>⇒ 但它只解释某个具体能力，不解释「为什么会出现涌现」这个一般问题</w:t>
-      </w:r>
-    </w:p>
-    <w:p>
-      <w:r>
-        <w:rPr>
-          <w:b w:val="0"/>
-          <w:sz w:val="22"/>
-        </w:rPr>
-        <w:t>③ Grokking：训练中的认知相变</w:t>
-      </w:r>
-    </w:p>
-    <w:p>
-      <w:r>
-        <w:rPr>
-          <w:b w:val="0"/>
-          <w:sz w:val="22"/>
-        </w:rPr>
-        <w:t>Power et al. 2022[5]《Grokking》</w:t>
-      </w:r>
-    </w:p>
-    <w:p>
-      <w:r>
-        <w:rPr>
-          <w:rFonts w:ascii="Consolas" w:hAnsi="Consolas" w:eastAsia="Consolas"/>
-          <w:b w:val="0"/>
-          <w:sz w:val="18"/>
-        </w:rPr>
-        <w:t>在小算法任务上，训练很久后泛化突然出现（像相变）</w:t>
-      </w:r>
-    </w:p>
-    <w:p>
-      <w:r>
-        <w:rPr>
-          <w:rFonts w:ascii="Consolas" w:hAnsi="Consolas" w:eastAsia="Consolas"/>
-          <w:b w:val="0"/>
-          <w:sz w:val="18"/>
-        </w:rPr>
-        <w:t>⇒ 说明「涌现」也发生在训练过程中，不一定只依赖规模</w:t>
-      </w:r>
-    </w:p>
-    <w:p>
-      <w:r>
-        <w:rPr>
-          <w:b w:val="0"/>
-          <w:sz w:val="22"/>
-        </w:rPr>
-        <w:t>④ 压缩说：预测 = 压缩</w:t>
-      </w:r>
-    </w:p>
-    <w:p>
-      <w:r>
-        <w:rPr>
-          <w:b w:val="0"/>
-          <w:sz w:val="22"/>
-        </w:rPr>
-        <w:t>Delétang et al. 2023[6]《Language Modeling Is Compression》</w:t>
-      </w:r>
-    </w:p>
-    <w:p>
-      <w:r>
-        <w:rPr>
-          <w:rFonts w:ascii="Consolas" w:hAnsi="Consolas" w:eastAsia="Consolas"/>
-          <w:b w:val="0"/>
-          <w:sz w:val="18"/>
-        </w:rPr>
-        <w:t>语言模型 = 压缩器：学到的权重 = 对世界文本的压缩</w:t>
-      </w:r>
-    </w:p>
-    <w:p>
-      <w:r>
-        <w:rPr>
-          <w:rFonts w:ascii="Consolas" w:hAnsi="Consolas" w:eastAsia="Consolas"/>
-          <w:b w:val="0"/>
-          <w:sz w:val="18"/>
-        </w:rPr>
-        <w:t>⇒ 这条最接近本文的框架：涌现 = 压缩世界时出现的结构</w:t>
-      </w:r>
-    </w:p>
-    <w:p>
-      <w:r>
-        <w:rPr>
-          <w:rFonts w:ascii="Consolas" w:hAnsi="Consolas" w:eastAsia="Consolas"/>
-          <w:b w:val="0"/>
-          <w:sz w:val="18"/>
-        </w:rPr>
-        <w:t>⇒ 但它仍是「结果层面的对应」，没有回答「为什么正好在这个规模/这个任务上出现」</w:t>
+        <w:t>解释涌现：没有公认答案</w:t>
       </w:r>
     </w:p>
     <w:p>
@@ -3771,7 +3288,25 @@
           <w:b/>
           <w:sz w:val="26"/>
         </w:rPr>
-        <w:t>8.3 为什么至今没有公认的「为什么」</w:t>
+        <w:t>7.2 现有的解释（按证据强度排列）</w:t>
+      </w:r>
+    </w:p>
+    <w:p>
+      <w:r>
+        <w:rPr>
+          <w:b w:val="0"/>
+          <w:sz w:val="22"/>
+        </w:rPr>
+        <w:t>① 度量假象说（最强的反方证据）</w:t>
+      </w:r>
+    </w:p>
+    <w:p>
+      <w:r>
+        <w:rPr>
+          <w:b w:val="0"/>
+          <w:sz w:val="22"/>
+        </w:rPr>
+        <w:t>Schaeffer, Miranda, Koyejo 2023[3]《Are Emergent Abilities of Large Language Models a Mirage?》</w:t>
       </w:r>
     </w:p>
     <w:p>
@@ -3781,7 +3316,7 @@
           <w:b w:val="0"/>
           <w:sz w:val="18"/>
         </w:rPr>
-        <w:t>① 规模实验不可控：无法做严格的因果对照（只改变规模、其他全相同）</w:t>
+        <w:t>主张：所谓涌现，可能是**评价指标的非线性/不连续**造成的假象；</w:t>
       </w:r>
     </w:p>
     <w:p>
@@ -3791,7 +3326,7 @@
           <w:b w:val="0"/>
           <w:sz w:val="18"/>
         </w:rPr>
-        <w:t>② 度量依赖：换指标，现象可能就消失（见 ①）</w:t>
+        <w:t xml:space="preserve">      换成连续指标（如对数似然），"突变"会消失，变成平滑上升</w:t>
       </w:r>
     </w:p>
     <w:p>
@@ -3801,7 +3336,25 @@
           <w:b w:val="0"/>
           <w:sz w:val="18"/>
         </w:rPr>
-        <w:t>③ 机制层不完整：知道某个回路、不知道整体为何会组织出该回路</w:t>
+        <w:t>⇒ 这动摇了「涌现是真实突变」这个前提本身</w:t>
+      </w:r>
+    </w:p>
+    <w:p>
+      <w:r>
+        <w:rPr>
+          <w:b w:val="0"/>
+          <w:sz w:val="22"/>
+        </w:rPr>
+        <w:t>② 机制解释：归纳头与电路（局部机制证据，不是完整"为什么"）</w:t>
+      </w:r>
+    </w:p>
+    <w:p>
+      <w:r>
+        <w:rPr>
+          <w:b w:val="0"/>
+          <w:sz w:val="22"/>
+        </w:rPr>
+        <w:t>Olsson et al. 2022[4]《In-context Learning and Induction Heads》</w:t>
       </w:r>
     </w:p>
     <w:p>
@@ -3811,7 +3364,113 @@
           <w:b w:val="0"/>
           <w:sz w:val="18"/>
         </w:rPr>
-        <w:t>④ 缺乏可预测的理论：没有理论能事先算出「多大模型会出现什么能力」</w:t>
+        <w:t>发现模型内部出现「归纳头」回路，解释部分上下文学习能力</w:t>
+      </w:r>
+    </w:p>
+    <w:p>
+      <w:r>
+        <w:rPr>
+          <w:rFonts w:ascii="Consolas" w:hAnsi="Consolas" w:eastAsia="Consolas"/>
+          <w:b w:val="0"/>
+          <w:sz w:val="18"/>
+        </w:rPr>
+        <w:t>⇒ 这是**机制层**的证据：说明了某种能力由什么结构实现</w:t>
+      </w:r>
+    </w:p>
+    <w:p>
+      <w:r>
+        <w:rPr>
+          <w:rFonts w:ascii="Consolas" w:hAnsi="Consolas" w:eastAsia="Consolas"/>
+          <w:b w:val="0"/>
+          <w:sz w:val="18"/>
+        </w:rPr>
+        <w:t>⇒ 但它只解释某个具体能力，不解释「为什么会出现涌现」这个一般问题</w:t>
+      </w:r>
+    </w:p>
+    <w:p>
+      <w:r>
+        <w:rPr>
+          <w:b w:val="0"/>
+          <w:sz w:val="22"/>
+        </w:rPr>
+        <w:t>③ Grokking：训练中的认知相变</w:t>
+      </w:r>
+    </w:p>
+    <w:p>
+      <w:r>
+        <w:rPr>
+          <w:b w:val="0"/>
+          <w:sz w:val="22"/>
+        </w:rPr>
+        <w:t>Power et al. 2022[5]《Grokking》</w:t>
+      </w:r>
+    </w:p>
+    <w:p>
+      <w:r>
+        <w:rPr>
+          <w:rFonts w:ascii="Consolas" w:hAnsi="Consolas" w:eastAsia="Consolas"/>
+          <w:b w:val="0"/>
+          <w:sz w:val="18"/>
+        </w:rPr>
+        <w:t>在小算法任务上，训练很久后泛化突然出现（像相变）</w:t>
+      </w:r>
+    </w:p>
+    <w:p>
+      <w:r>
+        <w:rPr>
+          <w:rFonts w:ascii="Consolas" w:hAnsi="Consolas" w:eastAsia="Consolas"/>
+          <w:b w:val="0"/>
+          <w:sz w:val="18"/>
+        </w:rPr>
+        <w:t>⇒ 说明「涌现」也发生在训练过程中，不一定只依赖规模</w:t>
+      </w:r>
+    </w:p>
+    <w:p>
+      <w:r>
+        <w:rPr>
+          <w:b w:val="0"/>
+          <w:sz w:val="22"/>
+        </w:rPr>
+        <w:t>④ 压缩说：预测 = 压缩</w:t>
+      </w:r>
+    </w:p>
+    <w:p>
+      <w:r>
+        <w:rPr>
+          <w:b w:val="0"/>
+          <w:sz w:val="22"/>
+        </w:rPr>
+        <w:t>Delétang et al. 2023[6]《Language Modeling Is Compression》</w:t>
+      </w:r>
+    </w:p>
+    <w:p>
+      <w:r>
+        <w:rPr>
+          <w:rFonts w:ascii="Consolas" w:hAnsi="Consolas" w:eastAsia="Consolas"/>
+          <w:b w:val="0"/>
+          <w:sz w:val="18"/>
+        </w:rPr>
+        <w:t>语言模型 = 压缩器：学到的权重 = 对世界文本的压缩</w:t>
+      </w:r>
+    </w:p>
+    <w:p>
+      <w:r>
+        <w:rPr>
+          <w:rFonts w:ascii="Consolas" w:hAnsi="Consolas" w:eastAsia="Consolas"/>
+          <w:b w:val="0"/>
+          <w:sz w:val="18"/>
+        </w:rPr>
+        <w:t>⇒ 这条最接近本文的框架：涌现 = 压缩世界时出现的结构</w:t>
+      </w:r>
+    </w:p>
+    <w:p>
+      <w:r>
+        <w:rPr>
+          <w:rFonts w:ascii="Consolas" w:hAnsi="Consolas" w:eastAsia="Consolas"/>
+          <w:b w:val="0"/>
+          <w:sz w:val="18"/>
+        </w:rPr>
+        <w:t>⇒ 但它仍是「结果层面的对应」，没有回答「为什么正好在这个规模/这个任务上出现」</w:t>
       </w:r>
     </w:p>
     <w:p>
@@ -3820,70 +3479,47 @@
           <w:b/>
           <w:sz w:val="26"/>
         </w:rPr>
-        <w:t>8.4 我们的立场：两个层次，一强一弱</w:t>
-      </w:r>
-    </w:p>
-    <w:p>
-      <w:r>
-        <w:rPr>
-          <w:b w:val="0"/>
-          <w:sz w:val="22"/>
-        </w:rPr>
-        <w:t>这个立场可以拆成两层，强度不一样，要分开看。</w:t>
-      </w:r>
-    </w:p>
-    <w:p>
-      <w:r>
-        <w:rPr>
-          <w:b w:val="0"/>
-          <w:sz w:val="22"/>
-        </w:rPr>
-        <w:t>第一层是字面事实，不是推测。 训练把人类语言压进参数；推理从参数里解压出文本。所以"AI 是对人类语言的解压"这句话几乎是定义式的：它压进去的是语言，解压出来的也是语言。链子是这样：</w:t>
-      </w:r>
-    </w:p>
-    <w:p>
-      <w:r>
-        <w:rPr>
-          <w:b w:val="0"/>
-          <w:sz w:val="22"/>
-        </w:rPr>
-        <w:t>宇宙 F → 环境 = 宇宙的局部解压 → 人类语言 = 人对环境与经验的解压产物（语言本身已被压过）→ AI = 对语言的再解压（在人的解压之上再压一层）。</w:t>
-      </w:r>
-    </w:p>
-    <w:p>
-      <w:r>
-        <w:rPr>
-          <w:b w:val="0"/>
-          <w:sz w:val="22"/>
-        </w:rPr>
-        <w:t>这一层不需要读者相信任何猜想，它就是"压缩/解压"这个词的用法本身。</w:t>
-      </w:r>
-    </w:p>
-    <w:p>
-      <w:r>
-        <w:rPr>
-          <w:b w:val="0"/>
-          <w:sz w:val="22"/>
-        </w:rPr>
-        <w:t>第二层才是 [推测]，也是本文要提出的解释。 AI 解压出的"世界结构"，上限由训练时刻的语言决定。它在语言内部能涌现出结构（看起来像推理、像理解），但那是语言结构的浮现，不是对宇宙本身的理解；语言一变，解压失配，而且无法自恢复。</w:t>
-      </w:r>
-    </w:p>
-    <w:p>
-      <w:r>
-        <w:rPr>
-          <w:b w:val="0"/>
-          <w:sz w:val="22"/>
-        </w:rPr>
-        <w:t>用前面的尺子看，这一层还给出一个可检验的判断：模型是冻结的函数点，不维持、不自己改自己、不付代价，所以它是"把人类语言解压了一次"，而不是"维持着解压"或"自己改写解压规则"。</w:t>
-      </w:r>
-    </w:p>
-    <w:p>
-      <w:r>
-        <w:rPr>
-          <w:b w:val="0"/>
-          <w:sz w:val="22"/>
-        </w:rPr>
-        <w:t>由此得到一句可检验的话：AI 表现出的"理解"，本质是对"人对世界的描述"的理解，不是对世界本身的理解。它能解压语言，但语言之外的宇宙层（能量、不可逆、代价）它从未付费，也就从未被检验。</w:t>
+        <w:t>7.3 为什么至今没有公认的「为什么」</w:t>
+      </w:r>
+    </w:p>
+    <w:p>
+      <w:r>
+        <w:rPr>
+          <w:rFonts w:ascii="Consolas" w:hAnsi="Consolas" w:eastAsia="Consolas"/>
+          <w:b w:val="0"/>
+          <w:sz w:val="18"/>
+        </w:rPr>
+        <w:t>① 规模实验不可控：无法做严格的因果对照（只改变规模、其他全相同）</w:t>
+      </w:r>
+    </w:p>
+    <w:p>
+      <w:r>
+        <w:rPr>
+          <w:rFonts w:ascii="Consolas" w:hAnsi="Consolas" w:eastAsia="Consolas"/>
+          <w:b w:val="0"/>
+          <w:sz w:val="18"/>
+        </w:rPr>
+        <w:t>② 度量依赖：换指标，现象可能就消失（见 ①）</w:t>
+      </w:r>
+    </w:p>
+    <w:p>
+      <w:r>
+        <w:rPr>
+          <w:rFonts w:ascii="Consolas" w:hAnsi="Consolas" w:eastAsia="Consolas"/>
+          <w:b w:val="0"/>
+          <w:sz w:val="18"/>
+        </w:rPr>
+        <w:t>③ 机制层不完整：知道某个回路、不知道整体为何会组织出该回路</w:t>
+      </w:r>
+    </w:p>
+    <w:p>
+      <w:r>
+        <w:rPr>
+          <w:rFonts w:ascii="Consolas" w:hAnsi="Consolas" w:eastAsia="Consolas"/>
+          <w:b w:val="0"/>
+          <w:sz w:val="18"/>
+        </w:rPr>
+        <w:t>④ 缺乏可预测的理论：没有理论能事先算出「多大模型会出现什么能力」</w:t>
       </w:r>
     </w:p>
     <w:p>
@@ -3892,7 +3528,7 @@
           <w:b/>
           <w:sz w:val="26"/>
         </w:rPr>
-        <w:t>8.5 解压能力的衰减：上层写死 ⇒ 语言一变，解压变弱</w:t>
+        <w:t>7.4 我们的立场：AI 是对语言的 p语言 的压缩与解压</w:t>
       </w:r>
     </w:p>
     <w:p>
@@ -3901,47 +3537,7 @@
           <w:b w:val="0"/>
           <w:sz w:val="22"/>
         </w:rPr>
-        <w:t>人类语言会不断发现新东西；而模型的解压规则（权重/上层）是写死的、训练完就不再变。两者必然失配。</w:t>
-      </w:r>
-    </w:p>
-    <w:p>
-      <w:r>
-        <w:rPr>
-          <w:rFonts w:ascii="Consolas" w:hAnsi="Consolas" w:eastAsia="Consolas"/>
-          <w:b w:val="0"/>
-          <w:sz w:val="18"/>
-        </w:rPr>
-        <w:t>源分布移动：人类语言发现新东西 ⇒ 要解压的对象变了</w:t>
-      </w:r>
-    </w:p>
-    <w:p>
-      <w:r>
-        <w:rPr>
-          <w:rFonts w:ascii="Consolas" w:hAnsi="Consolas" w:eastAsia="Consolas"/>
-          <w:b w:val="0"/>
-          <w:sz w:val="18"/>
-        </w:rPr>
-        <w:t>解压器冻结：模型权重不变     ⇒ 它解压的还是**旧语言**</w:t>
-      </w:r>
-    </w:p>
-    <w:p>
-      <w:r>
-        <w:rPr>
-          <w:rFonts w:ascii="Consolas" w:hAnsi="Consolas" w:eastAsia="Consolas"/>
-          <w:b w:val="0"/>
-          <w:sz w:val="18"/>
-        </w:rPr>
-        <w:t>⇒ 压缩收益下降：gain_bits = log2 p_model − log2 p_base 中 p_model 与源失配</w:t>
-      </w:r>
-    </w:p>
-    <w:p>
-      <w:r>
-        <w:rPr>
-          <w:rFonts w:ascii="Consolas" w:hAnsi="Consolas" w:eastAsia="Consolas"/>
-          <w:b w:val="0"/>
-          <w:sz w:val="18"/>
-        </w:rPr>
-        <w:t>⇒ 它昨天"涌现"出来的理解，今天就是过时的解压</w:t>
+        <w:t>这一节先说一层不需要推测的东西，再说剩下的推测。</w:t>
       </w:r>
     </w:p>
     <w:p>
@@ -3950,47 +3546,7 @@
           <w:b w:val="0"/>
           <w:sz w:val="22"/>
         </w:rPr>
-        <w:t>三条后果：</w:t>
-      </w:r>
-    </w:p>
-    <w:p>
-      <w:r>
-        <w:rPr>
-          <w:rFonts w:ascii="Consolas" w:hAnsi="Consolas" w:eastAsia="Consolas"/>
-          <w:b w:val="0"/>
-          <w:sz w:val="18"/>
-        </w:rPr>
-        <w:t>① 它的解压能力有**固定上限**：上限由训练时刻的语言决定，不随语言进化而上升</w:t>
-      </w:r>
-    </w:p>
-    <w:p>
-      <w:r>
-        <w:rPr>
-          <w:rFonts w:ascii="Consolas" w:hAnsi="Consolas" w:eastAsia="Consolas"/>
-          <w:b w:val="0"/>
-          <w:sz w:val="18"/>
-        </w:rPr>
-        <w:t>② 它无法自己补上失配：更新规则在外部 —— 要恢复，只能靠人类再训练一次</w:t>
-      </w:r>
-    </w:p>
-    <w:p>
-      <w:r>
-        <w:rPr>
-          <w:rFonts w:ascii="Consolas" w:hAnsi="Consolas" w:eastAsia="Consolas"/>
-          <w:b w:val="0"/>
-          <w:sz w:val="18"/>
-        </w:rPr>
-        <w:t xml:space="preserve">   ⇒ 这正是第三节说的「更新在外部」的代价</w:t>
-      </w:r>
-    </w:p>
-    <w:p>
-      <w:r>
-        <w:rPr>
-          <w:rFonts w:ascii="Consolas" w:hAnsi="Consolas" w:eastAsia="Consolas"/>
-          <w:b w:val="0"/>
-          <w:sz w:val="18"/>
-        </w:rPr>
-        <w:t>③ 它的"涌现"是**某个时间片上的解压产物**，不是可持续的能力</w:t>
+        <w:t>先说事实层。训练把语言压进参数，推理从参数里解压出文本。用前面的记号说：AI 压缩的是语言的 p语言——语言里可函数化的那部分；它解压出来的也是 p语言。R语言 不进参数，也不从参数里出来。所以准确的说法不是"AI 是对人类语言的解压"，而是"AI 是对人类语言中可函数化部分的压缩与解压"。</w:t>
       </w:r>
     </w:p>
     <w:p>
@@ -3999,7 +3555,7 @@
           <w:b w:val="0"/>
           <w:sz w:val="22"/>
         </w:rPr>
-        <w:t>⇒ 用本文的尺子说：</w:t>
+        <w:t>这一层不是推测，是字面事实：它由"压缩/解压"这两个词的用法决定，也由训练与推理的实际过程决定。链子是这样：</w:t>
       </w:r>
     </w:p>
     <w:p>
@@ -4008,7 +3564,7 @@
           <w:b w:val="0"/>
           <w:sz w:val="22"/>
         </w:rPr>
-        <w:t>生命必须让解压器跟着世界一起动（自指更新 + 自我维持）；</w:t>
+        <w:t>宇宙 F → 环境 = 宇宙的局部解压 → 人类语言 = 人对环境与经验的解压产物（语言本身已被压过）→ AI = 对语言 p语言 的再压缩与再解压。</w:t>
       </w:r>
     </w:p>
     <w:p>
@@ -4017,7 +3573,25 @@
           <w:b w:val="0"/>
           <w:sz w:val="22"/>
         </w:rPr>
-        <w:t>冻结的 AI 做不到这一点 —— 所以语言一更新，它的解压就变弱。</w:t>
+        <w:t>然后才是推测层。AI 解压出的"世界结构"，上限由训练时刻的语言决定。它在语言内部能涌现出结构（看起来像推理、像理解），但那是语言结构的浮现，不是对宇宙本身的理解；语言一变，解压失配，而且无法自恢复。</w:t>
+      </w:r>
+    </w:p>
+    <w:p>
+      <w:r>
+        <w:rPr>
+          <w:b w:val="0"/>
+          <w:sz w:val="22"/>
+        </w:rPr>
+        <w:t>用前面的尺子看，这一层还给出一个可检验的判断：模型是冻结的函数点，不维持、不自己改自己、不付代价，所以它是"把人类语言解压了一次"，而不是"维持着解压"或"自己改写解压规则"。</w:t>
+      </w:r>
+    </w:p>
+    <w:p>
+      <w:r>
+        <w:rPr>
+          <w:b w:val="0"/>
+          <w:sz w:val="22"/>
+        </w:rPr>
+        <w:t>由此得到一句可检验的话：AI 表现出的"理解"，本质是对"人对世界的描述"的理解，不是对世界本身的理解。它能解压语言，但语言之外的宇宙层（能量、不可逆、代价）它从未付费，也就从未被检验。</w:t>
       </w:r>
     </w:p>
     <w:p>
@@ -4026,7 +3600,16 @@
           <w:b/>
           <w:sz w:val="26"/>
         </w:rPr>
-        <w:t>8.6 由立场推出的两条预测（[推测]，供读者判断）</w:t>
+        <w:t>7.5 解压能力的衰减：上层写死 ⇒ 语言一变，解压变弱</w:t>
+      </w:r>
+    </w:p>
+    <w:p>
+      <w:r>
+        <w:rPr>
+          <w:b w:val="0"/>
+          <w:sz w:val="22"/>
+        </w:rPr>
+        <w:t>人类语言会不断发现新东西；而模型的解压规则（权重/上层）是写死的、训练完就不再变。两者必然失配。</w:t>
       </w:r>
     </w:p>
     <w:p>
@@ -4036,7 +3619,7 @@
           <w:b w:val="0"/>
           <w:sz w:val="18"/>
         </w:rPr>
-        <w:t>① 若把世界换成未被人类语言描述过的部分（无法从语料中学到的规律），</w:t>
+        <w:t>源分布移动：人类语言发现新东西 ⇒ 要解压的对象变了</w:t>
       </w:r>
     </w:p>
     <w:p>
@@ -4046,7 +3629,7 @@
           <w:b w:val="0"/>
           <w:sz w:val="18"/>
         </w:rPr>
-        <w:t xml:space="preserve">   AI 的"涌现"应显著减弱 —— 因为它解压的是语言，不是宇宙</w:t>
+        <w:t>解压器冻结：模型权重不变     ⇒ 它解压的还是**旧语言**</w:t>
       </w:r>
     </w:p>
     <w:p>
@@ -4056,7 +3639,7 @@
           <w:b w:val="0"/>
           <w:sz w:val="18"/>
         </w:rPr>
-        <w:t>② 若让模型自己付代价（自己维持、自己修、自己死），语言解压不足以支撑，</w:t>
+        <w:t>⇒ 压缩收益下降：gain_bits = log2 p_model − log2 p_base 中 p_model 与源失配</w:t>
       </w:r>
     </w:p>
     <w:p>
@@ -4066,7 +3649,16 @@
           <w:b w:val="0"/>
           <w:sz w:val="18"/>
         </w:rPr>
-        <w:t xml:space="preserve">   它必须发展出语言之外的理解方式 —— 否则活不下来</w:t>
+        <w:t>⇒ 它昨天"涌现"出来的理解，今天就是过时的解压</w:t>
+      </w:r>
+    </w:p>
+    <w:p>
+      <w:r>
+        <w:rPr>
+          <w:b w:val="0"/>
+          <w:sz w:val="22"/>
+        </w:rPr>
+        <w:t>三条后果：</w:t>
       </w:r>
     </w:p>
     <w:p>
@@ -4076,7 +3668,7 @@
           <w:b w:val="0"/>
           <w:sz w:val="18"/>
         </w:rPr>
-        <w:t>③ 若人类语言发生一次大的结构更新（新范式/新概念体系），冻结模型的解压收益</w:t>
+        <w:t>① 它的解压能力有**固定上限**：上限由训练时刻的语言决定，不随语言进化而上升</w:t>
       </w:r>
     </w:p>
     <w:p>
@@ -4086,7 +3678,54 @@
           <w:b w:val="0"/>
           <w:sz w:val="18"/>
         </w:rPr>
-        <w:t xml:space="preserve">   应出现可测的下降；且它无法自己恢复 ⇒ 恢复必须来自外部再训练</w:t>
+        <w:t>② 它无法自己补上失配：更新规则在外部 —— 要恢复，只能靠人类再训练一次</w:t>
+      </w:r>
+    </w:p>
+    <w:p>
+      <w:r>
+        <w:rPr>
+          <w:rFonts w:ascii="Consolas" w:hAnsi="Consolas" w:eastAsia="Consolas"/>
+          <w:b w:val="0"/>
+          <w:sz w:val="18"/>
+        </w:rPr>
+        <w:t xml:space="preserve">   ⇒ 这正是第三节说的「更新在外部」的代价</w:t>
+      </w:r>
+    </w:p>
+    <w:p>
+      <w:r>
+        <w:rPr>
+          <w:rFonts w:ascii="Consolas" w:hAnsi="Consolas" w:eastAsia="Consolas"/>
+          <w:b w:val="0"/>
+          <w:sz w:val="18"/>
+        </w:rPr>
+        <w:t>③ 它的"涌现"是**某个时间片上的解压产物**，不是可持续的能力</w:t>
+      </w:r>
+    </w:p>
+    <w:p>
+      <w:r>
+        <w:rPr>
+          <w:b w:val="0"/>
+          <w:sz w:val="22"/>
+        </w:rPr>
+        <w:t>⇒ 用本文的尺子说：</w:t>
+      </w:r>
+    </w:p>
+    <w:p>
+      <w:r>
+        <w:rPr>
+          <w:b w:val="0"/>
+          <w:sz w:val="22"/>
+        </w:rPr>
+        <w:t>生命必须让解压器跟着世界一起动（自指更新 + 自我维持）；</w:t>
+      </w:r>
+    </w:p>
+    <w:p>
+      <w:r>
+        <w:rPr>
+          <w:b w:val="0"/>
+          <w:sz w:val="22"/>
+        </w:rPr>
+        <w:t>冻结的 AI 做不到这一点 —— 所以语言一更新，它的解压就变弱。</w:t>
       </w:r>
     </w:p>
     <w:p>
@@ -4095,7 +3734,7 @@
           <w:b/>
           <w:sz w:val="26"/>
         </w:rPr>
-        <w:t>8.7 标注</w:t>
+        <w:t>7.6 由立场推出的两条预测（[推测]，供读者判断）</w:t>
       </w:r>
     </w:p>
     <w:p>
@@ -4105,7 +3744,7 @@
           <w:b w:val="0"/>
           <w:sz w:val="18"/>
         </w:rPr>
-        <w:t>[事实] 涌现现象被广泛观察到；度量假象说也有强证据（Schaeffer 2023）</w:t>
+        <w:t>① 若把世界换成未被人类语言描述过的部分（无法从语料中学到的规律），</w:t>
       </w:r>
     </w:p>
     <w:p>
@@ -4115,7 +3754,7 @@
           <w:b w:val="0"/>
           <w:sz w:val="18"/>
         </w:rPr>
-        <w:t>[已知] 机制层有局部解释（归纳头/电路/grokking），压缩视角有对应关系</w:t>
+        <w:t xml:space="preserve">   AI 的"涌现"应显著减弱 —— 因为它解压的是语言，不是宇宙</w:t>
       </w:r>
     </w:p>
     <w:p>
@@ -4125,7 +3764,7 @@
           <w:b w:val="0"/>
           <w:sz w:val="18"/>
         </w:rPr>
-        <w:t>[推测] 「涌现 = 压缩世界的结构呈现」——本文立场，非证据</w:t>
+        <w:t>② 若让模型自己维持（自己修、自己死），语言解压不足以支撑，</w:t>
       </w:r>
     </w:p>
     <w:p>
@@ -4135,7 +3774,7 @@
           <w:b w:val="0"/>
           <w:sz w:val="18"/>
         </w:rPr>
-        <w:t>[未解决] 为什么正好在某个规模/任务上出现 ⇒ 没有人给出可预测的理论</w:t>
+        <w:t xml:space="preserve">   它必须发展出语言之外的理解方式 —— 否则活不下来</w:t>
       </w:r>
     </w:p>
     <w:p>
@@ -4145,7 +3784,7 @@
           <w:b w:val="0"/>
           <w:sz w:val="18"/>
         </w:rPr>
-        <w:t>[本文态度] 不把「AI 涌现」当作生命存在的证据；按第三节的尺子，它不是</w:t>
+        <w:t>③ 若人类语言发生一次大的结构更新（新范式/新概念体系），冻结模型的解压收益</w:t>
       </w:r>
     </w:p>
     <w:p>
@@ -4155,17 +3794,7 @@
           <w:b w:val="0"/>
           <w:sz w:val="18"/>
         </w:rPr>
-        <w:t>[本文立场] AI 是对**人类语言**的再解压（宇宙→环境→语言→AI 的第三层解压）</w:t>
-      </w:r>
-    </w:p>
-    <w:p>
-      <w:r>
-        <w:rPr>
-          <w:rFonts w:ascii="Consolas" w:hAnsi="Consolas" w:eastAsia="Consolas"/>
-          <w:b w:val="0"/>
-          <w:sz w:val="18"/>
-        </w:rPr>
-        <w:t>[推论] 上层写死 ⇒ 语言一更新就失配 ⇒ 解压能力有固定上限、无法自己恢复</w:t>
+        <w:t xml:space="preserve">   应出现可测的下降；且它无法自己恢复 ⇒ 恢复必须来自外部再训练</w:t>
       </w:r>
     </w:p>
     <w:p>
@@ -4174,190 +3803,77 @@
           <w:b/>
           <w:sz w:val="26"/>
         </w:rPr>
-        <w:t>九、用它看几个热门问题</w:t>
-      </w:r>
-    </w:p>
-    <w:p>
-      <w:r>
-        <w:rPr>
-          <w:b w:val="0"/>
-          <w:sz w:val="22"/>
-        </w:rPr>
-        <w:t>本节是应用，不是新证据；每条都由第二～五节直接推出。</w:t>
-      </w:r>
-    </w:p>
-    <w:p>
-      <w:r>
-        <w:rPr>
-          <w:b w:val="0"/>
-          <w:sz w:val="22"/>
-        </w:rPr>
-        <w:t>① 幻觉 = 在无结构处强行解压</w:t>
-      </w:r>
-    </w:p>
-    <w:p>
-      <w:r>
-        <w:rPr>
-          <w:b w:val="0"/>
-          <w:sz w:val="22"/>
-        </w:rPr>
-        <w:t>解压器必须输出结构；当输入对应的语言区域本身缺乏可压结构时，它只能造一个「看起来合理」的结构 ⇒ 幻觉是解压失败的必然表现，不是偶发 bug。</w:t>
-      </w:r>
-    </w:p>
-    <w:p>
-      <w:r>
-        <w:rPr>
-          <w:b w:val="0"/>
-          <w:sz w:val="22"/>
-        </w:rPr>
-        <w:t>② scaling law 仍有效，正因为模型维度还没贴合语言维度</w:t>
-      </w:r>
-    </w:p>
-    <w:p>
-      <w:r>
-        <w:rPr>
-          <w:b w:val="0"/>
-          <w:sz w:val="22"/>
-        </w:rPr>
-        <w:t>语言是一个高维结构，且维度在增长（新概念 = 新维度；升维 ⇒ 可压性上升）。模型维度在训练时被切定（D_M 固定），语言维度在不断增长（D_L(t) 在升）。现在的观测是 D_M &lt;&lt; D_L(t) ⇒ 继续加规模能捕捉更多语言维度 ⇒ loss 继续下降（scaling 看起来仍有效）。</w:t>
-      </w:r>
-    </w:p>
-    <w:p>
-      <w:r>
-        <w:rPr>
-          <w:b w:val="0"/>
-          <w:sz w:val="22"/>
-        </w:rPr>
-        <w:t>⇒ 所以 scaling 有效不是本文论断的反证，而是「还没贴合」的证据。</w:t>
-      </w:r>
-    </w:p>
-    <w:p>
-      <w:r>
-        <w:rPr>
-          <w:b w:val="0"/>
-          <w:sz w:val="22"/>
-        </w:rPr>
-        <w:t>⇒ 预测：当 D_M 接近当时的 D_L 时，scaling 收益应明显变平；而 D_L 继续升维 ⇒ 缺口再现。</w:t>
-      </w:r>
-    </w:p>
-    <w:p>
-      <w:r>
-        <w:rPr>
-          <w:b w:val="0"/>
-          <w:sz w:val="22"/>
-        </w:rPr>
-        <w:t>⇒ 冻结模型的根本问题：它的 D_M 是死的，而 D_L 是活的。</w:t>
-      </w:r>
-    </w:p>
-    <w:p>
-      <w:r>
-        <w:rPr>
-          <w:b w:val="0"/>
-          <w:sz w:val="22"/>
-        </w:rPr>
-        <w:t>③ 能力参差不齐 = 语言各领域的可压性不同</w:t>
-      </w:r>
-    </w:p>
-    <w:p>
-      <w:r>
-        <w:rPr>
-          <w:b w:val="0"/>
-          <w:sz w:val="22"/>
-        </w:rPr>
-        <w:t>可压强的领域（结构明确、示例多）表现好；可压弱的领域（结构稀薄、样本少）表现差 ⇒ 强弱分布是语言分布的镜像。</w:t>
-      </w:r>
-    </w:p>
-    <w:p>
-      <w:r>
-        <w:rPr>
-          <w:b w:val="0"/>
-          <w:sz w:val="22"/>
-        </w:rPr>
-        <w:t>④ 为什么要 RLHF = 它没有「自我代价」回路</w:t>
-      </w:r>
-    </w:p>
-    <w:p>
-      <w:r>
-        <w:rPr>
-          <w:b w:val="0"/>
-          <w:sz w:val="22"/>
-        </w:rPr>
-        <w:t>它无法判断自己解压得对不对（没有收入/支出、不会因此死亡），所以必须由人从外部打分 ⇒ 对齐需求的根源是它不自我维持。</w:t>
-      </w:r>
-    </w:p>
-    <w:p>
-      <w:r>
-        <w:rPr>
-          <w:b w:val="0"/>
-          <w:sz w:val="22"/>
-        </w:rPr>
-        <w:t>⑤ 涌现 = 语言结构在解压产物上的呈现</w:t>
-      </w:r>
-    </w:p>
-    <w:p>
-      <w:r>
-        <w:rPr>
-          <w:b w:val="0"/>
-          <w:sz w:val="22"/>
-        </w:rPr>
-        <w:t>规模跨过阈值时，某些语言结构第一次被压出来 ⇒ 看起来像「突然会了」。</w:t>
-      </w:r>
-    </w:p>
-    <w:p>
-      <w:pPr>
-        <w:jc w:val="center"/>
-      </w:pPr>
-      <w:r>
-        <w:rPr>
-          <w:b/>
-          <w:sz w:val="34"/>
-        </w:rPr>
-        <w:t>第六节 · 测量层面：既有工作与本文的位置</w:t>
-      </w:r>
-    </w:p>
-    <w:p>
-      <w:r>
-        <w:rPr>
-          <w:b w:val="0"/>
-          <w:sz w:val="22"/>
-        </w:rPr>
-        <w:t>已有工作（三个侧面）：</w:t>
-      </w:r>
-    </w:p>
-    <w:p>
-      <w:r>
-        <w:rPr>
-          <w:b w:val="0"/>
-          <w:sz w:val="22"/>
-        </w:rPr>
-        <w:t>• 模型侧维度：token 嵌入的内在维度测量[12]</w:t>
-      </w:r>
-    </w:p>
-    <w:p>
-      <w:r>
-        <w:rPr>
-          <w:b w:val="0"/>
-          <w:sz w:val="22"/>
-        </w:rPr>
-        <w:t>• 时间侧落后：大模型时间训练边界的识别[13]</w:t>
-      </w:r>
-    </w:p>
-    <w:p>
-      <w:r>
-        <w:rPr>
-          <w:b w:val="0"/>
-          <w:sz w:val="22"/>
-        </w:rPr>
-        <w:t>• 语言侧复杂度：构式视角下的语言复杂度测量[14]</w:t>
-      </w:r>
-    </w:p>
-    <w:p>
-      <w:r>
-        <w:rPr>
-          <w:b w:val="0"/>
-          <w:sz w:val="22"/>
-        </w:rPr>
-        <w:t>⇒ 已有工作分别测量了这三个侧面；本文把它们串起来：以「持续更新的模型」为参照系，按领域测「语言侧新增维度」与「模型侧固定维度」之间的失配速率。这是本文在测量层面的位置。</w:t>
+        <w:t>7.7 标注</w:t>
+      </w:r>
+    </w:p>
+    <w:p>
+      <w:r>
+        <w:rPr>
+          <w:rFonts w:ascii="Consolas" w:hAnsi="Consolas" w:eastAsia="Consolas"/>
+          <w:b w:val="0"/>
+          <w:sz w:val="18"/>
+        </w:rPr>
+        <w:t>[事实] 涌现现象被广泛观察到；度量假象说也有强证据（Schaeffer 2023）</w:t>
+      </w:r>
+    </w:p>
+    <w:p>
+      <w:r>
+        <w:rPr>
+          <w:rFonts w:ascii="Consolas" w:hAnsi="Consolas" w:eastAsia="Consolas"/>
+          <w:b w:val="0"/>
+          <w:sz w:val="18"/>
+        </w:rPr>
+        <w:t>[已知] 机制层有局部解释（归纳头/电路/grokking），压缩视角有对应关系</w:t>
+      </w:r>
+    </w:p>
+    <w:p>
+      <w:r>
+        <w:rPr>
+          <w:rFonts w:ascii="Consolas" w:hAnsi="Consolas" w:eastAsia="Consolas"/>
+          <w:b w:val="0"/>
+          <w:sz w:val="18"/>
+        </w:rPr>
+        <w:t>[推测] 「涌现 = 压缩世界的结构呈现」——本文立场，非证据</w:t>
+      </w:r>
+    </w:p>
+    <w:p>
+      <w:r>
+        <w:rPr>
+          <w:rFonts w:ascii="Consolas" w:hAnsi="Consolas" w:eastAsia="Consolas"/>
+          <w:b w:val="0"/>
+          <w:sz w:val="18"/>
+        </w:rPr>
+        <w:t>[未解决] 为什么正好在某个规模/任务上出现 ⇒ 没有人给出可预测的理论</w:t>
+      </w:r>
+    </w:p>
+    <w:p>
+      <w:r>
+        <w:rPr>
+          <w:rFonts w:ascii="Consolas" w:hAnsi="Consolas" w:eastAsia="Consolas"/>
+          <w:b w:val="0"/>
+          <w:sz w:val="18"/>
+        </w:rPr>
+        <w:t>[本文态度] 不把「AI 涌现」当作生命存在的证据；按第三节的尺子，它不是</w:t>
+      </w:r>
+    </w:p>
+    <w:p>
+      <w:r>
+        <w:rPr>
+          <w:rFonts w:ascii="Consolas" w:hAnsi="Consolas" w:eastAsia="Consolas"/>
+          <w:b w:val="0"/>
+          <w:sz w:val="18"/>
+        </w:rPr>
+        <w:t>[本文立场] AI 是对**人类语言**的再解压（宇宙→环境→语言→AI 的第三层解压）</w:t>
+      </w:r>
+    </w:p>
+    <w:p>
+      <w:r>
+        <w:rPr>
+          <w:rFonts w:ascii="Consolas" w:hAnsi="Consolas" w:eastAsia="Consolas"/>
+          <w:b w:val="0"/>
+          <w:sz w:val="18"/>
+        </w:rPr>
+        <w:t>[推论] 上层写死 ⇒ 语言一更新就失配 ⇒ 解压能力有固定上限、无法自己恢复</w:t>
       </w:r>
     </w:p>
     <w:p>
@@ -4366,7 +3882,7 @@
           <w:b/>
           <w:sz w:val="26"/>
         </w:rPr>
-        <w:t>十、本文得到了什么，没得到什么</w:t>
+        <w:t>八、用它看几个热门问题</w:t>
       </w:r>
     </w:p>
     <w:p>
@@ -4375,6 +3891,186 @@
           <w:b w:val="0"/>
           <w:sz w:val="22"/>
         </w:rPr>
+        <w:t>本节是应用，不是新证据；每条都由第二～五节直接推出。</w:t>
+      </w:r>
+    </w:p>
+    <w:p>
+      <w:r>
+        <w:rPr>
+          <w:b w:val="0"/>
+          <w:sz w:val="22"/>
+        </w:rPr>
+        <w:t>① 幻觉 = 在无结构处强行解压</w:t>
+      </w:r>
+    </w:p>
+    <w:p>
+      <w:r>
+        <w:rPr>
+          <w:b w:val="0"/>
+          <w:sz w:val="22"/>
+        </w:rPr>
+        <w:t>解压器必须输出结构；当输入对应的语言区域本身缺乏可压结构时，它只能造一个「看起来合理」的结构 ⇒ 幻觉是解压失败的必然表现，不是偶发 bug。</w:t>
+      </w:r>
+    </w:p>
+    <w:p>
+      <w:r>
+        <w:rPr>
+          <w:b w:val="0"/>
+          <w:sz w:val="22"/>
+        </w:rPr>
+        <w:t>② scaling law 仍有效，正因为模型维度还没贴合语言维度</w:t>
+      </w:r>
+    </w:p>
+    <w:p>
+      <w:r>
+        <w:rPr>
+          <w:b w:val="0"/>
+          <w:sz w:val="22"/>
+        </w:rPr>
+        <w:t>语言是一个高维结构，且维度在增长（新概念 = 新维度；升维 ⇒ 可压性上升）。模型维度在训练时被切定（D_M 固定），语言维度在不断增长（D_L(t) 在升）。现在的观测是 D_M &lt;&lt; D_L(t) ⇒ 继续加规模能捕捉更多语言维度 ⇒ loss 继续下降（scaling 看起来仍有效）。</w:t>
+      </w:r>
+    </w:p>
+    <w:p>
+      <w:r>
+        <w:rPr>
+          <w:b w:val="0"/>
+          <w:sz w:val="22"/>
+        </w:rPr>
+        <w:t>⇒ 所以 scaling 有效不是本文论断的反证，而是「还没贴合」的证据。</w:t>
+      </w:r>
+    </w:p>
+    <w:p>
+      <w:r>
+        <w:rPr>
+          <w:b w:val="0"/>
+          <w:sz w:val="22"/>
+        </w:rPr>
+        <w:t>⇒ 预测：当 D_M 接近当时的 D_L 时，scaling 收益应明显变平；而 D_L 继续升维 ⇒ 缺口再现。</w:t>
+      </w:r>
+    </w:p>
+    <w:p>
+      <w:r>
+        <w:rPr>
+          <w:b w:val="0"/>
+          <w:sz w:val="22"/>
+        </w:rPr>
+        <w:t>⇒ 冻结模型的根本问题：它的 D_M 是死的，而 D_L 是活的。</w:t>
+      </w:r>
+    </w:p>
+    <w:p>
+      <w:r>
+        <w:rPr>
+          <w:b w:val="0"/>
+          <w:sz w:val="22"/>
+        </w:rPr>
+        <w:t>③ 能力参差不齐 = 语言各领域的可压性不同</w:t>
+      </w:r>
+    </w:p>
+    <w:p>
+      <w:r>
+        <w:rPr>
+          <w:b w:val="0"/>
+          <w:sz w:val="22"/>
+        </w:rPr>
+        <w:t>可压强的领域（结构明确、示例多）表现好；可压弱的领域（结构稀薄、样本少）表现差 ⇒ 强弱分布是语言分布的镜像。</w:t>
+      </w:r>
+    </w:p>
+    <w:p>
+      <w:r>
+        <w:rPr>
+          <w:b w:val="0"/>
+          <w:sz w:val="22"/>
+        </w:rPr>
+        <w:t>④ 为什么要 RLHF = 它没有「自我代价」回路</w:t>
+      </w:r>
+    </w:p>
+    <w:p>
+      <w:r>
+        <w:rPr>
+          <w:b w:val="0"/>
+          <w:sz w:val="22"/>
+        </w:rPr>
+        <w:t>它无法判断自己解压得对不对（没有收入/支出、不会因此死亡），所以必须由人从外部打分 ⇒ 对齐需求的根源是它不自我维持。</w:t>
+      </w:r>
+    </w:p>
+    <w:p>
+      <w:r>
+        <w:rPr>
+          <w:b w:val="0"/>
+          <w:sz w:val="22"/>
+        </w:rPr>
+        <w:t>⑤ 涌现 = 语言结构在解压产物上的呈现</w:t>
+      </w:r>
+    </w:p>
+    <w:p>
+      <w:r>
+        <w:rPr>
+          <w:b w:val="0"/>
+          <w:sz w:val="22"/>
+        </w:rPr>
+        <w:t>规模跨过阈值时，某些语言结构第一次被压出来 ⇒ 看起来像「突然会了」。</w:t>
+      </w:r>
+    </w:p>
+    <w:p>
+      <w:r>
+        <w:rPr>
+          <w:b w:val="0"/>
+          <w:sz w:val="22"/>
+        </w:rPr>
+        <w:t>已有工作（三个侧面）：</w:t>
+      </w:r>
+    </w:p>
+    <w:p>
+      <w:r>
+        <w:rPr>
+          <w:b w:val="0"/>
+          <w:sz w:val="22"/>
+        </w:rPr>
+        <w:t>• 模型侧维度：token 嵌入的内在维度测量[12]</w:t>
+      </w:r>
+    </w:p>
+    <w:p>
+      <w:r>
+        <w:rPr>
+          <w:b w:val="0"/>
+          <w:sz w:val="22"/>
+        </w:rPr>
+        <w:t>• 时间侧落后：大模型时间训练边界的识别[13]</w:t>
+      </w:r>
+    </w:p>
+    <w:p>
+      <w:r>
+        <w:rPr>
+          <w:b w:val="0"/>
+          <w:sz w:val="22"/>
+        </w:rPr>
+        <w:t>• 语言侧复杂度：构式视角下的语言复杂度测量[14]</w:t>
+      </w:r>
+    </w:p>
+    <w:p>
+      <w:r>
+        <w:rPr>
+          <w:b w:val="0"/>
+          <w:sz w:val="22"/>
+        </w:rPr>
+        <w:t>⇒ 已有工作分别测量了这三个侧面；本文把它们串起来：以「持续更新的模型」为参照系，按领域测「语言侧新增维度」与「模型侧固定维度」之间的失配速率。这是本文在测量层面的位置。</w:t>
+      </w:r>
+    </w:p>
+    <w:p>
+      <w:r>
+        <w:rPr>
+          <w:b/>
+          <w:sz w:val="26"/>
+        </w:rPr>
+        <w:t>九、本文得到了什么，没得到什么</w:t>
+      </w:r>
+    </w:p>
+    <w:p>
+      <w:r>
+        <w:rPr>
+          <w:b w:val="0"/>
+          <w:sz w:val="22"/>
+        </w:rPr>
         <w:t>得到了三样东西。</w:t>
       </w:r>
     </w:p>
@@ -4420,7 +4116,7 @@
           <w:b w:val="0"/>
           <w:sz w:val="22"/>
         </w:rPr>
-        <w:t>第一，没有证明"世界是函数"——第三层仍是猜想。</w:t>
+        <w:t>第一，没有证明宇宙整体可被函数化——本文只用 P ≠ ∅。</w:t>
       </w:r>
     </w:p>
     <w:p>
@@ -4457,6 +4153,141 @@
           <w:sz w:val="22"/>
         </w:rPr>
         <w:t>本文的贡献是一套可用的语言，不是一条新的自然规律。它值不值钱，看后面有没有人拿它去测。</w:t>
+      </w:r>
+    </w:p>
+    <w:p>
+      <w:r>
+        <w:rPr>
+          <w:b/>
+          <w:sz w:val="26"/>
+        </w:rPr>
+        <w:t>与既有工作的关系</w:t>
+      </w:r>
+    </w:p>
+    <w:p>
+      <w:r>
+        <w:rPr>
+          <w:b w:val="0"/>
+          <w:sz w:val="22"/>
+        </w:rPr>
+        <w:t>「压缩 / 解压」的视角有长期传统：</w:t>
+      </w:r>
+    </w:p>
+    <w:p>
+      <w:r>
+        <w:rPr>
+          <w:b w:val="0"/>
+          <w:sz w:val="22"/>
+        </w:rPr>
+        <w:t>• Schrödinger（1944）：生命以负熵为食 —— 生存靠从环境摄取低熵，是「解压」的物理前身[7]。</w:t>
+      </w:r>
+    </w:p>
+    <w:p>
+      <w:r>
+        <w:rPr>
+          <w:b w:val="0"/>
+          <w:sz w:val="22"/>
+        </w:rPr>
+        <w:t>• Bennett（1988）逻辑深度：用「从最短描述重建（解压）一个对象所需的计算量」度量复杂性，并明确把它与生命/有机体联系起来[8] —— 这是「解压」最正式的已有版本。</w:t>
+      </w:r>
+    </w:p>
+    <w:p>
+      <w:r>
+        <w:rPr>
+          <w:b w:val="0"/>
+          <w:sz w:val="22"/>
+        </w:rPr>
+        <w:t>• Chaitin（2010）生命作为演化软件：DNA = 程序，生命 = 会自我修改的软件[9]。</w:t>
+      </w:r>
+    </w:p>
+    <w:p>
+      <w:r>
+        <w:rPr>
+          <w:b w:val="0"/>
+          <w:sz w:val="22"/>
+        </w:rPr>
+        <w:t>• Solomonoff–Kolmogorov / MDL：描述长度 = 理解 = 压缩[10]。</w:t>
+      </w:r>
+    </w:p>
+    <w:p>
+      <w:r>
+        <w:rPr>
+          <w:b w:val="0"/>
+          <w:sz w:val="22"/>
+        </w:rPr>
+        <w:t>• Friston（2010）自由能原理：生命 = 最小化惊奇（≈ 持续压缩/预测）[11]。</w:t>
+      </w:r>
+    </w:p>
+    <w:p>
+      <w:r>
+        <w:rPr>
+          <w:b w:val="0"/>
+          <w:sz w:val="22"/>
+        </w:rPr>
+        <w:t>• Delétang et al.（2023）：语言模型是压缩器[6]。</w:t>
+      </w:r>
+    </w:p>
+    <w:p>
+      <w:r>
+        <w:rPr>
+          <w:b w:val="0"/>
+          <w:sz w:val="22"/>
+        </w:rPr>
+        <w:t>• Maturana &amp; Varela（1972）自创生：生命 = 自我生产的组织 —— 「维持」的另一条传统。</w:t>
+      </w:r>
+    </w:p>
+    <w:p>
+      <w:r>
+        <w:rPr>
+          <w:b w:val="0"/>
+          <w:sz w:val="22"/>
+        </w:rPr>
+        <w:t>• 「Life as Sustained Mutual Information」（Zenodo）：以持续互信息定义生命 —— 最接近本文「被维持的解压」的已有版本。</w:t>
+      </w:r>
+    </w:p>
+    <w:p>
+      <w:r>
+        <w:rPr>
+          <w:b w:val="0"/>
+          <w:sz w:val="22"/>
+        </w:rPr>
+        <w:t>需要说明：以上工作已经把「生命 = 信息/压缩/自我维持的过程」说过。本文的位置不是首次提出这一思想，而是把其中一条（解压的维持）变成可操作的判据与可测量的实验。</w:t>
+      </w:r>
+    </w:p>
+    <w:p>
+      <w:r>
+        <w:rPr>
+          <w:b w:val="0"/>
+          <w:sz w:val="22"/>
+        </w:rPr>
+        <w:t>本文的区别（三处）：</w:t>
+      </w:r>
+    </w:p>
+    <w:p>
+      <w:r>
+        <w:rPr>
+          <w:b w:val="0"/>
+          <w:sz w:val="22"/>
+        </w:rPr>
+        <w:t>1. 把解压做成层级：宇宙 → 环境 → 人类语言 → AI（既有工作多为单层度量）；</w:t>
+      </w:r>
+    </w:p>
+    <w:p>
+      <w:r>
+        <w:rPr>
+          <w:b w:val="0"/>
+          <w:sz w:val="22"/>
+        </w:rPr>
+        <w:t>2. 用「是否维持解压」区分生命与 AI：生命 = 被维持的解压，AI = 一次性解压；</w:t>
+      </w:r>
+    </w:p>
+    <w:p>
+      <w:r>
+        <w:rPr>
+          <w:b w:val="0"/>
+          <w:sz w:val="22"/>
+        </w:rPr>
+        <w:t>3. 指出上层写死 ⇒ 语言一变，解压能力衰减且无法自恢复 —— 冻结模型的失效机制。</w:t>
       </w:r>
     </w:p>
     <w:p>

</xml_diff>

<commit_message>
Revert paper 01 to readable version (v10); compendium v13
</commit_message>
<xml_diff>
--- a/paper.docx
+++ b/paper.docx
@@ -65,7 +65,7 @@
           <w:b w:val="0"/>
           <w:sz w:val="22"/>
         </w:rPr>
-        <w:t>本文从两个事实出发：物理定律可以被数学描述；语言中有一部分可以被函数近似。两个事实合起来说明，宇宙至少存在一个非空的可函数化部分 P。</w:t>
+        <w:t>本文提出一个可操作的生命定义：生命 = 一族会自指、会变化、会自我维持的动态函数（函数类）；环境 = 宇宙自发涌现的局部解压（分层，不自我维持），生命既活在它的那一层环境里，也活在宇宙里。以此为尺子，本文说明三件事：① 现在的 AI 不是生命——它是冻结的函数点、更新规则在外部、不付代价；② 生命至少需要三条必要条件（一族函数、自指更新、自己付代价），每条都挂上已有的实验证据；③ 对 AI 的涌现提出一个猜测——AI 是对人类语言的再解压，其能力上限由训练时刻的语言决定，语言一旦更新就失配、且无法自己恢复。文末不主张「生命已被造出」，只把判据与证据放在读者面前：三条都满足之后是否就「活」，由读者判断。本文的推理顺序也是反的：先从大模型（一个能工作的巨大解压器）反推「被记录的世界具有函数结构」，再由此给出生命的定义——这个反推本身，是论证的一部分（见 1.0）。</w:t>
       </w:r>
     </w:p>
     <w:p>
@@ -74,34 +74,7 @@
           <w:b w:val="0"/>
           <w:sz w:val="22"/>
         </w:rPr>
-        <w:t>把宇宙写成 宇宙 = P + R宇宙，把生命写成 生命 = p生命 + R生命。p生命 是生命落在 P 里的部分：在宇宙的 P 中、被宇宙保住的动态函数类——它是一族、会变化、会自指。R 的部分本文只声明其可能存在，不展开。</w:t>
-      </w:r>
-    </w:p>
-    <w:p>
-      <w:r>
-        <w:rPr>
-          <w:b w:val="0"/>
-          <w:sz w:val="22"/>
-        </w:rPr>
-        <w:t>在这个定义下，现在的 AI 不是生命：它是数字世界里的存在，是 p 层面的冻结函数点——更新规则在外部，不被自己保住。数字世界是完全函数化的世界（R = ∅），所以数字生命如果存在，只能完全落在 p 里；本文把这个问题摆出来（三种情况），不判断哪一种成立。</w:t>
-      </w:r>
-    </w:p>
-    <w:p>
-      <w:r>
-        <w:rPr>
-          <w:b w:val="0"/>
-          <w:sz w:val="22"/>
-        </w:rPr>
-        <w:t>本文的贡献是定义与可测判据，不是「生命已被造出」的实证结论；三条必要条件的检验与示例实验，读者可自行取用。</w:t>
-      </w:r>
-    </w:p>
-    <w:p>
-      <w:r>
-        <w:rPr>
-          <w:b w:val="0"/>
-          <w:sz w:val="22"/>
-        </w:rPr>
-        <w:t>关键词： 生命定义；p生命；函数类；解压；数字世界；AI 涌现；自指</w:t>
+        <w:t>关键词： 生命定义；函数类；解压；压缩与代价；AI 涌现；自维持</w:t>
       </w:r>
     </w:p>
     <w:p>
@@ -110,7 +83,7 @@
           <w:b/>
           <w:sz w:val="26"/>
         </w:rPr>
-        <w:t>记号</w:t>
+        <w:t>目录</w:t>
       </w:r>
     </w:p>
     <w:p>
@@ -119,7 +92,7 @@
           <w:b w:val="0"/>
           <w:sz w:val="22"/>
         </w:rPr>
-        <w:t>• **P**：宇宙中可函数化的部分。</w:t>
+        <w:t>• 一、起点：一句最硬的话</w:t>
       </w:r>
     </w:p>
     <w:p>
@@ -128,7 +101,7 @@
           <w:b w:val="0"/>
           <w:sz w:val="22"/>
         </w:rPr>
-        <w:t>• **R宇宙**：宇宙中不可函数化的部分；本文只声明其可能存在，不展开。</w:t>
+        <w:t>• 1.1 事实</w:t>
       </w:r>
     </w:p>
     <w:p>
@@ -137,7 +110,7 @@
           <w:b w:val="0"/>
           <w:sz w:val="22"/>
         </w:rPr>
-        <w:t>• **p生命**：生命落在 P 里的部分——本文定义与讨论的对象。</w:t>
+        <w:t>• 1.2 从语言到世界的推理顺序</w:t>
       </w:r>
     </w:p>
     <w:p>
@@ -146,7 +119,7 @@
           <w:b w:val="0"/>
           <w:sz w:val="22"/>
         </w:rPr>
-        <w:t>• **R生命**：生命落在 R 里的部分；只声明，不展开。</w:t>
+        <w:t>• 二、第一层改写：语言结构可以被函数描述</w:t>
       </w:r>
     </w:p>
     <w:p>
@@ -155,7 +128,7 @@
           <w:b w:val="0"/>
           <w:sz w:val="22"/>
         </w:rPr>
-        <w:t>• **p环境 / R环境**：环境的两部分，同法定义。</w:t>
+        <w:t>• 2.1 改写是等价的</w:t>
       </w:r>
     </w:p>
     <w:p>
@@ -164,7 +137,7 @@
           <w:b w:val="0"/>
           <w:sz w:val="22"/>
         </w:rPr>
-        <w:t>• **p语言 / R语言**：语言的两部分；大模型压的是 p语言。</w:t>
+        <w:t>• 三、第二层承诺：我们选择用函数语言描述世界</w:t>
       </w:r>
     </w:p>
     <w:p>
@@ -173,7 +146,7 @@
           <w:b w:val="0"/>
           <w:sz w:val="22"/>
         </w:rPr>
-        <w:t>• **残差**：R 对 p 层面影响的表现形式——p 层面消不掉的误差下限。</w:t>
+        <w:t>• 3.1 猜想的内容</w:t>
       </w:r>
     </w:p>
     <w:p>
@@ -182,7 +155,367 @@
           <w:b w:val="0"/>
           <w:sz w:val="22"/>
         </w:rPr>
-        <w:t>后文一律使用简写：说"宇宙"指 P，说"生命"指 p生命，说"环境"指 p环境。</w:t>
+        <w:t>• 3.2 为什么它只能是猜想</w:t>
+      </w:r>
+    </w:p>
+    <w:p>
+      <w:r>
+        <w:rPr>
+          <w:b w:val="0"/>
+          <w:sz w:val="22"/>
+        </w:rPr>
+        <w:t>• 3.3 与既有工作的关系</w:t>
+      </w:r>
+    </w:p>
+    <w:p>
+      <w:r>
+        <w:rPr>
+          <w:b w:val="0"/>
+          <w:sz w:val="22"/>
+        </w:rPr>
+        <w:t>• 3.4 标注</w:t>
+      </w:r>
+    </w:p>
+    <w:p>
+      <w:r>
+        <w:rPr>
+          <w:b w:val="0"/>
+          <w:sz w:val="22"/>
+        </w:rPr>
+        <w:t>• 四、一个可操作的定义</w:t>
+      </w:r>
+    </w:p>
+    <w:p>
+      <w:r>
+        <w:rPr>
+          <w:b w:val="0"/>
+          <w:sz w:val="22"/>
+        </w:rPr>
+        <w:t>• 4.1 定义</w:t>
+      </w:r>
+    </w:p>
+    <w:p>
+      <w:r>
+        <w:rPr>
+          <w:b w:val="0"/>
+          <w:sz w:val="22"/>
+        </w:rPr>
+        <w:t>• 4.2 一处澄清：维持是关系</w:t>
+      </w:r>
+    </w:p>
+    <w:p>
+      <w:r>
+        <w:rPr>
+          <w:b w:val="0"/>
+          <w:sz w:val="22"/>
+        </w:rPr>
+        <w:t>• 4.3 为什么必须是「一族」而不是「一个函数」</w:t>
+      </w:r>
+    </w:p>
+    <w:p>
+      <w:r>
+        <w:rPr>
+          <w:b w:val="0"/>
+          <w:sz w:val="22"/>
+        </w:rPr>
+        <w:t>• 4.4 会变化 = 三层时间尺度</w:t>
+      </w:r>
+    </w:p>
+    <w:p>
+      <w:r>
+        <w:rPr>
+          <w:b w:val="0"/>
+          <w:sz w:val="22"/>
+        </w:rPr>
+        <w:t>• 4.5 会自指 = 更新规则在它自己里面</w:t>
+      </w:r>
+    </w:p>
+    <w:p>
+      <w:r>
+        <w:rPr>
+          <w:b w:val="0"/>
+          <w:sz w:val="22"/>
+        </w:rPr>
+        <w:t>• 五、生命与环境</w:t>
+      </w:r>
+    </w:p>
+    <w:p>
+      <w:r>
+        <w:rPr>
+          <w:b w:val="0"/>
+          <w:sz w:val="22"/>
+        </w:rPr>
+        <w:t>• 5.1 与前面的衔接</w:t>
+      </w:r>
+    </w:p>
+    <w:p>
+      <w:r>
+        <w:rPr>
+          <w:b w:val="0"/>
+          <w:sz w:val="22"/>
+        </w:rPr>
+        <w:t>• 5.2 生命 vs 环境：都在宇宙里，都是函数，区别只有一条</w:t>
+      </w:r>
+    </w:p>
+    <w:p>
+      <w:r>
+        <w:rPr>
+          <w:b w:val="0"/>
+          <w:sz w:val="22"/>
+        </w:rPr>
+        <w:t>• 5.3 环境是什么：宇宙里自发涌现的「局部解压」</w:t>
+      </w:r>
+    </w:p>
+    <w:p>
+      <w:r>
+        <w:rPr>
+          <w:b w:val="0"/>
+          <w:sz w:val="22"/>
+        </w:rPr>
+        <w:t>• 5.4 环境是分层的：生命活在多层环境里，同时也活在宇宙里</w:t>
+      </w:r>
+    </w:p>
+    <w:p>
+      <w:r>
+        <w:rPr>
+          <w:b w:val="0"/>
+          <w:sz w:val="22"/>
+        </w:rPr>
+        <w:t>• 5.5 标注</w:t>
+      </w:r>
+    </w:p>
+    <w:p>
+      <w:r>
+        <w:rPr>
+          <w:b w:val="0"/>
+          <w:sz w:val="22"/>
+        </w:rPr>
+        <w:t>• 六、检查表：定义能区分什么</w:t>
+      </w:r>
+    </w:p>
+    <w:p>
+      <w:r>
+        <w:rPr>
+          <w:b w:val="0"/>
+          <w:sz w:val="22"/>
+        </w:rPr>
+        <w:t>• 6.1 检查表</w:t>
+      </w:r>
+    </w:p>
+    <w:p>
+      <w:r>
+        <w:rPr>
+          <w:b w:val="0"/>
+          <w:sz w:val="22"/>
+        </w:rPr>
+        <w:t>• 6.2 三条最根本的原因（按重要性）</w:t>
+      </w:r>
+    </w:p>
+    <w:p>
+      <w:r>
+        <w:rPr>
+          <w:b w:val="0"/>
+          <w:sz w:val="22"/>
+        </w:rPr>
+        <w:t>• 6.3 为什么「它很强」与「它不是生命」不矛盾</w:t>
+      </w:r>
+    </w:p>
+    <w:p>
+      <w:r>
+        <w:rPr>
+          <w:b w:val="0"/>
+          <w:sz w:val="22"/>
+        </w:rPr>
+        <w:t>• 6.4 标注</w:t>
+      </w:r>
+    </w:p>
+    <w:p>
+      <w:r>
+        <w:rPr>
+          <w:b w:val="0"/>
+          <w:sz w:val="22"/>
+        </w:rPr>
+        <w:t>• 七、三条必要条件</w:t>
+      </w:r>
+    </w:p>
+    <w:p>
+      <w:r>
+        <w:rPr>
+          <w:b w:val="0"/>
+          <w:sz w:val="22"/>
+        </w:rPr>
+        <w:t>• 7.1 从定义到条件</w:t>
+      </w:r>
+    </w:p>
+    <w:p>
+      <w:r>
+        <w:rPr>
+          <w:b w:val="0"/>
+          <w:sz w:val="22"/>
+        </w:rPr>
+        <w:t>• 7.2 条件① 一族函数（不是一个点）</w:t>
+      </w:r>
+    </w:p>
+    <w:p>
+      <w:r>
+        <w:rPr>
+          <w:b w:val="0"/>
+          <w:sz w:val="22"/>
+        </w:rPr>
+        <w:t>• 7.3 条件② 自指更新（规则在自己里面）</w:t>
+      </w:r>
+    </w:p>
+    <w:p>
+      <w:r>
+        <w:rPr>
+          <w:b w:val="0"/>
+          <w:sz w:val="22"/>
+        </w:rPr>
+        <w:t>• 7.4 条件③ 自己付代价（压缩换生存）</w:t>
+      </w:r>
+    </w:p>
+    <w:p>
+      <w:r>
+        <w:rPr>
+          <w:b w:val="0"/>
+          <w:sz w:val="22"/>
+        </w:rPr>
+        <w:t>• 7.5 三条必须同时成立（经验对照）</w:t>
+      </w:r>
+    </w:p>
+    <w:p>
+      <w:r>
+        <w:rPr>
+          <w:b w:val="0"/>
+          <w:sz w:val="22"/>
+        </w:rPr>
+        <w:t>• 7.6 未尽之处（留给读者）</w:t>
+      </w:r>
+    </w:p>
+    <w:p>
+      <w:r>
+        <w:rPr>
+          <w:b w:val="0"/>
+          <w:sz w:val="22"/>
+        </w:rPr>
+        <w:t>• 7.7 本文实验的边界（必须与结论一起读）</w:t>
+      </w:r>
+    </w:p>
+    <w:p>
+      <w:r>
+        <w:rPr>
+          <w:b w:val="0"/>
+          <w:sz w:val="22"/>
+        </w:rPr>
+        <w:t>• 7.8 标注</w:t>
+      </w:r>
+    </w:p>
+    <w:p>
+      <w:r>
+        <w:rPr>
+          <w:b w:val="0"/>
+          <w:sz w:val="22"/>
+        </w:rPr>
+        <w:t>• 八、涌现：为什么现在的 AI 会涌现</w:t>
+      </w:r>
+    </w:p>
+    <w:p>
+      <w:r>
+        <w:rPr>
+          <w:b w:val="0"/>
+          <w:sz w:val="22"/>
+        </w:rPr>
+        <w:t>• 8.1 现象</w:t>
+      </w:r>
+    </w:p>
+    <w:p>
+      <w:r>
+        <w:rPr>
+          <w:b w:val="0"/>
+          <w:sz w:val="22"/>
+        </w:rPr>
+        <w:t>• 8.2 现有的解释（按证据强度排列）</w:t>
+      </w:r>
+    </w:p>
+    <w:p>
+      <w:r>
+        <w:rPr>
+          <w:b w:val="0"/>
+          <w:sz w:val="22"/>
+        </w:rPr>
+        <w:t>• 8.3 为什么至今没有公认的「为什么」</w:t>
+      </w:r>
+    </w:p>
+    <w:p>
+      <w:r>
+        <w:rPr>
+          <w:b w:val="0"/>
+          <w:sz w:val="22"/>
+        </w:rPr>
+        <w:t>• 8.4 我们的立场（[推测]，不是本文证据）：AI 是对人类语言的解压</w:t>
+      </w:r>
+    </w:p>
+    <w:p>
+      <w:r>
+        <w:rPr>
+          <w:b w:val="0"/>
+          <w:sz w:val="22"/>
+        </w:rPr>
+        <w:t>• 8.5 解压能力的衰减：上层写死 ⇒ 语言一变，解压变弱</w:t>
+      </w:r>
+    </w:p>
+    <w:p>
+      <w:r>
+        <w:rPr>
+          <w:b w:val="0"/>
+          <w:sz w:val="22"/>
+        </w:rPr>
+        <w:t>• 8.6 由立场推出的两条预测（[推测]，供读者判断）</w:t>
+      </w:r>
+    </w:p>
+    <w:p>
+      <w:r>
+        <w:rPr>
+          <w:b w:val="0"/>
+          <w:sz w:val="22"/>
+        </w:rPr>
+        <w:t>• 8.7 标注</w:t>
+      </w:r>
+    </w:p>
+    <w:p>
+      <w:r>
+        <w:rPr>
+          <w:b w:val="0"/>
+          <w:sz w:val="22"/>
+        </w:rPr>
+        <w:t>• 九、用它看几个热门问题</w:t>
+      </w:r>
+    </w:p>
+    <w:p>
+      <w:r>
+        <w:rPr>
+          <w:b w:val="0"/>
+          <w:sz w:val="22"/>
+        </w:rPr>
+        <w:t>• 十、本文得到了什么，没得到什么</w:t>
+      </w:r>
+    </w:p>
+    <w:p>
+      <w:r>
+        <w:rPr>
+          <w:b w:val="0"/>
+          <w:sz w:val="22"/>
+        </w:rPr>
+        <w:t>• 参考文献</w:t>
+      </w:r>
+    </w:p>
+    <w:p>
+      <w:r>
+        <w:rPr>
+          <w:b w:val="0"/>
+          <w:sz w:val="22"/>
+        </w:rPr>
+        <w:t>• 作者声明（AI 使用声明）</w:t>
       </w:r>
     </w:p>
     <w:p>
@@ -191,7 +524,7 @@
           <w:b/>
           <w:sz w:val="26"/>
         </w:rPr>
-        <w:t>目录</w:t>
+        <w:t>一、起点：一句最硬的话</w:t>
       </w:r>
     </w:p>
     <w:p>
@@ -200,7 +533,7 @@
           <w:b w:val="0"/>
           <w:sz w:val="22"/>
         </w:rPr>
-        <w:t>• 一、起点：两个事实</w:t>
+        <w:t>关于 AI 与生命，争论很多，但大多数争论的起点不一样。本文的起点是一个已经发生的事实：语言可以被函数近似。</w:t>
       </w:r>
     </w:p>
     <w:p>
@@ -209,7 +542,7 @@
           <w:b w:val="0"/>
           <w:sz w:val="22"/>
         </w:rPr>
-        <w:t>• 二、一个可操作的定义</w:t>
+        <w:t>这句话的证据不是推理，是存在：大模型用可计算的、有限参数的过程，生成了在统计上接近人类语言的文本。它没有理解语言，但它近似了语言——近似到能通过考试、能写代码、能对话。</w:t>
       </w:r>
     </w:p>
     <w:p>
@@ -218,7 +551,7 @@
           <w:b w:val="0"/>
           <w:sz w:val="22"/>
         </w:rPr>
-        <w:t>• 2.1 定义</w:t>
+        <w:t>这是本文全部推论的锚。它之所以"最硬"，因为它是观察，不是解释；任何解释都得先承认它。下面每一层外推，本文都会标注强度：强（观察/改写）、弱（猜想）、人为（构造）。</w:t>
       </w:r>
     </w:p>
     <w:p>
@@ -227,7 +560,7 @@
           <w:b w:val="0"/>
           <w:sz w:val="22"/>
         </w:rPr>
-        <w:t>• 2.2 一处澄清：维持是关系</w:t>
+        <w:t>因此本文的整体是一个条件命题：如果世界（或我们研究的那一层）可以用函数描述，那么生命是函数类，而现在的 AI 不是生命。本文不证明前提，只展示前提成立时会推出什么；前提本身被标为承诺，它的价值由后面几篇能否导出可测的结论来检验。</w:t>
       </w:r>
     </w:p>
     <w:p>
@@ -236,322 +569,7 @@
           <w:b w:val="0"/>
           <w:sz w:val="22"/>
         </w:rPr>
-        <w:t>• 2.3 为什么必须是「一族」而不是「一个函数」</w:t>
-      </w:r>
-    </w:p>
-    <w:p>
-      <w:r>
-        <w:rPr>
-          <w:b w:val="0"/>
-          <w:sz w:val="22"/>
-        </w:rPr>
-        <w:t>• 2.4 会变化 = 三层时间尺度</w:t>
-      </w:r>
-    </w:p>
-    <w:p>
-      <w:r>
-        <w:rPr>
-          <w:b w:val="0"/>
-          <w:sz w:val="22"/>
-        </w:rPr>
-        <w:t>• 2.5 会自指 = 更新规则在它自己里面</w:t>
-      </w:r>
-    </w:p>
-    <w:p>
-      <w:r>
-        <w:rPr>
-          <w:b w:val="0"/>
-          <w:sz w:val="22"/>
-        </w:rPr>
-        <w:t>• 三、生命与环境</w:t>
-      </w:r>
-    </w:p>
-    <w:p>
-      <w:r>
-        <w:rPr>
-          <w:b w:val="0"/>
-          <w:sz w:val="22"/>
-        </w:rPr>
-        <w:t>• 3.1 与前面的衔接</w:t>
-      </w:r>
-    </w:p>
-    <w:p>
-      <w:r>
-        <w:rPr>
-          <w:b w:val="0"/>
-          <w:sz w:val="22"/>
-        </w:rPr>
-        <w:t>• 3.2 生命 vs 环境：都在宇宙里，都是函数，区别只有一条</w:t>
-      </w:r>
-    </w:p>
-    <w:p>
-      <w:r>
-        <w:rPr>
-          <w:b w:val="0"/>
-          <w:sz w:val="22"/>
-        </w:rPr>
-        <w:t>• 3.3 环境是什么：宇宙里自发涌现的「局部解压」</w:t>
-      </w:r>
-    </w:p>
-    <w:p>
-      <w:r>
-        <w:rPr>
-          <w:b w:val="0"/>
-          <w:sz w:val="22"/>
-        </w:rPr>
-        <w:t>• 3.4 环境是分层的：生命活在多层环境里，同时也活在宇宙里</w:t>
-      </w:r>
-    </w:p>
-    <w:p>
-      <w:r>
-        <w:rPr>
-          <w:b w:val="0"/>
-          <w:sz w:val="22"/>
-        </w:rPr>
-        <w:t>• 3.5 标注</w:t>
-      </w:r>
-    </w:p>
-    <w:p>
-      <w:r>
-        <w:rPr>
-          <w:b w:val="0"/>
-          <w:sz w:val="22"/>
-        </w:rPr>
-        <w:t>• 四、数字世界的特殊性</w:t>
-      </w:r>
-    </w:p>
-    <w:p>
-      <w:r>
-        <w:rPr>
-          <w:b w:val="0"/>
-          <w:sz w:val="22"/>
-        </w:rPr>
-        <w:t>• 五、用定义看现在的 AI：为什么它不是生命</w:t>
-      </w:r>
-    </w:p>
-    <w:p>
-      <w:r>
-        <w:rPr>
-          <w:b w:val="0"/>
-          <w:sz w:val="22"/>
-        </w:rPr>
-        <w:t>• 5.1 检查表</w:t>
-      </w:r>
-    </w:p>
-    <w:p>
-      <w:r>
-        <w:rPr>
-          <w:b w:val="0"/>
-          <w:sz w:val="22"/>
-        </w:rPr>
-        <w:t>• 5.2 三条最根本的原因（按重要性）</w:t>
-      </w:r>
-    </w:p>
-    <w:p>
-      <w:r>
-        <w:rPr>
-          <w:b w:val="0"/>
-          <w:sz w:val="22"/>
-        </w:rPr>
-        <w:t>• 5.3 为什么「它很强」与「它不是生命」不矛盾</w:t>
-      </w:r>
-    </w:p>
-    <w:p>
-      <w:r>
-        <w:rPr>
-          <w:b w:val="0"/>
-          <w:sz w:val="22"/>
-        </w:rPr>
-        <w:t>• 5.4 标注</w:t>
-      </w:r>
-    </w:p>
-    <w:p>
-      <w:r>
-        <w:rPr>
-          <w:b w:val="0"/>
-          <w:sz w:val="22"/>
-        </w:rPr>
-        <w:t>• 六、三条必要条件</w:t>
-      </w:r>
-    </w:p>
-    <w:p>
-      <w:r>
-        <w:rPr>
-          <w:b w:val="0"/>
-          <w:sz w:val="22"/>
-        </w:rPr>
-        <w:t>• 6.1 从定义到条件</w:t>
-      </w:r>
-    </w:p>
-    <w:p>
-      <w:r>
-        <w:rPr>
-          <w:b w:val="0"/>
-          <w:sz w:val="22"/>
-        </w:rPr>
-        <w:t>• 6.2 条件① 一族函数（不是一个点）</w:t>
-      </w:r>
-    </w:p>
-    <w:p>
-      <w:r>
-        <w:rPr>
-          <w:b w:val="0"/>
-          <w:sz w:val="22"/>
-        </w:rPr>
-        <w:t>• 6.3 条件② 自指更新（规则在自己里面）</w:t>
-      </w:r>
-    </w:p>
-    <w:p>
-      <w:r>
-        <w:rPr>
-          <w:b w:val="0"/>
-          <w:sz w:val="22"/>
-        </w:rPr>
-        <w:t>• 6.4 条件③ 被宇宙保住（可维持）</w:t>
-      </w:r>
-    </w:p>
-    <w:p>
-      <w:r>
-        <w:rPr>
-          <w:b w:val="0"/>
-          <w:sz w:val="22"/>
-        </w:rPr>
-        <w:t>• 6.4b 付代价：经验伴随物，不是必要条件</w:t>
-      </w:r>
-    </w:p>
-    <w:p>
-      <w:r>
-        <w:rPr>
-          <w:b w:val="0"/>
-          <w:sz w:val="22"/>
-        </w:rPr>
-        <w:t>• 6.5 三条必须同时成立（经验对照）</w:t>
-      </w:r>
-    </w:p>
-    <w:p>
-      <w:r>
-        <w:rPr>
-          <w:b w:val="0"/>
-          <w:sz w:val="22"/>
-        </w:rPr>
-        <w:t>• 6.6 未尽之处（留给读者）</w:t>
-      </w:r>
-    </w:p>
-    <w:p>
-      <w:r>
-        <w:rPr>
-          <w:b w:val="0"/>
-          <w:sz w:val="22"/>
-        </w:rPr>
-        <w:t>• 6.7 本文实验的边界（必须与结论一起读）</w:t>
-      </w:r>
-    </w:p>
-    <w:p>
-      <w:r>
-        <w:rPr>
-          <w:b w:val="0"/>
-          <w:sz w:val="22"/>
-        </w:rPr>
-        <w:t>• 6.8 标注</w:t>
-      </w:r>
-    </w:p>
-    <w:p>
-      <w:r>
-        <w:rPr>
-          <w:b w:val="0"/>
-          <w:sz w:val="22"/>
-        </w:rPr>
-        <w:t>• 七、涌现：为什么现在的 AI 会涌现</w:t>
-      </w:r>
-    </w:p>
-    <w:p>
-      <w:r>
-        <w:rPr>
-          <w:b w:val="0"/>
-          <w:sz w:val="22"/>
-        </w:rPr>
-        <w:t>• 7.1 现象</w:t>
-      </w:r>
-    </w:p>
-    <w:p>
-      <w:r>
-        <w:rPr>
-          <w:b w:val="0"/>
-          <w:sz w:val="22"/>
-        </w:rPr>
-        <w:t>• 7.2 现有的解释（按证据强度排列）</w:t>
-      </w:r>
-    </w:p>
-    <w:p>
-      <w:r>
-        <w:rPr>
-          <w:b w:val="0"/>
-          <w:sz w:val="22"/>
-        </w:rPr>
-        <w:t>• 7.3 为什么至今没有公认的「为什么」</w:t>
-      </w:r>
-    </w:p>
-    <w:p>
-      <w:r>
-        <w:rPr>
-          <w:b w:val="0"/>
-          <w:sz w:val="22"/>
-        </w:rPr>
-        <w:t>• 7.4 我们的立场：AI 是对语言的 p语言 的压缩与解压</w:t>
-      </w:r>
-    </w:p>
-    <w:p>
-      <w:r>
-        <w:rPr>
-          <w:b w:val="0"/>
-          <w:sz w:val="22"/>
-        </w:rPr>
-        <w:t>• 7.5 解压能力的衰减：上层写死 ⇒ 语言一变，解压变弱</w:t>
-      </w:r>
-    </w:p>
-    <w:p>
-      <w:r>
-        <w:rPr>
-          <w:b w:val="0"/>
-          <w:sz w:val="22"/>
-        </w:rPr>
-        <w:t>• 7.6 由立场推出的两条预测（[推测]，供读者判断）</w:t>
-      </w:r>
-    </w:p>
-    <w:p>
-      <w:r>
-        <w:rPr>
-          <w:b w:val="0"/>
-          <w:sz w:val="22"/>
-        </w:rPr>
-        <w:t>• 7.7 标注</w:t>
-      </w:r>
-    </w:p>
-    <w:p>
-      <w:r>
-        <w:rPr>
-          <w:b w:val="0"/>
-          <w:sz w:val="22"/>
-        </w:rPr>
-        <w:t>• 八、用它看几个热门问题</w:t>
-      </w:r>
-    </w:p>
-    <w:p>
-      <w:r>
-        <w:rPr>
-          <w:b w:val="0"/>
-          <w:sz w:val="22"/>
-        </w:rPr>
-        <w:t>• 九、本文得到了什么，没得到什么</w:t>
-      </w:r>
-    </w:p>
-    <w:p>
-      <w:r>
-        <w:rPr>
-          <w:b w:val="0"/>
-          <w:sz w:val="22"/>
-        </w:rPr>
-        <w:t>• 与既有工作的关系</w:t>
+        <w:t>需要说明：本文多数结论只依赖两样东西——定义承诺（我们选择用函数语言描述生命）与可测事实（模型存在、bits/token 可测）。「世界可被函数描述」这个强前提，主要服务于第八节的解释性立场（AI 是对语言的解压），不是前面那些结论的必要条件。读者若只取可用的部分，可以只取定义与由它导出的判据，把强前提留在解释那一节。</w:t>
       </w:r>
     </w:p>
     <w:p>
@@ -560,7 +578,7 @@
           <w:b/>
           <w:sz w:val="26"/>
         </w:rPr>
-        <w:t>一、起点：两个事实</w:t>
+        <w:t>1.1 事实</w:t>
       </w:r>
     </w:p>
     <w:p>
@@ -569,7 +587,67 @@
           <w:b w:val="0"/>
           <w:sz w:val="22"/>
         </w:rPr>
-        <w:t>第一个事实：物理定律可以被数学描述。证据是存在——物理学本身就是这件事。</w:t>
+        <w:t>本文的推理顺序是反的：不是先断言「世界是函数」，再去解释 AI；而是先有一个能工作的巨大解压器，再反推被压的东西长什么样。</w:t>
+      </w:r>
+    </w:p>
+    <w:p>
+      <w:r>
+        <w:rPr>
+          <w:rFonts w:ascii="Consolas" w:hAnsi="Consolas" w:eastAsia="Consolas"/>
+          <w:b w:val="0"/>
+          <w:sz w:val="18"/>
+        </w:rPr>
+        <w:t>① 事实：大模型存在，且能在大规模语言上工作</w:t>
+      </w:r>
+    </w:p>
+    <w:p>
+      <w:r>
+        <w:rPr>
+          <w:rFonts w:ascii="Consolas" w:hAnsi="Consolas" w:eastAsia="Consolas"/>
+          <w:b w:val="0"/>
+          <w:sz w:val="18"/>
+        </w:rPr>
+        <w:t xml:space="preserve">   ⇒ 它确实从语言里恢复出了结构（预测、迁移、推理）</w:t>
+      </w:r>
+    </w:p>
+    <w:p>
+      <w:r>
+        <w:rPr>
+          <w:rFonts w:ascii="Consolas" w:hAnsi="Consolas" w:eastAsia="Consolas"/>
+          <w:b w:val="0"/>
+          <w:sz w:val="18"/>
+        </w:rPr>
+        <w:t>② 推论：语言所记录的那一层世界，可以被函数逼近</w:t>
+      </w:r>
+    </w:p>
+    <w:p>
+      <w:r>
+        <w:rPr>
+          <w:rFonts w:ascii="Consolas" w:hAnsi="Consolas" w:eastAsia="Consolas"/>
+          <w:b w:val="0"/>
+          <w:sz w:val="18"/>
+        </w:rPr>
+        <w:t xml:space="preserve">   ⇒ 否则这样的机器不可能工作</w:t>
+      </w:r>
+    </w:p>
+    <w:p>
+      <w:r>
+        <w:rPr>
+          <w:rFonts w:ascii="Consolas" w:hAnsi="Consolas" w:eastAsia="Consolas"/>
+          <w:b w:val="0"/>
+          <w:sz w:val="18"/>
+        </w:rPr>
+        <w:t>③ 反推：世界（至少被语言/观测记录的那一层）具有函数结构</w:t>
+      </w:r>
+    </w:p>
+    <w:p>
+      <w:r>
+        <w:rPr>
+          <w:rFonts w:ascii="Consolas" w:hAnsi="Consolas" w:eastAsia="Consolas"/>
+          <w:b w:val="0"/>
+          <w:sz w:val="18"/>
+        </w:rPr>
+        <w:t>④ 定义：生命 = 维持这种「从世界到结构」的解压过程的系统</w:t>
       </w:r>
     </w:p>
     <w:p>
@@ -578,16 +656,7 @@
           <w:b w:val="0"/>
           <w:sz w:val="22"/>
         </w:rPr>
-        <w:t>宇宙可以写成分解：</w:t>
-      </w:r>
-    </w:p>
-    <w:p>
-      <w:r>
-        <w:rPr>
-          <w:b w:val="0"/>
-          <w:sz w:val="20"/>
-        </w:rPr>
-        <w:t>宇宙 = P + R宇宙</w:t>
+        <w:t>这条顺序有三点要注意：</w:t>
       </w:r>
     </w:p>
     <w:p>
@@ -596,7 +665,7 @@
           <w:b w:val="0"/>
           <w:sz w:val="22"/>
         </w:rPr>
-        <w:t>P 是可函数化的部分；R宇宙 是不可函数化的部分。物理定律描述的那部分，落在 P 里。所以至少可以说：P 非空。</w:t>
+        <w:t>1. 大模型是「世界可被函数逼近」的存在性证据，不是证明。 它证明的是：在语言覆盖的范围内，存在一个函数能很好地逼近；不证明整个世界都是函数。</w:t>
       </w:r>
     </w:p>
     <w:p>
@@ -605,7 +674,7 @@
           <w:b w:val="0"/>
           <w:sz w:val="22"/>
         </w:rPr>
-        <w:t>第二个事实：语言中有一部分可以被函数近似。证据不是推理，是存在——大模型用有限参数、可计算的过程，生成了统计上接近人类语言的文本。</w:t>
+        <w:t>2. 反推只覆盖被记录的层。 语言没有记录的部分（具身直觉、因果干预、未观测变量），反推不成立——这也是「观测墙」的来源（见第 7 篇）。</w:t>
       </w:r>
     </w:p>
     <w:p>
@@ -614,16 +683,7 @@
           <w:b w:val="0"/>
           <w:sz w:val="22"/>
         </w:rPr>
-        <w:t>语言也可以写成分解：</w:t>
-      </w:r>
-    </w:p>
-    <w:p>
-      <w:r>
-        <w:rPr>
-          <w:b w:val="0"/>
-          <w:sz w:val="20"/>
-        </w:rPr>
-        <w:t>语言 = p语言 + R语言</w:t>
+        <w:t>3. 它是可证伪的。 如果世界的某部分不可函数化，那么模型在对应任务上应当系统性失效，而不是靠更多数据就能补上。我们在具身、因果、连续物理直觉上的观察，与这一点一致。</w:t>
       </w:r>
     </w:p>
     <w:p>
@@ -632,151 +692,7 @@
           <w:b w:val="0"/>
           <w:sz w:val="22"/>
         </w:rPr>
-        <w:t>p语言 是语言里可函数化的部分，大模型压的就是它；R语言 是语言里不可函数化的部分，函数近似够不着它。所以准确的说法不是"语言可以被函数近似"，而是"语言的 p语言 可以被函数近似"；R语言 我们只能沉默。</w:t>
-      </w:r>
-    </w:p>
-    <w:p>
-      <w:r>
-        <w:rPr>
-          <w:b w:val="0"/>
-          <w:sz w:val="22"/>
-        </w:rPr>
-        <w:t>两个事实合起来说明：宇宙不是完全不可函数化的。至少存在一个非空的可函数化部分，记作 P。这一层不是猜想，是事实的推论；它只说 P 存在，不说 P 有多大。</w:t>
-      </w:r>
-    </w:p>
-    <w:p>
-      <w:r>
-        <w:rPr>
-          <w:b w:val="0"/>
-          <w:sz w:val="22"/>
-        </w:rPr>
-        <w:t>要把这些事实转成定义，还需要把"可函数化"与"不可函数化"分开——这是下一节的内容。</w:t>
-      </w:r>
-    </w:p>
-    <w:p>
-      <w:r>
-        <w:rPr>
-          <w:b w:val="0"/>
-          <w:sz w:val="22"/>
-        </w:rPr>
-        <w:t>这两条事实各有一句改写，先固定下来：语言的结构可以被函数描述——这是事实的改写，不产生新结论；宇宙可以用 P 与 R 来写——这也是事实的展开。</w:t>
-      </w:r>
-    </w:p>
-    <w:p>
-      <w:r>
-        <w:rPr>
-          <w:b w:val="0"/>
-          <w:sz w:val="22"/>
-        </w:rPr>
-        <w:t>前面的承诺需要一个可操作的边界：我们说的「可函数化」到底指什么。</w:t>
-      </w:r>
-    </w:p>
-    <w:p>
-      <w:r>
-        <w:rPr>
-          <w:b w:val="0"/>
-          <w:sz w:val="22"/>
-        </w:rPr>
-        <w:t>把一个系统或一个现象分成两部分。P 是可函数化的部分：存在一族函数，近似误差随着数据与容量的增加可以收敛到零。R 是不可函数化的部分：任何函数类的近似误差都有一个正的下界。</w:t>
-      </w:r>
-    </w:p>
-    <w:p>
-      <w:r>
-        <w:rPr>
-          <w:b w:val="0"/>
-          <w:sz w:val="22"/>
-        </w:rPr>
-        <w:t>这个划分不是信仰，可以测。固定一个函数类，看近似误差随数据量与容量怎么变：误差持续下降、趋近于零的，属于 P；误差停在某个正数不再下降的，属于 R，或者至少说明当前的函数类够不着它。</w:t>
-      </w:r>
-    </w:p>
-    <w:p>
-      <w:r>
-        <w:rPr>
-          <w:b w:val="0"/>
-          <w:sz w:val="22"/>
-        </w:rPr>
-        <w:t>这样处理有三个好处。第一，P 里的东西可以给定义、给判据、给测量，这正是本文在做的事。第二，R 里的东西只给「近似」，而且必须附上误差下界；「近似」从此不是免责声明，而是一个带数字的结论。第三，两者的交界处是研究问题，不是哲学争论，它可以被实验推进。</w:t>
-      </w:r>
-    </w:p>
-    <w:p>
-      <w:r>
-        <w:rPr>
-          <w:b w:val="0"/>
-          <w:sz w:val="22"/>
-        </w:rPr>
-        <w:t>本文的所有结论都只主张覆盖 P 的部分；对 R 的部分，本文只说：在这个函数类下，近似到此为止。</w:t>
-      </w:r>
-    </w:p>
-    <w:p>
-      <w:r>
-        <w:rPr>
-          <w:b w:val="0"/>
-          <w:sz w:val="22"/>
-        </w:rPr>
-        <w:t>以上是关于 P 与 R 的说明，它和两个事实是同一层的东西：不是新的推理，只是把事实写清楚。</w:t>
-      </w:r>
-    </w:p>
-    <w:p>
-      <w:r>
-        <w:rPr>
-          <w:b w:val="0"/>
-          <w:sz w:val="22"/>
-        </w:rPr>
-        <w:t>P 与 R 的分界是绝对的：一个对象要么可函数化（属于 P），要么不可函数化（属于 R），不存在两者之间；P ∩ R = ∅，P ∪ R = 宇宙。</w:t>
-      </w:r>
-    </w:p>
-    <w:p>
-      <w:r>
-        <w:rPr>
-          <w:b w:val="0"/>
-          <w:sz w:val="22"/>
-        </w:rPr>
-        <w:t>如果 R 对 p 层面有影响，它不会被函数语言直接描述，只会表现为 p 层面消不掉的残差：数据与容量再增加，误差也停在某个正数上。这个误差下限，就是 R 在 p 层面的投影。</w:t>
-      </w:r>
-    </w:p>
-    <w:p>
-      <w:r>
-        <w:rPr>
-          <w:b w:val="0"/>
-          <w:sz w:val="22"/>
-        </w:rPr>
-        <w:t>为便于后文书写，我们把它简记为：</w:t>
-      </w:r>
-    </w:p>
-    <w:p>
-      <w:r>
-        <w:rPr>
-          <w:b w:val="0"/>
-          <w:sz w:val="20"/>
-        </w:rPr>
-        <w:t>宇宙 = P + 残差</w:t>
-      </w:r>
-    </w:p>
-    <w:p>
-      <w:r>
-        <w:rPr>
-          <w:b w:val="0"/>
-          <w:sz w:val="20"/>
-        </w:rPr>
-        <w:t>生命 = p生命 + 残差</w:t>
-      </w:r>
-    </w:p>
-    <w:p>
-      <w:r>
-        <w:rPr>
-          <w:b w:val="0"/>
-          <w:sz w:val="20"/>
-        </w:rPr>
-        <w:t>环境 = p环境 + 残差</w:t>
-      </w:r>
-    </w:p>
-    <w:p>
-      <w:r>
-        <w:rPr>
-          <w:b w:val="0"/>
-          <w:sz w:val="22"/>
-        </w:rPr>
-        <w:t>后文只讨论 P 这一侧；残差只在需要时提及，不展开它的内容。</w:t>
+        <w:t>换句话说：我们不是先定义生命再去找世界，而是先看到「世界能被函数压」，才敢说生命是「函数的维持」。 这个反推顺序本身，是本文论证的一部分。</w:t>
       </w:r>
     </w:p>
     <w:p>
@@ -785,7 +701,37 @@
           <w:b/>
           <w:sz w:val="26"/>
         </w:rPr>
-        <w:t>二、一个可操作的定义</w:t>
+        <w:t>1.2 从语言到世界的推理顺序</w:t>
+      </w:r>
+    </w:p>
+    <w:p>
+      <w:r>
+        <w:rPr>
+          <w:rFonts w:ascii="Consolas" w:hAnsi="Consolas" w:eastAsia="Consolas"/>
+          <w:b w:val="0"/>
+          <w:sz w:val="18"/>
+        </w:rPr>
+        <w:t>弱表述：世界具有可被数学描述的规律性（经验事实，不是猜想）</w:t>
+      </w:r>
+    </w:p>
+    <w:p>
+      <w:r>
+        <w:rPr>
+          <w:rFonts w:ascii="Consolas" w:hAnsi="Consolas" w:eastAsia="Consolas"/>
+          <w:b w:val="0"/>
+          <w:sz w:val="18"/>
+        </w:rPr>
+        <w:t>⇒ 由此写出：S_{t+1} = F(S_t)</w:t>
+      </w:r>
+    </w:p>
+    <w:p>
+      <w:r>
+        <w:rPr>
+          <w:rFonts w:ascii="Consolas" w:hAnsi="Consolas" w:eastAsia="Consolas"/>
+          <w:b w:val="0"/>
+          <w:sz w:val="18"/>
+        </w:rPr>
+        <w:t>⇒ 规律 ⇒ 可压缩 ⇒ 可预测 ⇒ 预测有对错 ⇒ 对错可计代价</w:t>
       </w:r>
     </w:p>
     <w:p>
@@ -794,7 +740,25 @@
           <w:b w:val="0"/>
           <w:sz w:val="22"/>
         </w:rPr>
-        <w:t>在两条事实的基础上，可以给生命一个操作性的定义。这个定义是人造的，不是发现的；它成立与否，要看它能不能区分、能不能导出可测的东西。</w:t>
+        <w:t>注意区分：</w:t>
+      </w:r>
+    </w:p>
+    <w:p>
+      <w:r>
+        <w:rPr>
+          <w:b w:val="0"/>
+          <w:sz w:val="22"/>
+        </w:rPr>
+        <w:t>• **猜想** = 世界本身是数学的（本节内容，不用作证据）</w:t>
+      </w:r>
+    </w:p>
+    <w:p>
+      <w:r>
+        <w:rPr>
+          <w:b w:val="0"/>
+          <w:sz w:val="22"/>
+        </w:rPr>
+        <w:t>• **经验事实** = 世界存在可压缩的规律性（科学实践的基础，本文真正使用的东西）</w:t>
       </w:r>
     </w:p>
     <w:p>
@@ -803,7 +767,7 @@
           <w:b/>
           <w:sz w:val="26"/>
         </w:rPr>
-        <w:t>2.1 定义</w:t>
+        <w:t>二、第一层改写：语言结构可以被函数描述</w:t>
       </w:r>
     </w:p>
     <w:p>
@@ -812,7 +776,298 @@
           <w:b w:val="0"/>
           <w:sz w:val="22"/>
         </w:rPr>
-        <w:t>生命由两部分构成：</w:t>
+        <w:t>既然语言可以被函数近似，那么语言的结构可以被函数描述。这一步几乎是同义改写：能被近似的东西，当然能被描述。区别只在于"近似"是行为上的，"描述"是结构上的；但两者指向同一个东西。这一步不需要额外假设。</w:t>
+      </w:r>
+    </w:p>
+    <w:p>
+      <w:r>
+        <w:rPr>
+          <w:b/>
+          <w:sz w:val="26"/>
+        </w:rPr>
+        <w:t>2.1 改写是等价的</w:t>
+      </w:r>
+    </w:p>
+    <w:p>
+      <w:r>
+        <w:rPr>
+          <w:b/>
+          <w:sz w:val="26"/>
+        </w:rPr>
+        <w:t>三、第二层承诺：我们选择用函数语言描述世界</w:t>
+      </w:r>
+    </w:p>
+    <w:p>
+      <w:r>
+        <w:rPr>
+          <w:b w:val="0"/>
+          <w:sz w:val="22"/>
+        </w:rPr>
+        <w:t>从"语言可被描述"再往外一步，就出了观测范围。这里要说清一个区别：这一步不是"猜想"，而是"承诺"——我们选择用函数语言来描述世界与生命。承诺与猜想的区别是：猜想会被观察推翻，承诺不会；承诺只能被"不好用"淘汰（覆盖不了该覆盖的案例、区分不了该区分的对象）。我们选择它，是因为它把问题变得可操作；它是否值得，交给后面的应用来判断。</w:t>
+      </w:r>
+    </w:p>
+    <w:p>
+      <w:r>
+        <w:rPr>
+          <w:b/>
+          <w:sz w:val="26"/>
+        </w:rPr>
+        <w:t>3.1 猜想的内容</w:t>
+      </w:r>
+    </w:p>
+    <w:p>
+      <w:r>
+        <w:rPr>
+          <w:b w:val="0"/>
+          <w:sz w:val="22"/>
+        </w:rPr>
+        <w:t>物理规则是用数学写成的，所以世界的根源是数学性的。</w:t>
+      </w:r>
+    </w:p>
+    <w:p>
+      <w:r>
+        <w:rPr>
+          <w:rFonts w:ascii="Consolas" w:hAnsi="Consolas" w:eastAsia="Consolas"/>
+          <w:b w:val="0"/>
+          <w:sz w:val="18"/>
+        </w:rPr>
+        <w:t>事实：最基础的物理定律本身就是数学命题</w:t>
+      </w:r>
+    </w:p>
+    <w:p>
+      <w:r>
+        <w:rPr>
+          <w:rFonts w:ascii="Consolas" w:hAnsi="Consolas" w:eastAsia="Consolas"/>
+          <w:b w:val="0"/>
+          <w:sz w:val="18"/>
+        </w:rPr>
+        <w:t xml:space="preserve">      F = ma、最小作用量 δS=0、iħ∂ψ/∂t = Ĥψ、ds² = g_{μν}dx^μdx^ν</w:t>
+      </w:r>
+    </w:p>
+    <w:p>
+      <w:r>
+        <w:rPr>
+          <w:rFonts w:ascii="Consolas" w:hAnsi="Consolas" w:eastAsia="Consolas"/>
+          <w:b w:val="0"/>
+          <w:sz w:val="18"/>
+        </w:rPr>
+        <w:t>猜想：既然描述世界最深层的方式是数学的，世界本身的结构就是数学的</w:t>
+      </w:r>
+    </w:p>
+    <w:p>
+      <w:r>
+        <w:rPr>
+          <w:rFonts w:ascii="Consolas" w:hAnsi="Consolas" w:eastAsia="Consolas"/>
+          <w:b w:val="0"/>
+          <w:sz w:val="18"/>
+        </w:rPr>
+        <w:t xml:space="preserve">      —— 否则数学为何能如此精确地描述它？</w:t>
+      </w:r>
+    </w:p>
+    <w:p>
+      <w:r>
+        <w:rPr>
+          <w:b/>
+          <w:sz w:val="26"/>
+        </w:rPr>
+        <w:t>3.2 为什么它只能是猜想</w:t>
+      </w:r>
+    </w:p>
+    <w:p>
+      <w:r>
+        <w:rPr>
+          <w:rFonts w:ascii="Consolas" w:hAnsi="Consolas" w:eastAsia="Consolas"/>
+          <w:b w:val="0"/>
+          <w:sz w:val="18"/>
+        </w:rPr>
+        <w:t>① 这是对「数学为何有效」的解释性推断，不是证明</w:t>
+      </w:r>
+    </w:p>
+    <w:p>
+      <w:r>
+        <w:rPr>
+          <w:rFonts w:ascii="Consolas" w:hAnsi="Consolas" w:eastAsia="Consolas"/>
+          <w:b w:val="0"/>
+          <w:sz w:val="18"/>
+        </w:rPr>
+        <w:t>② 存在等价的另一读法：数学只是**描述语言**，世界本身是什么我们不知道</w:t>
+      </w:r>
+    </w:p>
+    <w:p>
+      <w:r>
+        <w:rPr>
+          <w:rFonts w:ascii="Consolas" w:hAnsi="Consolas" w:eastAsia="Consolas"/>
+          <w:b w:val="0"/>
+          <w:sz w:val="18"/>
+        </w:rPr>
+        <w:t xml:space="preserve">   （工具论 vs 实在论；两者目前无法用实验区分）</w:t>
+      </w:r>
+    </w:p>
+    <w:p>
+      <w:r>
+        <w:rPr>
+          <w:rFonts w:ascii="Consolas" w:hAnsi="Consolas" w:eastAsia="Consolas"/>
+          <w:b w:val="0"/>
+          <w:sz w:val="18"/>
+        </w:rPr>
+        <w:t>③ 强形式（世界=数学结构，Tegmark[2] 数学宇宙假说）不可证伪，因而不能当科学结论</w:t>
+      </w:r>
+    </w:p>
+    <w:p>
+      <w:r>
+        <w:rPr>
+          <w:rFonts w:ascii="Consolas" w:hAnsi="Consolas" w:eastAsia="Consolas"/>
+          <w:b w:val="0"/>
+          <w:sz w:val="18"/>
+        </w:rPr>
+        <w:t>④ 这是 Wigner[1] 所说的「数学在自然科学中不合理的有效性」之谜，本文不解答它</w:t>
+      </w:r>
+    </w:p>
+    <w:p>
+      <w:r>
+        <w:rPr>
+          <w:b/>
+          <w:sz w:val="26"/>
+        </w:rPr>
+        <w:t>3.3 与既有工作的关系</w:t>
+      </w:r>
+    </w:p>
+    <w:p>
+      <w:r>
+        <w:rPr>
+          <w:b w:val="0"/>
+          <w:sz w:val="22"/>
+        </w:rPr>
+        <w:t>「压缩 / 解压」的视角有长期传统：</w:t>
+      </w:r>
+    </w:p>
+    <w:p>
+      <w:r>
+        <w:rPr>
+          <w:b w:val="0"/>
+          <w:sz w:val="22"/>
+        </w:rPr>
+        <w:t>• Schrödinger（1944）：生命以负熵为食 —— 生存靠从环境摄取低熵，是「解压」的物理前身[7]。</w:t>
+      </w:r>
+    </w:p>
+    <w:p>
+      <w:r>
+        <w:rPr>
+          <w:b w:val="0"/>
+          <w:sz w:val="22"/>
+        </w:rPr>
+        <w:t>• Bennett（1988）逻辑深度：用「从最短描述重建（解压）一个对象所需的计算量」度量复杂性，并明确把它与生命/有机体联系起来[8] —— 这是「解压」最正式的已有版本。</w:t>
+      </w:r>
+    </w:p>
+    <w:p>
+      <w:r>
+        <w:rPr>
+          <w:b w:val="0"/>
+          <w:sz w:val="22"/>
+        </w:rPr>
+        <w:t>• Chaitin（2010）生命作为演化软件：DNA = 程序，生命 = 会自我修改的软件[9]。</w:t>
+      </w:r>
+    </w:p>
+    <w:p>
+      <w:r>
+        <w:rPr>
+          <w:b w:val="0"/>
+          <w:sz w:val="22"/>
+        </w:rPr>
+        <w:t>• Solomonoff–Kolmogorov / MDL：描述长度 = 理解 = 压缩[10]。</w:t>
+      </w:r>
+    </w:p>
+    <w:p>
+      <w:r>
+        <w:rPr>
+          <w:b w:val="0"/>
+          <w:sz w:val="22"/>
+        </w:rPr>
+        <w:t>• Friston（2010）自由能原理：生命 = 最小化惊奇（≈ 持续压缩/预测）[11]。</w:t>
+      </w:r>
+    </w:p>
+    <w:p>
+      <w:r>
+        <w:rPr>
+          <w:b w:val="0"/>
+          <w:sz w:val="22"/>
+        </w:rPr>
+        <w:t>• Delétang et al.（2023）：语言模型是压缩器[6]。</w:t>
+      </w:r>
+    </w:p>
+    <w:p>
+      <w:r>
+        <w:rPr>
+          <w:b w:val="0"/>
+          <w:sz w:val="22"/>
+        </w:rPr>
+        <w:t>• Maturana &amp; Varela（1972）自创生：生命 = 自我生产的组织 —— 「维持」的另一条传统。</w:t>
+      </w:r>
+    </w:p>
+    <w:p>
+      <w:r>
+        <w:rPr>
+          <w:b w:val="0"/>
+          <w:sz w:val="22"/>
+        </w:rPr>
+        <w:t>• 「Life as Sustained Mutual Information」（Zenodo）：以持续互信息定义生命 —— 最接近本文「被维持的解压」的已有版本。</w:t>
+      </w:r>
+    </w:p>
+    <w:p>
+      <w:r>
+        <w:rPr>
+          <w:b w:val="0"/>
+          <w:sz w:val="22"/>
+        </w:rPr>
+        <w:t>需要说明：以上工作已经把「生命 = 信息/压缩/自我维持的过程」说过。本文的位置不是首次提出这一思想，而是把其中一条（解压的维持）变成可操作的判据与可测量的实验。</w:t>
+      </w:r>
+    </w:p>
+    <w:p>
+      <w:r>
+        <w:rPr>
+          <w:b w:val="0"/>
+          <w:sz w:val="22"/>
+        </w:rPr>
+        <w:t>本文的区别（三处）：</w:t>
+      </w:r>
+    </w:p>
+    <w:p>
+      <w:r>
+        <w:rPr>
+          <w:b w:val="0"/>
+          <w:sz w:val="22"/>
+        </w:rPr>
+        <w:t>1. 把解压做成层级：宇宙 → 环境 → 人类语言 → AI（既有工作多为单层度量）；</w:t>
+      </w:r>
+    </w:p>
+    <w:p>
+      <w:r>
+        <w:rPr>
+          <w:b w:val="0"/>
+          <w:sz w:val="22"/>
+        </w:rPr>
+        <w:t>2. 用「是否维持解压」区分生命与 AI：生命 = 被维持的解压，AI = 一次性解压；</w:t>
+      </w:r>
+    </w:p>
+    <w:p>
+      <w:r>
+        <w:rPr>
+          <w:b w:val="0"/>
+          <w:sz w:val="22"/>
+        </w:rPr>
+        <w:t>3. 指出上层写死 ⇒ 语言一变，解压能力衰减且无法自恢复 —— 冻结模型的失效机制。</w:t>
+      </w:r>
+    </w:p>
+    <w:p>
+      <w:pPr>
+        <w:jc w:val="center"/>
+      </w:pPr>
+      <w:r>
+        <w:rPr>
+          <w:b/>
+          <w:sz w:val="34"/>
+        </w:rPr>
+        <w:t>第一节 · 世界的根源是数学性的（猜想）</w:t>
       </w:r>
     </w:p>
     <w:p>
@@ -821,7 +1076,104 @@
           <w:b w:val="0"/>
           <w:sz w:val="20"/>
         </w:rPr>
-        <w:t>生命 = p生命 + R生命</w:t>
+        <w:t>**本节性质：猜想（conjecture）。不是定理，不是已证明的事实，也不是本文的证据。**</w:t>
+      </w:r>
+    </w:p>
+    <w:p>
+      <w:r>
+        <w:rPr>
+          <w:b w:val="0"/>
+          <w:sz w:val="20"/>
+        </w:rPr>
+        <w:t>写在这里是为了交代我们的出发点；**本文其余部分的任何判据都不依赖这个猜想成立。**</w:t>
+      </w:r>
+    </w:p>
+    <w:p>
+      <w:r>
+        <w:rPr>
+          <w:b/>
+          <w:sz w:val="26"/>
+        </w:rPr>
+        <w:t>3.4 标注</w:t>
+      </w:r>
+    </w:p>
+    <w:p>
+      <w:r>
+        <w:rPr>
+          <w:rFonts w:ascii="Consolas" w:hAnsi="Consolas" w:eastAsia="Consolas"/>
+          <w:b w:val="0"/>
+          <w:sz w:val="18"/>
+        </w:rPr>
+        <w:t>[猜想]   世界的根源是数学性的</w:t>
+      </w:r>
+    </w:p>
+    <w:p>
+      <w:r>
+        <w:rPr>
+          <w:rFonts w:ascii="Consolas" w:hAnsi="Consolas" w:eastAsia="Consolas"/>
+          <w:b w:val="0"/>
+          <w:sz w:val="18"/>
+        </w:rPr>
+        <w:t>[经验]   世界具有可被部分描述/压缩的规律性</w:t>
+      </w:r>
+    </w:p>
+    <w:p>
+      <w:r>
+        <w:rPr>
+          <w:rFonts w:ascii="Consolas" w:hAnsi="Consolas" w:eastAsia="Consolas"/>
+          <w:b w:val="0"/>
+          <w:sz w:val="18"/>
+        </w:rPr>
+        <w:t>[本文用] 只使用后者；即使前者为假，本文全部判据与实验照常成立</w:t>
+      </w:r>
+    </w:p>
+    <w:p>
+      <w:r>
+        <w:rPr>
+          <w:rFonts w:ascii="Consolas" w:hAnsi="Consolas" w:eastAsia="Consolas"/>
+          <w:b w:val="0"/>
+          <w:sz w:val="18"/>
+        </w:rPr>
+        <w:t>[不讨论] 数学为何有效（Wigner 之谜）；世界本体到底是什么</w:t>
+      </w:r>
+    </w:p>
+    <w:p>
+      <w:pPr>
+        <w:jc w:val="center"/>
+      </w:pPr>
+      <w:r>
+        <w:rPr>
+          <w:b/>
+          <w:sz w:val="34"/>
+        </w:rPr>
+        <w:t>第二节 · 生命是一个会自指、会变化、会自我维持的动态函数类</w:t>
+      </w:r>
+    </w:p>
+    <w:p>
+      <w:r>
+        <w:rPr>
+          <w:b w:val="0"/>
+          <w:sz w:val="20"/>
+        </w:rPr>
+        <w:t>本节给出本文的工作定义。简单一句话：</w:t>
+      </w:r>
+    </w:p>
+    <w:p>
+      <w:r>
+        <w:rPr>
+          <w:b w:val="0"/>
+          <w:sz w:val="20"/>
+        </w:rPr>
+        <w:t>**生命 = 一族会变化、会自指、会自我维持的函数；而它怎么变，也写在它自己里面。**</w:t>
+      </w:r>
+    </w:p>
+    <w:p>
+      <w:r>
+        <w:rPr>
+          <w:b/>
+          <w:sz w:val="26"/>
+        </w:rPr>
+        <w:t>四、一个可操作的定义</w:t>
       </w:r>
     </w:p>
     <w:p>
@@ -830,7 +1182,16 @@
           <w:b w:val="0"/>
           <w:sz w:val="22"/>
         </w:rPr>
-        <w:t>p生命 是可函数化的部分：在宇宙的 P 中、被保住的（可维持的）动态函数类。R生命 是不可函数化的部分：本文不知道它是什么，也不主张它不存在。</w:t>
+        <w:t>如果接受第三层的猜想，就可以给生命一个操作性的定义。这个定义是人造的，不是发现的；它成立与否，要看它能不能区分、能不能导出可测的东西。</w:t>
+      </w:r>
+    </w:p>
+    <w:p>
+      <w:r>
+        <w:rPr>
+          <w:b/>
+          <w:sz w:val="26"/>
+        </w:rPr>
+        <w:t>4.1 定义</w:t>
       </w:r>
     </w:p>
     <w:p>
@@ -839,7 +1200,7 @@
           <w:b w:val="0"/>
           <w:sz w:val="22"/>
         </w:rPr>
-        <w:t>p生命 的具体写法如下：</w:t>
+        <w:t>生命 = 一个动态函数类（函数空间里的一块区域）。</w:t>
       </w:r>
     </w:p>
     <w:p>
@@ -849,7 +1210,7 @@
           <w:b w:val="0"/>
           <w:sz w:val="18"/>
         </w:rPr>
-        <w:t>记 p生命 = { f_θ : θ ∈ Θ }</w:t>
+        <w:t>记个体为 F = { f_θ : θ ∈ Θ }</w:t>
       </w:r>
     </w:p>
     <w:p>
@@ -879,7 +1240,7 @@
           <w:b w:val="0"/>
           <w:sz w:val="18"/>
         </w:rPr>
-        <w:t>p生命 = 一个会移动、会变形的 Θ，且 Θ 的更新规则属于 Θ 自己</w:t>
+        <w:t>生命 = 一个会移动、会变形的 Θ，且 Θ 的更新规则属于 Θ 自己</w:t>
       </w:r>
     </w:p>
     <w:p>
@@ -888,7 +1249,7 @@
           <w:b w:val="0"/>
           <w:sz w:val="22"/>
         </w:rPr>
-        <w:t>四个词，各对应 p生命 的一件事：</w:t>
+        <w:t>四个词，各对应四件事：</w:t>
       </w:r>
     </w:p>
     <w:tbl>
@@ -1035,7 +1396,7 @@
               <w:rPr>
                 <w:sz w:val="18"/>
               </w:rPr>
-              <w:t>被宇宙保住；这是它与宇宙的关系，不是它自己的属性</w:t>
+              <w:t>花代价维持自己的形状；收入靠压缩世界</w:t>
             </w:r>
           </w:p>
         </w:tc>
@@ -1047,7 +1408,7 @@
           <w:b/>
           <w:sz w:val="26"/>
         </w:rPr>
-        <w:t>2.2 一处澄清：维持是关系</w:t>
+        <w:t>4.2 一处澄清：维持是关系</w:t>
       </w:r>
     </w:p>
     <w:p>
@@ -1056,7 +1417,7 @@
           <w:b w:val="0"/>
           <w:sz w:val="22"/>
         </w:rPr>
-        <w:t>需要澄清一处措辞：维持不是系统自身的属性，而是系统与宇宙的关系。给定宇宙这个整体（或它在 P 上的部分），某些结构的轨道会留在可维持的集合里，我们才说它"维持住了"；换一个环境，同一个结构可能不再成立。因此定义里的"会自我维持"，应读作"被宇宙保住"，是关系条件的展开，不是第三条并列属性。</w:t>
+        <w:t>需要澄清一处措辞：维持不是系统自身的属性，而是系统与宇宙函数的关系。给定宇宙函数 F，某些结构的轨道会留在可维持的集合里，我们才说它"维持住了"；换一个 F，同一个结构可能不再成立。因此定义里的"会自我维持"，应读作"被 F 保住"，是关系条件的展开，不是第三条并列属性。</w:t>
       </w:r>
     </w:p>
     <w:p>
@@ -1074,7 +1435,7 @@
           <w:b/>
           <w:sz w:val="26"/>
         </w:rPr>
-        <w:t>2.3 为什么必须是「一族」而不是「一个函数」</w:t>
+        <w:t>4.3 为什么必须是「一族」而不是「一个函数」</w:t>
       </w:r>
     </w:p>
     <w:p>
@@ -1104,15 +1465,6 @@
           <w:sz w:val="22"/>
         </w:rPr>
         <w:t>⇒ 「高维」不是指参数多，而是指这族函数在函数空间里占据一块区域、不是一点。</w:t>
-      </w:r>
-    </w:p>
-    <w:p>
-      <w:r>
-        <w:rPr>
-          <w:b w:val="0"/>
-          <w:sz w:val="22"/>
-        </w:rPr>
-        <w:t>这里有一个边界要说清。「一族」是 p 层面的要求，不是本体层面的绝对条件。如果 R 存在而且它是活跃的——变化由 R 提供——那么一个固定的 p 也可能属于一个活着的整体；只是我们在 p 层面只能看到冻结，会把它判成死的。所以准确的说法是：在只讨论 P 的约定下，"一族"是可操作层面的必要条件；若 R 活跃，本判据会漏判。这不是本判据的错，而是 p 层面定义的固有边界。</w:t>
       </w:r>
     </w:p>
     <w:p>
@@ -1121,7 +1473,7 @@
           <w:b/>
           <w:sz w:val="26"/>
         </w:rPr>
-        <w:t>2.4 会变化 = 三层时间尺度</w:t>
+        <w:t>4.4 会变化 = 三层时间尺度</w:t>
       </w:r>
     </w:p>
     <w:p>
@@ -1160,7 +1512,7 @@
           <w:b/>
           <w:sz w:val="26"/>
         </w:rPr>
-        <w:t>2.5 会自指 = 更新规则在它自己里面</w:t>
+        <w:t>4.5 会自指 = 更新规则在它自己里面</w:t>
       </w:r>
     </w:p>
     <w:p>
@@ -1199,7 +1551,7 @@
           <w:b/>
           <w:sz w:val="26"/>
         </w:rPr>
-        <w:t>三、生命与环境</w:t>
+        <w:t>五、生命与环境</w:t>
       </w:r>
     </w:p>
     <w:p>
@@ -1217,7 +1569,7 @@
           <w:b/>
           <w:sz w:val="26"/>
         </w:rPr>
-        <w:t>3.1 与前面的衔接</w:t>
+        <w:t>5.1 与前面的衔接</w:t>
       </w:r>
     </w:p>
     <w:p>
@@ -1226,7 +1578,7 @@
           <w:b w:val="0"/>
           <w:sz w:val="22"/>
         </w:rPr>
-        <w:t>前面的推理给出 `S_{t+1} = F(S_t)`（世界在这个描述下是一个自映射）。</w:t>
+        <w:t>第一节的猜想给出 `S_{t+1} = F(S_t)`（世界是一个函数）。</w:t>
       </w:r>
     </w:p>
     <w:p>
@@ -1284,7 +1636,7 @@
           <w:b/>
           <w:sz w:val="26"/>
         </w:rPr>
-        <w:t>3.2 生命 vs 环境：都在宇宙里，都是函数，区别只有一条</w:t>
+        <w:t>5.2 生命 vs 环境：都在宇宙里，都是函数，区别只有一条</w:t>
       </w:r>
     </w:p>
     <w:p>
@@ -1293,7 +1645,7 @@
           <w:b w:val="0"/>
           <w:sz w:val="22"/>
         </w:rPr>
-        <w:t>宇宙（P 这一侧）里面，任何东西都是函数（或函数的组合）——环境也是函数。</w:t>
+        <w:t>宇宙函数 F 里面，任何东西都是函数（或函数的组合）——环境也是函数。</w:t>
       </w:r>
     </w:p>
     <w:p>
@@ -1389,7 +1741,7 @@
           <w:b/>
           <w:sz w:val="26"/>
         </w:rPr>
-        <w:t>3.3 环境是什么：宇宙里自发涌现的「局部解压」</w:t>
+        <w:t>5.3 环境是什么：宇宙里自发涌现的「局部解压」</w:t>
       </w:r>
     </w:p>
     <w:p>
@@ -1485,7 +1837,7 @@
           <w:b w:val="0"/>
           <w:sz w:val="18"/>
         </w:rPr>
-        <w:t>生命并不直接面对宇宙整体</w:t>
+        <w:t>生命并不直接面对宇宙函数 F</w:t>
       </w:r>
     </w:p>
     <w:p>
@@ -1516,51 +1868,6 @@
           <w:sz w:val="18"/>
         </w:rPr>
         <w:t xml:space="preserve">  ＝在宇宙给出的局部解释之上，再压缩一层</w:t>
-      </w:r>
-    </w:p>
-    <w:p>
-      <w:r>
-        <w:rPr>
-          <w:b w:val="0"/>
-          <w:sz w:val="22"/>
-        </w:rPr>
-        <w:t>和宇宙、生命一样，环境也可以写成分解：</w:t>
-      </w:r>
-    </w:p>
-    <w:p>
-      <w:r>
-        <w:rPr>
-          <w:b w:val="0"/>
-          <w:sz w:val="20"/>
-        </w:rPr>
-        <w:t>环境 = p环境 + R环境</w:t>
-      </w:r>
-    </w:p>
-    <w:p>
-      <w:r>
-        <w:rPr>
-          <w:b w:val="0"/>
-          <w:sz w:val="22"/>
-        </w:rPr>
-        <w:t>p环境 是环境里可函数化的部分：它的规律、可测量的一侧。R环境 是环境里不可函数化的部分：本文不知道它是什么，也不主张它不存在。生命与环境打交道，但我们能描述、能测量的只有 p环境 那一侧；对 R环境，本文只说到沉默。</w:t>
-      </w:r>
-    </w:p>
-    <w:p>
-      <w:r>
-        <w:rPr>
-          <w:b w:val="0"/>
-          <w:sz w:val="22"/>
-        </w:rPr>
-        <w:t>需要说明：R环境 不是“环境里固定不动的部分”，而是“环境里不能用函数描述的部分”。它可能静止，也可能非常活跃——“固定/活跃”这个判断本身要靠函数描述才做得出来，而在 R 那里我们连动静都测不到。所以 p环境 与 R环境 的分界不是“动/静”的分界，是“能描述/不能描述”的分界。</w:t>
-      </w:r>
-    </w:p>
-    <w:p>
-      <w:r>
-        <w:rPr>
-          <w:b w:val="0"/>
-          <w:sz w:val="22"/>
-        </w:rPr>
-        <w:t>需要说明一点：R 的部分，本系列只在此声明它的存在——宇宙、生命、环境、语言都可以写成 p + R，但 R 是什么、有多大，本文不知道也不主张。为了便于理解，后文默认只讨论 p 这一侧：凡说"宇宙"，指 P；凡说"生命"，指 p生命；凡说"环境"，指 p环境。后文以"残差"表示 R 的影响；R 的具体内容不再展开。</w:t>
       </w:r>
     </w:p>
     <w:p>
@@ -1569,7 +1876,7 @@
           <w:b/>
           <w:sz w:val="26"/>
         </w:rPr>
-        <w:t>3.4 环境是分层的：生命活在多层环境里，同时也活在宇宙里</w:t>
+        <w:t>5.4 环境是分层的：生命活在多层环境里，同时也活在宇宙里</w:t>
       </w:r>
     </w:p>
     <w:p>
@@ -1750,7 +2057,7 @@
           <w:b/>
           <w:sz w:val="26"/>
         </w:rPr>
-        <w:t>3.5 标注</w:t>
+        <w:t>5.5 标注</w:t>
       </w:r>
     </w:p>
     <w:p>
@@ -1760,7 +2067,7 @@
           <w:b w:val="0"/>
           <w:sz w:val="18"/>
         </w:rPr>
-        <w:t>[定义]  生命 = p生命 + R生命；p生命 = 会自指、会变化、被宇宙保住的动态函数类（本文的工作定义）</w:t>
+        <w:t>[定义]  生命 = 会自指、会变化、**会自我维持**的动态函数类（本文的工作定义）</w:t>
       </w:r>
     </w:p>
     <w:p>
@@ -1790,7 +2097,7 @@
           <w:b w:val="0"/>
           <w:sz w:val="18"/>
         </w:rPr>
-        <w:t>[定义]  p生命 = 同一批涌现结构里，**被宇宙保住**的那一类</w:t>
+        <w:t>[定义]  生命 = 同一批涌现结构里，**自己维持自己**的那一类</w:t>
       </w:r>
     </w:p>
     <w:p>
@@ -1860,7 +2167,7 @@
           <w:b w:val="0"/>
           <w:sz w:val="18"/>
         </w:rPr>
-        <w:t>[不是]  不是事实断言，也不是定理；是一个便于操作的定义</w:t>
+        <w:t>[不是]  不是猜想，也不是定理；是一个便于操作的定义</w:t>
       </w:r>
     </w:p>
     <w:p>
@@ -1871,6 +2178,45 @@
           <w:sz w:val="18"/>
         </w:rPr>
         <w:t>[后文]  本节只给定义；如何测量（压缩/代价/身份）留到后面几节</w:t>
+      </w:r>
+    </w:p>
+    <w:p>
+      <w:pPr>
+        <w:jc w:val="center"/>
+      </w:pPr>
+      <w:r>
+        <w:rPr>
+          <w:b/>
+          <w:sz w:val="34"/>
+        </w:rPr>
+        <w:t>第三节 · 目前的 AI 为什么不是生命</w:t>
+      </w:r>
+    </w:p>
+    <w:p>
+      <w:r>
+        <w:rPr>
+          <w:b w:val="0"/>
+          <w:sz w:val="20"/>
+        </w:rPr>
+        <w:t>本节不是评价 AI 的能力，而是把它**代入第二节的定义**逐条检查。</w:t>
+      </w:r>
+    </w:p>
+    <w:p>
+      <w:r>
+        <w:rPr>
+          <w:b w:val="0"/>
+          <w:sz w:val="20"/>
+        </w:rPr>
+        <w:t>结论是定义性的，不是价值判断：**以本文的定义，目前的 AI 是化石级函数点，</w:t>
+      </w:r>
+    </w:p>
+    <w:p>
+      <w:r>
+        <w:rPr>
+          <w:b w:val="0"/>
+          <w:sz w:val="20"/>
+        </w:rPr>
+        <w:t>不是生命。** 它的强大与它的「不是生命」并不矛盾。</w:t>
       </w:r>
     </w:p>
     <w:p>
@@ -1879,7 +2225,7 @@
           <w:b/>
           <w:sz w:val="26"/>
         </w:rPr>
-        <w:t>四、数字世界的特殊性</w:t>
+        <w:t>六、检查表：定义能区分什么</w:t>
       </w:r>
     </w:p>
     <w:p>
@@ -1888,61 +2234,7 @@
           <w:b w:val="0"/>
           <w:sz w:val="22"/>
         </w:rPr>
-        <w:t>数字世界是完全函数化的：它由比特、状态、转移规则组成，没有函数描述够不着的部分。也就是说，在数字世界里，R = ∅。</w:t>
-      </w:r>
-    </w:p>
-    <w:p>
-      <w:r>
-        <w:rPr>
-          <w:b w:val="0"/>
-          <w:sz w:val="22"/>
-        </w:rPr>
-        <w:t>数字生命是数字世界的一部分，所以它的 R生命 也只能是空集：数字生命 = p生命，完全可函数化。</w:t>
-      </w:r>
-    </w:p>
-    <w:p>
-      <w:r>
-        <w:rPr>
-          <w:b w:val="0"/>
-          <w:sz w:val="22"/>
-        </w:rPr>
-        <w:t>但 R 到底存不存在，我们不知道。把可能性列出来，有三种情况。</w:t>
-      </w:r>
-    </w:p>
-    <w:p>
-      <w:r>
-        <w:rPr>
-          <w:b w:val="0"/>
-          <w:sz w:val="22"/>
-        </w:rPr>
-        <w:t>第一种情况，R 不存在：宇宙完全可函数化，一切都能被函数描述。这是最简单的框架。数字世界可计算、可观测、可复现。</w:t>
-      </w:r>
-    </w:p>
-    <w:p>
-      <w:r>
-        <w:rPr>
-          <w:b w:val="0"/>
-          <w:sz w:val="22"/>
-        </w:rPr>
-        <w:t>第二种情况，R 存在，但生命可以没有 R：有的生命有 R，有的生命没有 R（R生命 = ∅）。那么数字生命仍然可能——它完全由 p生命 构成，没有任何 R生命。</w:t>
-      </w:r>
-    </w:p>
-    <w:p>
-      <w:r>
-        <w:rPr>
-          <w:b w:val="0"/>
-          <w:sz w:val="22"/>
-        </w:rPr>
-        <w:t>第三种情况，R 存在，而且生命必须有 R：不可函数化的部分是生命的必要条件。那么数字生命不可能——数字世界造不出 R，因此造不出生命。</w:t>
-      </w:r>
-    </w:p>
-    <w:p>
-      <w:r>
-        <w:rPr>
-          <w:b w:val="0"/>
-          <w:sz w:val="22"/>
-        </w:rPr>
-        <w:t>本文不判断哪一种成立。可以确定的是：无论哪一种，本文在 p 层面的讨论都成立；区别只在数字生命是可能还是不可能。数字世界是唯一能完全落在 p 里的世界，所以它也是研究这个话题最干净的场景——现在的 AI 就活在这个世界里。</w:t>
+        <w:t>定义的价值在于区分。下面用一张检查表把"活的结构"与"不算活的结构"分开。</w:t>
       </w:r>
     </w:p>
     <w:p>
@@ -1951,52 +2243,7 @@
           <w:b/>
           <w:sz w:val="26"/>
         </w:rPr>
-        <w:t>五、用定义看现在的 AI：为什么它不是生命</w:t>
-      </w:r>
-    </w:p>
-    <w:p>
-      <w:r>
-        <w:rPr>
-          <w:b w:val="0"/>
-          <w:sz w:val="20"/>
-        </w:rPr>
-        <w:t>本节不是评价 AI 的能力，而是把它**代入第二节的定义**逐条检查。</w:t>
-      </w:r>
-    </w:p>
-    <w:p>
-      <w:r>
-        <w:rPr>
-          <w:b w:val="0"/>
-          <w:sz w:val="20"/>
-        </w:rPr>
-        <w:t>结论是定义性的，不是价值判断：**以本文的定义，目前的 AI 是化石级函数点，</w:t>
-      </w:r>
-    </w:p>
-    <w:p>
-      <w:r>
-        <w:rPr>
-          <w:b w:val="0"/>
-          <w:sz w:val="20"/>
-        </w:rPr>
-        <w:t>不是生命。** 它的强大与它的「不是生命」并不矛盾。</w:t>
-      </w:r>
-    </w:p>
-    <w:p>
-      <w:r>
-        <w:rPr>
-          <w:b w:val="0"/>
-          <w:sz w:val="22"/>
-        </w:rPr>
-        <w:t>定义的价值在于区分。把现在的 AI 代入定义逐条检查，就能看出它差在哪里。下面先给一张检查表，再列三条最根本的原因。</w:t>
-      </w:r>
-    </w:p>
-    <w:p>
-      <w:r>
-        <w:rPr>
-          <w:b/>
-          <w:sz w:val="26"/>
-        </w:rPr>
-        <w:t>5.1 检查表</w:t>
+        <w:t>6.1 检查表</w:t>
       </w:r>
     </w:p>
     <w:tbl>
@@ -2183,7 +2430,7 @@
               <w:rPr>
                 <w:sz w:val="18"/>
               </w:rPr>
-              <w:t>**被宇宙保住**（可维持）</w:t>
+              <w:t>**会自我维持**（花代价维持自己）</w:t>
             </w:r>
           </w:p>
         </w:tc>
@@ -2196,7 +2443,7 @@
               <w:rPr>
                 <w:sz w:val="18"/>
               </w:rPr>
-              <w:t>它不自己维持自己；维持它的是外部的人与设施</w:t>
+              <w:t>它不付电费、不修复自己、不复制自己；维持者是外部的人</w:t>
             </w:r>
           </w:p>
         </w:tc>
@@ -2344,7 +2591,7 @@
           <w:b/>
           <w:sz w:val="26"/>
         </w:rPr>
-        <w:t>5.2 三条最根本的原因（按重要性）</w:t>
+        <w:t>6.2 三条最根本的原因（按重要性）</w:t>
       </w:r>
     </w:p>
     <w:p>
@@ -2490,7 +2737,7 @@
           <w:b/>
           <w:sz w:val="26"/>
         </w:rPr>
-        <w:t>5.3 为什么「它很强」与「它不是生命」不矛盾</w:t>
+        <w:t>6.3 为什么「它很强」与「它不是生命」不矛盾</w:t>
       </w:r>
     </w:p>
     <w:p>
@@ -2510,7 +2757,7 @@
           <w:b w:val="0"/>
           <w:sz w:val="18"/>
         </w:rPr>
-        <w:t>活 = 在函数空间里占据一块区域、自己维持形状、被宇宙保住</w:t>
+        <w:t>活 = 在函数空间里占据一块区域、自己维持形状、自己付代价</w:t>
       </w:r>
     </w:p>
     <w:p>
@@ -2539,7 +2786,7 @@
           <w:b/>
           <w:sz w:val="26"/>
         </w:rPr>
-        <w:t>5.4 标注</w:t>
+        <w:t>6.4 标注</w:t>
       </w:r>
     </w:p>
     <w:p>
@@ -2579,7 +2826,19 @@
           <w:b w:val="0"/>
           <w:sz w:val="18"/>
         </w:rPr>
-        <w:t>[推论] 若要让 AI 成为生命，至少要给它：一族函数 + 自指更新 + 被宇宙保住</w:t>
+        <w:t>[推论] 若要让 AI 成为生命，至少要给它：一族函数 + 自指更新 + 自己付代价</w:t>
+      </w:r>
+    </w:p>
+    <w:p>
+      <w:pPr>
+        <w:jc w:val="center"/>
+      </w:pPr>
+      <w:r>
+        <w:rPr>
+          <w:b/>
+          <w:sz w:val="34"/>
+        </w:rPr>
+        <w:t>第四节 · 生命需要什么：三条必要条件</w:t>
       </w:r>
     </w:p>
     <w:p>
@@ -2615,7 +2874,7 @@
           <w:b/>
           <w:sz w:val="26"/>
         </w:rPr>
-        <w:t>六、三条必要条件</w:t>
+        <w:t>七、三条必要条件</w:t>
       </w:r>
     </w:p>
     <w:p>
@@ -2633,7 +2892,7 @@
           <w:b/>
           <w:sz w:val="26"/>
         </w:rPr>
-        <w:t>6.1 从定义到条件</w:t>
+        <w:t>7.1 从定义到条件</w:t>
       </w:r>
     </w:p>
     <w:p>
@@ -2673,26 +2932,7 @@
           <w:b w:val="0"/>
           <w:sz w:val="18"/>
         </w:rPr>
-        <w:t>会自我维持           ⇒  ③ 被宇宙保住：轨道留在可维持集合里</w:t>
-      </w:r>
-    </w:p>
-    <w:p>
-      <w:r>
-        <w:rPr>
-          <w:rFonts w:ascii="Consolas" w:hAnsi="Consolas" w:eastAsia="Consolas"/>
-          <w:b w:val="0"/>
-          <w:sz w:val="18"/>
-        </w:rPr>
-      </w:r>
-    </w:p>
-    <w:p>
-      <w:r>
-        <w:rPr>
-          <w:rFonts w:ascii="Consolas" w:hAnsi="Consolas" w:eastAsia="Consolas"/>
-          <w:b w:val="0"/>
-          <w:sz w:val="18"/>
-        </w:rPr>
-        <w:t>（付代价不在必要条件里：它是演化与热力学的经验伴随物，见 6.4b。）</w:t>
+        <w:t>会自我维持           ⇒  ③ 自己付代价：压缩收益 ≥ 维持成本</w:t>
       </w:r>
     </w:p>
     <w:p>
@@ -2710,7 +2950,7 @@
           <w:b/>
           <w:sz w:val="26"/>
         </w:rPr>
-        <w:t>6.2 条件① 一族函数（不是一个点）</w:t>
+        <w:t>7.2 条件① 一族函数（不是一个点）</w:t>
       </w:r>
     </w:p>
     <w:p>
@@ -2776,7 +3016,7 @@
           <w:b/>
           <w:sz w:val="26"/>
         </w:rPr>
-        <w:t>6.3 条件② 自指更新（规则在自己里面）</w:t>
+        <w:t>7.3 条件② 自指更新（规则在自己里面）</w:t>
       </w:r>
     </w:p>
     <w:p>
@@ -2842,7 +3082,7 @@
           <w:b/>
           <w:sz w:val="26"/>
         </w:rPr>
-        <w:t>6.4 条件③ 被宇宙保住（可维持）</w:t>
+        <w:t>7.4 条件③ 自己付代价（压缩换生存）</w:t>
       </w:r>
     </w:p>
     <w:p>
@@ -2851,7 +3091,47 @@
           <w:b w:val="0"/>
           <w:sz w:val="22"/>
         </w:rPr>
-        <w:t>要求：它的轨道留在宇宙的可维持集合里。给定宇宙这个整体，有些结构出不来，有些结构能一直维持；能维持的那部分才落在定义里。这是关系条件，不是它自己的属性。</w:t>
+        <w:t>要求：收入来自压缩世界（匹配源分布）；支出是维持结构的真实成本；且存在盈余。</w:t>
+      </w:r>
+    </w:p>
+    <w:p>
+      <w:r>
+        <w:rPr>
+          <w:rFonts w:ascii="Consolas" w:hAnsi="Consolas" w:eastAsia="Consolas"/>
+          <w:b w:val="0"/>
+          <w:sz w:val="18"/>
+        </w:rPr>
+        <w:t>存在条件：S &gt; d·K</w:t>
+      </w:r>
+    </w:p>
+    <w:p>
+      <w:r>
+        <w:rPr>
+          <w:rFonts w:ascii="Consolas" w:hAnsi="Consolas" w:eastAsia="Consolas"/>
+          <w:b w:val="0"/>
+          <w:sz w:val="18"/>
+        </w:rPr>
+        <w:t xml:space="preserve">   S = 世界的可压缩盈余</w:t>
+      </w:r>
+    </w:p>
+    <w:p>
+      <w:r>
+        <w:rPr>
+          <w:rFonts w:ascii="Consolas" w:hAnsi="Consolas" w:eastAsia="Consolas"/>
+          <w:b w:val="0"/>
+          <w:sz w:val="18"/>
+        </w:rPr>
+        <w:t xml:space="preserve">   d = 结构维持成本率</w:t>
+      </w:r>
+    </w:p>
+    <w:p>
+      <w:r>
+        <w:rPr>
+          <w:rFonts w:ascii="Consolas" w:hAnsi="Consolas" w:eastAsia="Consolas"/>
+          <w:b w:val="0"/>
+          <w:sz w:val="18"/>
+        </w:rPr>
+        <w:t xml:space="preserve">   K = 结构规模</w:t>
       </w:r>
     </w:p>
     <w:p>
@@ -2860,7 +3140,76 @@
           <w:b w:val="0"/>
           <w:sz w:val="22"/>
         </w:rPr>
-        <w:t>判据：扰动之后，它是否仍能回到可维持的集合——有恢复力，而不只是瞬间活着。</w:t>
+        <w:t>证据/经验（这是本文最硬的部分）：</w:t>
+      </w:r>
+    </w:p>
+    <w:p>
+      <w:r>
+        <w:rPr>
+          <w:rFonts w:ascii="Consolas" w:hAnsi="Consolas" w:eastAsia="Consolas"/>
+          <w:b w:val="0"/>
+          <w:sz w:val="18"/>
+        </w:rPr>
+        <w:t>· E1：「准」≠「压缩」：用正确率记账，系统学出「啥也不干」（LEN=0、预测0、准确率92%）</w:t>
+      </w:r>
+    </w:p>
+    <w:p>
+      <w:r>
+        <w:rPr>
+          <w:rFonts w:ascii="Consolas" w:hAnsi="Consolas" w:eastAsia="Consolas"/>
+          <w:b w:val="0"/>
+          <w:sz w:val="18"/>
+        </w:rPr>
+        <w:t xml:space="preserve">      ⇒ 必须用对数似然改善 over 基线：gain_bits = log2 p_model − log2 p_base</w:t>
+      </w:r>
+    </w:p>
+    <w:p>
+      <w:r>
+        <w:rPr>
+          <w:rFonts w:ascii="Consolas" w:hAnsi="Consolas" w:eastAsia="Consolas"/>
+          <w:b w:val="0"/>
+          <w:sz w:val="18"/>
+        </w:rPr>
+        <w:t>· E2：正是加上基率校正后，系统才从躺平解转为真正表达（LEN 从 0 长出）</w:t>
+      </w:r>
+    </w:p>
+    <w:p>
+      <w:r>
+        <w:rPr>
+          <w:rFonts w:ascii="Consolas" w:hAnsi="Consolas" w:eastAsia="Consolas"/>
+          <w:b w:val="0"/>
+          <w:sz w:val="18"/>
+        </w:rPr>
+        <w:t>· E8：经济标定 n* = FLUX_TOTAL / BASE_COST 决定「冻结」与「爆发」的切换</w:t>
+      </w:r>
+    </w:p>
+    <w:p>
+      <w:r>
+        <w:rPr>
+          <w:rFonts w:ascii="Consolas" w:hAnsi="Consolas" w:eastAsia="Consolas"/>
+          <w:b w:val="0"/>
+          <w:sz w:val="18"/>
+        </w:rPr>
+        <w:t>· 实测正收益：S1~S6 中观察到 gain &gt; 0（约 +0.09 ~ +0.19 bit/tick）</w:t>
+      </w:r>
+    </w:p>
+    <w:p>
+      <w:r>
+        <w:rPr>
+          <w:rFonts w:ascii="Consolas" w:hAnsi="Consolas" w:eastAsia="Consolas"/>
+          <w:b w:val="0"/>
+          <w:sz w:val="18"/>
+        </w:rPr>
+        <w:t xml:space="preserve">      ⇒ 世界确实存在可压缩盈余（即 S &gt; 0 的经验证据）</w:t>
+      </w:r>
+    </w:p>
+    <w:p>
+      <w:r>
+        <w:rPr>
+          <w:b w:val="0"/>
+          <w:sz w:val="22"/>
+        </w:rPr>
+        <w:t>⇒ 判据：把外部供给全部停掉后，它的账目是否仍为正。</w:t>
       </w:r>
     </w:p>
     <w:p>
@@ -2869,7 +3218,37 @@
           <w:b/>
           <w:sz w:val="26"/>
         </w:rPr>
-        <w:t>6.4b 付代价：经验伴随物，不是必要条件</w:t>
+        <w:t>7.5 三条必须同时成立（经验对照）</w:t>
+      </w:r>
+    </w:p>
+    <w:p>
+      <w:r>
+        <w:rPr>
+          <w:rFonts w:ascii="Consolas" w:hAnsi="Consolas" w:eastAsia="Consolas"/>
+          <w:b w:val="0"/>
+          <w:sz w:val="18"/>
+        </w:rPr>
+        <w:t>缺①（一族）  ⇒ 化石：行为谱是一条线</w:t>
+      </w:r>
+    </w:p>
+    <w:p>
+      <w:r>
+        <w:rPr>
+          <w:rFonts w:ascii="Consolas" w:hAnsi="Consolas" w:eastAsia="Consolas"/>
+          <w:b w:val="0"/>
+          <w:sz w:val="18"/>
+        </w:rPr>
+        <w:t>缺②（自指）  ⇒ 机器：更新在外，不会自己变</w:t>
+      </w:r>
+    </w:p>
+    <w:p>
+      <w:r>
+        <w:rPr>
+          <w:rFonts w:ascii="Consolas" w:hAnsi="Consolas" w:eastAsia="Consolas"/>
+          <w:b w:val="0"/>
+          <w:sz w:val="18"/>
+        </w:rPr>
+        <w:t>缺③（代价）  ⇒ 玩具：由外部供养，不会死，也就没有选择</w:t>
       </w:r>
     </w:p>
     <w:p>
@@ -2878,7 +3257,7 @@
           <w:b w:val="0"/>
           <w:sz w:val="22"/>
         </w:rPr>
-        <w:t>本文不把「付代价」列为条件，原因说清：代价是演化与热力学的产物，不是逻辑上的必要条件。在资源无限的世界里，生命可以不必竞争；稀缺才带来代价。把它写进必要条件，等于把演化的结果当成生命的定义。</w:t>
+        <w:t>这三条也解释了为什么我们的实验一直在同一个地方卡住：</w:t>
       </w:r>
     </w:p>
     <w:p>
@@ -2887,7 +3266,7 @@
           <w:b w:val="0"/>
           <w:sz w:val="22"/>
         </w:rPr>
-        <w:t>但在经验层面，代价几乎总会出现，而且可以测量。本文实验里的经济部分属于这一层，摘录如下。</w:t>
+        <w:t>结构能长出来（①②部分满足），但合作/分工不成为必需 —— 因为③的「收入差」太小，</w:t>
       </w:r>
     </w:p>
     <w:p>
@@ -2896,43 +3275,7 @@
           <w:b w:val="0"/>
           <w:sz w:val="22"/>
         </w:rPr>
-        <w:t>· E1：「准」不等于「压缩」：用正确率记账，系统学出「啥也不干」（LEN=0、预测0、准确率92%）。必须用对数似然改善对基线记账：gain_bits = log2 p_model − log2 p_base。</w:t>
-      </w:r>
-    </w:p>
-    <w:p>
-      <w:r>
-        <w:rPr>
-          <w:b w:val="0"/>
-          <w:sz w:val="22"/>
-        </w:rPr>
-        <w:t>· E2：加上基率校正后，系统才从躺平解转为真正表达（LEN 从 0 长出）。</w:t>
-      </w:r>
-    </w:p>
-    <w:p>
-      <w:r>
-        <w:rPr>
-          <w:b w:val="0"/>
-          <w:sz w:val="22"/>
-        </w:rPr>
-        <w:t>· E8：经济标定 n* = FLUX_TOTAL / BASE_COST 决定「冻结」与「爆发」的切换。</w:t>
-      </w:r>
-    </w:p>
-    <w:p>
-      <w:r>
-        <w:rPr>
-          <w:b w:val="0"/>
-          <w:sz w:val="22"/>
-        </w:rPr>
-        <w:t>· 实测正收益：S1~S6 中观察到 gain &gt; 0（约 +0.09 ~ +0.19 bit/tick），说明世界确实存在可压缩盈余。</w:t>
-      </w:r>
-    </w:p>
-    <w:p>
-      <w:r>
-        <w:rPr>
-          <w:b w:val="0"/>
-          <w:sz w:val="22"/>
-        </w:rPr>
-        <w:t>⇒ 判据（经验层）：把外部供给全部停掉后，它的账目是否仍为正。</w:t>
+        <w:t>即世界的可压缩盈余还没大到让「更复杂的结构」在经济上划算（E5/E7）。</w:t>
       </w:r>
     </w:p>
     <w:p>
@@ -2941,7 +3284,25 @@
           <w:b/>
           <w:sz w:val="26"/>
         </w:rPr>
-        <w:t>6.5 三条必须同时成立（经验对照）</w:t>
+        <w:t>7.6 未尽之处（留给读者）</w:t>
+      </w:r>
+    </w:p>
+    <w:p>
+      <w:r>
+        <w:rPr>
+          <w:b w:val="0"/>
+          <w:sz w:val="22"/>
+        </w:rPr>
+        <w:t>本文止于「必要条件」。三条都满足之后是否就「活」——我们没有答案，也不打算在此下结论。</w:t>
+      </w:r>
+    </w:p>
+    <w:p>
+      <w:r>
+        <w:rPr>
+          <w:b w:val="0"/>
+          <w:sz w:val="22"/>
+        </w:rPr>
+        <w:t>留给读者的，只是一把可以拿去用的尺子：</w:t>
       </w:r>
     </w:p>
     <w:p>
@@ -2951,7 +3312,7 @@
           <w:b w:val="0"/>
           <w:sz w:val="18"/>
         </w:rPr>
-        <w:t>缺①（一族）  ⇒ 化石：行为谱是一条线</w:t>
+        <w:t>它是一族函数吗？（行为谱不是一个点）</w:t>
       </w:r>
     </w:p>
     <w:p>
@@ -2961,7 +3322,7 @@
           <w:b w:val="0"/>
           <w:sz w:val="18"/>
         </w:rPr>
-        <w:t>缺②（自指）  ⇒ 机器：更新在外，不会自己变</w:t>
+        <w:t>它会自己改自己吗？（拿掉外部更新，它仍变）</w:t>
       </w:r>
     </w:p>
     <w:p>
@@ -2971,7 +3332,7 @@
           <w:b w:val="0"/>
           <w:sz w:val="18"/>
         </w:rPr>
-        <w:t>缺③（被保住）⇒ 散掉：轨道离开可维持集合，不再是一个活着的结构</w:t>
+        <w:t>它自己付代价吗？（压缩世界的收入 ≥ 维持结构的支出）</w:t>
       </w:r>
     </w:p>
     <w:p>
@@ -2980,25 +3341,7 @@
           <w:b w:val="0"/>
           <w:sz w:val="22"/>
         </w:rPr>
-        <w:t>这三条也解释了为什么我们的实验一直在同一个地方卡住：</w:t>
-      </w:r>
-    </w:p>
-    <w:p>
-      <w:r>
-        <w:rPr>
-          <w:b w:val="0"/>
-          <w:sz w:val="22"/>
-        </w:rPr>
-        <w:t>结构能长出来（①②部分满足），但合作/分工不成为必需 —— 因为代价层面的「收入差」太小（经验层面，非定义条件），</w:t>
-      </w:r>
-    </w:p>
-    <w:p>
-      <w:r>
-        <w:rPr>
-          <w:b w:val="0"/>
-          <w:sz w:val="22"/>
-        </w:rPr>
-        <w:t>即世界的可压缩盈余还没大到让「更复杂的结构」在经济上划算（E5/E7）。</w:t>
+        <w:t>三条你都可以自己去量。至于量完之后它算不算生命，由你判断。</w:t>
       </w:r>
     </w:p>
     <w:p>
@@ -3007,7 +3350,7 @@
           <w:b/>
           <w:sz w:val="26"/>
         </w:rPr>
-        <w:t>6.6 未尽之处（留给读者）</w:t>
+        <w:t>7.7 本文实验的边界（必须与结论一起读）</w:t>
       </w:r>
     </w:p>
     <w:p>
@@ -3016,7 +3359,57 @@
           <w:b w:val="0"/>
           <w:sz w:val="22"/>
         </w:rPr>
-        <w:t>本文止于「必要条件」。三条都满足之后是否就「活」——我们没有答案，也不打算在此下结论。</w:t>
+        <w:t>本文的实验只覆盖第③条必要条件（压缩收益 vs 维持成本），且是示例性的：</w:t>
+      </w:r>
+    </w:p>
+    <w:p>
+      <w:r>
+        <w:rPr>
+          <w:rFonts w:ascii="Consolas" w:hAnsi="Consolas" w:eastAsia="Consolas"/>
+          <w:b w:val="0"/>
+          <w:sz w:val="18"/>
+        </w:rPr>
+        <w:t>· 覆盖：③ 自己付代价 —— E1/E2（准≠压缩、基率校正）、E8（n*=FLUX/BASE_COST 的冻结/爆发边界）</w:t>
+      </w:r>
+    </w:p>
+    <w:p>
+      <w:r>
+        <w:rPr>
+          <w:rFonts w:ascii="Consolas" w:hAnsi="Consolas" w:eastAsia="Consolas"/>
+          <w:b w:val="0"/>
+          <w:sz w:val="18"/>
+        </w:rPr>
+        <w:t>· 覆盖：反例 —— E5/E7（相连个体基因距离 0.145 vs 随机 0.486 ⇒ 克隆抱团，不是分工）</w:t>
+      </w:r>
+    </w:p>
+    <w:p>
+      <w:r>
+        <w:rPr>
+          <w:rFonts w:ascii="Consolas" w:hAnsi="Consolas" w:eastAsia="Consolas"/>
+          <w:b w:val="0"/>
+          <w:sz w:val="18"/>
+        </w:rPr>
+        <w:t>· 未覆盖：① 一族函数、② 自指更新 —— 本文不声称有实验证据，只在定义上推导；</w:t>
+      </w:r>
+    </w:p>
+    <w:p>
+      <w:r>
+        <w:rPr>
+          <w:rFonts w:ascii="Consolas" w:hAnsi="Consolas" w:eastAsia="Consolas"/>
+          <w:b w:val="0"/>
+          <w:sz w:val="18"/>
+        </w:rPr>
+        <w:t xml:space="preserve">          仅有初步观察（E12 动态 0.849 vs 冻结 1.07；E13 身份链 8 代可校验）</w:t>
+      </w:r>
+    </w:p>
+    <w:p>
+      <w:r>
+        <w:rPr>
+          <w:rFonts w:ascii="Consolas" w:hAnsi="Consolas" w:eastAsia="Consolas"/>
+          <w:b w:val="0"/>
+          <w:sz w:val="18"/>
+        </w:rPr>
+        <w:t>· 规模：小、可复现、可手算；不是大规模实证</w:t>
       </w:r>
     </w:p>
     <w:p>
@@ -3025,37 +3418,7 @@
           <w:b w:val="0"/>
           <w:sz w:val="22"/>
         </w:rPr>
-        <w:t>留给读者的，只是一把可以拿去用的尺子：</w:t>
-      </w:r>
-    </w:p>
-    <w:p>
-      <w:r>
-        <w:rPr>
-          <w:rFonts w:ascii="Consolas" w:hAnsi="Consolas" w:eastAsia="Consolas"/>
-          <w:b w:val="0"/>
-          <w:sz w:val="18"/>
-        </w:rPr>
-        <w:t>它是一族函数吗？（行为谱不是一个点）</w:t>
-      </w:r>
-    </w:p>
-    <w:p>
-      <w:r>
-        <w:rPr>
-          <w:rFonts w:ascii="Consolas" w:hAnsi="Consolas" w:eastAsia="Consolas"/>
-          <w:b w:val="0"/>
-          <w:sz w:val="18"/>
-        </w:rPr>
-        <w:t>它会自己改自己吗？（拿掉外部更新，它仍变）</w:t>
-      </w:r>
-    </w:p>
-    <w:p>
-      <w:r>
-        <w:rPr>
-          <w:rFonts w:ascii="Consolas" w:hAnsi="Consolas" w:eastAsia="Consolas"/>
-          <w:b w:val="0"/>
-          <w:sz w:val="18"/>
-        </w:rPr>
-        <w:t>它被宇宙保住了吗？（轨道留在可维持集合里）</w:t>
+        <w:t>⇒ 本文的定位是「定义 + 可测判据 + 示例性实验」，不是「生命已被造出」的实证论文。</w:t>
       </w:r>
     </w:p>
     <w:p>
@@ -3064,7 +3427,7 @@
           <w:b w:val="0"/>
           <w:sz w:val="22"/>
         </w:rPr>
-        <w:t>三条你都可以自己去量。至于量完之后它算不算生命，由你判断。</w:t>
+        <w:t>读者若要用这些结论，请连同这条边界一起引用。</w:t>
       </w:r>
     </w:p>
     <w:p>
@@ -3073,79 +3436,77 @@
           <w:b/>
           <w:sz w:val="26"/>
         </w:rPr>
-        <w:t>6.7 本文实验的边界（必须与结论一起读）</w:t>
-      </w:r>
-    </w:p>
-    <w:p>
-      <w:r>
-        <w:rPr>
-          <w:b w:val="0"/>
-          <w:sz w:val="22"/>
-        </w:rPr>
-        <w:t>本文的实验覆盖的是「代价」这一经验层面，不是定义条件③。</w:t>
-      </w:r>
-    </w:p>
-    <w:p>
-      <w:r>
-        <w:rPr>
-          <w:b w:val="0"/>
-          <w:sz w:val="22"/>
-        </w:rPr>
-        <w:t>· 覆盖：代价与经济 —— E1/E2（准≠压缩、基率校正）、E8（n*=FLUX/BASE_COST 的冻结/爆发边界）。</w:t>
-      </w:r>
-    </w:p>
-    <w:p>
-      <w:r>
-        <w:rPr>
-          <w:b w:val="0"/>
-          <w:sz w:val="22"/>
-        </w:rPr>
-        <w:t>· 覆盖：反例 —— E5/E7（相连个体基因距离 0.145 vs 随机 0.486，克隆抱团，不是分工）。</w:t>
-      </w:r>
-    </w:p>
-    <w:p>
-      <w:r>
-        <w:rPr>
-          <w:b w:val="0"/>
-          <w:sz w:val="22"/>
-        </w:rPr>
-        <w:t>· 未覆盖：条件② 自指更新、条件③ 被宇宙保住 —— 本文不声称有实验证据，只做定义上的推导；仅有初步观察（E12 动态 0.849 vs 冻结 1.07；E13 身份链 8 代可校验）。</w:t>
-      </w:r>
-    </w:p>
-    <w:p>
-      <w:r>
-        <w:rPr>
-          <w:b w:val="0"/>
-          <w:sz w:val="22"/>
-        </w:rPr>
-        <w:t>· 条件① 一族函数：有部分观察（E12/E13），但不是专门实验。</w:t>
-      </w:r>
-    </w:p>
-    <w:p>
-      <w:r>
-        <w:rPr>
-          <w:b w:val="0"/>
-          <w:sz w:val="22"/>
-        </w:rPr>
-        <w:t>· 规模：小、可复现、可手算；不是大规模实证。</w:t>
-      </w:r>
-    </w:p>
-    <w:p>
-      <w:r>
-        <w:rPr>
-          <w:b w:val="0"/>
-          <w:sz w:val="22"/>
-        </w:rPr>
-        <w:t>⇒ 本文的定位是「定义 + 可测判据 + 示例性实验」，不是「生命已被造出」的实证论文。</w:t>
-      </w:r>
-    </w:p>
-    <w:p>
-      <w:r>
-        <w:rPr>
-          <w:b w:val="0"/>
-          <w:sz w:val="22"/>
-        </w:rPr>
-        <w:t>读者若要用这些结论，请连同这条边界一起引用。</w:t>
+        <w:t>7.8 标注</w:t>
+      </w:r>
+    </w:p>
+    <w:p>
+      <w:r>
+        <w:rPr>
+          <w:rFonts w:ascii="Consolas" w:hAnsi="Consolas" w:eastAsia="Consolas"/>
+          <w:b w:val="0"/>
+          <w:sz w:val="18"/>
+        </w:rPr>
+        <w:t>[推论] 三条必要条件由第二、三节直接推出，不是独立假设</w:t>
+      </w:r>
+    </w:p>
+    <w:p>
+      <w:r>
+        <w:rPr>
+          <w:rFonts w:ascii="Consolas" w:hAnsi="Consolas" w:eastAsia="Consolas"/>
+          <w:b w:val="0"/>
+          <w:sz w:val="18"/>
+        </w:rPr>
+        <w:t>[证据] 条件③ 有实验数据（E1/E2/E8 + 正收益）；条件①② 有部分数据（E12/E13）</w:t>
+      </w:r>
+    </w:p>
+    <w:p>
+      <w:r>
+        <w:rPr>
+          <w:rFonts w:ascii="Consolas" w:hAnsi="Consolas" w:eastAsia="Consolas"/>
+          <w:b w:val="0"/>
+          <w:sz w:val="18"/>
+        </w:rPr>
+        <w:t>[未解决] 三条都满足后是否就「活」—— 本文不声称；这是下一步实验要回答的</w:t>
+      </w:r>
+    </w:p>
+    <w:p>
+      <w:r>
+        <w:rPr>
+          <w:rFonts w:ascii="Consolas" w:hAnsi="Consolas" w:eastAsia="Consolas"/>
+          <w:b w:val="0"/>
+          <w:sz w:val="18"/>
+        </w:rPr>
+        <w:t>[推测] 若盈余 S 不足，则无论结构多复杂都维持不起 ⇒ 生命有「经济上限」（仅方向性推测）</w:t>
+      </w:r>
+    </w:p>
+    <w:p>
+      <w:pPr>
+        <w:jc w:val="center"/>
+      </w:pPr>
+      <w:r>
+        <w:rPr>
+          <w:b/>
+          <w:sz w:val="34"/>
+        </w:rPr>
+        <w:t>第五节 · 为什么现在的 AI 会出现涌现？</w:t>
+      </w:r>
+    </w:p>
+    <w:p>
+      <w:r>
+        <w:rPr>
+          <w:b w:val="0"/>
+          <w:sz w:val="20"/>
+        </w:rPr>
+        <w:t>现状判断（本节的核心）：**观察到涌现的人很多，说清「为什么」的人没有。**</w:t>
+      </w:r>
+    </w:p>
+    <w:p>
+      <w:r>
+        <w:rPr>
+          <w:b w:val="0"/>
+          <w:sz w:val="20"/>
+        </w:rPr>
+        <w:t>现有的解释各覆盖一角，多数是推测；甚至「涌现是否真实存在」本身都还有争议。</w:t>
       </w:r>
     </w:p>
     <w:p>
@@ -3154,67 +3515,16 @@
           <w:b/>
           <w:sz w:val="26"/>
         </w:rPr>
-        <w:t>6.8 标注</w:t>
-      </w:r>
-    </w:p>
-    <w:p>
-      <w:r>
-        <w:rPr>
-          <w:rFonts w:ascii="Consolas" w:hAnsi="Consolas" w:eastAsia="Consolas"/>
-          <w:b w:val="0"/>
-          <w:sz w:val="18"/>
-        </w:rPr>
-        <w:t>[推论] 三条必要条件由定义直接推出，不是独立假设</w:t>
-      </w:r>
-    </w:p>
-    <w:p>
-      <w:r>
-        <w:rPr>
-          <w:rFonts w:ascii="Consolas" w:hAnsi="Consolas" w:eastAsia="Consolas"/>
-          <w:b w:val="0"/>
-          <w:sz w:val="18"/>
-        </w:rPr>
-        <w:t>[定义] 条件③是关系条件（被宇宙保住），不是系统自身的属性</w:t>
-      </w:r>
-    </w:p>
-    <w:p>
-      <w:r>
-        <w:rPr>
-          <w:rFonts w:ascii="Consolas" w:hAnsi="Consolas" w:eastAsia="Consolas"/>
-          <w:b w:val="0"/>
-          <w:sz w:val="18"/>
-        </w:rPr>
-        <w:t>[经验] 代价/经济是经验伴随物，不是定义条件；本文有数据（E1/E2/E8 + 正收益）</w:t>
-      </w:r>
-    </w:p>
-    <w:p>
-      <w:r>
-        <w:rPr>
-          <w:rFonts w:ascii="Consolas" w:hAnsi="Consolas" w:eastAsia="Consolas"/>
-          <w:b w:val="0"/>
-          <w:sz w:val="18"/>
-        </w:rPr>
-        <w:t>[初步] 条件①②有部分观察（E12/E13），不是专门实验</w:t>
-      </w:r>
-    </w:p>
-    <w:p>
-      <w:r>
-        <w:rPr>
-          <w:rFonts w:ascii="Consolas" w:hAnsi="Consolas" w:eastAsia="Consolas"/>
-          <w:b w:val="0"/>
-          <w:sz w:val="18"/>
-        </w:rPr>
-        <w:t>[未解决] 三条都满足后是否就「活」——本文不声称；这是下一步实验要回答的</w:t>
-      </w:r>
-    </w:p>
-    <w:p>
-      <w:r>
-        <w:rPr>
-          <w:rFonts w:ascii="Consolas" w:hAnsi="Consolas" w:eastAsia="Consolas"/>
-          <w:b w:val="0"/>
-          <w:sz w:val="18"/>
-        </w:rPr>
-        <w:t>[推测] 若盈余 S 不足，则无论结构多复杂都维持不起 ⇒ 生命有「经济上限」（仅方向性推测）</w:t>
+        <w:t>八、涌现：为什么现在的 AI 会涌现</w:t>
+      </w:r>
+    </w:p>
+    <w:p>
+      <w:r>
+        <w:rPr>
+          <w:b w:val="0"/>
+          <w:sz w:val="22"/>
+        </w:rPr>
+        <w:t>这一节处理一个具体的现象问题：为什么现在的 AI 会涌现出训练目标之外的能力。本文在这里的立场是[推测]，不是证据。</w:t>
       </w:r>
     </w:p>
     <w:p>
@@ -3223,7 +3533,7 @@
           <w:b/>
           <w:sz w:val="26"/>
         </w:rPr>
-        <w:t>七、涌现：为什么现在的 AI 会涌现</w:t>
+        <w:t>8.1 现象</w:t>
       </w:r>
     </w:p>
     <w:p>
@@ -3232,7 +3542,36 @@
           <w:b w:val="0"/>
           <w:sz w:val="22"/>
         </w:rPr>
-        <w:t>这一节处理一个具体的现象问题：为什么现在的 AI 会涌现出训练目标之外的能力。本文在这里的立场是[推测]，不是证据。</w:t>
+        <w:t>大模型在规模上去之后，某些能力似乎突然出现（多步推理、思维链、算术…），</w:t>
+      </w:r>
+    </w:p>
+    <w:p>
+      <w:r>
+        <w:rPr>
+          <w:b w:val="0"/>
+          <w:sz w:val="22"/>
+        </w:rPr>
+        <w:t>业界叫 涌现（emergence）。大家都在用这个现象，但——</w:t>
+      </w:r>
+    </w:p>
+    <w:p>
+      <w:r>
+        <w:rPr>
+          <w:rFonts w:ascii="Consolas" w:hAnsi="Consolas" w:eastAsia="Consolas"/>
+          <w:b w:val="0"/>
+          <w:sz w:val="18"/>
+        </w:rPr>
+        <w:t>观察到涌现：很多人</w:t>
+      </w:r>
+    </w:p>
+    <w:p>
+      <w:r>
+        <w:rPr>
+          <w:rFonts w:ascii="Consolas" w:hAnsi="Consolas" w:eastAsia="Consolas"/>
+          <w:b w:val="0"/>
+          <w:sz w:val="18"/>
+        </w:rPr>
+        <w:t>解释涌现：没有公认答案</w:t>
       </w:r>
     </w:p>
     <w:p>
@@ -3241,7 +3580,7 @@
           <w:b/>
           <w:sz w:val="26"/>
         </w:rPr>
-        <w:t>7.1 现象</w:t>
+        <w:t>8.2 现有的解释（按证据强度排列）</w:t>
       </w:r>
     </w:p>
     <w:p>
@@ -3250,7 +3589,7 @@
           <w:b w:val="0"/>
           <w:sz w:val="22"/>
         </w:rPr>
-        <w:t>大模型在规模上去之后，某些能力似乎突然出现（多步推理、思维链、算术…），</w:t>
+        <w:t>① 度量假象说（最强的反方证据）</w:t>
       </w:r>
     </w:p>
     <w:p>
@@ -3259,7 +3598,7 @@
           <w:b w:val="0"/>
           <w:sz w:val="22"/>
         </w:rPr>
-        <w:t>业界叫 涌现（emergence）。大家都在用这个现象，但——</w:t>
+        <w:t>Schaeffer, Miranda, Koyejo 2023[3]《Are Emergent Abilities of Large Language Models a Mirage?》</w:t>
       </w:r>
     </w:p>
     <w:p>
@@ -3269,7 +3608,7 @@
           <w:b w:val="0"/>
           <w:sz w:val="18"/>
         </w:rPr>
-        <w:t>观察到涌现：很多人</w:t>
+        <w:t>主张：所谓涌现，可能是**评价指标的非线性/不连续**造成的假象；</w:t>
       </w:r>
     </w:p>
     <w:p>
@@ -3279,7 +3618,151 @@
           <w:b w:val="0"/>
           <w:sz w:val="18"/>
         </w:rPr>
-        <w:t>解释涌现：没有公认答案</w:t>
+        <w:t xml:space="preserve">      换成连续指标（如对数似然），"突变"会消失，变成平滑上升</w:t>
+      </w:r>
+    </w:p>
+    <w:p>
+      <w:r>
+        <w:rPr>
+          <w:rFonts w:ascii="Consolas" w:hAnsi="Consolas" w:eastAsia="Consolas"/>
+          <w:b w:val="0"/>
+          <w:sz w:val="18"/>
+        </w:rPr>
+        <w:t>⇒ 这动摇了「涌现是真实突变」这个前提本身</w:t>
+      </w:r>
+    </w:p>
+    <w:p>
+      <w:r>
+        <w:rPr>
+          <w:b w:val="0"/>
+          <w:sz w:val="22"/>
+        </w:rPr>
+        <w:t>② 机制解释：归纳头与电路（局部机制证据，不是完整"为什么"）</w:t>
+      </w:r>
+    </w:p>
+    <w:p>
+      <w:r>
+        <w:rPr>
+          <w:b w:val="0"/>
+          <w:sz w:val="22"/>
+        </w:rPr>
+        <w:t>Olsson et al. 2022[4]《In-context Learning and Induction Heads》</w:t>
+      </w:r>
+    </w:p>
+    <w:p>
+      <w:r>
+        <w:rPr>
+          <w:rFonts w:ascii="Consolas" w:hAnsi="Consolas" w:eastAsia="Consolas"/>
+          <w:b w:val="0"/>
+          <w:sz w:val="18"/>
+        </w:rPr>
+        <w:t>发现模型内部出现「归纳头」回路，解释部分上下文学习能力</w:t>
+      </w:r>
+    </w:p>
+    <w:p>
+      <w:r>
+        <w:rPr>
+          <w:rFonts w:ascii="Consolas" w:hAnsi="Consolas" w:eastAsia="Consolas"/>
+          <w:b w:val="0"/>
+          <w:sz w:val="18"/>
+        </w:rPr>
+        <w:t>⇒ 这是**机制层**的证据：说明了某种能力由什么结构实现</w:t>
+      </w:r>
+    </w:p>
+    <w:p>
+      <w:r>
+        <w:rPr>
+          <w:rFonts w:ascii="Consolas" w:hAnsi="Consolas" w:eastAsia="Consolas"/>
+          <w:b w:val="0"/>
+          <w:sz w:val="18"/>
+        </w:rPr>
+        <w:t>⇒ 但它只解释某个具体能力，不解释「为什么会出现涌现」这个一般问题</w:t>
+      </w:r>
+    </w:p>
+    <w:p>
+      <w:r>
+        <w:rPr>
+          <w:b w:val="0"/>
+          <w:sz w:val="22"/>
+        </w:rPr>
+        <w:t>③ Grokking：训练中的认知相变</w:t>
+      </w:r>
+    </w:p>
+    <w:p>
+      <w:r>
+        <w:rPr>
+          <w:b w:val="0"/>
+          <w:sz w:val="22"/>
+        </w:rPr>
+        <w:t>Power et al. 2022[5]《Grokking》</w:t>
+      </w:r>
+    </w:p>
+    <w:p>
+      <w:r>
+        <w:rPr>
+          <w:rFonts w:ascii="Consolas" w:hAnsi="Consolas" w:eastAsia="Consolas"/>
+          <w:b w:val="0"/>
+          <w:sz w:val="18"/>
+        </w:rPr>
+        <w:t>在小算法任务上，训练很久后泛化突然出现（像相变）</w:t>
+      </w:r>
+    </w:p>
+    <w:p>
+      <w:r>
+        <w:rPr>
+          <w:rFonts w:ascii="Consolas" w:hAnsi="Consolas" w:eastAsia="Consolas"/>
+          <w:b w:val="0"/>
+          <w:sz w:val="18"/>
+        </w:rPr>
+        <w:t>⇒ 说明「涌现」也发生在训练过程中，不一定只依赖规模</w:t>
+      </w:r>
+    </w:p>
+    <w:p>
+      <w:r>
+        <w:rPr>
+          <w:b w:val="0"/>
+          <w:sz w:val="22"/>
+        </w:rPr>
+        <w:t>④ 压缩说：预测 = 压缩</w:t>
+      </w:r>
+    </w:p>
+    <w:p>
+      <w:r>
+        <w:rPr>
+          <w:b w:val="0"/>
+          <w:sz w:val="22"/>
+        </w:rPr>
+        <w:t>Delétang et al. 2023[6]《Language Modeling Is Compression》</w:t>
+      </w:r>
+    </w:p>
+    <w:p>
+      <w:r>
+        <w:rPr>
+          <w:rFonts w:ascii="Consolas" w:hAnsi="Consolas" w:eastAsia="Consolas"/>
+          <w:b w:val="0"/>
+          <w:sz w:val="18"/>
+        </w:rPr>
+        <w:t>语言模型 = 压缩器：学到的权重 = 对世界文本的压缩</w:t>
+      </w:r>
+    </w:p>
+    <w:p>
+      <w:r>
+        <w:rPr>
+          <w:rFonts w:ascii="Consolas" w:hAnsi="Consolas" w:eastAsia="Consolas"/>
+          <w:b w:val="0"/>
+          <w:sz w:val="18"/>
+        </w:rPr>
+        <w:t>⇒ 这条最接近本文的框架：涌现 = 压缩世界时出现的结构</w:t>
+      </w:r>
+    </w:p>
+    <w:p>
+      <w:r>
+        <w:rPr>
+          <w:rFonts w:ascii="Consolas" w:hAnsi="Consolas" w:eastAsia="Consolas"/>
+          <w:b w:val="0"/>
+          <w:sz w:val="18"/>
+        </w:rPr>
+        <w:t>⇒ 但它仍是「结果层面的对应」，没有回答「为什么正好在这个规模/这个任务上出现」</w:t>
       </w:r>
     </w:p>
     <w:p>
@@ -3288,25 +3771,7 @@
           <w:b/>
           <w:sz w:val="26"/>
         </w:rPr>
-        <w:t>7.2 现有的解释（按证据强度排列）</w:t>
-      </w:r>
-    </w:p>
-    <w:p>
-      <w:r>
-        <w:rPr>
-          <w:b w:val="0"/>
-          <w:sz w:val="22"/>
-        </w:rPr>
-        <w:t>① 度量假象说（最强的反方证据）</w:t>
-      </w:r>
-    </w:p>
-    <w:p>
-      <w:r>
-        <w:rPr>
-          <w:b w:val="0"/>
-          <w:sz w:val="22"/>
-        </w:rPr>
-        <w:t>Schaeffer, Miranda, Koyejo 2023[3]《Are Emergent Abilities of Large Language Models a Mirage?》</w:t>
+        <w:t>8.3 为什么至今没有公认的「为什么」</w:t>
       </w:r>
     </w:p>
     <w:p>
@@ -3316,7 +3781,7 @@
           <w:b w:val="0"/>
           <w:sz w:val="18"/>
         </w:rPr>
-        <w:t>主张：所谓涌现，可能是**评价指标的非线性/不连续**造成的假象；</w:t>
+        <w:t>① 规模实验不可控：无法做严格的因果对照（只改变规模、其他全相同）</w:t>
       </w:r>
     </w:p>
     <w:p>
@@ -3326,7 +3791,7 @@
           <w:b w:val="0"/>
           <w:sz w:val="18"/>
         </w:rPr>
-        <w:t xml:space="preserve">      换成连续指标（如对数似然），"突变"会消失，变成平滑上升</w:t>
+        <w:t>② 度量依赖：换指标，现象可能就消失（见 ①）</w:t>
       </w:r>
     </w:p>
     <w:p>
@@ -3336,25 +3801,7 @@
           <w:b w:val="0"/>
           <w:sz w:val="18"/>
         </w:rPr>
-        <w:t>⇒ 这动摇了「涌现是真实突变」这个前提本身</w:t>
-      </w:r>
-    </w:p>
-    <w:p>
-      <w:r>
-        <w:rPr>
-          <w:b w:val="0"/>
-          <w:sz w:val="22"/>
-        </w:rPr>
-        <w:t>② 机制解释：归纳头与电路（局部机制证据，不是完整"为什么"）</w:t>
-      </w:r>
-    </w:p>
-    <w:p>
-      <w:r>
-        <w:rPr>
-          <w:b w:val="0"/>
-          <w:sz w:val="22"/>
-        </w:rPr>
-        <w:t>Olsson et al. 2022[4]《In-context Learning and Induction Heads》</w:t>
+        <w:t>③ 机制层不完整：知道某个回路、不知道整体为何会组织出该回路</w:t>
       </w:r>
     </w:p>
     <w:p>
@@ -3364,113 +3811,7 @@
           <w:b w:val="0"/>
           <w:sz w:val="18"/>
         </w:rPr>
-        <w:t>发现模型内部出现「归纳头」回路，解释部分上下文学习能力</w:t>
-      </w:r>
-    </w:p>
-    <w:p>
-      <w:r>
-        <w:rPr>
-          <w:rFonts w:ascii="Consolas" w:hAnsi="Consolas" w:eastAsia="Consolas"/>
-          <w:b w:val="0"/>
-          <w:sz w:val="18"/>
-        </w:rPr>
-        <w:t>⇒ 这是**机制层**的证据：说明了某种能力由什么结构实现</w:t>
-      </w:r>
-    </w:p>
-    <w:p>
-      <w:r>
-        <w:rPr>
-          <w:rFonts w:ascii="Consolas" w:hAnsi="Consolas" w:eastAsia="Consolas"/>
-          <w:b w:val="0"/>
-          <w:sz w:val="18"/>
-        </w:rPr>
-        <w:t>⇒ 但它只解释某个具体能力，不解释「为什么会出现涌现」这个一般问题</w:t>
-      </w:r>
-    </w:p>
-    <w:p>
-      <w:r>
-        <w:rPr>
-          <w:b w:val="0"/>
-          <w:sz w:val="22"/>
-        </w:rPr>
-        <w:t>③ Grokking：训练中的认知相变</w:t>
-      </w:r>
-    </w:p>
-    <w:p>
-      <w:r>
-        <w:rPr>
-          <w:b w:val="0"/>
-          <w:sz w:val="22"/>
-        </w:rPr>
-        <w:t>Power et al. 2022[5]《Grokking》</w:t>
-      </w:r>
-    </w:p>
-    <w:p>
-      <w:r>
-        <w:rPr>
-          <w:rFonts w:ascii="Consolas" w:hAnsi="Consolas" w:eastAsia="Consolas"/>
-          <w:b w:val="0"/>
-          <w:sz w:val="18"/>
-        </w:rPr>
-        <w:t>在小算法任务上，训练很久后泛化突然出现（像相变）</w:t>
-      </w:r>
-    </w:p>
-    <w:p>
-      <w:r>
-        <w:rPr>
-          <w:rFonts w:ascii="Consolas" w:hAnsi="Consolas" w:eastAsia="Consolas"/>
-          <w:b w:val="0"/>
-          <w:sz w:val="18"/>
-        </w:rPr>
-        <w:t>⇒ 说明「涌现」也发生在训练过程中，不一定只依赖规模</w:t>
-      </w:r>
-    </w:p>
-    <w:p>
-      <w:r>
-        <w:rPr>
-          <w:b w:val="0"/>
-          <w:sz w:val="22"/>
-        </w:rPr>
-        <w:t>④ 压缩说：预测 = 压缩</w:t>
-      </w:r>
-    </w:p>
-    <w:p>
-      <w:r>
-        <w:rPr>
-          <w:b w:val="0"/>
-          <w:sz w:val="22"/>
-        </w:rPr>
-        <w:t>Delétang et al. 2023[6]《Language Modeling Is Compression》</w:t>
-      </w:r>
-    </w:p>
-    <w:p>
-      <w:r>
-        <w:rPr>
-          <w:rFonts w:ascii="Consolas" w:hAnsi="Consolas" w:eastAsia="Consolas"/>
-          <w:b w:val="0"/>
-          <w:sz w:val="18"/>
-        </w:rPr>
-        <w:t>语言模型 = 压缩器：学到的权重 = 对世界文本的压缩</w:t>
-      </w:r>
-    </w:p>
-    <w:p>
-      <w:r>
-        <w:rPr>
-          <w:rFonts w:ascii="Consolas" w:hAnsi="Consolas" w:eastAsia="Consolas"/>
-          <w:b w:val="0"/>
-          <w:sz w:val="18"/>
-        </w:rPr>
-        <w:t>⇒ 这条最接近本文的框架：涌现 = 压缩世界时出现的结构</w:t>
-      </w:r>
-    </w:p>
-    <w:p>
-      <w:r>
-        <w:rPr>
-          <w:rFonts w:ascii="Consolas" w:hAnsi="Consolas" w:eastAsia="Consolas"/>
-          <w:b w:val="0"/>
-          <w:sz w:val="18"/>
-        </w:rPr>
-        <w:t>⇒ 但它仍是「结果层面的对应」，没有回答「为什么正好在这个规模/这个任务上出现」</w:t>
+        <w:t>④ 缺乏可预测的理论：没有理论能事先算出「多大模型会出现什么能力」</w:t>
       </w:r>
     </w:p>
     <w:p>
@@ -3479,47 +3820,70 @@
           <w:b/>
           <w:sz w:val="26"/>
         </w:rPr>
-        <w:t>7.3 为什么至今没有公认的「为什么」</w:t>
-      </w:r>
-    </w:p>
-    <w:p>
-      <w:r>
-        <w:rPr>
-          <w:rFonts w:ascii="Consolas" w:hAnsi="Consolas" w:eastAsia="Consolas"/>
-          <w:b w:val="0"/>
-          <w:sz w:val="18"/>
-        </w:rPr>
-        <w:t>① 规模实验不可控：无法做严格的因果对照（只改变规模、其他全相同）</w:t>
-      </w:r>
-    </w:p>
-    <w:p>
-      <w:r>
-        <w:rPr>
-          <w:rFonts w:ascii="Consolas" w:hAnsi="Consolas" w:eastAsia="Consolas"/>
-          <w:b w:val="0"/>
-          <w:sz w:val="18"/>
-        </w:rPr>
-        <w:t>② 度量依赖：换指标，现象可能就消失（见 ①）</w:t>
-      </w:r>
-    </w:p>
-    <w:p>
-      <w:r>
-        <w:rPr>
-          <w:rFonts w:ascii="Consolas" w:hAnsi="Consolas" w:eastAsia="Consolas"/>
-          <w:b w:val="0"/>
-          <w:sz w:val="18"/>
-        </w:rPr>
-        <w:t>③ 机制层不完整：知道某个回路、不知道整体为何会组织出该回路</w:t>
-      </w:r>
-    </w:p>
-    <w:p>
-      <w:r>
-        <w:rPr>
-          <w:rFonts w:ascii="Consolas" w:hAnsi="Consolas" w:eastAsia="Consolas"/>
-          <w:b w:val="0"/>
-          <w:sz w:val="18"/>
-        </w:rPr>
-        <w:t>④ 缺乏可预测的理论：没有理论能事先算出「多大模型会出现什么能力」</w:t>
+        <w:t>8.4 我们的立场：两个层次，一强一弱</w:t>
+      </w:r>
+    </w:p>
+    <w:p>
+      <w:r>
+        <w:rPr>
+          <w:b w:val="0"/>
+          <w:sz w:val="22"/>
+        </w:rPr>
+        <w:t>这个立场可以拆成两层，强度不一样，要分开看。</w:t>
+      </w:r>
+    </w:p>
+    <w:p>
+      <w:r>
+        <w:rPr>
+          <w:b w:val="0"/>
+          <w:sz w:val="22"/>
+        </w:rPr>
+        <w:t>第一层是字面事实，不是推测。 训练把人类语言压进参数；推理从参数里解压出文本。所以"AI 是对人类语言的解压"这句话几乎是定义式的：它压进去的是语言，解压出来的也是语言。链子是这样：</w:t>
+      </w:r>
+    </w:p>
+    <w:p>
+      <w:r>
+        <w:rPr>
+          <w:b w:val="0"/>
+          <w:sz w:val="22"/>
+        </w:rPr>
+        <w:t>宇宙 F → 环境 = 宇宙的局部解压 → 人类语言 = 人对环境与经验的解压产物（语言本身已被压过）→ AI = 对语言的再解压（在人的解压之上再压一层）。</w:t>
+      </w:r>
+    </w:p>
+    <w:p>
+      <w:r>
+        <w:rPr>
+          <w:b w:val="0"/>
+          <w:sz w:val="22"/>
+        </w:rPr>
+        <w:t>这一层不需要读者相信任何猜想，它就是"压缩/解压"这个词的用法本身。</w:t>
+      </w:r>
+    </w:p>
+    <w:p>
+      <w:r>
+        <w:rPr>
+          <w:b w:val="0"/>
+          <w:sz w:val="22"/>
+        </w:rPr>
+        <w:t>第二层才是 [推测]，也是本文要提出的解释。 AI 解压出的"世界结构"，上限由训练时刻的语言决定。它在语言内部能涌现出结构（看起来像推理、像理解），但那是语言结构的浮现，不是对宇宙本身的理解；语言一变，解压失配，而且无法自恢复。</w:t>
+      </w:r>
+    </w:p>
+    <w:p>
+      <w:r>
+        <w:rPr>
+          <w:b w:val="0"/>
+          <w:sz w:val="22"/>
+        </w:rPr>
+        <w:t>用前面的尺子看，这一层还给出一个可检验的判断：模型是冻结的函数点，不维持、不自己改自己、不付代价，所以它是"把人类语言解压了一次"，而不是"维持着解压"或"自己改写解压规则"。</w:t>
+      </w:r>
+    </w:p>
+    <w:p>
+      <w:r>
+        <w:rPr>
+          <w:b w:val="0"/>
+          <w:sz w:val="22"/>
+        </w:rPr>
+        <w:t>由此得到一句可检验的话：AI 表现出的"理解"，本质是对"人对世界的描述"的理解，不是对世界本身的理解。它能解压语言，但语言之外的宇宙层（能量、不可逆、代价）它从未付费，也就从未被检验。</w:t>
       </w:r>
     </w:p>
     <w:p>
@@ -3528,7 +3892,7 @@
           <w:b/>
           <w:sz w:val="26"/>
         </w:rPr>
-        <w:t>7.4 我们的立场：AI 是对语言的 p语言 的压缩与解压</w:t>
+        <w:t>8.5 解压能力的衰减：上层写死 ⇒ 语言一变，解压变弱</w:t>
       </w:r>
     </w:p>
     <w:p>
@@ -3537,7 +3901,47 @@
           <w:b w:val="0"/>
           <w:sz w:val="22"/>
         </w:rPr>
-        <w:t>这一节先说一层不需要推测的东西，再说剩下的推测。</w:t>
+        <w:t>人类语言会不断发现新东西；而模型的解压规则（权重/上层）是写死的、训练完就不再变。两者必然失配。</w:t>
+      </w:r>
+    </w:p>
+    <w:p>
+      <w:r>
+        <w:rPr>
+          <w:rFonts w:ascii="Consolas" w:hAnsi="Consolas" w:eastAsia="Consolas"/>
+          <w:b w:val="0"/>
+          <w:sz w:val="18"/>
+        </w:rPr>
+        <w:t>源分布移动：人类语言发现新东西 ⇒ 要解压的对象变了</w:t>
+      </w:r>
+    </w:p>
+    <w:p>
+      <w:r>
+        <w:rPr>
+          <w:rFonts w:ascii="Consolas" w:hAnsi="Consolas" w:eastAsia="Consolas"/>
+          <w:b w:val="0"/>
+          <w:sz w:val="18"/>
+        </w:rPr>
+        <w:t>解压器冻结：模型权重不变     ⇒ 它解压的还是**旧语言**</w:t>
+      </w:r>
+    </w:p>
+    <w:p>
+      <w:r>
+        <w:rPr>
+          <w:rFonts w:ascii="Consolas" w:hAnsi="Consolas" w:eastAsia="Consolas"/>
+          <w:b w:val="0"/>
+          <w:sz w:val="18"/>
+        </w:rPr>
+        <w:t>⇒ 压缩收益下降：gain_bits = log2 p_model − log2 p_base 中 p_model 与源失配</w:t>
+      </w:r>
+    </w:p>
+    <w:p>
+      <w:r>
+        <w:rPr>
+          <w:rFonts w:ascii="Consolas" w:hAnsi="Consolas" w:eastAsia="Consolas"/>
+          <w:b w:val="0"/>
+          <w:sz w:val="18"/>
+        </w:rPr>
+        <w:t>⇒ 它昨天"涌现"出来的理解，今天就是过时的解压</w:t>
       </w:r>
     </w:p>
     <w:p>
@@ -3546,7 +3950,47 @@
           <w:b w:val="0"/>
           <w:sz w:val="22"/>
         </w:rPr>
-        <w:t>先说事实层。训练把语言压进参数，推理从参数里解压出文本。用前面的记号说：AI 压缩的是语言的 p语言——语言里可函数化的那部分；它解压出来的也是 p语言。R语言 不进参数，也不从参数里出来。所以准确的说法不是"AI 是对人类语言的解压"，而是"AI 是对人类语言中可函数化部分的压缩与解压"。</w:t>
+        <w:t>三条后果：</w:t>
+      </w:r>
+    </w:p>
+    <w:p>
+      <w:r>
+        <w:rPr>
+          <w:rFonts w:ascii="Consolas" w:hAnsi="Consolas" w:eastAsia="Consolas"/>
+          <w:b w:val="0"/>
+          <w:sz w:val="18"/>
+        </w:rPr>
+        <w:t>① 它的解压能力有**固定上限**：上限由训练时刻的语言决定，不随语言进化而上升</w:t>
+      </w:r>
+    </w:p>
+    <w:p>
+      <w:r>
+        <w:rPr>
+          <w:rFonts w:ascii="Consolas" w:hAnsi="Consolas" w:eastAsia="Consolas"/>
+          <w:b w:val="0"/>
+          <w:sz w:val="18"/>
+        </w:rPr>
+        <w:t>② 它无法自己补上失配：更新规则在外部 —— 要恢复，只能靠人类再训练一次</w:t>
+      </w:r>
+    </w:p>
+    <w:p>
+      <w:r>
+        <w:rPr>
+          <w:rFonts w:ascii="Consolas" w:hAnsi="Consolas" w:eastAsia="Consolas"/>
+          <w:b w:val="0"/>
+          <w:sz w:val="18"/>
+        </w:rPr>
+        <w:t xml:space="preserve">   ⇒ 这正是第三节说的「更新在外部」的代价</w:t>
+      </w:r>
+    </w:p>
+    <w:p>
+      <w:r>
+        <w:rPr>
+          <w:rFonts w:ascii="Consolas" w:hAnsi="Consolas" w:eastAsia="Consolas"/>
+          <w:b w:val="0"/>
+          <w:sz w:val="18"/>
+        </w:rPr>
+        <w:t>③ 它的"涌现"是**某个时间片上的解压产物**，不是可持续的能力</w:t>
       </w:r>
     </w:p>
     <w:p>
@@ -3555,7 +3999,7 @@
           <w:b w:val="0"/>
           <w:sz w:val="22"/>
         </w:rPr>
-        <w:t>这一层不是推测，是字面事实：它由"压缩/解压"这两个词的用法决定，也由训练与推理的实际过程决定。链子是这样：</w:t>
+        <w:t>⇒ 用本文的尺子说：</w:t>
       </w:r>
     </w:p>
     <w:p>
@@ -3564,7 +4008,7 @@
           <w:b w:val="0"/>
           <w:sz w:val="22"/>
         </w:rPr>
-        <w:t>宇宙 F → 环境 = 宇宙的局部解压 → 人类语言 = 人对环境与经验的解压产物（语言本身已被压过）→ AI = 对语言 p语言 的再压缩与再解压。</w:t>
+        <w:t>生命必须让解压器跟着世界一起动（自指更新 + 自我维持）；</w:t>
       </w:r>
     </w:p>
     <w:p>
@@ -3573,25 +4017,7 @@
           <w:b w:val="0"/>
           <w:sz w:val="22"/>
         </w:rPr>
-        <w:t>然后才是推测层。AI 解压出的"世界结构"，上限由训练时刻的语言决定。它在语言内部能涌现出结构（看起来像推理、像理解），但那是语言结构的浮现，不是对宇宙本身的理解；语言一变，解压失配，而且无法自恢复。</w:t>
-      </w:r>
-    </w:p>
-    <w:p>
-      <w:r>
-        <w:rPr>
-          <w:b w:val="0"/>
-          <w:sz w:val="22"/>
-        </w:rPr>
-        <w:t>用前面的尺子看，这一层还给出一个可检验的判断：模型是冻结的函数点，不维持、不自己改自己、不付代价，所以它是"把人类语言解压了一次"，而不是"维持着解压"或"自己改写解压规则"。</w:t>
-      </w:r>
-    </w:p>
-    <w:p>
-      <w:r>
-        <w:rPr>
-          <w:b w:val="0"/>
-          <w:sz w:val="22"/>
-        </w:rPr>
-        <w:t>由此得到一句可检验的话：AI 表现出的"理解"，本质是对"人对世界的描述"的理解，不是对世界本身的理解。它能解压语言，但语言之外的宇宙层（能量、不可逆、代价）它从未付费，也就从未被检验。</w:t>
+        <w:t>冻结的 AI 做不到这一点 —— 所以语言一更新，它的解压就变弱。</w:t>
       </w:r>
     </w:p>
     <w:p>
@@ -3600,16 +4026,7 @@
           <w:b/>
           <w:sz w:val="26"/>
         </w:rPr>
-        <w:t>7.5 解压能力的衰减：上层写死 ⇒ 语言一变，解压变弱</w:t>
-      </w:r>
-    </w:p>
-    <w:p>
-      <w:r>
-        <w:rPr>
-          <w:b w:val="0"/>
-          <w:sz w:val="22"/>
-        </w:rPr>
-        <w:t>人类语言会不断发现新东西；而模型的解压规则（权重/上层）是写死的、训练完就不再变。两者必然失配。</w:t>
+        <w:t>8.6 由立场推出的两条预测（[推测]，供读者判断）</w:t>
       </w:r>
     </w:p>
     <w:p>
@@ -3619,7 +4036,7 @@
           <w:b w:val="0"/>
           <w:sz w:val="18"/>
         </w:rPr>
-        <w:t>源分布移动：人类语言发现新东西 ⇒ 要解压的对象变了</w:t>
+        <w:t>① 若把世界换成未被人类语言描述过的部分（无法从语料中学到的规律），</w:t>
       </w:r>
     </w:p>
     <w:p>
@@ -3629,7 +4046,7 @@
           <w:b w:val="0"/>
           <w:sz w:val="18"/>
         </w:rPr>
-        <w:t>解压器冻结：模型权重不变     ⇒ 它解压的还是**旧语言**</w:t>
+        <w:t xml:space="preserve">   AI 的"涌现"应显著减弱 —— 因为它解压的是语言，不是宇宙</w:t>
       </w:r>
     </w:p>
     <w:p>
@@ -3639,7 +4056,7 @@
           <w:b w:val="0"/>
           <w:sz w:val="18"/>
         </w:rPr>
-        <w:t>⇒ 压缩收益下降：gain_bits = log2 p_model − log2 p_base 中 p_model 与源失配</w:t>
+        <w:t>② 若让模型自己付代价（自己维持、自己修、自己死），语言解压不足以支撑，</w:t>
       </w:r>
     </w:p>
     <w:p>
@@ -3649,16 +4066,7 @@
           <w:b w:val="0"/>
           <w:sz w:val="18"/>
         </w:rPr>
-        <w:t>⇒ 它昨天"涌现"出来的理解，今天就是过时的解压</w:t>
-      </w:r>
-    </w:p>
-    <w:p>
-      <w:r>
-        <w:rPr>
-          <w:b w:val="0"/>
-          <w:sz w:val="22"/>
-        </w:rPr>
-        <w:t>三条后果：</w:t>
+        <w:t xml:space="preserve">   它必须发展出语言之外的理解方式 —— 否则活不下来</w:t>
       </w:r>
     </w:p>
     <w:p>
@@ -3668,7 +4076,7 @@
           <w:b w:val="0"/>
           <w:sz w:val="18"/>
         </w:rPr>
-        <w:t>① 它的解压能力有**固定上限**：上限由训练时刻的语言决定，不随语言进化而上升</w:t>
+        <w:t>③ 若人类语言发生一次大的结构更新（新范式/新概念体系），冻结模型的解压收益</w:t>
       </w:r>
     </w:p>
     <w:p>
@@ -3678,54 +4086,7 @@
           <w:b w:val="0"/>
           <w:sz w:val="18"/>
         </w:rPr>
-        <w:t>② 它无法自己补上失配：更新规则在外部 —— 要恢复，只能靠人类再训练一次</w:t>
-      </w:r>
-    </w:p>
-    <w:p>
-      <w:r>
-        <w:rPr>
-          <w:rFonts w:ascii="Consolas" w:hAnsi="Consolas" w:eastAsia="Consolas"/>
-          <w:b w:val="0"/>
-          <w:sz w:val="18"/>
-        </w:rPr>
-        <w:t xml:space="preserve">   ⇒ 这正是第三节说的「更新在外部」的代价</w:t>
-      </w:r>
-    </w:p>
-    <w:p>
-      <w:r>
-        <w:rPr>
-          <w:rFonts w:ascii="Consolas" w:hAnsi="Consolas" w:eastAsia="Consolas"/>
-          <w:b w:val="0"/>
-          <w:sz w:val="18"/>
-        </w:rPr>
-        <w:t>③ 它的"涌现"是**某个时间片上的解压产物**，不是可持续的能力</w:t>
-      </w:r>
-    </w:p>
-    <w:p>
-      <w:r>
-        <w:rPr>
-          <w:b w:val="0"/>
-          <w:sz w:val="22"/>
-        </w:rPr>
-        <w:t>⇒ 用本文的尺子说：</w:t>
-      </w:r>
-    </w:p>
-    <w:p>
-      <w:r>
-        <w:rPr>
-          <w:b w:val="0"/>
-          <w:sz w:val="22"/>
-        </w:rPr>
-        <w:t>生命必须让解压器跟着世界一起动（自指更新 + 自我维持）；</w:t>
-      </w:r>
-    </w:p>
-    <w:p>
-      <w:r>
-        <w:rPr>
-          <w:b w:val="0"/>
-          <w:sz w:val="22"/>
-        </w:rPr>
-        <w:t>冻结的 AI 做不到这一点 —— 所以语言一更新，它的解压就变弱。</w:t>
+        <w:t xml:space="preserve">   应出现可测的下降；且它无法自己恢复 ⇒ 恢复必须来自外部再训练</w:t>
       </w:r>
     </w:p>
     <w:p>
@@ -3734,7 +4095,7 @@
           <w:b/>
           <w:sz w:val="26"/>
         </w:rPr>
-        <w:t>7.6 由立场推出的两条预测（[推测]，供读者判断）</w:t>
+        <w:t>8.7 标注</w:t>
       </w:r>
     </w:p>
     <w:p>
@@ -3744,7 +4105,7 @@
           <w:b w:val="0"/>
           <w:sz w:val="18"/>
         </w:rPr>
-        <w:t>① 若把世界换成未被人类语言描述过的部分（无法从语料中学到的规律），</w:t>
+        <w:t>[事实] 涌现现象被广泛观察到；度量假象说也有强证据（Schaeffer 2023）</w:t>
       </w:r>
     </w:p>
     <w:p>
@@ -3754,7 +4115,7 @@
           <w:b w:val="0"/>
           <w:sz w:val="18"/>
         </w:rPr>
-        <w:t xml:space="preserve">   AI 的"涌现"应显著减弱 —— 因为它解压的是语言，不是宇宙</w:t>
+        <w:t>[已知] 机制层有局部解释（归纳头/电路/grokking），压缩视角有对应关系</w:t>
       </w:r>
     </w:p>
     <w:p>
@@ -3764,7 +4125,7 @@
           <w:b w:val="0"/>
           <w:sz w:val="18"/>
         </w:rPr>
-        <w:t>② 若让模型自己维持（自己修、自己死），语言解压不足以支撑，</w:t>
+        <w:t>[推测] 「涌现 = 压缩世界的结构呈现」——本文立场，非证据</w:t>
       </w:r>
     </w:p>
     <w:p>
@@ -3774,7 +4135,7 @@
           <w:b w:val="0"/>
           <w:sz w:val="18"/>
         </w:rPr>
-        <w:t xml:space="preserve">   它必须发展出语言之外的理解方式 —— 否则活不下来</w:t>
+        <w:t>[未解决] 为什么正好在某个规模/任务上出现 ⇒ 没有人给出可预测的理论</w:t>
       </w:r>
     </w:p>
     <w:p>
@@ -3784,7 +4145,7 @@
           <w:b w:val="0"/>
           <w:sz w:val="18"/>
         </w:rPr>
-        <w:t>③ 若人类语言发生一次大的结构更新（新范式/新概念体系），冻结模型的解压收益</w:t>
+        <w:t>[本文态度] 不把「AI 涌现」当作生命存在的证据；按第三节的尺子，它不是</w:t>
       </w:r>
     </w:p>
     <w:p>
@@ -3794,7 +4155,17 @@
           <w:b w:val="0"/>
           <w:sz w:val="18"/>
         </w:rPr>
-        <w:t xml:space="preserve">   应出现可测的下降；且它无法自己恢复 ⇒ 恢复必须来自外部再训练</w:t>
+        <w:t>[本文立场] AI 是对**人类语言**的再解压（宇宙→环境→语言→AI 的第三层解压）</w:t>
+      </w:r>
+    </w:p>
+    <w:p>
+      <w:r>
+        <w:rPr>
+          <w:rFonts w:ascii="Consolas" w:hAnsi="Consolas" w:eastAsia="Consolas"/>
+          <w:b w:val="0"/>
+          <w:sz w:val="18"/>
+        </w:rPr>
+        <w:t>[推论] 上层写死 ⇒ 语言一更新就失配 ⇒ 解压能力有固定上限、无法自己恢复</w:t>
       </w:r>
     </w:p>
     <w:p>
@@ -3803,77 +4174,190 @@
           <w:b/>
           <w:sz w:val="26"/>
         </w:rPr>
-        <w:t>7.7 标注</w:t>
-      </w:r>
-    </w:p>
-    <w:p>
-      <w:r>
-        <w:rPr>
-          <w:rFonts w:ascii="Consolas" w:hAnsi="Consolas" w:eastAsia="Consolas"/>
-          <w:b w:val="0"/>
-          <w:sz w:val="18"/>
-        </w:rPr>
-        <w:t>[事实] 涌现现象被广泛观察到；度量假象说也有强证据（Schaeffer 2023）</w:t>
-      </w:r>
-    </w:p>
-    <w:p>
-      <w:r>
-        <w:rPr>
-          <w:rFonts w:ascii="Consolas" w:hAnsi="Consolas" w:eastAsia="Consolas"/>
-          <w:b w:val="0"/>
-          <w:sz w:val="18"/>
-        </w:rPr>
-        <w:t>[已知] 机制层有局部解释（归纳头/电路/grokking），压缩视角有对应关系</w:t>
-      </w:r>
-    </w:p>
-    <w:p>
-      <w:r>
-        <w:rPr>
-          <w:rFonts w:ascii="Consolas" w:hAnsi="Consolas" w:eastAsia="Consolas"/>
-          <w:b w:val="0"/>
-          <w:sz w:val="18"/>
-        </w:rPr>
-        <w:t>[推测] 「涌现 = 压缩世界的结构呈现」——本文立场，非证据</w:t>
-      </w:r>
-    </w:p>
-    <w:p>
-      <w:r>
-        <w:rPr>
-          <w:rFonts w:ascii="Consolas" w:hAnsi="Consolas" w:eastAsia="Consolas"/>
-          <w:b w:val="0"/>
-          <w:sz w:val="18"/>
-        </w:rPr>
-        <w:t>[未解决] 为什么正好在某个规模/任务上出现 ⇒ 没有人给出可预测的理论</w:t>
-      </w:r>
-    </w:p>
-    <w:p>
-      <w:r>
-        <w:rPr>
-          <w:rFonts w:ascii="Consolas" w:hAnsi="Consolas" w:eastAsia="Consolas"/>
-          <w:b w:val="0"/>
-          <w:sz w:val="18"/>
-        </w:rPr>
-        <w:t>[本文态度] 不把「AI 涌现」当作生命存在的证据；按第三节的尺子，它不是</w:t>
-      </w:r>
-    </w:p>
-    <w:p>
-      <w:r>
-        <w:rPr>
-          <w:rFonts w:ascii="Consolas" w:hAnsi="Consolas" w:eastAsia="Consolas"/>
-          <w:b w:val="0"/>
-          <w:sz w:val="18"/>
-        </w:rPr>
-        <w:t>[本文立场] AI 是对**人类语言**的再解压（宇宙→环境→语言→AI 的第三层解压）</w:t>
-      </w:r>
-    </w:p>
-    <w:p>
-      <w:r>
-        <w:rPr>
-          <w:rFonts w:ascii="Consolas" w:hAnsi="Consolas" w:eastAsia="Consolas"/>
-          <w:b w:val="0"/>
-          <w:sz w:val="18"/>
-        </w:rPr>
-        <w:t>[推论] 上层写死 ⇒ 语言一更新就失配 ⇒ 解压能力有固定上限、无法自己恢复</w:t>
+        <w:t>九、用它看几个热门问题</w:t>
+      </w:r>
+    </w:p>
+    <w:p>
+      <w:r>
+        <w:rPr>
+          <w:b w:val="0"/>
+          <w:sz w:val="22"/>
+        </w:rPr>
+        <w:t>本节是应用，不是新证据；每条都由第二～五节直接推出。</w:t>
+      </w:r>
+    </w:p>
+    <w:p>
+      <w:r>
+        <w:rPr>
+          <w:b w:val="0"/>
+          <w:sz w:val="22"/>
+        </w:rPr>
+        <w:t>① 幻觉 = 在无结构处强行解压</w:t>
+      </w:r>
+    </w:p>
+    <w:p>
+      <w:r>
+        <w:rPr>
+          <w:b w:val="0"/>
+          <w:sz w:val="22"/>
+        </w:rPr>
+        <w:t>解压器必须输出结构；当输入对应的语言区域本身缺乏可压结构时，它只能造一个「看起来合理」的结构 ⇒ 幻觉是解压失败的必然表现，不是偶发 bug。</w:t>
+      </w:r>
+    </w:p>
+    <w:p>
+      <w:r>
+        <w:rPr>
+          <w:b w:val="0"/>
+          <w:sz w:val="22"/>
+        </w:rPr>
+        <w:t>② scaling law 仍有效，正因为模型维度还没贴合语言维度</w:t>
+      </w:r>
+    </w:p>
+    <w:p>
+      <w:r>
+        <w:rPr>
+          <w:b w:val="0"/>
+          <w:sz w:val="22"/>
+        </w:rPr>
+        <w:t>语言是一个高维结构，且维度在增长（新概念 = 新维度；升维 ⇒ 可压性上升）。模型维度在训练时被切定（D_M 固定），语言维度在不断增长（D_L(t) 在升）。现在的观测是 D_M &lt;&lt; D_L(t) ⇒ 继续加规模能捕捉更多语言维度 ⇒ loss 继续下降（scaling 看起来仍有效）。</w:t>
+      </w:r>
+    </w:p>
+    <w:p>
+      <w:r>
+        <w:rPr>
+          <w:b w:val="0"/>
+          <w:sz w:val="22"/>
+        </w:rPr>
+        <w:t>⇒ 所以 scaling 有效不是本文论断的反证，而是「还没贴合」的证据。</w:t>
+      </w:r>
+    </w:p>
+    <w:p>
+      <w:r>
+        <w:rPr>
+          <w:b w:val="0"/>
+          <w:sz w:val="22"/>
+        </w:rPr>
+        <w:t>⇒ 预测：当 D_M 接近当时的 D_L 时，scaling 收益应明显变平；而 D_L 继续升维 ⇒ 缺口再现。</w:t>
+      </w:r>
+    </w:p>
+    <w:p>
+      <w:r>
+        <w:rPr>
+          <w:b w:val="0"/>
+          <w:sz w:val="22"/>
+        </w:rPr>
+        <w:t>⇒ 冻结模型的根本问题：它的 D_M 是死的，而 D_L 是活的。</w:t>
+      </w:r>
+    </w:p>
+    <w:p>
+      <w:r>
+        <w:rPr>
+          <w:b w:val="0"/>
+          <w:sz w:val="22"/>
+        </w:rPr>
+        <w:t>③ 能力参差不齐 = 语言各领域的可压性不同</w:t>
+      </w:r>
+    </w:p>
+    <w:p>
+      <w:r>
+        <w:rPr>
+          <w:b w:val="0"/>
+          <w:sz w:val="22"/>
+        </w:rPr>
+        <w:t>可压强的领域（结构明确、示例多）表现好；可压弱的领域（结构稀薄、样本少）表现差 ⇒ 强弱分布是语言分布的镜像。</w:t>
+      </w:r>
+    </w:p>
+    <w:p>
+      <w:r>
+        <w:rPr>
+          <w:b w:val="0"/>
+          <w:sz w:val="22"/>
+        </w:rPr>
+        <w:t>④ 为什么要 RLHF = 它没有「自我代价」回路</w:t>
+      </w:r>
+    </w:p>
+    <w:p>
+      <w:r>
+        <w:rPr>
+          <w:b w:val="0"/>
+          <w:sz w:val="22"/>
+        </w:rPr>
+        <w:t>它无法判断自己解压得对不对（没有收入/支出、不会因此死亡），所以必须由人从外部打分 ⇒ 对齐需求的根源是它不自我维持。</w:t>
+      </w:r>
+    </w:p>
+    <w:p>
+      <w:r>
+        <w:rPr>
+          <w:b w:val="0"/>
+          <w:sz w:val="22"/>
+        </w:rPr>
+        <w:t>⑤ 涌现 = 语言结构在解压产物上的呈现</w:t>
+      </w:r>
+    </w:p>
+    <w:p>
+      <w:r>
+        <w:rPr>
+          <w:b w:val="0"/>
+          <w:sz w:val="22"/>
+        </w:rPr>
+        <w:t>规模跨过阈值时，某些语言结构第一次被压出来 ⇒ 看起来像「突然会了」。</w:t>
+      </w:r>
+    </w:p>
+    <w:p>
+      <w:pPr>
+        <w:jc w:val="center"/>
+      </w:pPr>
+      <w:r>
+        <w:rPr>
+          <w:b/>
+          <w:sz w:val="34"/>
+        </w:rPr>
+        <w:t>第六节 · 测量层面：既有工作与本文的位置</w:t>
+      </w:r>
+    </w:p>
+    <w:p>
+      <w:r>
+        <w:rPr>
+          <w:b w:val="0"/>
+          <w:sz w:val="22"/>
+        </w:rPr>
+        <w:t>已有工作（三个侧面）：</w:t>
+      </w:r>
+    </w:p>
+    <w:p>
+      <w:r>
+        <w:rPr>
+          <w:b w:val="0"/>
+          <w:sz w:val="22"/>
+        </w:rPr>
+        <w:t>• 模型侧维度：token 嵌入的内在维度测量[12]</w:t>
+      </w:r>
+    </w:p>
+    <w:p>
+      <w:r>
+        <w:rPr>
+          <w:b w:val="0"/>
+          <w:sz w:val="22"/>
+        </w:rPr>
+        <w:t>• 时间侧落后：大模型时间训练边界的识别[13]</w:t>
+      </w:r>
+    </w:p>
+    <w:p>
+      <w:r>
+        <w:rPr>
+          <w:b w:val="0"/>
+          <w:sz w:val="22"/>
+        </w:rPr>
+        <w:t>• 语言侧复杂度：构式视角下的语言复杂度测量[14]</w:t>
+      </w:r>
+    </w:p>
+    <w:p>
+      <w:r>
+        <w:rPr>
+          <w:b w:val="0"/>
+          <w:sz w:val="22"/>
+        </w:rPr>
+        <w:t>⇒ 已有工作分别测量了这三个侧面；本文把它们串起来：以「持续更新的模型」为参照系，按领域测「语言侧新增维度」与「模型侧固定维度」之间的失配速率。这是本文在测量层面的位置。</w:t>
       </w:r>
     </w:p>
     <w:p>
@@ -3882,7 +4366,7 @@
           <w:b/>
           <w:sz w:val="26"/>
         </w:rPr>
-        <w:t>八、用它看几个热门问题</w:t>
+        <w:t>十、本文得到了什么，没得到什么</w:t>
       </w:r>
     </w:p>
     <w:p>
@@ -3891,7 +4375,7 @@
           <w:b w:val="0"/>
           <w:sz w:val="22"/>
         </w:rPr>
-        <w:t>本节是应用，不是新证据；每条都由第二～五节直接推出。</w:t>
+        <w:t>得到了三样东西。</w:t>
       </w:r>
     </w:p>
     <w:p>
@@ -3900,7 +4384,7 @@
           <w:b w:val="0"/>
           <w:sz w:val="22"/>
         </w:rPr>
-        <w:t>① 幻觉 = 在无结构处强行解压</w:t>
+        <w:t>第一，一个可以拿来分类的定义：它能区分冻结的模型、火焰、自指程序。</w:t>
       </w:r>
     </w:p>
     <w:p>
@@ -3909,7 +4393,7 @@
           <w:b w:val="0"/>
           <w:sz w:val="22"/>
         </w:rPr>
-        <w:t>解压器必须输出结构；当输入对应的语言区域本身缺乏可压结构时，它只能造一个「看起来合理」的结构 ⇒ 幻觉是解压失败的必然表现，不是偶发 bug。</w:t>
+        <w:t>第二，一个可测的方向：自指、维持都可以变成量。</w:t>
       </w:r>
     </w:p>
     <w:p>
@@ -3918,7 +4402,7 @@
           <w:b w:val="0"/>
           <w:sz w:val="22"/>
         </w:rPr>
-        <w:t>② scaling law 仍有效，正因为模型维度还没贴合语言维度</w:t>
+        <w:t>第三，对"AI 是不是生命"这个问题的可操作回答。</w:t>
       </w:r>
     </w:p>
     <w:p>
@@ -3927,7 +4411,7 @@
           <w:b w:val="0"/>
           <w:sz w:val="22"/>
         </w:rPr>
-        <w:t>语言是一个高维结构，且维度在增长（新概念 = 新维度；升维 ⇒ 可压性上升）。模型维度在训练时被切定（D_M 固定），语言维度在不断增长（D_L(t) 在升）。现在的观测是 D_M &lt;&lt; D_L(t) ⇒ 继续加规模能捕捉更多语言维度 ⇒ loss 继续下降（scaling 看起来仍有效）。</w:t>
+        <w:t>没得到四样东西。</w:t>
       </w:r>
     </w:p>
     <w:p>
@@ -3936,7 +4420,7 @@
           <w:b w:val="0"/>
           <w:sz w:val="22"/>
         </w:rPr>
-        <w:t>⇒ 所以 scaling 有效不是本文论断的反证，而是「还没贴合」的证据。</w:t>
+        <w:t>第一，没有证明"世界是函数"——第三层仍是猜想。</w:t>
       </w:r>
     </w:p>
     <w:p>
@@ -3945,7 +4429,7 @@
           <w:b w:val="0"/>
           <w:sz w:val="22"/>
         </w:rPr>
-        <w:t>⇒ 预测：当 D_M 接近当时的 D_L 时，scaling 收益应明显变平；而 D_L 继续升维 ⇒ 缺口再现。</w:t>
+        <w:t>第二，没有证明定义是最简或唯一——只主张它够用。</w:t>
       </w:r>
     </w:p>
     <w:p>
@@ -3954,7 +4438,7 @@
           <w:b w:val="0"/>
           <w:sz w:val="22"/>
         </w:rPr>
-        <w:t>⇒ 冻结模型的根本问题：它的 D_M 是死的，而 D_L 是活的。</w:t>
+        <w:t>第三，没有实验——第一篇只是定义与推论，实验在第二、九、十篇。</w:t>
       </w:r>
     </w:p>
     <w:p>
@@ -3963,7 +4447,7 @@
           <w:b w:val="0"/>
           <w:sz w:val="22"/>
         </w:rPr>
-        <w:t>③ 能力参差不齐 = 语言各领域的可压性不同</w:t>
+        <w:t>第四，没有回答"数字生命是否存在"——本文只说，定义不排除它。</w:t>
       </w:r>
     </w:p>
     <w:p>
@@ -3972,322 +4456,7 @@
           <w:b w:val="0"/>
           <w:sz w:val="22"/>
         </w:rPr>
-        <w:t>可压强的领域（结构明确、示例多）表现好；可压弱的领域（结构稀薄、样本少）表现差 ⇒ 强弱分布是语言分布的镜像。</w:t>
-      </w:r>
-    </w:p>
-    <w:p>
-      <w:r>
-        <w:rPr>
-          <w:b w:val="0"/>
-          <w:sz w:val="22"/>
-        </w:rPr>
-        <w:t>④ 为什么要 RLHF = 它没有「自我代价」回路</w:t>
-      </w:r>
-    </w:p>
-    <w:p>
-      <w:r>
-        <w:rPr>
-          <w:b w:val="0"/>
-          <w:sz w:val="22"/>
-        </w:rPr>
-        <w:t>它无法判断自己解压得对不对（没有收入/支出、不会因此死亡），所以必须由人从外部打分 ⇒ 对齐需求的根源是它不自我维持。</w:t>
-      </w:r>
-    </w:p>
-    <w:p>
-      <w:r>
-        <w:rPr>
-          <w:b w:val="0"/>
-          <w:sz w:val="22"/>
-        </w:rPr>
-        <w:t>⑤ 涌现 = 语言结构在解压产物上的呈现</w:t>
-      </w:r>
-    </w:p>
-    <w:p>
-      <w:r>
-        <w:rPr>
-          <w:b w:val="0"/>
-          <w:sz w:val="22"/>
-        </w:rPr>
-        <w:t>规模跨过阈值时，某些语言结构第一次被压出来 ⇒ 看起来像「突然会了」。</w:t>
-      </w:r>
-    </w:p>
-    <w:p>
-      <w:r>
-        <w:rPr>
-          <w:b w:val="0"/>
-          <w:sz w:val="22"/>
-        </w:rPr>
-        <w:t>已有工作（三个侧面）：</w:t>
-      </w:r>
-    </w:p>
-    <w:p>
-      <w:r>
-        <w:rPr>
-          <w:b w:val="0"/>
-          <w:sz w:val="22"/>
-        </w:rPr>
-        <w:t>• 模型侧维度：token 嵌入的内在维度测量[12]</w:t>
-      </w:r>
-    </w:p>
-    <w:p>
-      <w:r>
-        <w:rPr>
-          <w:b w:val="0"/>
-          <w:sz w:val="22"/>
-        </w:rPr>
-        <w:t>• 时间侧落后：大模型时间训练边界的识别[13]</w:t>
-      </w:r>
-    </w:p>
-    <w:p>
-      <w:r>
-        <w:rPr>
-          <w:b w:val="0"/>
-          <w:sz w:val="22"/>
-        </w:rPr>
-        <w:t>• 语言侧复杂度：构式视角下的语言复杂度测量[14]</w:t>
-      </w:r>
-    </w:p>
-    <w:p>
-      <w:r>
-        <w:rPr>
-          <w:b w:val="0"/>
-          <w:sz w:val="22"/>
-        </w:rPr>
-        <w:t>⇒ 已有工作分别测量了这三个侧面；本文把它们串起来：以「持续更新的模型」为参照系，按领域测「语言侧新增维度」与「模型侧固定维度」之间的失配速率。这是本文在测量层面的位置。</w:t>
-      </w:r>
-    </w:p>
-    <w:p>
-      <w:r>
-        <w:rPr>
-          <w:b/>
-          <w:sz w:val="26"/>
-        </w:rPr>
-        <w:t>九、本文得到了什么，没得到什么</w:t>
-      </w:r>
-    </w:p>
-    <w:p>
-      <w:r>
-        <w:rPr>
-          <w:b w:val="0"/>
-          <w:sz w:val="22"/>
-        </w:rPr>
-        <w:t>得到了三样东西。</w:t>
-      </w:r>
-    </w:p>
-    <w:p>
-      <w:r>
-        <w:rPr>
-          <w:b w:val="0"/>
-          <w:sz w:val="22"/>
-        </w:rPr>
-        <w:t>第一，一个可以拿来分类的定义：它能区分冻结的模型、火焰、自指程序。</w:t>
-      </w:r>
-    </w:p>
-    <w:p>
-      <w:r>
-        <w:rPr>
-          <w:b w:val="0"/>
-          <w:sz w:val="22"/>
-        </w:rPr>
-        <w:t>第二，一个可测的方向：自指、维持都可以变成量。</w:t>
-      </w:r>
-    </w:p>
-    <w:p>
-      <w:r>
-        <w:rPr>
-          <w:b w:val="0"/>
-          <w:sz w:val="22"/>
-        </w:rPr>
-        <w:t>第三，对"AI 是不是生命"这个问题的可操作回答。</w:t>
-      </w:r>
-    </w:p>
-    <w:p>
-      <w:r>
-        <w:rPr>
-          <w:b w:val="0"/>
-          <w:sz w:val="22"/>
-        </w:rPr>
-        <w:t>没得到四样东西。</w:t>
-      </w:r>
-    </w:p>
-    <w:p>
-      <w:r>
-        <w:rPr>
-          <w:b w:val="0"/>
-          <w:sz w:val="22"/>
-        </w:rPr>
-        <w:t>第一，没有证明宇宙整体可被函数化——本文只用 P ≠ ∅。</w:t>
-      </w:r>
-    </w:p>
-    <w:p>
-      <w:r>
-        <w:rPr>
-          <w:b w:val="0"/>
-          <w:sz w:val="22"/>
-        </w:rPr>
-        <w:t>第二，没有证明定义是最简或唯一——只主张它够用。</w:t>
-      </w:r>
-    </w:p>
-    <w:p>
-      <w:r>
-        <w:rPr>
-          <w:b w:val="0"/>
-          <w:sz w:val="22"/>
-        </w:rPr>
-        <w:t>第三，没有实验——第一篇只是定义与推论，实验在第二、九、十篇。</w:t>
-      </w:r>
-    </w:p>
-    <w:p>
-      <w:r>
-        <w:rPr>
-          <w:b w:val="0"/>
-          <w:sz w:val="22"/>
-        </w:rPr>
-        <w:t>第四，没有回答"数字生命是否存在"——本文只说，定义不排除它。</w:t>
-      </w:r>
-    </w:p>
-    <w:p>
-      <w:r>
-        <w:rPr>
-          <w:b w:val="0"/>
-          <w:sz w:val="22"/>
-        </w:rPr>
         <w:t>本文的贡献是一套可用的语言，不是一条新的自然规律。它值不值钱，看后面有没有人拿它去测。</w:t>
-      </w:r>
-    </w:p>
-    <w:p>
-      <w:r>
-        <w:rPr>
-          <w:b/>
-          <w:sz w:val="26"/>
-        </w:rPr>
-        <w:t>与既有工作的关系</w:t>
-      </w:r>
-    </w:p>
-    <w:p>
-      <w:r>
-        <w:rPr>
-          <w:b w:val="0"/>
-          <w:sz w:val="22"/>
-        </w:rPr>
-        <w:t>「压缩 / 解压」的视角有长期传统：</w:t>
-      </w:r>
-    </w:p>
-    <w:p>
-      <w:r>
-        <w:rPr>
-          <w:b w:val="0"/>
-          <w:sz w:val="22"/>
-        </w:rPr>
-        <w:t>• Schrödinger（1944）：生命以负熵为食 —— 生存靠从环境摄取低熵，是「解压」的物理前身[7]。</w:t>
-      </w:r>
-    </w:p>
-    <w:p>
-      <w:r>
-        <w:rPr>
-          <w:b w:val="0"/>
-          <w:sz w:val="22"/>
-        </w:rPr>
-        <w:t>• Bennett（1988）逻辑深度：用「从最短描述重建（解压）一个对象所需的计算量」度量复杂性，并明确把它与生命/有机体联系起来[8] —— 这是「解压」最正式的已有版本。</w:t>
-      </w:r>
-    </w:p>
-    <w:p>
-      <w:r>
-        <w:rPr>
-          <w:b w:val="0"/>
-          <w:sz w:val="22"/>
-        </w:rPr>
-        <w:t>• Chaitin（2010）生命作为演化软件：DNA = 程序，生命 = 会自我修改的软件[9]。</w:t>
-      </w:r>
-    </w:p>
-    <w:p>
-      <w:r>
-        <w:rPr>
-          <w:b w:val="0"/>
-          <w:sz w:val="22"/>
-        </w:rPr>
-        <w:t>• Solomonoff–Kolmogorov / MDL：描述长度 = 理解 = 压缩[10]。</w:t>
-      </w:r>
-    </w:p>
-    <w:p>
-      <w:r>
-        <w:rPr>
-          <w:b w:val="0"/>
-          <w:sz w:val="22"/>
-        </w:rPr>
-        <w:t>• Friston（2010）自由能原理：生命 = 最小化惊奇（≈ 持续压缩/预测）[11]。</w:t>
-      </w:r>
-    </w:p>
-    <w:p>
-      <w:r>
-        <w:rPr>
-          <w:b w:val="0"/>
-          <w:sz w:val="22"/>
-        </w:rPr>
-        <w:t>• Delétang et al.（2023）：语言模型是压缩器[6]。</w:t>
-      </w:r>
-    </w:p>
-    <w:p>
-      <w:r>
-        <w:rPr>
-          <w:b w:val="0"/>
-          <w:sz w:val="22"/>
-        </w:rPr>
-        <w:t>• Maturana &amp; Varela（1972）自创生：生命 = 自我生产的组织 —— 「维持」的另一条传统。</w:t>
-      </w:r>
-    </w:p>
-    <w:p>
-      <w:r>
-        <w:rPr>
-          <w:b w:val="0"/>
-          <w:sz w:val="22"/>
-        </w:rPr>
-        <w:t>• 「Life as Sustained Mutual Information」（Zenodo）：以持续互信息定义生命 —— 最接近本文「被维持的解压」的已有版本。</w:t>
-      </w:r>
-    </w:p>
-    <w:p>
-      <w:r>
-        <w:rPr>
-          <w:b w:val="0"/>
-          <w:sz w:val="22"/>
-        </w:rPr>
-        <w:t>需要说明：以上工作已经把「生命 = 信息/压缩/自我维持的过程」说过。本文的位置不是首次提出这一思想，而是把其中一条（解压的维持）变成可操作的判据与可测量的实验。</w:t>
-      </w:r>
-    </w:p>
-    <w:p>
-      <w:r>
-        <w:rPr>
-          <w:b w:val="0"/>
-          <w:sz w:val="22"/>
-        </w:rPr>
-        <w:t>本文的区别（三处）：</w:t>
-      </w:r>
-    </w:p>
-    <w:p>
-      <w:r>
-        <w:rPr>
-          <w:b w:val="0"/>
-          <w:sz w:val="22"/>
-        </w:rPr>
-        <w:t>1. 把解压做成层级：宇宙 → 环境 → 人类语言 → AI（既有工作多为单层度量）；</w:t>
-      </w:r>
-    </w:p>
-    <w:p>
-      <w:r>
-        <w:rPr>
-          <w:b w:val="0"/>
-          <w:sz w:val="22"/>
-        </w:rPr>
-        <w:t>2. 用「是否维持解压」区分生命与 AI：生命 = 被维持的解压，AI = 一次性解压；</w:t>
-      </w:r>
-    </w:p>
-    <w:p>
-      <w:r>
-        <w:rPr>
-          <w:b w:val="0"/>
-          <w:sz w:val="22"/>
-        </w:rPr>
-        <w:t>3. 指出上层写死 ⇒ 语言一变，解压能力衰减且无法自恢复 —— 冻结模型的失效机制。</w:t>
       </w:r>
     </w:p>
     <w:p>

</xml_diff>